<commit_message>
ADAP 2023: Complete draft of budget and justification
</commit_message>
<xml_diff>
--- a/budget/budget_justification.docx
+++ b/budget/budget_justification.docx
@@ -67,159 +67,188 @@
         <w:ind w:left="180" w:right="1580" w:firstLine="360"/>
         <w:rPr>
           <w:color w:val="000000" w:themeColor="text1"/>
-          <w:sz w:val="22"/>
-          <w:szCs w:val="22"/>
+          <w:sz w:val="24"/>
+          <w:szCs w:val="24"/>
         </w:rPr>
       </w:pPr>
       <w:bookmarkStart w:id="3" w:name="Technical_Approach_and_Methodology"/>
       <w:bookmarkEnd w:id="3"/>
       <w:r>
-        <w:t>The budget includes salary, benefits, travel, publication charges, and indirect costs for the host institution of the PI and Co-PI, support for two graduate students, and participant support costs for the RET program</w:t>
-      </w:r>
-      <w:r>
-        <w:t>.</w:t>
+        <w:rPr>
+          <w:sz w:val="24"/>
+          <w:szCs w:val="24"/>
+        </w:rPr>
+        <w:t xml:space="preserve">The budget includes salary, benefits, travel, publication charges, and indirect costs for the host institution of the PI </w:t>
+      </w:r>
+      <w:r>
+        <w:rPr>
+          <w:sz w:val="24"/>
+          <w:szCs w:val="24"/>
+        </w:rPr>
+        <w:t xml:space="preserve">as well as </w:t>
+      </w:r>
+      <w:r>
+        <w:rPr>
+          <w:sz w:val="24"/>
+          <w:szCs w:val="24"/>
+        </w:rPr>
+        <w:t xml:space="preserve">support for </w:t>
+      </w:r>
+      <w:r>
+        <w:rPr>
+          <w:sz w:val="24"/>
+          <w:szCs w:val="24"/>
+        </w:rPr>
+        <w:t>one</w:t>
+      </w:r>
+      <w:r>
+        <w:rPr>
+          <w:sz w:val="24"/>
+          <w:szCs w:val="24"/>
+        </w:rPr>
+        <w:t xml:space="preserve"> graduate.</w:t>
       </w:r>
       <w:r>
         <w:rPr>
           <w:color w:val="000000" w:themeColor="text1"/>
-          <w:sz w:val="22"/>
-          <w:szCs w:val="22"/>
+          <w:sz w:val="24"/>
+          <w:szCs w:val="24"/>
         </w:rPr>
         <w:softHyphen/>
       </w:r>
       <w:r>
         <w:rPr>
           <w:color w:val="000000" w:themeColor="text1"/>
-          <w:sz w:val="22"/>
-          <w:szCs w:val="22"/>
+          <w:sz w:val="24"/>
+          <w:szCs w:val="24"/>
         </w:rPr>
         <w:softHyphen/>
       </w:r>
       <w:r>
         <w:rPr>
           <w:color w:val="000000" w:themeColor="text1"/>
-          <w:sz w:val="22"/>
-          <w:szCs w:val="22"/>
+          <w:sz w:val="24"/>
+          <w:szCs w:val="24"/>
         </w:rPr>
         <w:softHyphen/>
       </w:r>
       <w:r>
         <w:rPr>
           <w:color w:val="000000" w:themeColor="text1"/>
-          <w:sz w:val="22"/>
-          <w:szCs w:val="22"/>
+          <w:sz w:val="24"/>
+          <w:szCs w:val="24"/>
         </w:rPr>
         <w:softHyphen/>
       </w:r>
       <w:r>
         <w:rPr>
           <w:color w:val="000000" w:themeColor="text1"/>
-          <w:sz w:val="22"/>
-          <w:szCs w:val="22"/>
+          <w:sz w:val="24"/>
+          <w:szCs w:val="24"/>
         </w:rPr>
         <w:softHyphen/>
       </w:r>
       <w:r>
         <w:rPr>
           <w:color w:val="000000" w:themeColor="text1"/>
-          <w:sz w:val="22"/>
-          <w:szCs w:val="22"/>
+          <w:sz w:val="24"/>
+          <w:szCs w:val="24"/>
         </w:rPr>
         <w:softHyphen/>
       </w:r>
       <w:r>
         <w:rPr>
           <w:color w:val="000000" w:themeColor="text1"/>
-          <w:sz w:val="22"/>
-          <w:szCs w:val="22"/>
+          <w:sz w:val="24"/>
+          <w:szCs w:val="24"/>
         </w:rPr>
         <w:softHyphen/>
       </w:r>
       <w:r>
         <w:rPr>
           <w:color w:val="000000" w:themeColor="text1"/>
-          <w:sz w:val="22"/>
-          <w:szCs w:val="22"/>
+          <w:sz w:val="24"/>
+          <w:szCs w:val="24"/>
         </w:rPr>
         <w:softHyphen/>
       </w:r>
       <w:r>
         <w:rPr>
           <w:color w:val="000000" w:themeColor="text1"/>
-          <w:sz w:val="22"/>
-          <w:szCs w:val="22"/>
+          <w:sz w:val="24"/>
+          <w:szCs w:val="24"/>
         </w:rPr>
         <w:softHyphen/>
       </w:r>
       <w:r>
         <w:rPr>
           <w:color w:val="000000" w:themeColor="text1"/>
-          <w:sz w:val="22"/>
-          <w:szCs w:val="22"/>
+          <w:sz w:val="24"/>
+          <w:szCs w:val="24"/>
         </w:rPr>
         <w:softHyphen/>
       </w:r>
       <w:r>
         <w:rPr>
           <w:color w:val="000000" w:themeColor="text1"/>
-          <w:sz w:val="22"/>
-          <w:szCs w:val="22"/>
+          <w:sz w:val="24"/>
+          <w:szCs w:val="24"/>
         </w:rPr>
         <w:softHyphen/>
       </w:r>
       <w:r>
         <w:rPr>
           <w:color w:val="000000" w:themeColor="text1"/>
-          <w:sz w:val="22"/>
-          <w:szCs w:val="22"/>
+          <w:sz w:val="24"/>
+          <w:szCs w:val="24"/>
         </w:rPr>
         <w:softHyphen/>
       </w:r>
       <w:r>
         <w:rPr>
           <w:color w:val="000000" w:themeColor="text1"/>
-          <w:sz w:val="22"/>
-          <w:szCs w:val="22"/>
+          <w:sz w:val="24"/>
+          <w:szCs w:val="24"/>
         </w:rPr>
         <w:softHyphen/>
       </w:r>
       <w:r>
         <w:rPr>
           <w:color w:val="000000" w:themeColor="text1"/>
-          <w:sz w:val="22"/>
-          <w:szCs w:val="22"/>
+          <w:sz w:val="24"/>
+          <w:szCs w:val="24"/>
         </w:rPr>
         <w:softHyphen/>
       </w:r>
       <w:r>
         <w:rPr>
           <w:color w:val="000000" w:themeColor="text1"/>
-          <w:sz w:val="22"/>
-          <w:szCs w:val="22"/>
+          <w:sz w:val="24"/>
+          <w:szCs w:val="24"/>
         </w:rPr>
         <w:softHyphen/>
       </w:r>
       <w:r>
         <w:rPr>
           <w:color w:val="000000" w:themeColor="text1"/>
-          <w:sz w:val="22"/>
-          <w:szCs w:val="22"/>
+          <w:sz w:val="24"/>
+          <w:szCs w:val="24"/>
         </w:rPr>
         <w:softHyphen/>
       </w:r>
       <w:r>
         <w:rPr>
           <w:color w:val="000000" w:themeColor="text1"/>
-          <w:sz w:val="22"/>
-          <w:szCs w:val="22"/>
+          <w:sz w:val="24"/>
+          <w:szCs w:val="24"/>
         </w:rPr>
         <w:softHyphen/>
       </w:r>
       <w:r>
         <w:rPr>
           <w:color w:val="000000" w:themeColor="text1"/>
-          <w:sz w:val="22"/>
-          <w:szCs w:val="22"/>
+          <w:sz w:val="24"/>
+          <w:szCs w:val="24"/>
         </w:rPr>
         <w:softHyphen/>
       </w:r>
@@ -237,29 +266,29 @@
         <w:spacing w:before="160" w:line="238" w:lineRule="exact"/>
         <w:ind w:left="180" w:right="1584" w:firstLine="360"/>
         <w:rPr>
-          <w:sz w:val="22"/>
-          <w:szCs w:val="22"/>
-        </w:rPr>
-      </w:pPr>
-      <w:r>
-        <w:rPr>
-          <w:sz w:val="22"/>
-          <w:szCs w:val="22"/>
+          <w:sz w:val="24"/>
+          <w:szCs w:val="24"/>
+        </w:rPr>
+      </w:pPr>
+      <w:r>
+        <w:rPr>
+          <w:sz w:val="24"/>
+          <w:szCs w:val="24"/>
         </w:rPr>
         <w:t>Salaries and</w:t>
       </w:r>
       <w:r>
         <w:rPr>
           <w:spacing w:val="2"/>
-          <w:sz w:val="22"/>
-          <w:szCs w:val="22"/>
+          <w:sz w:val="24"/>
+          <w:szCs w:val="24"/>
         </w:rPr>
         <w:t xml:space="preserve"> </w:t>
       </w:r>
       <w:r>
         <w:rPr>
-          <w:sz w:val="22"/>
-          <w:szCs w:val="22"/>
+          <w:sz w:val="24"/>
+          <w:szCs w:val="24"/>
         </w:rPr>
         <w:t>Wages</w:t>
       </w:r>
@@ -270,49 +299,63 @@
         <w:spacing w:before="48" w:line="288" w:lineRule="auto"/>
         <w:ind w:left="180" w:right="1580" w:firstLine="360"/>
         <w:rPr>
-          <w:sz w:val="22"/>
-          <w:szCs w:val="22"/>
-        </w:rPr>
-      </w:pPr>
-      <w:r>
-        <w:rPr>
-          <w:sz w:val="22"/>
-          <w:szCs w:val="22"/>
-        </w:rPr>
-        <w:t xml:space="preserve">Salaries for all personnel are based upon current academic and staff salary scales </w:t>
-      </w:r>
-      <w:r>
-        <w:rPr>
-          <w:sz w:val="22"/>
-          <w:szCs w:val="22"/>
+          <w:sz w:val="24"/>
+          <w:szCs w:val="24"/>
+        </w:rPr>
+      </w:pPr>
+      <w:r>
+        <w:rPr>
+          <w:sz w:val="24"/>
+          <w:szCs w:val="24"/>
+        </w:rPr>
+        <w:t xml:space="preserve">Salaries for all personnel are based </w:t>
+      </w:r>
+      <w:r>
+        <w:rPr>
+          <w:sz w:val="24"/>
+          <w:szCs w:val="24"/>
+        </w:rPr>
+        <w:t>on</w:t>
+      </w:r>
+      <w:r>
+        <w:rPr>
+          <w:sz w:val="24"/>
+          <w:szCs w:val="24"/>
+        </w:rPr>
+        <w:t xml:space="preserve"> current academic and staff salary scales </w:t>
+      </w:r>
+      <w:r>
+        <w:rPr>
+          <w:sz w:val="24"/>
+          <w:szCs w:val="24"/>
         </w:rPr>
         <w:t>for the PI’s</w:t>
       </w:r>
       <w:r>
         <w:rPr>
-          <w:sz w:val="22"/>
-          <w:szCs w:val="22"/>
+          <w:sz w:val="24"/>
+          <w:szCs w:val="24"/>
         </w:rPr>
         <w:t xml:space="preserve"> institution</w:t>
       </w:r>
       <w:r>
         <w:rPr>
-          <w:sz w:val="22"/>
-          <w:szCs w:val="22"/>
+          <w:sz w:val="24"/>
+          <w:szCs w:val="24"/>
         </w:rPr>
         <w:t xml:space="preserve">. </w:t>
       </w:r>
       <w:r>
         <w:rPr>
-          <w:sz w:val="22"/>
-          <w:szCs w:val="22"/>
+          <w:sz w:val="24"/>
+          <w:szCs w:val="24"/>
         </w:rPr>
         <w:t>The institution</w:t>
       </w:r>
       <w:r>
         <w:rPr>
-          <w:sz w:val="22"/>
-          <w:szCs w:val="22"/>
+          <w:sz w:val="24"/>
+          <w:szCs w:val="24"/>
         </w:rPr>
         <w:t xml:space="preserve"> defines a year as 9 academic and 3 summer months, September – August.</w:t>
       </w:r>
@@ -330,23 +373,23 @@
         <w:spacing w:before="160"/>
         <w:ind w:left="180" w:right="1584" w:firstLine="360"/>
         <w:rPr>
-          <w:sz w:val="22"/>
-          <w:szCs w:val="22"/>
+          <w:sz w:val="24"/>
+          <w:szCs w:val="24"/>
         </w:rPr>
       </w:pPr>
       <w:bookmarkStart w:id="4" w:name="Photometric_Performance"/>
       <w:bookmarkEnd w:id="4"/>
       <w:r>
         <w:rPr>
-          <w:sz w:val="22"/>
-          <w:szCs w:val="22"/>
+          <w:sz w:val="24"/>
+          <w:szCs w:val="24"/>
         </w:rPr>
         <w:t>Senior Personnel:</w:t>
       </w:r>
       <w:r>
         <w:rPr>
-          <w:sz w:val="22"/>
-          <w:szCs w:val="22"/>
+          <w:sz w:val="24"/>
+          <w:szCs w:val="24"/>
         </w:rPr>
         <w:t xml:space="preserve"> </w:t>
       </w:r>
@@ -364,37 +407,37 @@
         <w:spacing w:before="160" w:line="360" w:lineRule="auto"/>
         <w:ind w:left="180" w:right="1584" w:firstLine="360"/>
         <w:rPr>
-          <w:sz w:val="22"/>
-          <w:szCs w:val="22"/>
-        </w:rPr>
-      </w:pPr>
-      <w:r>
-        <w:rPr>
-          <w:sz w:val="22"/>
-          <w:szCs w:val="22"/>
+          <w:sz w:val="24"/>
+          <w:szCs w:val="24"/>
+        </w:rPr>
+      </w:pPr>
+      <w:r>
+        <w:rPr>
+          <w:sz w:val="24"/>
+          <w:szCs w:val="24"/>
         </w:rPr>
         <w:t>PI</w:t>
       </w:r>
       <w:r>
         <w:rPr>
-          <w:sz w:val="22"/>
-          <w:szCs w:val="22"/>
+          <w:sz w:val="24"/>
+          <w:szCs w:val="24"/>
         </w:rPr>
         <w:t xml:space="preserve"> </w:t>
       </w:r>
       <w:r>
         <w:rPr>
           <w:spacing w:val="-5"/>
-          <w:sz w:val="22"/>
-          <w:szCs w:val="22"/>
+          <w:sz w:val="24"/>
+          <w:szCs w:val="24"/>
         </w:rPr>
         <w:t xml:space="preserve">Dr. </w:t>
       </w:r>
       <w:proofErr w:type="spellStart"/>
       <w:r>
         <w:rPr>
-          <w:sz w:val="22"/>
-          <w:szCs w:val="22"/>
+          <w:sz w:val="24"/>
+          <w:szCs w:val="24"/>
         </w:rPr>
         <w:t>Kaloyan</w:t>
       </w:r>
@@ -402,8 +445,8 @@
       <w:r>
         <w:rPr>
           <w:spacing w:val="-14"/>
-          <w:sz w:val="22"/>
-          <w:szCs w:val="22"/>
+          <w:sz w:val="24"/>
+          <w:szCs w:val="24"/>
         </w:rPr>
         <w:t xml:space="preserve"> </w:t>
       </w:r>
@@ -411,8 +454,8 @@
       <w:r>
         <w:rPr>
           <w:spacing w:val="-3"/>
-          <w:sz w:val="22"/>
-          <w:szCs w:val="22"/>
+          <w:sz w:val="24"/>
+          <w:szCs w:val="24"/>
         </w:rPr>
         <w:t>Penev</w:t>
       </w:r>
@@ -435,74 +478,74 @@
         <w:ind w:left="180" w:right="1580" w:firstLine="360"/>
         <w:rPr>
           <w:color w:val="000000" w:themeColor="text1"/>
-          <w:sz w:val="22"/>
-          <w:szCs w:val="22"/>
-        </w:rPr>
-      </w:pPr>
-      <w:r>
-        <w:rPr>
-          <w:sz w:val="22"/>
-          <w:szCs w:val="22"/>
+          <w:sz w:val="24"/>
+          <w:szCs w:val="24"/>
+        </w:rPr>
+      </w:pPr>
+      <w:r>
+        <w:rPr>
+          <w:sz w:val="24"/>
+          <w:szCs w:val="24"/>
         </w:rPr>
         <w:t xml:space="preserve">The budget provides a total of </w:t>
       </w:r>
       <w:r>
         <w:rPr>
-          <w:sz w:val="22"/>
-          <w:szCs w:val="22"/>
-        </w:rPr>
-        <w:t>3</w:t>
-      </w:r>
-      <w:r>
-        <w:rPr>
-          <w:sz w:val="22"/>
-          <w:szCs w:val="22"/>
+          <w:sz w:val="24"/>
+          <w:szCs w:val="24"/>
+        </w:rPr>
+        <w:t>2</w:t>
+      </w:r>
+      <w:r>
+        <w:rPr>
+          <w:sz w:val="24"/>
+          <w:szCs w:val="24"/>
         </w:rPr>
         <w:t xml:space="preserve"> months of summer salary support </w:t>
       </w:r>
       <w:r>
         <w:rPr>
           <w:spacing w:val="-3"/>
-          <w:sz w:val="22"/>
-          <w:szCs w:val="22"/>
+          <w:sz w:val="24"/>
+          <w:szCs w:val="24"/>
         </w:rPr>
         <w:t xml:space="preserve">for </w:t>
       </w:r>
       <w:r>
         <w:rPr>
           <w:spacing w:val="-3"/>
-          <w:sz w:val="22"/>
-          <w:szCs w:val="22"/>
+          <w:sz w:val="24"/>
+          <w:szCs w:val="24"/>
         </w:rPr>
         <w:t xml:space="preserve">the </w:t>
       </w:r>
       <w:r>
         <w:rPr>
-          <w:sz w:val="22"/>
-          <w:szCs w:val="22"/>
+          <w:sz w:val="24"/>
+          <w:szCs w:val="24"/>
         </w:rPr>
         <w:t xml:space="preserve">PI </w:t>
       </w:r>
       <w:r>
         <w:rPr>
           <w:spacing w:val="-3"/>
-          <w:sz w:val="22"/>
-          <w:szCs w:val="22"/>
+          <w:sz w:val="24"/>
+          <w:szCs w:val="24"/>
         </w:rPr>
         <w:t xml:space="preserve">over </w:t>
       </w:r>
       <w:r>
         <w:rPr>
-          <w:sz w:val="22"/>
-          <w:szCs w:val="22"/>
+          <w:sz w:val="24"/>
+          <w:szCs w:val="24"/>
         </w:rPr>
         <w:t>the term of the proposal</w:t>
       </w:r>
       <w:r>
         <w:rPr>
           <w:color w:val="000000" w:themeColor="text1"/>
-          <w:sz w:val="22"/>
-          <w:szCs w:val="22"/>
+          <w:sz w:val="24"/>
+          <w:szCs w:val="24"/>
         </w:rPr>
         <w:t>, 1 month for each of the three summers.</w:t>
       </w:r>
@@ -514,175 +557,175 @@
         <w:ind w:left="180" w:right="1580" w:firstLine="360"/>
         <w:rPr>
           <w:spacing w:val="-3"/>
-          <w:sz w:val="22"/>
-          <w:szCs w:val="22"/>
+          <w:sz w:val="24"/>
+          <w:szCs w:val="24"/>
         </w:rPr>
       </w:pPr>
       <w:r>
         <w:rPr>
           <w:spacing w:val="-4"/>
-          <w:sz w:val="22"/>
-          <w:szCs w:val="22"/>
+          <w:sz w:val="24"/>
+          <w:szCs w:val="24"/>
         </w:rPr>
         <w:t>The PI’s</w:t>
       </w:r>
       <w:r>
         <w:rPr>
           <w:spacing w:val="8"/>
-          <w:sz w:val="22"/>
-          <w:szCs w:val="22"/>
+          <w:sz w:val="24"/>
+          <w:szCs w:val="24"/>
         </w:rPr>
         <w:t xml:space="preserve"> </w:t>
       </w:r>
       <w:r>
         <w:rPr>
-          <w:sz w:val="22"/>
-          <w:szCs w:val="22"/>
+          <w:sz w:val="24"/>
+          <w:szCs w:val="24"/>
         </w:rPr>
         <w:t>academic</w:t>
       </w:r>
       <w:r>
         <w:rPr>
           <w:spacing w:val="7"/>
-          <w:sz w:val="22"/>
-          <w:szCs w:val="22"/>
+          <w:sz w:val="24"/>
+          <w:szCs w:val="24"/>
         </w:rPr>
         <w:t xml:space="preserve"> </w:t>
       </w:r>
       <w:r>
         <w:rPr>
-          <w:sz w:val="22"/>
-          <w:szCs w:val="22"/>
+          <w:sz w:val="24"/>
+          <w:szCs w:val="24"/>
         </w:rPr>
         <w:t>year</w:t>
       </w:r>
       <w:r>
         <w:rPr>
           <w:spacing w:val="7"/>
-          <w:sz w:val="22"/>
-          <w:szCs w:val="22"/>
+          <w:sz w:val="24"/>
+          <w:szCs w:val="24"/>
         </w:rPr>
         <w:t xml:space="preserve"> </w:t>
       </w:r>
       <w:r>
         <w:rPr>
-          <w:sz w:val="22"/>
-          <w:szCs w:val="22"/>
+          <w:sz w:val="24"/>
+          <w:szCs w:val="24"/>
         </w:rPr>
         <w:t>salary</w:t>
       </w:r>
       <w:r>
         <w:rPr>
           <w:spacing w:val="7"/>
-          <w:sz w:val="22"/>
-          <w:szCs w:val="22"/>
+          <w:sz w:val="24"/>
+          <w:szCs w:val="24"/>
         </w:rPr>
         <w:t xml:space="preserve"> </w:t>
       </w:r>
       <w:r>
         <w:rPr>
           <w:spacing w:val="7"/>
-          <w:sz w:val="22"/>
-          <w:szCs w:val="22"/>
+          <w:sz w:val="24"/>
+          <w:szCs w:val="24"/>
         </w:rPr>
         <w:t xml:space="preserve">(9 months) </w:t>
       </w:r>
       <w:r>
         <w:rPr>
-          <w:sz w:val="22"/>
-          <w:szCs w:val="22"/>
+          <w:sz w:val="24"/>
+          <w:szCs w:val="24"/>
         </w:rPr>
         <w:t>is</w:t>
       </w:r>
       <w:r>
         <w:rPr>
           <w:spacing w:val="8"/>
-          <w:sz w:val="22"/>
-          <w:szCs w:val="22"/>
+          <w:sz w:val="24"/>
+          <w:szCs w:val="24"/>
         </w:rPr>
         <w:t xml:space="preserve"> </w:t>
       </w:r>
       <w:r>
         <w:rPr>
-          <w:sz w:val="22"/>
-          <w:szCs w:val="22"/>
+          <w:sz w:val="24"/>
+          <w:szCs w:val="24"/>
         </w:rPr>
         <w:t>fully</w:t>
       </w:r>
       <w:r>
         <w:rPr>
           <w:spacing w:val="7"/>
-          <w:sz w:val="22"/>
-          <w:szCs w:val="22"/>
+          <w:sz w:val="24"/>
+          <w:szCs w:val="24"/>
         </w:rPr>
         <w:t xml:space="preserve"> </w:t>
       </w:r>
       <w:r>
         <w:rPr>
-          <w:sz w:val="22"/>
-          <w:szCs w:val="22"/>
+          <w:sz w:val="24"/>
+          <w:szCs w:val="24"/>
         </w:rPr>
         <w:t>supported</w:t>
       </w:r>
       <w:r>
         <w:rPr>
           <w:spacing w:val="7"/>
-          <w:sz w:val="22"/>
-          <w:szCs w:val="22"/>
+          <w:sz w:val="24"/>
+          <w:szCs w:val="24"/>
         </w:rPr>
         <w:t xml:space="preserve"> </w:t>
       </w:r>
       <w:r>
         <w:rPr>
           <w:spacing w:val="-3"/>
-          <w:sz w:val="22"/>
-          <w:szCs w:val="22"/>
+          <w:sz w:val="24"/>
+          <w:szCs w:val="24"/>
         </w:rPr>
         <w:t>by</w:t>
       </w:r>
       <w:r>
         <w:rPr>
           <w:spacing w:val="7"/>
-          <w:sz w:val="22"/>
-          <w:szCs w:val="22"/>
+          <w:sz w:val="24"/>
+          <w:szCs w:val="24"/>
         </w:rPr>
         <w:t xml:space="preserve"> </w:t>
       </w:r>
       <w:r>
         <w:rPr>
-          <w:sz w:val="22"/>
-          <w:szCs w:val="22"/>
+          <w:sz w:val="24"/>
+          <w:szCs w:val="24"/>
         </w:rPr>
         <w:t>his institution</w:t>
       </w:r>
       <w:r>
         <w:rPr>
-          <w:sz w:val="22"/>
-          <w:szCs w:val="22"/>
+          <w:sz w:val="24"/>
+          <w:szCs w:val="24"/>
         </w:rPr>
         <w:t xml:space="preserve"> and an additional summer month of salary is provided for faculty who teach during the </w:t>
       </w:r>
       <w:proofErr w:type="gramStart"/>
       <w:r>
         <w:rPr>
-          <w:sz w:val="22"/>
-          <w:szCs w:val="22"/>
+          <w:sz w:val="24"/>
+          <w:szCs w:val="24"/>
         </w:rPr>
         <w:t>Summer</w:t>
       </w:r>
       <w:proofErr w:type="gramEnd"/>
       <w:r>
         <w:rPr>
-          <w:sz w:val="22"/>
-          <w:szCs w:val="22"/>
+          <w:sz w:val="24"/>
+          <w:szCs w:val="24"/>
         </w:rPr>
         <w:t xml:space="preserve"> term</w:t>
       </w:r>
       <w:r>
         <w:rPr>
           <w:spacing w:val="-3"/>
-          <w:sz w:val="22"/>
-          <w:szCs w:val="22"/>
+          <w:sz w:val="24"/>
+          <w:szCs w:val="24"/>
         </w:rPr>
         <w:t>.</w:t>
       </w:r>
@@ -690,19 +733,19 @@
     <w:p>
       <w:pPr>
         <w:pStyle w:val="BodyText"/>
-        <w:spacing w:line="288" w:lineRule="auto"/>
+        <w:spacing w:after="240" w:line="288" w:lineRule="auto"/>
         <w:ind w:left="180" w:right="1580" w:firstLine="360"/>
         <w:rPr>
           <w:spacing w:val="-3"/>
-          <w:sz w:val="22"/>
-          <w:szCs w:val="22"/>
+          <w:sz w:val="24"/>
+          <w:szCs w:val="24"/>
         </w:rPr>
       </w:pPr>
       <w:r>
         <w:rPr>
           <w:spacing w:val="-3"/>
-          <w:sz w:val="22"/>
-          <w:szCs w:val="22"/>
+          <w:sz w:val="24"/>
+          <w:szCs w:val="24"/>
         </w:rPr>
         <w:t xml:space="preserve">As the PI of the project, Dr. </w:t>
       </w:r>
@@ -710,8 +753,8 @@
       <w:r>
         <w:rPr>
           <w:spacing w:val="-3"/>
-          <w:sz w:val="22"/>
-          <w:szCs w:val="22"/>
+          <w:sz w:val="24"/>
+          <w:szCs w:val="24"/>
         </w:rPr>
         <w:t>Penev</w:t>
       </w:r>
@@ -719,8 +762,8 @@
       <w:r>
         <w:rPr>
           <w:spacing w:val="-3"/>
-          <w:sz w:val="22"/>
-          <w:szCs w:val="22"/>
+          <w:sz w:val="24"/>
+          <w:szCs w:val="24"/>
         </w:rPr>
         <w:t xml:space="preserve"> will:</w:t>
       </w:r>
@@ -732,19 +775,19 @@
           <w:ilvl w:val="0"/>
           <w:numId w:val="11"/>
         </w:numPr>
-        <w:spacing w:line="288" w:lineRule="auto"/>
-        <w:ind w:left="180" w:right="1580" w:firstLine="360"/>
+        <w:spacing w:after="240" w:line="276" w:lineRule="auto"/>
+        <w:ind w:left="900" w:right="1580"/>
         <w:rPr>
           <w:spacing w:val="-3"/>
-          <w:sz w:val="22"/>
-          <w:szCs w:val="22"/>
+          <w:sz w:val="24"/>
+          <w:szCs w:val="24"/>
         </w:rPr>
       </w:pPr>
       <w:r>
         <w:rPr>
           <w:spacing w:val="-3"/>
-          <w:sz w:val="22"/>
-          <w:szCs w:val="22"/>
+          <w:sz w:val="24"/>
+          <w:szCs w:val="24"/>
         </w:rPr>
         <w:t>Provide the general scientific direction of the project.</w:t>
       </w:r>
@@ -756,21 +799,29 @@
           <w:ilvl w:val="0"/>
           <w:numId w:val="11"/>
         </w:numPr>
-        <w:spacing w:line="288" w:lineRule="auto"/>
-        <w:ind w:left="180" w:right="1580" w:firstLine="360"/>
+        <w:spacing w:after="240" w:line="276" w:lineRule="auto"/>
+        <w:ind w:left="900" w:right="1580"/>
         <w:rPr>
           <w:spacing w:val="-3"/>
-          <w:sz w:val="22"/>
-          <w:szCs w:val="22"/>
+          <w:sz w:val="24"/>
+          <w:szCs w:val="24"/>
         </w:rPr>
       </w:pPr>
       <w:r>
         <w:rPr>
           <w:spacing w:val="-3"/>
-          <w:sz w:val="22"/>
-          <w:szCs w:val="22"/>
+          <w:sz w:val="24"/>
+          <w:szCs w:val="24"/>
         </w:rPr>
         <w:t>Help with collecting and preparing the data required for all analyses listed in the project description</w:t>
+      </w:r>
+      <w:r>
+        <w:rPr>
+          <w:spacing w:val="-3"/>
+          <w:sz w:val="24"/>
+          <w:szCs w:val="24"/>
+        </w:rPr>
+        <w:t>.</w:t>
       </w:r>
     </w:p>
     <w:p>
@@ -780,19 +831,19 @@
           <w:ilvl w:val="0"/>
           <w:numId w:val="11"/>
         </w:numPr>
-        <w:spacing w:line="288" w:lineRule="auto"/>
-        <w:ind w:left="180" w:right="1580" w:firstLine="360"/>
+        <w:spacing w:after="240" w:line="276" w:lineRule="auto"/>
+        <w:ind w:left="900" w:right="1580"/>
         <w:rPr>
           <w:spacing w:val="-3"/>
-          <w:sz w:val="22"/>
-          <w:szCs w:val="22"/>
+          <w:sz w:val="24"/>
+          <w:szCs w:val="24"/>
         </w:rPr>
       </w:pPr>
       <w:r>
         <w:rPr>
           <w:spacing w:val="-3"/>
-          <w:sz w:val="22"/>
-          <w:szCs w:val="22"/>
+          <w:sz w:val="24"/>
+          <w:szCs w:val="24"/>
         </w:rPr>
         <w:t>Oversee the software development effort: coordination, and integration of team member contributions.</w:t>
       </w:r>
@@ -804,19 +855,19 @@
           <w:ilvl w:val="0"/>
           <w:numId w:val="11"/>
         </w:numPr>
-        <w:spacing w:line="288" w:lineRule="auto"/>
-        <w:ind w:left="180" w:right="1580" w:firstLine="360"/>
+        <w:spacing w:after="240" w:line="276" w:lineRule="auto"/>
+        <w:ind w:left="900" w:right="1580"/>
         <w:rPr>
           <w:spacing w:val="-3"/>
-          <w:sz w:val="22"/>
-          <w:szCs w:val="22"/>
+          <w:sz w:val="24"/>
+          <w:szCs w:val="24"/>
         </w:rPr>
       </w:pPr>
       <w:r>
         <w:rPr>
           <w:spacing w:val="-3"/>
-          <w:sz w:val="22"/>
-          <w:szCs w:val="22"/>
+          <w:sz w:val="24"/>
+          <w:szCs w:val="24"/>
         </w:rPr>
         <w:t>Be an active developer in the software effort.</w:t>
       </w:r>
@@ -828,21 +879,21 @@
           <w:ilvl w:val="0"/>
           <w:numId w:val="11"/>
         </w:numPr>
-        <w:spacing w:line="288" w:lineRule="auto"/>
-        <w:ind w:left="180" w:right="1580" w:firstLine="360"/>
+        <w:spacing w:after="240" w:line="276" w:lineRule="auto"/>
+        <w:ind w:left="900" w:right="1580"/>
         <w:rPr>
           <w:spacing w:val="-3"/>
-          <w:sz w:val="22"/>
-          <w:szCs w:val="22"/>
+          <w:sz w:val="24"/>
+          <w:szCs w:val="24"/>
         </w:rPr>
       </w:pPr>
       <w:r>
         <w:rPr>
           <w:spacing w:val="-3"/>
-          <w:sz w:val="22"/>
-          <w:szCs w:val="22"/>
-        </w:rPr>
-        <w:t>Request and oversee computing and storage allocation at resources available through the PI’s institution</w:t>
+          <w:sz w:val="24"/>
+          <w:szCs w:val="24"/>
+        </w:rPr>
+        <w:t>Participate in the manual vetting and review as described in the Science/Technical/Management section.</w:t>
       </w:r>
     </w:p>
     <w:p>
@@ -852,21 +903,29 @@
           <w:ilvl w:val="0"/>
           <w:numId w:val="11"/>
         </w:numPr>
-        <w:spacing w:line="288" w:lineRule="auto"/>
-        <w:ind w:left="180" w:right="1580" w:firstLine="360"/>
+        <w:spacing w:after="240" w:line="276" w:lineRule="auto"/>
+        <w:ind w:left="900" w:right="1580"/>
         <w:rPr>
           <w:spacing w:val="-3"/>
-          <w:sz w:val="22"/>
-          <w:szCs w:val="22"/>
+          <w:sz w:val="24"/>
+          <w:szCs w:val="24"/>
         </w:rPr>
       </w:pPr>
       <w:r>
         <w:rPr>
           <w:spacing w:val="-3"/>
-          <w:sz w:val="22"/>
-          <w:szCs w:val="22"/>
-        </w:rPr>
-        <w:t>Help with the preparation of publications</w:t>
+          <w:sz w:val="24"/>
+          <w:szCs w:val="24"/>
+        </w:rPr>
+        <w:t>Request and oversee computing and storage allocation at resources available through the PI’s institution</w:t>
+      </w:r>
+      <w:r>
+        <w:rPr>
+          <w:spacing w:val="-3"/>
+          <w:sz w:val="24"/>
+          <w:szCs w:val="24"/>
+        </w:rPr>
+        <w:t>.</w:t>
       </w:r>
     </w:p>
     <w:p>
@@ -876,380 +935,62 @@
           <w:ilvl w:val="0"/>
           <w:numId w:val="11"/>
         </w:numPr>
-        <w:spacing w:line="288" w:lineRule="auto"/>
-        <w:ind w:left="180" w:right="1580" w:firstLine="360"/>
+        <w:spacing w:after="240" w:line="276" w:lineRule="auto"/>
+        <w:ind w:left="900" w:right="1580"/>
         <w:rPr>
           <w:spacing w:val="-3"/>
-          <w:sz w:val="22"/>
-          <w:szCs w:val="22"/>
+          <w:sz w:val="24"/>
+          <w:szCs w:val="24"/>
         </w:rPr>
       </w:pPr>
       <w:r>
         <w:rPr>
           <w:spacing w:val="-3"/>
-          <w:sz w:val="22"/>
-          <w:szCs w:val="22"/>
-        </w:rPr>
-        <w:t xml:space="preserve">Help recruit RET participants and lead the RET </w:t>
+          <w:sz w:val="24"/>
+          <w:szCs w:val="24"/>
+        </w:rPr>
+        <w:t>Lead two of the publications and h</w:t>
       </w:r>
       <w:r>
         <w:rPr>
           <w:spacing w:val="-3"/>
-          <w:sz w:val="22"/>
-          <w:szCs w:val="22"/>
-        </w:rPr>
-        <w:t xml:space="preserve">research </w:t>
+          <w:sz w:val="24"/>
+          <w:szCs w:val="24"/>
+        </w:rPr>
+        <w:t xml:space="preserve">elp with the preparation of </w:t>
       </w:r>
       <w:r>
         <w:rPr>
           <w:spacing w:val="-3"/>
-          <w:sz w:val="22"/>
-          <w:szCs w:val="22"/>
-        </w:rPr>
-        <w:t>projects</w:t>
+          <w:sz w:val="24"/>
+          <w:szCs w:val="24"/>
+        </w:rPr>
+        <w:t>the others.</w:t>
       </w:r>
     </w:p>
     <w:p>
       <w:pPr>
-        <w:pStyle w:val="Heading1"/>
-        <w:numPr>
-          <w:ilvl w:val="2"/>
-          <w:numId w:val="7"/>
-        </w:numPr>
-        <w:tabs>
-          <w:tab w:val="left" w:pos="931"/>
-        </w:tabs>
-        <w:spacing w:before="160" w:line="360" w:lineRule="auto"/>
-        <w:ind w:left="180" w:right="1584" w:firstLine="360"/>
-        <w:rPr>
-          <w:sz w:val="22"/>
-          <w:szCs w:val="22"/>
-        </w:rPr>
-      </w:pPr>
-      <w:r>
-        <w:rPr>
-          <w:sz w:val="22"/>
-          <w:szCs w:val="22"/>
-        </w:rPr>
-        <w:t>Co-PI Dr. Mary Urquhart</w:t>
-      </w:r>
+        <w:pStyle w:val="BodyText"/>
+        <w:spacing w:after="240" w:line="276" w:lineRule="auto"/>
+        <w:ind w:left="900" w:right="1580"/>
+        <w:rPr>
+          <w:spacing w:val="-3"/>
+          <w:sz w:val="24"/>
+          <w:szCs w:val="24"/>
+        </w:rPr>
+      </w:pPr>
     </w:p>
     <w:p>
       <w:pPr>
         <w:pStyle w:val="BodyText"/>
-        <w:spacing w:before="0" w:line="288" w:lineRule="auto"/>
-        <w:ind w:left="180" w:right="1580" w:firstLine="360"/>
-        <w:rPr>
-          <w:sz w:val="22"/>
-          <w:szCs w:val="22"/>
-        </w:rPr>
-      </w:pPr>
-      <w:r>
-        <w:rPr>
-          <w:sz w:val="22"/>
-          <w:szCs w:val="22"/>
-        </w:rPr>
-        <w:t xml:space="preserve">The budget provides a total of 1 month of summer salary support for </w:t>
-      </w:r>
-      <w:r>
-        <w:rPr>
-          <w:sz w:val="22"/>
-          <w:szCs w:val="22"/>
-        </w:rPr>
-        <w:t xml:space="preserve">Co-PI </w:t>
-      </w:r>
-      <w:r>
-        <w:rPr>
-          <w:sz w:val="22"/>
-          <w:szCs w:val="22"/>
-        </w:rPr>
-        <w:t xml:space="preserve">Dr. Urquhart over the term of the proposal, 0.5 months during the summers of proposal years 2 and 3. </w:t>
-      </w:r>
-    </w:p>
-    <w:p>
-      <w:pPr>
-        <w:pStyle w:val="BodyText"/>
-        <w:spacing w:before="0" w:line="288" w:lineRule="auto"/>
-        <w:ind w:left="180" w:right="1580" w:firstLine="360"/>
+        <w:spacing w:after="240" w:line="276" w:lineRule="auto"/>
+        <w:ind w:left="900" w:right="1580"/>
         <w:rPr>
           <w:spacing w:val="-3"/>
-          <w:sz w:val="22"/>
-          <w:szCs w:val="22"/>
-        </w:rPr>
-      </w:pPr>
-      <w:r>
-        <w:rPr>
-          <w:sz w:val="22"/>
-          <w:szCs w:val="22"/>
-        </w:rPr>
-        <w:t>The Co-PI’s academic year</w:t>
-      </w:r>
-      <w:r>
-        <w:rPr>
-          <w:spacing w:val="7"/>
-          <w:sz w:val="22"/>
-          <w:szCs w:val="22"/>
-        </w:rPr>
-        <w:t xml:space="preserve"> </w:t>
-      </w:r>
-      <w:r>
-        <w:rPr>
-          <w:sz w:val="22"/>
-          <w:szCs w:val="22"/>
-        </w:rPr>
-        <w:t>salary</w:t>
-      </w:r>
-      <w:r>
-        <w:rPr>
-          <w:spacing w:val="7"/>
-          <w:sz w:val="22"/>
-          <w:szCs w:val="22"/>
-        </w:rPr>
-        <w:t xml:space="preserve"> (9 months) </w:t>
-      </w:r>
-      <w:r>
-        <w:rPr>
-          <w:sz w:val="22"/>
-          <w:szCs w:val="22"/>
-        </w:rPr>
-        <w:t>is</w:t>
-      </w:r>
-      <w:r>
-        <w:rPr>
-          <w:spacing w:val="8"/>
-          <w:sz w:val="22"/>
-          <w:szCs w:val="22"/>
-        </w:rPr>
-        <w:t xml:space="preserve"> </w:t>
-      </w:r>
-      <w:r>
-        <w:rPr>
-          <w:sz w:val="22"/>
-          <w:szCs w:val="22"/>
-        </w:rPr>
-        <w:t>fully</w:t>
-      </w:r>
-      <w:r>
-        <w:rPr>
-          <w:spacing w:val="7"/>
-          <w:sz w:val="22"/>
-          <w:szCs w:val="22"/>
-        </w:rPr>
-        <w:t xml:space="preserve"> </w:t>
-      </w:r>
-      <w:r>
-        <w:rPr>
-          <w:sz w:val="22"/>
-          <w:szCs w:val="22"/>
-        </w:rPr>
-        <w:t>supported</w:t>
-      </w:r>
-      <w:r>
-        <w:rPr>
-          <w:spacing w:val="7"/>
-          <w:sz w:val="22"/>
-          <w:szCs w:val="22"/>
-        </w:rPr>
-        <w:t xml:space="preserve"> </w:t>
-      </w:r>
-      <w:r>
-        <w:rPr>
-          <w:spacing w:val="-3"/>
-          <w:sz w:val="22"/>
-          <w:szCs w:val="22"/>
-        </w:rPr>
-        <w:t>by</w:t>
-      </w:r>
-      <w:r>
-        <w:rPr>
-          <w:spacing w:val="7"/>
-          <w:sz w:val="22"/>
-          <w:szCs w:val="22"/>
-        </w:rPr>
-        <w:t xml:space="preserve"> </w:t>
-      </w:r>
-      <w:r>
-        <w:rPr>
-          <w:sz w:val="22"/>
-          <w:szCs w:val="22"/>
-        </w:rPr>
-        <w:t xml:space="preserve">his institution and an additional summer month of salary is provided for faculty who teach during the </w:t>
-      </w:r>
-      <w:proofErr w:type="gramStart"/>
-      <w:r>
-        <w:rPr>
-          <w:sz w:val="22"/>
-          <w:szCs w:val="22"/>
-        </w:rPr>
-        <w:t>Summer</w:t>
-      </w:r>
-      <w:proofErr w:type="gramEnd"/>
-      <w:r>
-        <w:rPr>
-          <w:sz w:val="22"/>
-          <w:szCs w:val="22"/>
-        </w:rPr>
-        <w:t xml:space="preserve"> term</w:t>
-      </w:r>
-      <w:r>
-        <w:rPr>
-          <w:spacing w:val="-3"/>
-          <w:sz w:val="22"/>
-          <w:szCs w:val="22"/>
-        </w:rPr>
-        <w:t>.</w:t>
-      </w:r>
-    </w:p>
-    <w:p>
-      <w:pPr>
-        <w:pStyle w:val="BodyText"/>
-        <w:spacing w:before="0" w:line="288" w:lineRule="auto"/>
-        <w:ind w:left="180" w:right="1580" w:firstLine="360"/>
-        <w:rPr>
-          <w:spacing w:val="-3"/>
-          <w:sz w:val="22"/>
-          <w:szCs w:val="22"/>
-        </w:rPr>
-      </w:pPr>
-      <w:r>
-        <w:rPr>
-          <w:spacing w:val="-3"/>
-          <w:sz w:val="22"/>
-          <w:szCs w:val="22"/>
-        </w:rPr>
-        <w:t xml:space="preserve">Dr. Urquhart will contribute to the research experience for </w:t>
-      </w:r>
-      <w:proofErr w:type="gramStart"/>
-      <w:r>
-        <w:rPr>
-          <w:spacing w:val="-3"/>
-          <w:sz w:val="22"/>
-          <w:szCs w:val="22"/>
-        </w:rPr>
-        <w:t>teachers</w:t>
-      </w:r>
-      <w:proofErr w:type="gramEnd"/>
-      <w:r>
-        <w:rPr>
-          <w:spacing w:val="-3"/>
-          <w:sz w:val="22"/>
-          <w:szCs w:val="22"/>
-        </w:rPr>
-        <w:t xml:space="preserve"> component of the project</w:t>
-      </w:r>
-      <w:r>
-        <w:rPr>
-          <w:spacing w:val="-3"/>
-          <w:sz w:val="22"/>
-          <w:szCs w:val="22"/>
-        </w:rPr>
-        <w:t xml:space="preserve"> (see project description for details)</w:t>
-      </w:r>
-      <w:r>
-        <w:rPr>
-          <w:spacing w:val="-3"/>
-          <w:sz w:val="22"/>
-          <w:szCs w:val="22"/>
-        </w:rPr>
-        <w:t xml:space="preserve"> by:</w:t>
-      </w:r>
-    </w:p>
-    <w:p>
-      <w:pPr>
-        <w:pStyle w:val="BodyText"/>
-        <w:numPr>
-          <w:ilvl w:val="0"/>
-          <w:numId w:val="15"/>
-        </w:numPr>
-        <w:spacing w:line="288" w:lineRule="auto"/>
-        <w:ind w:left="180" w:right="1580" w:firstLine="360"/>
-        <w:rPr>
-          <w:spacing w:val="-3"/>
-          <w:sz w:val="22"/>
-          <w:szCs w:val="22"/>
-        </w:rPr>
-      </w:pPr>
-      <w:r>
-        <w:rPr>
-          <w:spacing w:val="-3"/>
-          <w:sz w:val="22"/>
-          <w:szCs w:val="22"/>
-        </w:rPr>
-        <w:t>Helping to recruit RET participants</w:t>
-      </w:r>
-    </w:p>
-    <w:p>
-      <w:pPr>
-        <w:pStyle w:val="BodyText"/>
-        <w:numPr>
-          <w:ilvl w:val="0"/>
-          <w:numId w:val="15"/>
-        </w:numPr>
-        <w:spacing w:line="288" w:lineRule="auto"/>
-        <w:ind w:left="180" w:right="1580" w:firstLine="360"/>
-        <w:rPr>
-          <w:spacing w:val="-3"/>
-          <w:sz w:val="22"/>
-          <w:szCs w:val="22"/>
-        </w:rPr>
-      </w:pPr>
-      <w:r>
-        <w:rPr>
-          <w:spacing w:val="-3"/>
-          <w:sz w:val="22"/>
-          <w:szCs w:val="22"/>
-        </w:rPr>
-        <w:t>Leading the creation of lessons plans</w:t>
-      </w:r>
-    </w:p>
-    <w:p>
-      <w:pPr>
-        <w:pStyle w:val="BodyText"/>
-        <w:numPr>
-          <w:ilvl w:val="0"/>
-          <w:numId w:val="15"/>
-        </w:numPr>
-        <w:spacing w:line="288" w:lineRule="auto"/>
-        <w:ind w:left="180" w:right="1580" w:firstLine="360"/>
-        <w:rPr>
-          <w:spacing w:val="-3"/>
-          <w:sz w:val="22"/>
-          <w:szCs w:val="22"/>
-        </w:rPr>
-      </w:pPr>
-      <w:r>
-        <w:rPr>
-          <w:spacing w:val="-3"/>
-          <w:sz w:val="22"/>
-          <w:szCs w:val="22"/>
-        </w:rPr>
-        <w:t>Lead the design and delivery of conference workshops with RET participants</w:t>
-      </w:r>
-    </w:p>
-    <w:p>
-      <w:pPr>
-        <w:pStyle w:val="BodyText"/>
-        <w:numPr>
-          <w:ilvl w:val="0"/>
-          <w:numId w:val="15"/>
-        </w:numPr>
-        <w:spacing w:line="288" w:lineRule="auto"/>
-        <w:ind w:left="180" w:right="1580" w:firstLine="360"/>
-        <w:rPr>
-          <w:spacing w:val="-3"/>
-          <w:sz w:val="22"/>
-          <w:szCs w:val="22"/>
-        </w:rPr>
-      </w:pPr>
-      <w:r>
-        <w:rPr>
-          <w:spacing w:val="-3"/>
-          <w:sz w:val="22"/>
-          <w:szCs w:val="22"/>
-        </w:rPr>
-        <w:lastRenderedPageBreak/>
-        <w:t>Advise PI and students on community engagement and creation of explanatory videos</w:t>
-      </w:r>
+          <w:sz w:val="24"/>
+          <w:szCs w:val="24"/>
+        </w:rPr>
+      </w:pPr>
     </w:p>
     <w:p>
       <w:pPr>
@@ -1264,38 +1005,39 @@
         <w:spacing w:before="160" w:line="239" w:lineRule="exact"/>
         <w:ind w:left="180" w:right="1584" w:firstLine="360"/>
         <w:rPr>
-          <w:sz w:val="22"/>
-          <w:szCs w:val="22"/>
-        </w:rPr>
-      </w:pPr>
-      <w:r>
-        <w:rPr>
-          <w:sz w:val="22"/>
-          <w:szCs w:val="22"/>
-        </w:rPr>
+          <w:sz w:val="24"/>
+          <w:szCs w:val="24"/>
+        </w:rPr>
+      </w:pPr>
+      <w:r>
+        <w:rPr>
+          <w:sz w:val="24"/>
+          <w:szCs w:val="24"/>
+        </w:rPr>
+        <w:lastRenderedPageBreak/>
         <w:t>Graduate</w:t>
       </w:r>
       <w:r>
         <w:rPr>
           <w:spacing w:val="1"/>
-          <w:sz w:val="22"/>
-          <w:szCs w:val="22"/>
+          <w:sz w:val="24"/>
+          <w:szCs w:val="24"/>
         </w:rPr>
         <w:t xml:space="preserve"> </w:t>
       </w:r>
       <w:r>
         <w:rPr>
-          <w:sz w:val="22"/>
-          <w:szCs w:val="22"/>
-        </w:rPr>
-        <w:t>Students</w:t>
-      </w:r>
-      <w:r>
-        <w:rPr>
-          <w:sz w:val="22"/>
-          <w:szCs w:val="22"/>
-        </w:rPr>
-        <w:t>: Joshua Schussler and Mohammad Mahmud</w:t>
+          <w:sz w:val="24"/>
+          <w:szCs w:val="24"/>
+        </w:rPr>
+        <w:t>Student</w:t>
+      </w:r>
+      <w:r>
+        <w:rPr>
+          <w:sz w:val="24"/>
+          <w:szCs w:val="24"/>
+        </w:rPr>
+        <w:t xml:space="preserve"> Joshua Schussler</w:t>
       </w:r>
     </w:p>
     <w:p>
@@ -1304,181 +1046,199 @@
         <w:spacing w:before="42" w:line="288" w:lineRule="auto"/>
         <w:ind w:left="180" w:right="1580" w:firstLine="360"/>
         <w:rPr>
-          <w:sz w:val="22"/>
-          <w:szCs w:val="22"/>
+          <w:sz w:val="24"/>
+          <w:szCs w:val="24"/>
         </w:rPr>
       </w:pPr>
       <w:r>
         <w:rPr>
           <w:spacing w:val="-4"/>
-          <w:sz w:val="22"/>
-          <w:szCs w:val="22"/>
-        </w:rPr>
-        <w:t xml:space="preserve">The two </w:t>
+          <w:sz w:val="24"/>
+          <w:szCs w:val="24"/>
+        </w:rPr>
+        <w:t xml:space="preserve">The </w:t>
       </w:r>
       <w:r>
         <w:rPr>
           <w:spacing w:val="-4"/>
-          <w:sz w:val="22"/>
-          <w:szCs w:val="22"/>
+          <w:sz w:val="24"/>
+          <w:szCs w:val="24"/>
         </w:rPr>
         <w:t xml:space="preserve">Ph.D. </w:t>
       </w:r>
       <w:r>
         <w:rPr>
-          <w:sz w:val="22"/>
-          <w:szCs w:val="22"/>
-        </w:rPr>
-        <w:t>student</w:t>
-      </w:r>
-      <w:r>
-        <w:rPr>
-          <w:sz w:val="22"/>
-          <w:szCs w:val="22"/>
-        </w:rPr>
-        <w:t>s</w:t>
-      </w:r>
-      <w:r>
-        <w:rPr>
-          <w:sz w:val="22"/>
-          <w:szCs w:val="22"/>
+          <w:sz w:val="24"/>
+          <w:szCs w:val="24"/>
+        </w:rPr>
+        <w:t xml:space="preserve">student </w:t>
+      </w:r>
+      <w:r>
+        <w:rPr>
+          <w:sz w:val="24"/>
+          <w:szCs w:val="24"/>
+        </w:rPr>
+        <w:t>is</w:t>
+      </w:r>
+      <w:r>
+        <w:rPr>
+          <w:sz w:val="24"/>
+          <w:szCs w:val="24"/>
         </w:rPr>
         <w:t xml:space="preserve"> </w:t>
       </w:r>
       <w:r>
         <w:rPr>
-          <w:sz w:val="22"/>
-          <w:szCs w:val="22"/>
-        </w:rPr>
-        <w:t>are</w:t>
-      </w:r>
-      <w:r>
-        <w:rPr>
-          <w:sz w:val="22"/>
-          <w:szCs w:val="22"/>
-        </w:rPr>
-        <w:t xml:space="preserve"> </w:t>
-      </w:r>
-      <w:r>
-        <w:rPr>
-          <w:sz w:val="22"/>
-          <w:szCs w:val="22"/>
-        </w:rPr>
-        <w:t>both</w:t>
-      </w:r>
-      <w:r>
-        <w:rPr>
-          <w:sz w:val="22"/>
-          <w:szCs w:val="22"/>
-        </w:rPr>
-        <w:t xml:space="preserve"> member</w:t>
-      </w:r>
-      <w:r>
-        <w:rPr>
-          <w:sz w:val="22"/>
-          <w:szCs w:val="22"/>
-        </w:rPr>
-        <w:t>s</w:t>
-      </w:r>
-      <w:r>
-        <w:rPr>
-          <w:sz w:val="22"/>
-          <w:szCs w:val="22"/>
-        </w:rPr>
-        <w:t xml:space="preserve"> of </w:t>
-      </w:r>
-      <w:r>
-        <w:rPr>
-          <w:sz w:val="22"/>
-          <w:szCs w:val="22"/>
+          <w:sz w:val="24"/>
+          <w:szCs w:val="24"/>
+        </w:rPr>
+        <w:t>a</w:t>
+      </w:r>
+      <w:r>
+        <w:rPr>
+          <w:sz w:val="24"/>
+          <w:szCs w:val="24"/>
+        </w:rPr>
+        <w:t xml:space="preserve"> member of </w:t>
+      </w:r>
+      <w:r>
+        <w:rPr>
+          <w:sz w:val="24"/>
+          <w:szCs w:val="24"/>
         </w:rPr>
         <w:t xml:space="preserve">the </w:t>
       </w:r>
       <w:r>
         <w:rPr>
-          <w:sz w:val="22"/>
-          <w:szCs w:val="22"/>
+          <w:sz w:val="24"/>
+          <w:szCs w:val="24"/>
         </w:rPr>
         <w:t>P</w:t>
       </w:r>
       <w:r>
         <w:rPr>
-          <w:sz w:val="22"/>
-          <w:szCs w:val="22"/>
+          <w:sz w:val="24"/>
+          <w:szCs w:val="24"/>
         </w:rPr>
         <w:t>I</w:t>
       </w:r>
       <w:r>
         <w:rPr>
           <w:spacing w:val="-5"/>
-          <w:sz w:val="22"/>
-          <w:szCs w:val="22"/>
+          <w:sz w:val="24"/>
+          <w:szCs w:val="24"/>
         </w:rPr>
         <w:t xml:space="preserve">’s </w:t>
       </w:r>
       <w:r>
         <w:rPr>
           <w:spacing w:val="-5"/>
-          <w:sz w:val="22"/>
-          <w:szCs w:val="22"/>
+          <w:sz w:val="24"/>
+          <w:szCs w:val="24"/>
         </w:rPr>
         <w:t xml:space="preserve">research </w:t>
       </w:r>
       <w:r>
         <w:rPr>
-          <w:sz w:val="22"/>
-          <w:szCs w:val="22"/>
+          <w:sz w:val="24"/>
+          <w:szCs w:val="24"/>
         </w:rPr>
         <w:t>group and</w:t>
       </w:r>
       <w:r>
         <w:rPr>
-          <w:sz w:val="22"/>
-          <w:szCs w:val="22"/>
-        </w:rPr>
-        <w:t xml:space="preserve"> contributed software and analysis to the preliminary work presented in this proposal. Both students are very familiar with the orbital evolution code POET. </w:t>
-      </w:r>
-      <w:r>
-        <w:rPr>
-          <w:sz w:val="22"/>
-          <w:szCs w:val="22"/>
-        </w:rPr>
-        <w:t>Both students will be part of the core development team</w:t>
-      </w:r>
-      <w:r>
-        <w:rPr>
-          <w:sz w:val="22"/>
-          <w:szCs w:val="22"/>
-        </w:rPr>
-        <w:t xml:space="preserve"> for this </w:t>
-      </w:r>
-      <w:r>
-        <w:rPr>
-          <w:sz w:val="22"/>
-          <w:szCs w:val="22"/>
-        </w:rPr>
-        <w:t>project and</w:t>
-      </w:r>
-      <w:r>
-        <w:rPr>
-          <w:sz w:val="22"/>
-          <w:szCs w:val="22"/>
-        </w:rPr>
-        <w:t xml:space="preserve"> will be </w:t>
-      </w:r>
-      <w:r>
-        <w:rPr>
-          <w:sz w:val="22"/>
-          <w:szCs w:val="22"/>
+          <w:sz w:val="24"/>
+          <w:szCs w:val="24"/>
+        </w:rPr>
+        <w:t xml:space="preserve"> contributed </w:t>
+      </w:r>
+      <w:proofErr w:type="spellStart"/>
+      <w:r>
+        <w:rPr>
+          <w:sz w:val="24"/>
+          <w:szCs w:val="24"/>
+        </w:rPr>
+        <w:t>significantnly</w:t>
+      </w:r>
+      <w:proofErr w:type="spellEnd"/>
+      <w:r>
+        <w:rPr>
+          <w:sz w:val="24"/>
+          <w:szCs w:val="24"/>
+        </w:rPr>
+        <w:t xml:space="preserve"> in the preparation of this proposal</w:t>
+      </w:r>
+      <w:r>
+        <w:rPr>
+          <w:sz w:val="24"/>
+          <w:szCs w:val="24"/>
+        </w:rPr>
+        <w:t xml:space="preserve">. </w:t>
+      </w:r>
+      <w:proofErr w:type="spellStart"/>
+      <w:r>
+        <w:rPr>
+          <w:sz w:val="24"/>
+          <w:szCs w:val="24"/>
+        </w:rPr>
+        <w:t>Mr</w:t>
+      </w:r>
+      <w:proofErr w:type="spellEnd"/>
+      <w:r>
+        <w:rPr>
+          <w:sz w:val="24"/>
+          <w:szCs w:val="24"/>
+        </w:rPr>
+        <w:t xml:space="preserve"> Schussler </w:t>
+      </w:r>
+      <w:r>
+        <w:rPr>
+          <w:sz w:val="24"/>
+          <w:szCs w:val="24"/>
+        </w:rPr>
+        <w:t xml:space="preserve">will be </w:t>
+      </w:r>
+      <w:r>
+        <w:rPr>
+          <w:sz w:val="24"/>
+          <w:szCs w:val="24"/>
         </w:rPr>
         <w:t xml:space="preserve">lead </w:t>
       </w:r>
       <w:r>
         <w:rPr>
-          <w:sz w:val="22"/>
-          <w:szCs w:val="22"/>
-        </w:rPr>
-        <w:t>authors on all publications produced.</w:t>
+          <w:sz w:val="24"/>
+          <w:szCs w:val="24"/>
+        </w:rPr>
+        <w:t>authors on a</w:t>
+      </w:r>
+      <w:r>
+        <w:rPr>
+          <w:sz w:val="24"/>
+          <w:szCs w:val="24"/>
+        </w:rPr>
+        <w:t>t least two of the</w:t>
+      </w:r>
+      <w:r>
+        <w:rPr>
+          <w:sz w:val="24"/>
+          <w:szCs w:val="24"/>
+        </w:rPr>
+        <w:t xml:space="preserve"> publications produced</w:t>
+      </w:r>
+      <w:r>
+        <w:rPr>
+          <w:sz w:val="24"/>
+          <w:szCs w:val="24"/>
+        </w:rPr>
+        <w:t xml:space="preserve"> and a significant contributor on the other two</w:t>
+      </w:r>
+      <w:r>
+        <w:rPr>
+          <w:sz w:val="24"/>
+          <w:szCs w:val="24"/>
+        </w:rPr>
+        <w:t>.</w:t>
       </w:r>
       <w:bookmarkStart w:id="10" w:name="High_Precision_Photometry_Even_With_Larg"/>
       <w:bookmarkEnd w:id="10"/>
@@ -1486,133 +1246,61 @@
     <w:p>
       <w:pPr>
         <w:pStyle w:val="BodyText"/>
-        <w:spacing w:before="42" w:line="288" w:lineRule="auto"/>
+        <w:spacing w:before="42" w:after="240" w:line="288" w:lineRule="auto"/>
         <w:ind w:left="180" w:right="1580" w:firstLine="360"/>
         <w:rPr>
-          <w:sz w:val="22"/>
-          <w:szCs w:val="22"/>
-        </w:rPr>
-      </w:pPr>
-      <w:r>
-        <w:rPr>
-          <w:sz w:val="22"/>
-          <w:szCs w:val="22"/>
+          <w:sz w:val="24"/>
+          <w:szCs w:val="24"/>
+        </w:rPr>
+      </w:pPr>
+      <w:r>
+        <w:rPr>
+          <w:sz w:val="24"/>
+          <w:szCs w:val="24"/>
         </w:rPr>
         <w:t>The proposal includes</w:t>
       </w:r>
       <w:r>
         <w:rPr>
-          <w:sz w:val="22"/>
-          <w:szCs w:val="22"/>
-        </w:rPr>
-        <w:t xml:space="preserve"> a total of 66 months of graduate student support over the three proposal years:</w:t>
-      </w:r>
-    </w:p>
-    <w:p>
-      <w:pPr>
-        <w:pStyle w:val="BodyText"/>
-        <w:numPr>
-          <w:ilvl w:val="0"/>
-          <w:numId w:val="16"/>
-        </w:numPr>
-        <w:spacing w:before="42" w:line="288" w:lineRule="auto"/>
-        <w:ind w:left="180" w:right="1580" w:firstLine="360"/>
-        <w:rPr>
-          <w:sz w:val="22"/>
-          <w:szCs w:val="22"/>
-        </w:rPr>
-      </w:pPr>
-      <w:r>
-        <w:rPr>
-          <w:sz w:val="22"/>
-          <w:szCs w:val="22"/>
-        </w:rPr>
-        <w:t>full year</w:t>
-      </w:r>
-      <w:r>
-        <w:rPr>
-          <w:sz w:val="22"/>
-          <w:szCs w:val="22"/>
-        </w:rPr>
-        <w:t xml:space="preserve"> (academic + summer)</w:t>
-      </w:r>
-      <w:r>
-        <w:rPr>
-          <w:sz w:val="22"/>
-          <w:szCs w:val="22"/>
-        </w:rPr>
-        <w:t xml:space="preserve"> support for </w:t>
-      </w:r>
-      <w:r>
-        <w:rPr>
-          <w:sz w:val="22"/>
-          <w:szCs w:val="22"/>
-        </w:rPr>
-        <w:t xml:space="preserve">Joshua Schussler </w:t>
-      </w:r>
-      <w:r>
-        <w:rPr>
-          <w:sz w:val="22"/>
-          <w:szCs w:val="22"/>
-        </w:rPr>
-        <w:t xml:space="preserve">for </w:t>
-      </w:r>
-      <w:r>
-        <w:rPr>
-          <w:sz w:val="22"/>
-          <w:szCs w:val="22"/>
-        </w:rPr>
-        <w:t>all</w:t>
-      </w:r>
-      <w:r>
-        <w:rPr>
-          <w:sz w:val="22"/>
-          <w:szCs w:val="22"/>
-        </w:rPr>
-        <w:t xml:space="preserve"> </w:t>
-      </w:r>
-      <w:r>
-        <w:rPr>
-          <w:sz w:val="22"/>
-          <w:szCs w:val="22"/>
-        </w:rPr>
-        <w:t>three</w:t>
-      </w:r>
-      <w:r>
-        <w:rPr>
-          <w:sz w:val="22"/>
-          <w:szCs w:val="22"/>
-        </w:rPr>
-        <w:t xml:space="preserve"> years of the proposal</w:t>
-      </w:r>
-      <w:r>
-        <w:rPr>
-          <w:sz w:val="22"/>
-          <w:szCs w:val="22"/>
-        </w:rPr>
-        <w:t xml:space="preserve">, </w:t>
-      </w:r>
-    </w:p>
-    <w:p>
-      <w:pPr>
-        <w:pStyle w:val="BodyText"/>
-        <w:numPr>
-          <w:ilvl w:val="0"/>
-          <w:numId w:val="16"/>
-        </w:numPr>
-        <w:spacing w:before="42" w:line="288" w:lineRule="auto"/>
-        <w:ind w:left="180" w:right="1580" w:firstLine="360"/>
-        <w:rPr>
-          <w:sz w:val="22"/>
-          <w:szCs w:val="22"/>
-        </w:rPr>
-      </w:pPr>
-      <w:r>
-        <w:rPr>
-          <w:sz w:val="22"/>
-          <w:szCs w:val="22"/>
-        </w:rPr>
-        <w:t>full year (academic + summer) support during years 1 and 2 and 6 months of support during year 3 for Mohammad Mahmud</w:t>
+          <w:sz w:val="24"/>
+          <w:szCs w:val="24"/>
+        </w:rPr>
+        <w:t xml:space="preserve"> a total of </w:t>
+      </w:r>
+      <w:r>
+        <w:rPr>
+          <w:sz w:val="24"/>
+          <w:szCs w:val="24"/>
+        </w:rPr>
+        <w:t>24</w:t>
+      </w:r>
+      <w:r>
+        <w:rPr>
+          <w:sz w:val="24"/>
+          <w:szCs w:val="24"/>
+        </w:rPr>
+        <w:t xml:space="preserve"> months of graduate student support over the </w:t>
+      </w:r>
+      <w:r>
+        <w:rPr>
+          <w:sz w:val="24"/>
+          <w:szCs w:val="24"/>
+        </w:rPr>
+        <w:t>two</w:t>
+      </w:r>
+      <w:r>
+        <w:rPr>
+          <w:sz w:val="24"/>
+          <w:szCs w:val="24"/>
+        </w:rPr>
+        <w:t xml:space="preserve"> proposal years</w:t>
+      </w:r>
+      <w:r>
+        <w:rPr>
+          <w:sz w:val="24"/>
+          <w:szCs w:val="24"/>
+        </w:rPr>
+        <w:t>, 12 months for each proposal year.</w:t>
       </w:r>
     </w:p>
     <w:p>
@@ -1629,23 +1317,23 @@
         <w:ind w:left="180" w:right="1584" w:firstLine="360"/>
         <w:rPr>
           <w:color w:val="000000" w:themeColor="text1"/>
-          <w:sz w:val="22"/>
-          <w:szCs w:val="22"/>
+          <w:sz w:val="24"/>
+          <w:szCs w:val="24"/>
         </w:rPr>
       </w:pPr>
       <w:r>
         <w:rPr>
           <w:color w:val="000000" w:themeColor="text1"/>
-          <w:sz w:val="22"/>
-          <w:szCs w:val="22"/>
+          <w:sz w:val="24"/>
+          <w:szCs w:val="24"/>
         </w:rPr>
         <w:t xml:space="preserve">Fringe </w:t>
       </w:r>
       <w:r>
         <w:rPr>
           <w:color w:val="000000" w:themeColor="text1"/>
-          <w:sz w:val="22"/>
-          <w:szCs w:val="22"/>
+          <w:sz w:val="24"/>
+          <w:szCs w:val="24"/>
         </w:rPr>
         <w:t>Benefits</w:t>
       </w:r>
@@ -1653,61 +1341,61 @@
     <w:p>
       <w:pPr>
         <w:pStyle w:val="BodyText"/>
-        <w:spacing w:before="43" w:line="288" w:lineRule="auto"/>
+        <w:spacing w:before="43" w:after="240" w:line="288" w:lineRule="auto"/>
         <w:ind w:left="180" w:right="1580" w:firstLine="360"/>
         <w:rPr>
-          <w:sz w:val="22"/>
-          <w:szCs w:val="22"/>
+          <w:sz w:val="24"/>
+          <w:szCs w:val="24"/>
         </w:rPr>
       </w:pPr>
       <w:bookmarkStart w:id="11" w:name="Computational_and_Storage_Feasibility"/>
       <w:bookmarkEnd w:id="11"/>
       <w:r>
         <w:rPr>
-          <w:sz w:val="22"/>
-          <w:szCs w:val="22"/>
+          <w:sz w:val="24"/>
+          <w:szCs w:val="24"/>
         </w:rPr>
         <w:t xml:space="preserve">Employee benefits were estimated in accordance to commonly applied or historical rates used. UTD fringe benefit rates are </w:t>
       </w:r>
       <w:r>
         <w:rPr>
-          <w:sz w:val="22"/>
-          <w:szCs w:val="22"/>
+          <w:sz w:val="24"/>
+          <w:szCs w:val="24"/>
         </w:rPr>
         <w:t>32</w:t>
       </w:r>
       <w:r>
         <w:rPr>
-          <w:sz w:val="22"/>
-          <w:szCs w:val="22"/>
+          <w:sz w:val="24"/>
+          <w:szCs w:val="24"/>
         </w:rPr>
         <w:t xml:space="preserve">% of salary for faculty and </w:t>
       </w:r>
       <w:r>
         <w:rPr>
-          <w:sz w:val="22"/>
-          <w:szCs w:val="22"/>
+          <w:sz w:val="24"/>
+          <w:szCs w:val="24"/>
         </w:rPr>
         <w:t>25</w:t>
       </w:r>
       <w:r>
         <w:rPr>
-          <w:sz w:val="22"/>
-          <w:szCs w:val="22"/>
+          <w:sz w:val="24"/>
+          <w:szCs w:val="24"/>
         </w:rPr>
         <w:t xml:space="preserve">% for graduate students during the academic year and summer months. Graduate student benefit amounts </w:t>
       </w:r>
       <w:r>
         <w:rPr>
-          <w:sz w:val="22"/>
-          <w:szCs w:val="22"/>
+          <w:sz w:val="24"/>
+          <w:szCs w:val="24"/>
         </w:rPr>
         <w:t>include</w:t>
       </w:r>
       <w:r>
         <w:rPr>
-          <w:sz w:val="22"/>
-          <w:szCs w:val="22"/>
+          <w:sz w:val="24"/>
+          <w:szCs w:val="24"/>
         </w:rPr>
         <w:t xml:space="preserve"> additional funds to cover employee and employer insurance premiums.</w:t>
       </w:r>
@@ -1726,15 +1414,15 @@
         <w:ind w:left="180" w:right="1584" w:firstLine="360"/>
         <w:rPr>
           <w:color w:val="000000" w:themeColor="text1"/>
-          <w:sz w:val="22"/>
-          <w:szCs w:val="22"/>
+          <w:sz w:val="24"/>
+          <w:szCs w:val="24"/>
         </w:rPr>
       </w:pPr>
       <w:r>
         <w:rPr>
           <w:color w:val="000000" w:themeColor="text1"/>
-          <w:sz w:val="22"/>
-          <w:szCs w:val="22"/>
+          <w:sz w:val="24"/>
+          <w:szCs w:val="24"/>
         </w:rPr>
         <w:t>Travel</w:t>
       </w:r>
@@ -1745,221 +1433,151 @@
         <w:spacing w:before="44" w:line="266" w:lineRule="auto"/>
         <w:ind w:left="180" w:right="1580" w:firstLine="360"/>
         <w:rPr>
-          <w:sz w:val="22"/>
-          <w:szCs w:val="22"/>
+          <w:sz w:val="24"/>
+          <w:szCs w:val="24"/>
         </w:rPr>
       </w:pPr>
       <w:r>
         <w:rPr>
           <w:spacing w:val="-7"/>
-          <w:sz w:val="22"/>
-          <w:szCs w:val="22"/>
+          <w:sz w:val="24"/>
+          <w:szCs w:val="24"/>
         </w:rPr>
         <w:t xml:space="preserve">Travel </w:t>
       </w:r>
       <w:r>
         <w:rPr>
-          <w:sz w:val="22"/>
-          <w:szCs w:val="22"/>
+          <w:sz w:val="24"/>
+          <w:szCs w:val="24"/>
         </w:rPr>
         <w:t>to technical conferences and meetings held domestically are anticipated</w:t>
       </w:r>
       <w:r>
         <w:rPr>
-          <w:sz w:val="22"/>
-          <w:szCs w:val="22"/>
+          <w:sz w:val="24"/>
+          <w:szCs w:val="24"/>
         </w:rPr>
         <w:t xml:space="preserve"> to disseminate the scientific results</w:t>
       </w:r>
       <w:r>
         <w:rPr>
-          <w:sz w:val="22"/>
-          <w:szCs w:val="22"/>
+          <w:sz w:val="24"/>
+          <w:szCs w:val="24"/>
         </w:rPr>
         <w:t xml:space="preserve">. Based on the work plan (see project description) we include support for </w:t>
       </w:r>
       <w:r>
         <w:rPr>
-          <w:sz w:val="22"/>
-          <w:szCs w:val="22"/>
+          <w:sz w:val="24"/>
+          <w:szCs w:val="24"/>
         </w:rPr>
         <w:t>1</w:t>
       </w:r>
       <w:r>
         <w:rPr>
-          <w:sz w:val="22"/>
-          <w:szCs w:val="22"/>
+          <w:sz w:val="24"/>
+          <w:szCs w:val="24"/>
         </w:rPr>
         <w:t xml:space="preserve"> trip</w:t>
       </w:r>
       <w:r>
         <w:rPr>
-          <w:sz w:val="22"/>
-          <w:szCs w:val="22"/>
+          <w:sz w:val="24"/>
+          <w:szCs w:val="24"/>
+        </w:rPr>
+        <w:t xml:space="preserve"> to a scientific conference for each proposal participant for a total of four trips</w:t>
+      </w:r>
+      <w:r>
+        <w:rPr>
+          <w:spacing w:val="-4"/>
+          <w:sz w:val="24"/>
+          <w:szCs w:val="24"/>
+        </w:rPr>
+        <w:t xml:space="preserve">. </w:t>
+      </w:r>
+      <w:r>
+        <w:rPr>
+          <w:sz w:val="24"/>
+          <w:szCs w:val="24"/>
+        </w:rPr>
+        <w:t>Approximate estimated cost is $2,</w:t>
+      </w:r>
+      <w:r>
+        <w:rPr>
+          <w:sz w:val="24"/>
+          <w:szCs w:val="24"/>
+        </w:rPr>
+        <w:t>4</w:t>
+      </w:r>
+      <w:r>
+        <w:rPr>
+          <w:sz w:val="24"/>
+          <w:szCs w:val="24"/>
+        </w:rPr>
+        <w:t xml:space="preserve">00 </w:t>
+      </w:r>
+      <w:r>
+        <w:rPr>
+          <w:spacing w:val="-3"/>
+          <w:sz w:val="24"/>
+          <w:szCs w:val="24"/>
+        </w:rPr>
+        <w:t xml:space="preserve">per </w:t>
+      </w:r>
+      <w:r>
+        <w:rPr>
+          <w:sz w:val="24"/>
+          <w:szCs w:val="24"/>
+        </w:rPr>
+        <w:t>trip</w:t>
+      </w:r>
+      <w:r>
+        <w:rPr>
+          <w:sz w:val="24"/>
+          <w:szCs w:val="24"/>
+        </w:rPr>
+        <w:t xml:space="preserve"> for the PI and 2035 for the graduate student</w:t>
+      </w:r>
+      <w:r>
+        <w:rPr>
+          <w:sz w:val="24"/>
+          <w:szCs w:val="24"/>
+        </w:rPr>
+        <w:t xml:space="preserve"> or $</w:t>
+      </w:r>
+      <w:r>
+        <w:rPr>
+          <w:sz w:val="24"/>
+          <w:szCs w:val="24"/>
+        </w:rPr>
+        <w:t>8,87</w:t>
+      </w:r>
+      <w:r>
+        <w:rPr>
+          <w:sz w:val="24"/>
+          <w:szCs w:val="24"/>
+        </w:rPr>
+        <w:t>0 total</w:t>
+      </w:r>
+      <w:r>
+        <w:rPr>
+          <w:sz w:val="24"/>
+          <w:szCs w:val="24"/>
+        </w:rPr>
+        <w:t>.  The cost was estimated using the most recent AAS</w:t>
+      </w:r>
+      <w:r>
+        <w:rPr>
+          <w:spacing w:val="6"/>
+          <w:sz w:val="24"/>
+          <w:szCs w:val="24"/>
         </w:rPr>
         <w:t xml:space="preserve"> </w:t>
       </w:r>
       <w:r>
         <w:rPr>
-          <w:sz w:val="22"/>
-          <w:szCs w:val="22"/>
-        </w:rPr>
-        <w:t>each</w:t>
-      </w:r>
-      <w:r>
-        <w:rPr>
-          <w:sz w:val="22"/>
-          <w:szCs w:val="22"/>
-        </w:rPr>
-        <w:t xml:space="preserve"> </w:t>
-      </w:r>
-      <w:r>
-        <w:rPr>
-          <w:sz w:val="22"/>
-          <w:szCs w:val="22"/>
-        </w:rPr>
-        <w:t xml:space="preserve">year for </w:t>
-      </w:r>
-      <w:r>
-        <w:rPr>
-          <w:sz w:val="22"/>
-          <w:szCs w:val="22"/>
-        </w:rPr>
-        <w:t>each</w:t>
-      </w:r>
-      <w:r>
-        <w:rPr>
-          <w:sz w:val="22"/>
-          <w:szCs w:val="22"/>
-        </w:rPr>
-        <w:t xml:space="preserve"> </w:t>
-      </w:r>
-      <w:r>
-        <w:rPr>
-          <w:sz w:val="22"/>
-          <w:szCs w:val="22"/>
-        </w:rPr>
-        <w:t>graduate student</w:t>
-      </w:r>
-      <w:r>
-        <w:rPr>
-          <w:sz w:val="22"/>
-          <w:szCs w:val="22"/>
-        </w:rPr>
-        <w:t xml:space="preserve">, for a total of </w:t>
-      </w:r>
-      <w:r>
-        <w:rPr>
-          <w:sz w:val="22"/>
-          <w:szCs w:val="22"/>
-        </w:rPr>
-        <w:t>six</w:t>
-      </w:r>
-      <w:r>
-        <w:rPr>
-          <w:sz w:val="22"/>
-          <w:szCs w:val="22"/>
-        </w:rPr>
-        <w:t xml:space="preserve"> trips</w:t>
-      </w:r>
-      <w:r>
-        <w:rPr>
-          <w:spacing w:val="-4"/>
-          <w:sz w:val="22"/>
-          <w:szCs w:val="22"/>
-        </w:rPr>
-        <w:t xml:space="preserve">. </w:t>
-      </w:r>
-      <w:r>
-        <w:rPr>
-          <w:sz w:val="22"/>
-          <w:szCs w:val="22"/>
-        </w:rPr>
-        <w:t>Approximate estimated cost is $2,</w:t>
-      </w:r>
-      <w:r>
-        <w:rPr>
-          <w:sz w:val="22"/>
-          <w:szCs w:val="22"/>
-        </w:rPr>
-        <w:t>2</w:t>
-      </w:r>
-      <w:r>
-        <w:rPr>
-          <w:sz w:val="22"/>
-          <w:szCs w:val="22"/>
-        </w:rPr>
-        <w:t xml:space="preserve">00 </w:t>
-      </w:r>
-      <w:r>
-        <w:rPr>
-          <w:spacing w:val="-3"/>
-          <w:sz w:val="22"/>
-          <w:szCs w:val="22"/>
-        </w:rPr>
-        <w:t xml:space="preserve">per </w:t>
-      </w:r>
-      <w:r>
-        <w:rPr>
-          <w:sz w:val="22"/>
-          <w:szCs w:val="22"/>
-        </w:rPr>
-        <w:t>trip</w:t>
-      </w:r>
-      <w:r>
-        <w:rPr>
-          <w:sz w:val="22"/>
-          <w:szCs w:val="22"/>
-        </w:rPr>
-        <w:t xml:space="preserve"> or $</w:t>
-      </w:r>
-      <w:r>
-        <w:rPr>
-          <w:sz w:val="22"/>
-          <w:szCs w:val="22"/>
-        </w:rPr>
-        <w:t>13</w:t>
-      </w:r>
-      <w:r>
-        <w:rPr>
-          <w:sz w:val="22"/>
-          <w:szCs w:val="22"/>
-        </w:rPr>
-        <w:t>,</w:t>
-      </w:r>
-      <w:r>
-        <w:rPr>
-          <w:sz w:val="22"/>
-          <w:szCs w:val="22"/>
-        </w:rPr>
-        <w:t>2</w:t>
-      </w:r>
-      <w:r>
-        <w:rPr>
-          <w:sz w:val="22"/>
-          <w:szCs w:val="22"/>
-        </w:rPr>
-        <w:t>00 total</w:t>
-      </w:r>
-      <w:r>
-        <w:rPr>
-          <w:sz w:val="22"/>
-          <w:szCs w:val="22"/>
-        </w:rPr>
-        <w:t>.  The cost was estimated using the most recent AAS</w:t>
-      </w:r>
-      <w:r>
-        <w:rPr>
-          <w:spacing w:val="6"/>
-          <w:sz w:val="22"/>
-          <w:szCs w:val="22"/>
-        </w:rPr>
-        <w:t xml:space="preserve"> </w:t>
-      </w:r>
-      <w:r>
-        <w:rPr>
-          <w:sz w:val="22"/>
-          <w:szCs w:val="22"/>
+          <w:sz w:val="24"/>
+          <w:szCs w:val="24"/>
         </w:rPr>
         <w:t>conference.</w:t>
       </w:r>
@@ -1967,583 +1585,299 @@
     <w:p>
       <w:pPr>
         <w:pStyle w:val="BodyText"/>
-        <w:spacing w:before="25" w:line="254" w:lineRule="auto"/>
+        <w:spacing w:before="25" w:after="240" w:line="254" w:lineRule="auto"/>
         <w:ind w:left="180" w:right="1580" w:firstLine="360"/>
         <w:rPr>
-          <w:sz w:val="22"/>
-          <w:szCs w:val="22"/>
-        </w:rPr>
-      </w:pPr>
-      <w:r>
-        <w:rPr>
-          <w:sz w:val="22"/>
-          <w:szCs w:val="22"/>
-        </w:rPr>
-        <w:t xml:space="preserve">American Astronomical Society meeting #235 </w:t>
-      </w:r>
-      <w:r>
-        <w:rPr>
-          <w:sz w:val="22"/>
-          <w:szCs w:val="22"/>
-        </w:rPr>
-        <w:t>Pasadena</w:t>
-      </w:r>
-      <w:r>
-        <w:rPr>
-          <w:sz w:val="22"/>
-          <w:szCs w:val="22"/>
+          <w:sz w:val="24"/>
+          <w:szCs w:val="24"/>
+        </w:rPr>
+      </w:pPr>
+      <w:r>
+        <w:rPr>
+          <w:sz w:val="24"/>
+          <w:szCs w:val="24"/>
+        </w:rPr>
+        <w:t>American Astronomical Society meeting #2</w:t>
+      </w:r>
+      <w:r>
+        <w:rPr>
+          <w:sz w:val="24"/>
+          <w:szCs w:val="24"/>
+        </w:rPr>
+        <w:t>41</w:t>
+      </w:r>
+      <w:r>
+        <w:rPr>
+          <w:sz w:val="24"/>
+          <w:szCs w:val="24"/>
+        </w:rPr>
+        <w:t xml:space="preserve"> </w:t>
+      </w:r>
+      <w:r>
+        <w:rPr>
+          <w:sz w:val="24"/>
+          <w:szCs w:val="24"/>
+        </w:rPr>
+        <w:t>Seattle</w:t>
+      </w:r>
+      <w:r>
+        <w:rPr>
+          <w:sz w:val="24"/>
+          <w:szCs w:val="24"/>
         </w:rPr>
         <w:t xml:space="preserve">, </w:t>
       </w:r>
       <w:r>
         <w:rPr>
-          <w:sz w:val="22"/>
-          <w:szCs w:val="22"/>
-        </w:rPr>
-        <w:t>CA</w:t>
-      </w:r>
-      <w:r>
-        <w:rPr>
-          <w:sz w:val="22"/>
-          <w:szCs w:val="22"/>
+          <w:sz w:val="24"/>
+          <w:szCs w:val="24"/>
+        </w:rPr>
+        <w:t>WA</w:t>
+      </w:r>
+      <w:r>
+        <w:rPr>
+          <w:sz w:val="24"/>
+          <w:szCs w:val="24"/>
         </w:rPr>
         <w:t xml:space="preserve"> </w:t>
       </w:r>
       <w:r>
         <w:rPr>
-          <w:sz w:val="22"/>
-          <w:szCs w:val="22"/>
-        </w:rPr>
-        <w:t>12</w:t>
-      </w:r>
-      <w:r>
-        <w:rPr>
-          <w:sz w:val="22"/>
-          <w:szCs w:val="22"/>
+          <w:sz w:val="24"/>
+          <w:szCs w:val="24"/>
+        </w:rPr>
+        <w:t>8</w:t>
+      </w:r>
+      <w:r>
+        <w:rPr>
+          <w:sz w:val="24"/>
+          <w:szCs w:val="24"/>
         </w:rPr>
         <w:t xml:space="preserve"> – </w:t>
       </w:r>
       <w:r>
         <w:rPr>
-          <w:sz w:val="22"/>
-          <w:szCs w:val="22"/>
-        </w:rPr>
-        <w:t>16</w:t>
-      </w:r>
-      <w:r>
-        <w:rPr>
-          <w:sz w:val="22"/>
-          <w:szCs w:val="22"/>
+          <w:sz w:val="24"/>
+          <w:szCs w:val="24"/>
+        </w:rPr>
+        <w:t>1</w:t>
+      </w:r>
+      <w:r>
+        <w:rPr>
+          <w:sz w:val="24"/>
+          <w:szCs w:val="24"/>
+        </w:rPr>
+        <w:t>2</w:t>
+      </w:r>
+      <w:r>
+        <w:rPr>
+          <w:sz w:val="24"/>
+          <w:szCs w:val="24"/>
         </w:rPr>
         <w:t xml:space="preserve"> </w:t>
       </w:r>
       <w:r>
         <w:rPr>
-          <w:sz w:val="22"/>
-          <w:szCs w:val="22"/>
-        </w:rPr>
-        <w:t>June</w:t>
-      </w:r>
-      <w:r>
-        <w:rPr>
-          <w:sz w:val="22"/>
-          <w:szCs w:val="22"/>
+          <w:sz w:val="24"/>
+          <w:szCs w:val="24"/>
+        </w:rPr>
+        <w:t>J</w:t>
+      </w:r>
+      <w:r>
+        <w:rPr>
+          <w:sz w:val="24"/>
+          <w:szCs w:val="24"/>
+        </w:rPr>
+        <w:t>an</w:t>
+      </w:r>
+      <w:r>
+        <w:rPr>
+          <w:sz w:val="24"/>
+          <w:szCs w:val="24"/>
         </w:rPr>
         <w:t xml:space="preserve"> 202</w:t>
       </w:r>
       <w:r>
         <w:rPr>
-          <w:sz w:val="22"/>
-          <w:szCs w:val="22"/>
-        </w:rPr>
-        <w:t>2</w:t>
-      </w:r>
-      <w:r>
-        <w:rPr>
-          <w:sz w:val="22"/>
-          <w:szCs w:val="22"/>
+          <w:sz w:val="24"/>
+          <w:szCs w:val="24"/>
+        </w:rPr>
+        <w:t>3</w:t>
+      </w:r>
+      <w:r>
+        <w:rPr>
+          <w:sz w:val="24"/>
+          <w:szCs w:val="24"/>
         </w:rPr>
         <w:t xml:space="preserve">. The registration fees for the meeting </w:t>
       </w:r>
       <w:r>
         <w:rPr>
-          <w:sz w:val="22"/>
-          <w:szCs w:val="22"/>
-        </w:rPr>
-        <w:t>are</w:t>
-      </w:r>
-      <w:r>
-        <w:rPr>
-          <w:sz w:val="22"/>
-          <w:szCs w:val="22"/>
+          <w:sz w:val="24"/>
+          <w:szCs w:val="24"/>
+        </w:rPr>
+        <w:t>were</w:t>
+      </w:r>
+      <w:r>
+        <w:rPr>
+          <w:sz w:val="24"/>
+          <w:szCs w:val="24"/>
         </w:rPr>
         <w:t xml:space="preserve"> $</w:t>
       </w:r>
       <w:r>
         <w:rPr>
-          <w:sz w:val="22"/>
-          <w:szCs w:val="22"/>
-        </w:rPr>
-        <w:t>4</w:t>
-      </w:r>
-      <w:r>
-        <w:rPr>
-          <w:sz w:val="22"/>
-          <w:szCs w:val="22"/>
-        </w:rPr>
-        <w:t>75</w:t>
-      </w:r>
-      <w:r>
-        <w:rPr>
-          <w:sz w:val="22"/>
-          <w:szCs w:val="22"/>
+          <w:sz w:val="24"/>
+          <w:szCs w:val="24"/>
+        </w:rPr>
+        <w:t>730 for full AAS members and $365</w:t>
+      </w:r>
+      <w:r>
+        <w:rPr>
+          <w:sz w:val="24"/>
+          <w:szCs w:val="24"/>
         </w:rPr>
         <w:t xml:space="preserve"> for </w:t>
       </w:r>
       <w:r>
         <w:rPr>
-          <w:sz w:val="22"/>
-          <w:szCs w:val="22"/>
-        </w:rPr>
-        <w:t xml:space="preserve">graduate student </w:t>
-      </w:r>
-      <w:r>
-        <w:rPr>
-          <w:sz w:val="22"/>
-          <w:szCs w:val="22"/>
-        </w:rPr>
-        <w:t xml:space="preserve">registration. Airfare from Dallas/Fort Worth International Airport to </w:t>
-      </w:r>
-      <w:r>
-        <w:rPr>
-          <w:sz w:val="22"/>
-          <w:szCs w:val="22"/>
+          <w:sz w:val="24"/>
+          <w:szCs w:val="24"/>
+        </w:rPr>
+        <w:t>graduate student</w:t>
+      </w:r>
+      <w:r>
+        <w:rPr>
+          <w:sz w:val="24"/>
+          <w:szCs w:val="24"/>
+        </w:rPr>
+        <w:t>s</w:t>
+      </w:r>
+      <w:r>
+        <w:rPr>
+          <w:sz w:val="24"/>
+          <w:szCs w:val="24"/>
+        </w:rPr>
+        <w:t xml:space="preserve">. Airfare from Dallas/Fort Worth International Airport to </w:t>
+      </w:r>
+      <w:r>
+        <w:rPr>
+          <w:sz w:val="24"/>
+          <w:szCs w:val="24"/>
         </w:rPr>
         <w:t>LAX</w:t>
       </w:r>
       <w:r>
         <w:rPr>
-          <w:sz w:val="22"/>
-          <w:szCs w:val="22"/>
+          <w:sz w:val="24"/>
+          <w:szCs w:val="24"/>
         </w:rPr>
         <w:t xml:space="preserve"> Airport </w:t>
       </w:r>
       <w:r>
         <w:rPr>
-          <w:sz w:val="22"/>
-          <w:szCs w:val="22"/>
+          <w:sz w:val="24"/>
+          <w:szCs w:val="24"/>
         </w:rPr>
         <w:t>is</w:t>
       </w:r>
       <w:r>
         <w:rPr>
-          <w:sz w:val="22"/>
-          <w:szCs w:val="22"/>
+          <w:sz w:val="24"/>
+          <w:szCs w:val="24"/>
         </w:rPr>
         <w:t xml:space="preserve"> $</w:t>
       </w:r>
       <w:r>
         <w:rPr>
-          <w:sz w:val="22"/>
-          <w:szCs w:val="22"/>
-        </w:rPr>
-        <w:t>4</w:t>
-      </w:r>
-      <w:r>
-        <w:rPr>
-          <w:sz w:val="22"/>
-          <w:szCs w:val="22"/>
-        </w:rPr>
-        <w:t>85, ground transportation is $150</w:t>
-      </w:r>
-      <w:r>
-        <w:rPr>
-          <w:sz w:val="22"/>
-          <w:szCs w:val="22"/>
+          <w:sz w:val="24"/>
+          <w:szCs w:val="24"/>
+        </w:rPr>
+        <w:t>360</w:t>
+      </w:r>
+      <w:r>
+        <w:rPr>
+          <w:sz w:val="24"/>
+          <w:szCs w:val="24"/>
+        </w:rPr>
+        <w:t xml:space="preserve">, ground transportation </w:t>
+      </w:r>
+      <w:r>
+        <w:rPr>
+          <w:sz w:val="24"/>
+          <w:szCs w:val="24"/>
+        </w:rPr>
+        <w:t>was estimated at</w:t>
+      </w:r>
+      <w:r>
+        <w:rPr>
+          <w:sz w:val="24"/>
+          <w:szCs w:val="24"/>
+        </w:rPr>
+        <w:t xml:space="preserve"> $1</w:t>
+      </w:r>
+      <w:r>
+        <w:rPr>
+          <w:sz w:val="24"/>
+          <w:szCs w:val="24"/>
+        </w:rPr>
+        <w:t>85 (uber)</w:t>
+      </w:r>
+      <w:r>
+        <w:rPr>
+          <w:sz w:val="24"/>
+          <w:szCs w:val="24"/>
         </w:rPr>
         <w:t xml:space="preserve">. The hotel stay </w:t>
       </w:r>
       <w:r>
         <w:rPr>
-          <w:sz w:val="22"/>
-          <w:szCs w:val="22"/>
+          <w:sz w:val="24"/>
+          <w:szCs w:val="24"/>
         </w:rPr>
         <w:t>is</w:t>
       </w:r>
       <w:r>
         <w:rPr>
-          <w:sz w:val="22"/>
-          <w:szCs w:val="22"/>
+          <w:sz w:val="24"/>
+          <w:szCs w:val="24"/>
         </w:rPr>
         <w:t xml:space="preserve"> $</w:t>
       </w:r>
       <w:r>
         <w:rPr>
-          <w:sz w:val="22"/>
-          <w:szCs w:val="22"/>
-        </w:rPr>
-        <w:t>9</w:t>
-      </w:r>
-      <w:r>
-        <w:rPr>
-          <w:sz w:val="22"/>
-          <w:szCs w:val="22"/>
-        </w:rPr>
-        <w:t>75</w:t>
-      </w:r>
-      <w:r>
-        <w:rPr>
-          <w:sz w:val="22"/>
-          <w:szCs w:val="22"/>
+          <w:sz w:val="24"/>
+          <w:szCs w:val="24"/>
+        </w:rPr>
+        <w:t>102</w:t>
+      </w:r>
+      <w:r>
+        <w:rPr>
+          <w:sz w:val="24"/>
+          <w:szCs w:val="24"/>
+        </w:rPr>
+        <w:t>5</w:t>
+      </w:r>
+      <w:r>
+        <w:rPr>
+          <w:sz w:val="24"/>
+          <w:szCs w:val="24"/>
         </w:rPr>
         <w:t xml:space="preserve"> total for four nights, and $25/day of </w:t>
       </w:r>
       <w:r>
         <w:rPr>
-          <w:sz w:val="22"/>
-          <w:szCs w:val="22"/>
+          <w:sz w:val="24"/>
+          <w:szCs w:val="24"/>
         </w:rPr>
         <w:t xml:space="preserve">per diem </w:t>
       </w:r>
       <w:r>
         <w:rPr>
-          <w:sz w:val="22"/>
-          <w:szCs w:val="22"/>
+          <w:sz w:val="24"/>
+          <w:szCs w:val="24"/>
         </w:rPr>
         <w:t>over four days were assumed.</w:t>
-      </w:r>
-    </w:p>
-    <w:p>
-      <w:pPr>
-        <w:pStyle w:val="BodyText"/>
-        <w:spacing w:before="25" w:line="254" w:lineRule="auto"/>
-        <w:ind w:left="180" w:right="1580" w:firstLine="360"/>
-        <w:rPr>
-          <w:color w:val="000000" w:themeColor="text1"/>
-          <w:sz w:val="22"/>
-          <w:szCs w:val="22"/>
-        </w:rPr>
-      </w:pPr>
-      <w:r>
-        <w:rPr>
-          <w:color w:val="000000" w:themeColor="text1"/>
-          <w:sz w:val="22"/>
-          <w:szCs w:val="22"/>
-        </w:rPr>
-        <w:t xml:space="preserve">To support the </w:t>
-      </w:r>
-      <w:r>
-        <w:rPr>
-          <w:color w:val="000000" w:themeColor="text1"/>
-          <w:sz w:val="22"/>
-          <w:szCs w:val="22"/>
-        </w:rPr>
-        <w:t>broader impacts</w:t>
-      </w:r>
-      <w:r>
-        <w:rPr>
-          <w:color w:val="000000" w:themeColor="text1"/>
-          <w:sz w:val="22"/>
-          <w:szCs w:val="22"/>
-        </w:rPr>
-        <w:t xml:space="preserve"> plan, attendance at </w:t>
-      </w:r>
-      <w:r>
-        <w:rPr>
-          <w:color w:val="000000" w:themeColor="text1"/>
-          <w:sz w:val="22"/>
-          <w:szCs w:val="22"/>
-        </w:rPr>
-        <w:t>a</w:t>
-      </w:r>
-      <w:r>
-        <w:rPr>
-          <w:color w:val="000000" w:themeColor="text1"/>
-          <w:sz w:val="22"/>
-          <w:szCs w:val="22"/>
-        </w:rPr>
-        <w:t xml:space="preserve"> national physics/science teacher conference </w:t>
-      </w:r>
-      <w:r>
-        <w:rPr>
-          <w:color w:val="000000" w:themeColor="text1"/>
-          <w:sz w:val="22"/>
-          <w:szCs w:val="22"/>
-        </w:rPr>
-        <w:t>in year 3</w:t>
-      </w:r>
-      <w:r>
-        <w:rPr>
-          <w:color w:val="000000" w:themeColor="text1"/>
-          <w:sz w:val="22"/>
-          <w:szCs w:val="22"/>
-        </w:rPr>
-        <w:t xml:space="preserve"> (such as the American Association of Physics Teachers summer meeting) is budgeted for Urquhart to present with an RET participant on the proposed project at an estimated at $500 for registration, $600 roundtrip air and ground transportation, and $900 for lodging and per diem for Urquhart, totaling $2,000.</w:t>
-      </w:r>
-      <w:r>
-        <w:rPr>
-          <w:color w:val="000000" w:themeColor="text1"/>
-          <w:sz w:val="22"/>
-          <w:szCs w:val="22"/>
-        </w:rPr>
-        <w:t xml:space="preserve"> Trave</w:t>
-      </w:r>
-      <w:r>
-        <w:rPr>
-          <w:color w:val="000000" w:themeColor="text1"/>
-          <w:sz w:val="22"/>
-          <w:szCs w:val="22"/>
-        </w:rPr>
-        <w:t>l to national conference</w:t>
-      </w:r>
-      <w:r>
-        <w:rPr>
-          <w:color w:val="000000" w:themeColor="text1"/>
-          <w:sz w:val="22"/>
-          <w:szCs w:val="22"/>
-        </w:rPr>
-        <w:t xml:space="preserve"> is expected during the </w:t>
-      </w:r>
-      <w:r>
-        <w:rPr>
-          <w:color w:val="000000" w:themeColor="text1"/>
-          <w:sz w:val="22"/>
-          <w:szCs w:val="22"/>
-        </w:rPr>
-        <w:t>summer</w:t>
-      </w:r>
-      <w:r>
-        <w:rPr>
-          <w:color w:val="000000" w:themeColor="text1"/>
-          <w:sz w:val="22"/>
-          <w:szCs w:val="22"/>
-        </w:rPr>
-        <w:t xml:space="preserve"> </w:t>
-      </w:r>
-      <w:r>
-        <w:rPr>
-          <w:color w:val="000000" w:themeColor="text1"/>
-          <w:sz w:val="22"/>
-          <w:szCs w:val="22"/>
-        </w:rPr>
-        <w:t xml:space="preserve">of the year </w:t>
-      </w:r>
-      <w:r>
-        <w:rPr>
-          <w:color w:val="000000" w:themeColor="text1"/>
-          <w:sz w:val="22"/>
-          <w:szCs w:val="22"/>
-        </w:rPr>
-        <w:t xml:space="preserve">following the </w:t>
-      </w:r>
-      <w:r>
-        <w:rPr>
-          <w:color w:val="000000" w:themeColor="text1"/>
-          <w:sz w:val="22"/>
-          <w:szCs w:val="22"/>
-        </w:rPr>
-        <w:t xml:space="preserve">first </w:t>
-      </w:r>
-      <w:r>
-        <w:rPr>
-          <w:color w:val="000000" w:themeColor="text1"/>
-          <w:sz w:val="22"/>
-          <w:szCs w:val="22"/>
-        </w:rPr>
-        <w:t>RET.</w:t>
-      </w:r>
-    </w:p>
-    <w:p>
-      <w:pPr>
-        <w:pStyle w:val="BodyText"/>
-        <w:spacing w:before="25" w:line="254" w:lineRule="auto"/>
-        <w:ind w:left="180" w:right="1580" w:firstLine="360"/>
-        <w:rPr>
-          <w:color w:val="000000" w:themeColor="text1"/>
-          <w:sz w:val="22"/>
-          <w:szCs w:val="22"/>
-        </w:rPr>
-      </w:pPr>
-      <w:r>
-        <w:rPr>
-          <w:color w:val="000000" w:themeColor="text1"/>
-          <w:sz w:val="22"/>
-          <w:szCs w:val="22"/>
-        </w:rPr>
-        <w:t xml:space="preserve">One statewide science teacher conference per year for </w:t>
-      </w:r>
-      <w:r>
-        <w:rPr>
-          <w:color w:val="000000" w:themeColor="text1"/>
-          <w:sz w:val="22"/>
-          <w:szCs w:val="22"/>
-        </w:rPr>
-        <w:t>2</w:t>
-      </w:r>
-      <w:r>
-        <w:rPr>
-          <w:color w:val="000000" w:themeColor="text1"/>
-          <w:sz w:val="22"/>
-          <w:szCs w:val="22"/>
-        </w:rPr>
-        <w:t xml:space="preserve"> years is budgeted for Dr. Urquhart to present with an RET participant on the proposed project at $250 for registration, $350 ground transportation, and $600 lodging and per diem totaling $1200 each year in years </w:t>
-      </w:r>
-      <w:r>
-        <w:rPr>
-          <w:color w:val="000000" w:themeColor="text1"/>
-          <w:sz w:val="22"/>
-          <w:szCs w:val="22"/>
-        </w:rPr>
-        <w:t>2</w:t>
-      </w:r>
-      <w:r>
-        <w:rPr>
-          <w:color w:val="000000" w:themeColor="text1"/>
-          <w:sz w:val="22"/>
-          <w:szCs w:val="22"/>
-        </w:rPr>
-        <w:t xml:space="preserve"> and 3</w:t>
-      </w:r>
-      <w:r>
-        <w:rPr>
-          <w:color w:val="000000" w:themeColor="text1"/>
-          <w:sz w:val="22"/>
-          <w:szCs w:val="22"/>
-        </w:rPr>
-        <w:t>, with a request of $</w:t>
-      </w:r>
-      <w:r>
-        <w:rPr>
-          <w:color w:val="000000" w:themeColor="text1"/>
-          <w:sz w:val="22"/>
-          <w:szCs w:val="22"/>
-        </w:rPr>
-        <w:t>24</w:t>
-      </w:r>
-      <w:r>
-        <w:rPr>
-          <w:color w:val="000000" w:themeColor="text1"/>
-          <w:sz w:val="22"/>
-          <w:szCs w:val="22"/>
-        </w:rPr>
-        <w:t>00 overall.</w:t>
-      </w:r>
-    </w:p>
-    <w:p>
-      <w:pPr>
-        <w:pStyle w:val="BodyText"/>
-        <w:spacing w:before="25" w:line="254" w:lineRule="auto"/>
-        <w:ind w:left="180" w:right="1580" w:firstLine="360"/>
-        <w:rPr>
-          <w:color w:val="000000" w:themeColor="text1"/>
-          <w:sz w:val="22"/>
-          <w:szCs w:val="22"/>
-        </w:rPr>
-      </w:pPr>
-      <w:r>
-        <w:rPr>
-          <w:color w:val="000000" w:themeColor="text1"/>
-          <w:sz w:val="22"/>
-          <w:szCs w:val="22"/>
-        </w:rPr>
-        <w:t xml:space="preserve">Additionally, one local science teacher conference per year is budgeted in years </w:t>
-      </w:r>
-      <w:r>
-        <w:rPr>
-          <w:color w:val="000000" w:themeColor="text1"/>
-          <w:sz w:val="22"/>
-          <w:szCs w:val="22"/>
-        </w:rPr>
-        <w:t>2 and 3</w:t>
-      </w:r>
-      <w:r>
-        <w:rPr>
-          <w:color w:val="000000" w:themeColor="text1"/>
-          <w:sz w:val="22"/>
-          <w:szCs w:val="22"/>
-        </w:rPr>
-        <w:t xml:space="preserve"> for Dr. Urquhart to present with a RET participant. Registration for the Metroplex Area Mini-Conference for the Advancement of Science Teaching is typically free for presenters and there </w:t>
-      </w:r>
-      <w:r>
-        <w:rPr>
-          <w:color w:val="000000" w:themeColor="text1"/>
-          <w:sz w:val="22"/>
-          <w:szCs w:val="22"/>
-        </w:rPr>
-        <w:lastRenderedPageBreak/>
-        <w:t xml:space="preserve">is no overnight stay. Roundtrip mileage is estimated at a maximum of $50 each year for </w:t>
-      </w:r>
-      <w:r>
-        <w:rPr>
-          <w:color w:val="000000" w:themeColor="text1"/>
-          <w:sz w:val="22"/>
-          <w:szCs w:val="22"/>
-        </w:rPr>
-        <w:t>two</w:t>
-      </w:r>
-      <w:r>
-        <w:rPr>
-          <w:color w:val="000000" w:themeColor="text1"/>
-          <w:sz w:val="22"/>
-          <w:szCs w:val="22"/>
-        </w:rPr>
-        <w:t xml:space="preserve"> years in years </w:t>
-      </w:r>
-      <w:r>
-        <w:rPr>
-          <w:color w:val="000000" w:themeColor="text1"/>
-          <w:sz w:val="22"/>
-          <w:szCs w:val="22"/>
-        </w:rPr>
-        <w:t>2</w:t>
-      </w:r>
-      <w:r>
-        <w:rPr>
-          <w:color w:val="000000" w:themeColor="text1"/>
-          <w:sz w:val="22"/>
-          <w:szCs w:val="22"/>
-        </w:rPr>
-        <w:t xml:space="preserve"> and 3</w:t>
-      </w:r>
-      <w:r>
-        <w:rPr>
-          <w:color w:val="000000" w:themeColor="text1"/>
-          <w:sz w:val="22"/>
-          <w:szCs w:val="22"/>
-        </w:rPr>
-        <w:t xml:space="preserve"> totaling $1</w:t>
-      </w:r>
-      <w:r>
-        <w:rPr>
-          <w:color w:val="000000" w:themeColor="text1"/>
-          <w:sz w:val="22"/>
-          <w:szCs w:val="22"/>
-        </w:rPr>
-        <w:t>0</w:t>
-      </w:r>
-      <w:r>
-        <w:rPr>
-          <w:color w:val="000000" w:themeColor="text1"/>
-          <w:sz w:val="22"/>
-          <w:szCs w:val="22"/>
-        </w:rPr>
-        <w:t>0</w:t>
-      </w:r>
-      <w:r>
-        <w:rPr>
-          <w:color w:val="000000" w:themeColor="text1"/>
-          <w:sz w:val="22"/>
-          <w:szCs w:val="22"/>
-        </w:rPr>
-        <w:t xml:space="preserve"> for the duration of the project</w:t>
-      </w:r>
-      <w:r>
-        <w:rPr>
-          <w:color w:val="000000" w:themeColor="text1"/>
-          <w:sz w:val="22"/>
-          <w:szCs w:val="22"/>
-        </w:rPr>
-        <w:t>.</w:t>
       </w:r>
     </w:p>
     <w:p>
@@ -2559,95 +1893,403 @@
         <w:spacing w:before="160"/>
         <w:ind w:left="180" w:right="1584" w:firstLine="360"/>
         <w:rPr>
-          <w:color w:val="000000" w:themeColor="text1"/>
-          <w:sz w:val="22"/>
-          <w:szCs w:val="22"/>
-        </w:rPr>
-      </w:pPr>
-      <w:r>
-        <w:rPr>
-          <w:color w:val="000000" w:themeColor="text1"/>
-          <w:sz w:val="22"/>
-          <w:szCs w:val="22"/>
-        </w:rPr>
-        <w:t>Materials and Supplies</w:t>
+          <w:sz w:val="24"/>
+          <w:szCs w:val="24"/>
+        </w:rPr>
+      </w:pPr>
+      <w:r>
+        <w:rPr>
+          <w:sz w:val="24"/>
+          <w:szCs w:val="24"/>
+        </w:rPr>
+        <w:t>Publication</w:t>
+      </w:r>
+      <w:r>
+        <w:rPr>
+          <w:spacing w:val="1"/>
+          <w:sz w:val="24"/>
+          <w:szCs w:val="24"/>
+        </w:rPr>
+        <w:t xml:space="preserve"> </w:t>
+      </w:r>
+      <w:r>
+        <w:rPr>
+          <w:sz w:val="24"/>
+          <w:szCs w:val="24"/>
+        </w:rPr>
+        <w:t>Costs</w:t>
       </w:r>
     </w:p>
     <w:p>
       <w:pPr>
-        <w:pStyle w:val="Heading1"/>
-        <w:tabs>
-          <w:tab w:val="left" w:pos="752"/>
-        </w:tabs>
-        <w:spacing w:before="44"/>
-        <w:ind w:left="180" w:right="1584" w:firstLine="360"/>
-        <w:rPr>
-          <w:b w:val="0"/>
-          <w:bCs w:val="0"/>
-          <w:color w:val="FF0000"/>
-          <w:sz w:val="22"/>
-          <w:szCs w:val="22"/>
-        </w:rPr>
-      </w:pPr>
-      <w:r>
-        <w:rPr>
-          <w:b w:val="0"/>
-          <w:bCs w:val="0"/>
-          <w:color w:val="000000" w:themeColor="text1"/>
-          <w:sz w:val="22"/>
-          <w:szCs w:val="22"/>
-        </w:rPr>
-        <w:t>$200/year for years 2</w:t>
-      </w:r>
-      <w:r>
-        <w:rPr>
-          <w:b w:val="0"/>
-          <w:bCs w:val="0"/>
-          <w:color w:val="000000" w:themeColor="text1"/>
-          <w:sz w:val="22"/>
-          <w:szCs w:val="22"/>
-        </w:rPr>
-        <w:t xml:space="preserve"> and 3</w:t>
-      </w:r>
-      <w:r>
-        <w:rPr>
-          <w:b w:val="0"/>
-          <w:bCs w:val="0"/>
-          <w:color w:val="000000" w:themeColor="text1"/>
-          <w:sz w:val="22"/>
-          <w:szCs w:val="22"/>
-        </w:rPr>
-        <w:t>, or $</w:t>
-      </w:r>
-      <w:r>
-        <w:rPr>
-          <w:b w:val="0"/>
-          <w:bCs w:val="0"/>
-          <w:color w:val="000000" w:themeColor="text1"/>
-          <w:sz w:val="22"/>
-          <w:szCs w:val="22"/>
-        </w:rPr>
-        <w:t>4</w:t>
-      </w:r>
-      <w:r>
-        <w:rPr>
-          <w:b w:val="0"/>
-          <w:bCs w:val="0"/>
-          <w:color w:val="000000" w:themeColor="text1"/>
-          <w:sz w:val="22"/>
-          <w:szCs w:val="22"/>
-        </w:rPr>
-        <w:t>00 total, is budgeted for materials used to design and test lessons related to the PI’s work and/or to present workshops on these lessons and the PIs work at teacher conferences</w:t>
-      </w:r>
-      <w:r>
-        <w:rPr>
-          <w:b w:val="0"/>
-          <w:bCs w:val="0"/>
-          <w:color w:val="000000" w:themeColor="text1"/>
-          <w:sz w:val="22"/>
-          <w:szCs w:val="22"/>
-        </w:rPr>
-        <w:t>.</w:t>
+        <w:pStyle w:val="BodyText"/>
+        <w:spacing w:after="240" w:line="273" w:lineRule="auto"/>
+        <w:ind w:left="180" w:right="1580" w:firstLine="360"/>
+        <w:rPr>
+          <w:sz w:val="24"/>
+          <w:szCs w:val="24"/>
+        </w:rPr>
+      </w:pPr>
+      <w:r>
+        <w:rPr>
+          <w:spacing w:val="-4"/>
+          <w:sz w:val="24"/>
+          <w:szCs w:val="24"/>
+        </w:rPr>
+        <w:t xml:space="preserve">We </w:t>
+      </w:r>
+      <w:r>
+        <w:rPr>
+          <w:sz w:val="24"/>
+          <w:szCs w:val="24"/>
+        </w:rPr>
+        <w:t xml:space="preserve">plan </w:t>
+      </w:r>
+      <w:r>
+        <w:rPr>
+          <w:spacing w:val="-3"/>
+          <w:sz w:val="24"/>
+          <w:szCs w:val="24"/>
+        </w:rPr>
+        <w:t xml:space="preserve">for </w:t>
+      </w:r>
+      <w:r>
+        <w:rPr>
+          <w:sz w:val="24"/>
+          <w:szCs w:val="24"/>
+        </w:rPr>
+        <w:t>five</w:t>
+      </w:r>
+      <w:r>
+        <w:rPr>
+          <w:sz w:val="24"/>
+          <w:szCs w:val="24"/>
+        </w:rPr>
+        <w:t xml:space="preserve"> </w:t>
+      </w:r>
+      <w:r>
+        <w:rPr>
+          <w:sz w:val="24"/>
+          <w:szCs w:val="24"/>
+        </w:rPr>
+        <w:t xml:space="preserve">publications to be produced </w:t>
+      </w:r>
+      <w:r>
+        <w:rPr>
+          <w:spacing w:val="-3"/>
+          <w:sz w:val="24"/>
+          <w:szCs w:val="24"/>
+        </w:rPr>
+        <w:t xml:space="preserve">by </w:t>
+      </w:r>
+      <w:r>
+        <w:rPr>
+          <w:sz w:val="24"/>
+          <w:szCs w:val="24"/>
+        </w:rPr>
+        <w:t xml:space="preserve">this project. </w:t>
+      </w:r>
+      <w:r>
+        <w:rPr>
+          <w:spacing w:val="-4"/>
+          <w:sz w:val="24"/>
+          <w:szCs w:val="24"/>
+        </w:rPr>
+        <w:t xml:space="preserve">We </w:t>
+      </w:r>
+      <w:r>
+        <w:rPr>
+          <w:sz w:val="24"/>
+          <w:szCs w:val="24"/>
+        </w:rPr>
+        <w:t>will likely submit to the “American Astronomical Society Journals”. Assuming an</w:t>
+      </w:r>
+      <w:r>
+        <w:rPr>
+          <w:spacing w:val="5"/>
+          <w:sz w:val="24"/>
+          <w:szCs w:val="24"/>
+        </w:rPr>
+        <w:t xml:space="preserve"> </w:t>
+      </w:r>
+      <w:r>
+        <w:rPr>
+          <w:sz w:val="24"/>
+          <w:szCs w:val="24"/>
+        </w:rPr>
+        <w:t>average</w:t>
+      </w:r>
+      <w:r>
+        <w:rPr>
+          <w:spacing w:val="5"/>
+          <w:sz w:val="24"/>
+          <w:szCs w:val="24"/>
+        </w:rPr>
+        <w:t xml:space="preserve"> </w:t>
+      </w:r>
+      <w:r>
+        <w:rPr>
+          <w:sz w:val="24"/>
+          <w:szCs w:val="24"/>
+        </w:rPr>
+        <w:t>of</w:t>
+      </w:r>
+      <w:r>
+        <w:rPr>
+          <w:spacing w:val="6"/>
+          <w:sz w:val="24"/>
+          <w:szCs w:val="24"/>
+        </w:rPr>
+        <w:t xml:space="preserve"> </w:t>
+      </w:r>
+      <w:r>
+        <w:rPr>
+          <w:sz w:val="24"/>
+          <w:szCs w:val="24"/>
+        </w:rPr>
+        <w:t>$1,</w:t>
+      </w:r>
+      <w:r>
+        <w:rPr>
+          <w:sz w:val="24"/>
+          <w:szCs w:val="24"/>
+        </w:rPr>
+        <w:t>9</w:t>
+      </w:r>
+      <w:r>
+        <w:rPr>
+          <w:sz w:val="24"/>
+          <w:szCs w:val="24"/>
+        </w:rPr>
+        <w:t>00</w:t>
+      </w:r>
+      <w:r>
+        <w:rPr>
+          <w:spacing w:val="5"/>
+          <w:sz w:val="24"/>
+          <w:szCs w:val="24"/>
+        </w:rPr>
+        <w:t xml:space="preserve"> </w:t>
+      </w:r>
+      <w:r>
+        <w:rPr>
+          <w:sz w:val="24"/>
+          <w:szCs w:val="24"/>
+        </w:rPr>
+        <w:t>per</w:t>
+      </w:r>
+      <w:r>
+        <w:rPr>
+          <w:spacing w:val="6"/>
+          <w:sz w:val="24"/>
+          <w:szCs w:val="24"/>
+        </w:rPr>
+        <w:t xml:space="preserve"> </w:t>
+      </w:r>
+      <w:r>
+        <w:rPr>
+          <w:sz w:val="24"/>
+          <w:szCs w:val="24"/>
+        </w:rPr>
+        <w:t>article</w:t>
+      </w:r>
+      <w:r>
+        <w:rPr>
+          <w:sz w:val="24"/>
+          <w:szCs w:val="24"/>
+        </w:rPr>
+        <w:t xml:space="preserve"> ($</w:t>
+      </w:r>
+      <w:r>
+        <w:rPr>
+          <w:sz w:val="24"/>
+          <w:szCs w:val="24"/>
+        </w:rPr>
+        <w:t>7</w:t>
+      </w:r>
+      <w:r>
+        <w:rPr>
+          <w:sz w:val="24"/>
+          <w:szCs w:val="24"/>
+        </w:rPr>
+        <w:t>,</w:t>
+      </w:r>
+      <w:r>
+        <w:rPr>
+          <w:sz w:val="24"/>
+          <w:szCs w:val="24"/>
+        </w:rPr>
+        <w:t>6</w:t>
+      </w:r>
+      <w:r>
+        <w:rPr>
+          <w:sz w:val="24"/>
+          <w:szCs w:val="24"/>
+        </w:rPr>
+        <w:t>00 total for the project)</w:t>
+      </w:r>
+      <w:r>
+        <w:rPr>
+          <w:sz w:val="24"/>
+          <w:szCs w:val="24"/>
+        </w:rPr>
+        <w:t>,</w:t>
+      </w:r>
+      <w:r>
+        <w:rPr>
+          <w:spacing w:val="5"/>
+          <w:sz w:val="24"/>
+          <w:szCs w:val="24"/>
+        </w:rPr>
+        <w:t xml:space="preserve"> </w:t>
+      </w:r>
+      <w:r>
+        <w:rPr>
+          <w:sz w:val="24"/>
+          <w:szCs w:val="24"/>
+        </w:rPr>
+        <w:t>based</w:t>
+      </w:r>
+      <w:r>
+        <w:rPr>
+          <w:spacing w:val="6"/>
+          <w:sz w:val="24"/>
+          <w:szCs w:val="24"/>
+        </w:rPr>
+        <w:t xml:space="preserve"> </w:t>
+      </w:r>
+      <w:r>
+        <w:rPr>
+          <w:sz w:val="24"/>
+          <w:szCs w:val="24"/>
+        </w:rPr>
+        <w:t>on</w:t>
+      </w:r>
+      <w:r>
+        <w:rPr>
+          <w:spacing w:val="5"/>
+          <w:sz w:val="24"/>
+          <w:szCs w:val="24"/>
+        </w:rPr>
+        <w:t xml:space="preserve"> </w:t>
+      </w:r>
+      <w:r>
+        <w:rPr>
+          <w:sz w:val="24"/>
+          <w:szCs w:val="24"/>
+        </w:rPr>
+        <w:t>averages</w:t>
+      </w:r>
+      <w:r>
+        <w:rPr>
+          <w:spacing w:val="5"/>
+          <w:sz w:val="24"/>
+          <w:szCs w:val="24"/>
+        </w:rPr>
+        <w:t xml:space="preserve"> </w:t>
+      </w:r>
+      <w:r>
+        <w:rPr>
+          <w:sz w:val="24"/>
+          <w:szCs w:val="24"/>
+        </w:rPr>
+        <w:t>of</w:t>
+      </w:r>
+      <w:r>
+        <w:rPr>
+          <w:spacing w:val="6"/>
+          <w:sz w:val="24"/>
+          <w:szCs w:val="24"/>
+        </w:rPr>
+        <w:t xml:space="preserve"> </w:t>
+      </w:r>
+      <w:r>
+        <w:rPr>
+          <w:sz w:val="24"/>
+          <w:szCs w:val="24"/>
+        </w:rPr>
+        <w:t>past</w:t>
+      </w:r>
+      <w:r>
+        <w:rPr>
+          <w:spacing w:val="5"/>
+          <w:sz w:val="24"/>
+          <w:szCs w:val="24"/>
+        </w:rPr>
+        <w:t xml:space="preserve"> </w:t>
+      </w:r>
+      <w:r>
+        <w:rPr>
+          <w:sz w:val="24"/>
+          <w:szCs w:val="24"/>
+        </w:rPr>
+        <w:t>publications</w:t>
+      </w:r>
+      <w:r>
+        <w:rPr>
+          <w:spacing w:val="6"/>
+          <w:sz w:val="24"/>
+          <w:szCs w:val="24"/>
+        </w:rPr>
+        <w:t xml:space="preserve"> </w:t>
+      </w:r>
+      <w:r>
+        <w:rPr>
+          <w:sz w:val="24"/>
+          <w:szCs w:val="24"/>
+        </w:rPr>
+        <w:t>from</w:t>
+      </w:r>
+      <w:r>
+        <w:rPr>
+          <w:spacing w:val="5"/>
+          <w:sz w:val="24"/>
+          <w:szCs w:val="24"/>
+        </w:rPr>
+        <w:t xml:space="preserve"> </w:t>
+      </w:r>
+      <w:r>
+        <w:rPr>
+          <w:sz w:val="24"/>
+          <w:szCs w:val="24"/>
+        </w:rPr>
+        <w:t>our</w:t>
+      </w:r>
+      <w:r>
+        <w:rPr>
+          <w:spacing w:val="6"/>
+          <w:sz w:val="24"/>
+          <w:szCs w:val="24"/>
+        </w:rPr>
+        <w:t xml:space="preserve"> </w:t>
+      </w:r>
+      <w:r>
+        <w:rPr>
+          <w:sz w:val="24"/>
+          <w:szCs w:val="24"/>
+        </w:rPr>
+        <w:t>group.</w:t>
+      </w:r>
+      <w:r>
+        <w:rPr>
+          <w:sz w:val="24"/>
+          <w:szCs w:val="24"/>
+        </w:rPr>
+        <w:t xml:space="preserve"> </w:t>
+      </w:r>
+      <w:r>
+        <w:rPr>
+          <w:sz w:val="24"/>
+          <w:szCs w:val="24"/>
+        </w:rPr>
+        <w:t xml:space="preserve">We expect 1 publication in year 1 and three in year 2 </w:t>
+      </w:r>
+      <w:r>
+        <w:rPr>
+          <w:sz w:val="24"/>
+          <w:szCs w:val="24"/>
+        </w:rPr>
+        <w:t>(see work plan in project description):</w:t>
       </w:r>
     </w:p>
     <w:p>
@@ -2663,1139 +2305,29 @@
         <w:spacing w:before="160"/>
         <w:ind w:left="180" w:right="1584" w:firstLine="360"/>
         <w:rPr>
-          <w:color w:val="000000" w:themeColor="text1"/>
-          <w:sz w:val="22"/>
-          <w:szCs w:val="22"/>
-        </w:rPr>
-      </w:pPr>
-      <w:r>
-        <w:rPr>
-          <w:color w:val="000000" w:themeColor="text1"/>
-          <w:sz w:val="22"/>
-          <w:szCs w:val="22"/>
-        </w:rPr>
-        <w:t>Participant Support Costs</w:t>
-      </w:r>
-    </w:p>
-    <w:p>
-      <w:pPr>
-        <w:pStyle w:val="Heading1"/>
-        <w:tabs>
-          <w:tab w:val="left" w:pos="752"/>
-        </w:tabs>
-        <w:spacing w:before="44"/>
-        <w:ind w:left="180" w:right="1584" w:firstLine="360"/>
-        <w:rPr>
-          <w:b w:val="0"/>
-          <w:bCs w:val="0"/>
-          <w:color w:val="000000" w:themeColor="text1"/>
-          <w:sz w:val="22"/>
-          <w:szCs w:val="22"/>
-        </w:rPr>
-      </w:pPr>
-      <w:r>
-        <w:rPr>
-          <w:b w:val="0"/>
-          <w:bCs w:val="0"/>
-          <w:color w:val="000000" w:themeColor="text1"/>
-          <w:sz w:val="22"/>
-          <w:szCs w:val="22"/>
-        </w:rPr>
-        <w:t xml:space="preserve">RET stipends are budgeted for one RET a year over </w:t>
-      </w:r>
-      <w:r>
-        <w:rPr>
-          <w:b w:val="0"/>
-          <w:bCs w:val="0"/>
-          <w:color w:val="000000" w:themeColor="text1"/>
-          <w:sz w:val="22"/>
-          <w:szCs w:val="22"/>
-        </w:rPr>
-        <w:t xml:space="preserve">years 2 and 3. There will not be sufficient time to recruit an RET participant for the first </w:t>
-      </w:r>
-      <w:r>
-        <w:rPr>
-          <w:b w:val="0"/>
-          <w:bCs w:val="0"/>
-          <w:color w:val="000000" w:themeColor="text1"/>
-          <w:sz w:val="22"/>
-          <w:szCs w:val="22"/>
-        </w:rPr>
-        <w:t>summer of the proposal.</w:t>
-      </w:r>
-      <w:r>
-        <w:rPr>
-          <w:b w:val="0"/>
-          <w:bCs w:val="0"/>
-          <w:color w:val="000000" w:themeColor="text1"/>
-          <w:sz w:val="22"/>
-          <w:szCs w:val="22"/>
+          <w:sz w:val="24"/>
+          <w:szCs w:val="24"/>
+        </w:rPr>
+      </w:pPr>
+      <w:r>
+        <w:rPr>
+          <w:sz w:val="24"/>
+          <w:szCs w:val="24"/>
+        </w:rPr>
+        <w:t>Indirect</w:t>
+      </w:r>
+      <w:r>
+        <w:rPr>
+          <w:spacing w:val="1"/>
+          <w:sz w:val="24"/>
+          <w:szCs w:val="24"/>
         </w:rPr>
         <w:t xml:space="preserve"> </w:t>
       </w:r>
       <w:r>
         <w:rPr>
-          <w:b w:val="0"/>
-          <w:bCs w:val="0"/>
-          <w:color w:val="000000" w:themeColor="text1"/>
-          <w:sz w:val="22"/>
-          <w:szCs w:val="22"/>
-        </w:rPr>
-        <w:t>E</w:t>
-      </w:r>
-      <w:r>
-        <w:rPr>
-          <w:b w:val="0"/>
-          <w:bCs w:val="0"/>
-          <w:color w:val="000000" w:themeColor="text1"/>
-          <w:sz w:val="22"/>
-          <w:szCs w:val="22"/>
-        </w:rPr>
-        <w:t xml:space="preserve">ach </w:t>
-      </w:r>
-      <w:r>
-        <w:rPr>
-          <w:b w:val="0"/>
-          <w:bCs w:val="0"/>
-          <w:color w:val="000000" w:themeColor="text1"/>
-          <w:sz w:val="22"/>
-          <w:szCs w:val="22"/>
-        </w:rPr>
-        <w:t>participant will receive</w:t>
-      </w:r>
-      <w:r>
-        <w:rPr>
-          <w:b w:val="0"/>
-          <w:bCs w:val="0"/>
-          <w:color w:val="000000" w:themeColor="text1"/>
-          <w:sz w:val="22"/>
-          <w:szCs w:val="22"/>
-        </w:rPr>
-        <w:t xml:space="preserve"> a stipend of </w:t>
-      </w:r>
-      <w:r>
-        <w:rPr>
-          <w:b w:val="0"/>
-          <w:bCs w:val="0"/>
-          <w:color w:val="000000" w:themeColor="text1"/>
-          <w:sz w:val="22"/>
-          <w:szCs w:val="22"/>
-        </w:rPr>
-        <w:t>$600/week</w:t>
-      </w:r>
-      <w:r>
-        <w:rPr>
-          <w:b w:val="0"/>
-          <w:bCs w:val="0"/>
-          <w:color w:val="000000" w:themeColor="text1"/>
-          <w:sz w:val="22"/>
-          <w:szCs w:val="22"/>
-        </w:rPr>
-        <w:t xml:space="preserve"> for 8 weeks each summer equaling $4800 each year</w:t>
-      </w:r>
-      <w:r>
-        <w:rPr>
-          <w:b w:val="0"/>
-          <w:bCs w:val="0"/>
-          <w:color w:val="000000" w:themeColor="text1"/>
-          <w:sz w:val="22"/>
-          <w:szCs w:val="22"/>
-        </w:rPr>
-        <w:t xml:space="preserve">, or </w:t>
-      </w:r>
-      <w:r>
-        <w:rPr>
-          <w:b w:val="0"/>
-          <w:bCs w:val="0"/>
-          <w:color w:val="000000" w:themeColor="text1"/>
-          <w:sz w:val="22"/>
-          <w:szCs w:val="22"/>
-        </w:rPr>
-        <w:t>a total of $</w:t>
-      </w:r>
-      <w:r>
-        <w:rPr>
-          <w:b w:val="0"/>
-          <w:bCs w:val="0"/>
-          <w:color w:val="000000" w:themeColor="text1"/>
-          <w:sz w:val="22"/>
-          <w:szCs w:val="22"/>
-        </w:rPr>
-        <w:t>9</w:t>
-      </w:r>
-      <w:r>
-        <w:rPr>
-          <w:b w:val="0"/>
-          <w:bCs w:val="0"/>
-          <w:color w:val="000000" w:themeColor="text1"/>
-          <w:sz w:val="22"/>
-          <w:szCs w:val="22"/>
-        </w:rPr>
-        <w:t>,</w:t>
-      </w:r>
-      <w:r>
-        <w:rPr>
-          <w:b w:val="0"/>
-          <w:bCs w:val="0"/>
-          <w:color w:val="000000" w:themeColor="text1"/>
-          <w:sz w:val="22"/>
-          <w:szCs w:val="22"/>
-        </w:rPr>
-        <w:t>6</w:t>
-      </w:r>
-      <w:r>
-        <w:rPr>
-          <w:b w:val="0"/>
-          <w:bCs w:val="0"/>
-          <w:color w:val="000000" w:themeColor="text1"/>
-          <w:sz w:val="22"/>
-          <w:szCs w:val="22"/>
-        </w:rPr>
-        <w:t>00.</w:t>
-      </w:r>
-    </w:p>
-    <w:p>
-      <w:pPr>
-        <w:pStyle w:val="Heading1"/>
-        <w:tabs>
-          <w:tab w:val="left" w:pos="752"/>
-        </w:tabs>
-        <w:spacing w:before="110"/>
-        <w:ind w:left="180" w:right="1580" w:firstLine="360"/>
-        <w:rPr>
-          <w:b w:val="0"/>
-          <w:bCs w:val="0"/>
-          <w:color w:val="000000" w:themeColor="text1"/>
-          <w:sz w:val="22"/>
-          <w:szCs w:val="22"/>
-        </w:rPr>
-      </w:pPr>
-      <w:r>
-        <w:rPr>
-          <w:b w:val="0"/>
-          <w:bCs w:val="0"/>
-          <w:color w:val="000000" w:themeColor="text1"/>
-          <w:sz w:val="22"/>
-          <w:szCs w:val="22"/>
-        </w:rPr>
-        <w:t xml:space="preserve">The budget also includes travel funds for RET participants. Travel is budgeted as follows for RET </w:t>
-      </w:r>
-      <w:r>
-        <w:rPr>
-          <w:b w:val="0"/>
-          <w:bCs w:val="0"/>
-          <w:color w:val="000000" w:themeColor="text1"/>
-          <w:sz w:val="22"/>
-          <w:szCs w:val="22"/>
-        </w:rPr>
-        <w:t>participants:</w:t>
-      </w:r>
-    </w:p>
-    <w:p>
-      <w:pPr>
-        <w:pStyle w:val="Heading1"/>
-        <w:tabs>
-          <w:tab w:val="left" w:pos="752"/>
-        </w:tabs>
-        <w:spacing w:before="110"/>
-        <w:ind w:left="180" w:right="1580" w:firstLine="360"/>
-        <w:rPr>
-          <w:b w:val="0"/>
-          <w:bCs w:val="0"/>
-          <w:color w:val="000000" w:themeColor="text1"/>
-          <w:sz w:val="22"/>
-          <w:szCs w:val="22"/>
-        </w:rPr>
-      </w:pPr>
-      <w:r>
-        <w:rPr>
-          <w:b w:val="0"/>
-          <w:bCs w:val="0"/>
-          <w:color w:val="000000" w:themeColor="text1"/>
-          <w:sz w:val="22"/>
-          <w:szCs w:val="22"/>
-        </w:rPr>
-        <w:t>One national conference</w:t>
-      </w:r>
-      <w:r>
-        <w:rPr>
-          <w:b w:val="0"/>
-          <w:bCs w:val="0"/>
-          <w:color w:val="000000" w:themeColor="text1"/>
-          <w:sz w:val="22"/>
-          <w:szCs w:val="22"/>
-        </w:rPr>
-        <w:t xml:space="preserve"> during the summer of the year after the RET,</w:t>
-      </w:r>
-      <w:r>
-        <w:rPr>
-          <w:b w:val="0"/>
-          <w:bCs w:val="0"/>
-          <w:color w:val="000000" w:themeColor="text1"/>
-          <w:sz w:val="22"/>
-          <w:szCs w:val="22"/>
-        </w:rPr>
-        <w:t xml:space="preserve"> to present on the proposed project with Dr. Urquhart such as the American Association of Physics Teachers summer meeting, is estimated at $500 for registration, $600 roundtrip air and ground transportation, and $900 for lodging and per diem per person, totaling $2,000 </w:t>
-      </w:r>
-      <w:r>
-        <w:rPr>
-          <w:b w:val="0"/>
-          <w:bCs w:val="0"/>
-          <w:color w:val="000000" w:themeColor="text1"/>
-          <w:sz w:val="22"/>
-          <w:szCs w:val="22"/>
-        </w:rPr>
-        <w:t>during year 3</w:t>
-      </w:r>
-      <w:r>
-        <w:rPr>
-          <w:b w:val="0"/>
-          <w:bCs w:val="0"/>
-          <w:color w:val="000000" w:themeColor="text1"/>
-          <w:sz w:val="22"/>
-          <w:szCs w:val="22"/>
-        </w:rPr>
-        <w:t>.</w:t>
-      </w:r>
-    </w:p>
-    <w:p>
-      <w:pPr>
-        <w:pStyle w:val="Heading1"/>
-        <w:tabs>
-          <w:tab w:val="left" w:pos="752"/>
-        </w:tabs>
-        <w:spacing w:before="110"/>
-        <w:ind w:left="180" w:right="1580" w:firstLine="360"/>
-        <w:rPr>
-          <w:b w:val="0"/>
-          <w:bCs w:val="0"/>
-          <w:color w:val="000000" w:themeColor="text1"/>
-          <w:sz w:val="22"/>
-          <w:szCs w:val="22"/>
-        </w:rPr>
-      </w:pPr>
-      <w:r>
-        <w:rPr>
-          <w:b w:val="0"/>
-          <w:bCs w:val="0"/>
-          <w:color w:val="000000" w:themeColor="text1"/>
-          <w:sz w:val="22"/>
-          <w:szCs w:val="22"/>
-        </w:rPr>
-        <w:t xml:space="preserve">One statewide meeting per year is budgeted for the RET to present with Dr. Urquhart on the proposed project at $250 for registration, $350 ground transportation, and $600 lodging and per diem totaling $1200 each year in years </w:t>
-      </w:r>
-      <w:r>
-        <w:rPr>
-          <w:b w:val="0"/>
-          <w:bCs w:val="0"/>
-          <w:color w:val="000000" w:themeColor="text1"/>
-          <w:sz w:val="22"/>
-          <w:szCs w:val="22"/>
-        </w:rPr>
-        <w:t>2</w:t>
-      </w:r>
-      <w:r>
-        <w:rPr>
-          <w:b w:val="0"/>
-          <w:bCs w:val="0"/>
-          <w:color w:val="000000" w:themeColor="text1"/>
-          <w:sz w:val="22"/>
-          <w:szCs w:val="22"/>
-        </w:rPr>
-        <w:t xml:space="preserve"> and 3</w:t>
-      </w:r>
-      <w:r>
-        <w:rPr>
-          <w:b w:val="0"/>
-          <w:bCs w:val="0"/>
-          <w:color w:val="000000" w:themeColor="text1"/>
-          <w:sz w:val="22"/>
-          <w:szCs w:val="22"/>
-        </w:rPr>
-        <w:t>, with a request of $</w:t>
-      </w:r>
-      <w:r>
-        <w:rPr>
-          <w:b w:val="0"/>
-          <w:bCs w:val="0"/>
-          <w:color w:val="000000" w:themeColor="text1"/>
-          <w:sz w:val="22"/>
-          <w:szCs w:val="22"/>
-        </w:rPr>
-        <w:t>24</w:t>
-      </w:r>
-      <w:r>
-        <w:rPr>
-          <w:b w:val="0"/>
-          <w:bCs w:val="0"/>
-          <w:color w:val="000000" w:themeColor="text1"/>
-          <w:sz w:val="22"/>
-          <w:szCs w:val="22"/>
-        </w:rPr>
-        <w:t>00 overall.</w:t>
-      </w:r>
-    </w:p>
-    <w:p>
-      <w:pPr>
-        <w:pStyle w:val="Heading1"/>
-        <w:tabs>
-          <w:tab w:val="left" w:pos="752"/>
-        </w:tabs>
-        <w:spacing w:before="110"/>
-        <w:ind w:left="180" w:right="1580" w:firstLine="360"/>
-        <w:rPr>
-          <w:b w:val="0"/>
-          <w:bCs w:val="0"/>
-          <w:color w:val="000000" w:themeColor="text1"/>
-          <w:sz w:val="22"/>
-          <w:szCs w:val="22"/>
-        </w:rPr>
-      </w:pPr>
-      <w:r>
-        <w:rPr>
-          <w:b w:val="0"/>
-          <w:bCs w:val="0"/>
-          <w:color w:val="000000" w:themeColor="text1"/>
-          <w:sz w:val="22"/>
-          <w:szCs w:val="22"/>
-        </w:rPr>
-        <w:t xml:space="preserve">One local science teacher conference per year is budgeted in years </w:t>
-      </w:r>
-      <w:r>
-        <w:rPr>
-          <w:b w:val="0"/>
-          <w:bCs w:val="0"/>
-          <w:color w:val="000000" w:themeColor="text1"/>
-          <w:sz w:val="22"/>
-          <w:szCs w:val="22"/>
-        </w:rPr>
-        <w:t>2 and 3</w:t>
-      </w:r>
-      <w:r>
-        <w:rPr>
-          <w:b w:val="0"/>
-          <w:bCs w:val="0"/>
-          <w:color w:val="000000" w:themeColor="text1"/>
-          <w:sz w:val="22"/>
-          <w:szCs w:val="22"/>
-        </w:rPr>
-        <w:t xml:space="preserve"> for at least one RET participant to present with Dr. Urquhart. Registration for the Metroplex Area Mini-Conference for the Advancement of Science Teaching is typically free for presenters and there is no overnight stay. Roundtrip mileage is estimated at a maximum of $50 each year for three years in years </w:t>
-      </w:r>
-      <w:r>
-        <w:rPr>
-          <w:b w:val="0"/>
-          <w:bCs w:val="0"/>
-          <w:color w:val="000000" w:themeColor="text1"/>
-          <w:sz w:val="22"/>
-          <w:szCs w:val="22"/>
-        </w:rPr>
-        <w:t>2</w:t>
-      </w:r>
-      <w:r>
-        <w:rPr>
-          <w:b w:val="0"/>
-          <w:bCs w:val="0"/>
-          <w:color w:val="000000" w:themeColor="text1"/>
-          <w:sz w:val="22"/>
-          <w:szCs w:val="22"/>
-        </w:rPr>
-        <w:t xml:space="preserve"> and 3</w:t>
-      </w:r>
-      <w:r>
-        <w:rPr>
-          <w:b w:val="0"/>
-          <w:bCs w:val="0"/>
-          <w:color w:val="000000" w:themeColor="text1"/>
-          <w:sz w:val="22"/>
-          <w:szCs w:val="22"/>
-        </w:rPr>
-        <w:t xml:space="preserve"> totaling $1</w:t>
-      </w:r>
-      <w:r>
-        <w:rPr>
-          <w:b w:val="0"/>
-          <w:bCs w:val="0"/>
-          <w:color w:val="000000" w:themeColor="text1"/>
-          <w:sz w:val="22"/>
-          <w:szCs w:val="22"/>
-        </w:rPr>
-        <w:t>0</w:t>
-      </w:r>
-      <w:r>
-        <w:rPr>
-          <w:b w:val="0"/>
-          <w:bCs w:val="0"/>
-          <w:color w:val="000000" w:themeColor="text1"/>
-          <w:sz w:val="22"/>
-          <w:szCs w:val="22"/>
-        </w:rPr>
-        <w:t>0</w:t>
-      </w:r>
-      <w:r>
-        <w:rPr>
-          <w:b w:val="0"/>
-          <w:bCs w:val="0"/>
-          <w:color w:val="000000" w:themeColor="text1"/>
-          <w:sz w:val="22"/>
-          <w:szCs w:val="22"/>
-        </w:rPr>
-        <w:t xml:space="preserve"> for the duration of the project</w:t>
-      </w:r>
-      <w:r>
-        <w:rPr>
-          <w:b w:val="0"/>
-          <w:bCs w:val="0"/>
-          <w:color w:val="000000" w:themeColor="text1"/>
-          <w:sz w:val="22"/>
-          <w:szCs w:val="22"/>
-        </w:rPr>
-        <w:t>.</w:t>
-      </w:r>
-    </w:p>
-    <w:p>
-      <w:pPr>
-        <w:pStyle w:val="Heading1"/>
-        <w:numPr>
-          <w:ilvl w:val="0"/>
-          <w:numId w:val="1"/>
-        </w:numPr>
-        <w:tabs>
-          <w:tab w:val="left" w:pos="752"/>
-        </w:tabs>
-        <w:spacing w:before="160"/>
-        <w:ind w:left="180" w:right="1584" w:firstLine="360"/>
-        <w:rPr>
-          <w:sz w:val="22"/>
-          <w:szCs w:val="22"/>
-        </w:rPr>
-      </w:pPr>
-      <w:r>
-        <w:rPr>
-          <w:sz w:val="22"/>
-          <w:szCs w:val="22"/>
-        </w:rPr>
-        <w:t>Publication</w:t>
-      </w:r>
-      <w:r>
-        <w:rPr>
-          <w:spacing w:val="1"/>
-          <w:sz w:val="22"/>
-          <w:szCs w:val="22"/>
-        </w:rPr>
-        <w:t xml:space="preserve"> </w:t>
-      </w:r>
-      <w:r>
-        <w:rPr>
-          <w:sz w:val="22"/>
-          <w:szCs w:val="22"/>
-        </w:rPr>
-        <w:t>Costs</w:t>
-      </w:r>
-    </w:p>
-    <w:p>
-      <w:pPr>
-        <w:pStyle w:val="BodyText"/>
-        <w:spacing w:line="273" w:lineRule="auto"/>
-        <w:ind w:left="180" w:right="1580" w:firstLine="360"/>
-        <w:rPr>
-          <w:sz w:val="22"/>
-          <w:szCs w:val="22"/>
-        </w:rPr>
-      </w:pPr>
-      <w:r>
-        <w:rPr>
-          <w:spacing w:val="-4"/>
-          <w:sz w:val="22"/>
-          <w:szCs w:val="22"/>
-        </w:rPr>
-        <w:t xml:space="preserve">We </w:t>
-      </w:r>
-      <w:r>
-        <w:rPr>
-          <w:sz w:val="22"/>
-          <w:szCs w:val="22"/>
-        </w:rPr>
-        <w:t xml:space="preserve">plan </w:t>
-      </w:r>
-      <w:r>
-        <w:rPr>
-          <w:spacing w:val="-3"/>
-          <w:sz w:val="22"/>
-          <w:szCs w:val="22"/>
-        </w:rPr>
-        <w:t xml:space="preserve">for </w:t>
-      </w:r>
-      <w:r>
-        <w:rPr>
-          <w:sz w:val="22"/>
-          <w:szCs w:val="22"/>
-        </w:rPr>
-        <w:t>five</w:t>
-      </w:r>
-      <w:r>
-        <w:rPr>
-          <w:sz w:val="22"/>
-          <w:szCs w:val="22"/>
-        </w:rPr>
-        <w:t xml:space="preserve"> </w:t>
-      </w:r>
-      <w:r>
-        <w:rPr>
-          <w:sz w:val="22"/>
-          <w:szCs w:val="22"/>
-        </w:rPr>
-        <w:t xml:space="preserve">publications to be produced </w:t>
-      </w:r>
-      <w:r>
-        <w:rPr>
-          <w:spacing w:val="-3"/>
-          <w:sz w:val="22"/>
-          <w:szCs w:val="22"/>
-        </w:rPr>
-        <w:t xml:space="preserve">by </w:t>
-      </w:r>
-      <w:r>
-        <w:rPr>
-          <w:sz w:val="22"/>
-          <w:szCs w:val="22"/>
-        </w:rPr>
-        <w:t xml:space="preserve">this project. </w:t>
-      </w:r>
-      <w:r>
-        <w:rPr>
-          <w:spacing w:val="-4"/>
-          <w:sz w:val="22"/>
-          <w:szCs w:val="22"/>
-        </w:rPr>
-        <w:t xml:space="preserve">We </w:t>
-      </w:r>
-      <w:r>
-        <w:rPr>
-          <w:sz w:val="22"/>
-          <w:szCs w:val="22"/>
-        </w:rPr>
-        <w:t>will likely submit to the “American Astronomical Society Journals”. Assuming an</w:t>
-      </w:r>
-      <w:r>
-        <w:rPr>
-          <w:spacing w:val="5"/>
-          <w:sz w:val="22"/>
-          <w:szCs w:val="22"/>
-        </w:rPr>
-        <w:t xml:space="preserve"> </w:t>
-      </w:r>
-      <w:r>
-        <w:rPr>
-          <w:sz w:val="22"/>
-          <w:szCs w:val="22"/>
-        </w:rPr>
-        <w:t>average</w:t>
-      </w:r>
-      <w:r>
-        <w:rPr>
-          <w:spacing w:val="5"/>
-          <w:sz w:val="22"/>
-          <w:szCs w:val="22"/>
-        </w:rPr>
-        <w:t xml:space="preserve"> </w:t>
-      </w:r>
-      <w:r>
-        <w:rPr>
-          <w:sz w:val="22"/>
-          <w:szCs w:val="22"/>
-        </w:rPr>
-        <w:t>of</w:t>
-      </w:r>
-      <w:r>
-        <w:rPr>
-          <w:spacing w:val="6"/>
-          <w:sz w:val="22"/>
-          <w:szCs w:val="22"/>
-        </w:rPr>
-        <w:t xml:space="preserve"> </w:t>
-      </w:r>
-      <w:r>
-        <w:rPr>
-          <w:sz w:val="22"/>
-          <w:szCs w:val="22"/>
-        </w:rPr>
-        <w:t>$1,</w:t>
-      </w:r>
-      <w:r>
-        <w:rPr>
-          <w:sz w:val="22"/>
-          <w:szCs w:val="22"/>
-        </w:rPr>
-        <w:t>9</w:t>
-      </w:r>
-      <w:r>
-        <w:rPr>
-          <w:sz w:val="22"/>
-          <w:szCs w:val="22"/>
-        </w:rPr>
-        <w:t>00</w:t>
-      </w:r>
-      <w:r>
-        <w:rPr>
-          <w:spacing w:val="5"/>
-          <w:sz w:val="22"/>
-          <w:szCs w:val="22"/>
-        </w:rPr>
-        <w:t xml:space="preserve"> </w:t>
-      </w:r>
-      <w:r>
-        <w:rPr>
-          <w:sz w:val="22"/>
-          <w:szCs w:val="22"/>
-        </w:rPr>
-        <w:t>per</w:t>
-      </w:r>
-      <w:r>
-        <w:rPr>
-          <w:spacing w:val="6"/>
-          <w:sz w:val="22"/>
-          <w:szCs w:val="22"/>
-        </w:rPr>
-        <w:t xml:space="preserve"> </w:t>
-      </w:r>
-      <w:r>
-        <w:rPr>
-          <w:sz w:val="22"/>
-          <w:szCs w:val="22"/>
-        </w:rPr>
-        <w:t>article</w:t>
-      </w:r>
-      <w:r>
-        <w:rPr>
-          <w:sz w:val="22"/>
-          <w:szCs w:val="22"/>
-        </w:rPr>
-        <w:t xml:space="preserve"> ($</w:t>
-      </w:r>
-      <w:r>
-        <w:rPr>
-          <w:sz w:val="22"/>
-          <w:szCs w:val="22"/>
-        </w:rPr>
-        <w:t>9</w:t>
-      </w:r>
-      <w:r>
-        <w:rPr>
-          <w:sz w:val="22"/>
-          <w:szCs w:val="22"/>
-        </w:rPr>
-        <w:t>,</w:t>
-      </w:r>
-      <w:r>
-        <w:rPr>
-          <w:sz w:val="22"/>
-          <w:szCs w:val="22"/>
-        </w:rPr>
-        <w:t>5</w:t>
-      </w:r>
-      <w:r>
-        <w:rPr>
-          <w:sz w:val="22"/>
-          <w:szCs w:val="22"/>
-        </w:rPr>
-        <w:t>00 total for the project)</w:t>
-      </w:r>
-      <w:r>
-        <w:rPr>
-          <w:sz w:val="22"/>
-          <w:szCs w:val="22"/>
-        </w:rPr>
-        <w:t>,</w:t>
-      </w:r>
-      <w:r>
-        <w:rPr>
-          <w:spacing w:val="5"/>
-          <w:sz w:val="22"/>
-          <w:szCs w:val="22"/>
-        </w:rPr>
-        <w:t xml:space="preserve"> </w:t>
-      </w:r>
-      <w:r>
-        <w:rPr>
-          <w:sz w:val="22"/>
-          <w:szCs w:val="22"/>
-        </w:rPr>
-        <w:t>based</w:t>
-      </w:r>
-      <w:r>
-        <w:rPr>
-          <w:spacing w:val="6"/>
-          <w:sz w:val="22"/>
-          <w:szCs w:val="22"/>
-        </w:rPr>
-        <w:t xml:space="preserve"> </w:t>
-      </w:r>
-      <w:r>
-        <w:rPr>
-          <w:sz w:val="22"/>
-          <w:szCs w:val="22"/>
-        </w:rPr>
-        <w:t>on</w:t>
-      </w:r>
-      <w:r>
-        <w:rPr>
-          <w:spacing w:val="5"/>
-          <w:sz w:val="22"/>
-          <w:szCs w:val="22"/>
-        </w:rPr>
-        <w:t xml:space="preserve"> </w:t>
-      </w:r>
-      <w:r>
-        <w:rPr>
-          <w:sz w:val="22"/>
-          <w:szCs w:val="22"/>
-        </w:rPr>
-        <w:t>averages</w:t>
-      </w:r>
-      <w:r>
-        <w:rPr>
-          <w:spacing w:val="5"/>
-          <w:sz w:val="22"/>
-          <w:szCs w:val="22"/>
-        </w:rPr>
-        <w:t xml:space="preserve"> </w:t>
-      </w:r>
-      <w:r>
-        <w:rPr>
-          <w:sz w:val="22"/>
-          <w:szCs w:val="22"/>
-        </w:rPr>
-        <w:t>of</w:t>
-      </w:r>
-      <w:r>
-        <w:rPr>
-          <w:spacing w:val="6"/>
-          <w:sz w:val="22"/>
-          <w:szCs w:val="22"/>
-        </w:rPr>
-        <w:t xml:space="preserve"> </w:t>
-      </w:r>
-      <w:r>
-        <w:rPr>
-          <w:sz w:val="22"/>
-          <w:szCs w:val="22"/>
-        </w:rPr>
-        <w:t>past</w:t>
-      </w:r>
-      <w:r>
-        <w:rPr>
-          <w:spacing w:val="5"/>
-          <w:sz w:val="22"/>
-          <w:szCs w:val="22"/>
-        </w:rPr>
-        <w:t xml:space="preserve"> </w:t>
-      </w:r>
-      <w:r>
-        <w:rPr>
-          <w:sz w:val="22"/>
-          <w:szCs w:val="22"/>
-        </w:rPr>
-        <w:t>publications</w:t>
-      </w:r>
-      <w:r>
-        <w:rPr>
-          <w:spacing w:val="6"/>
-          <w:sz w:val="22"/>
-          <w:szCs w:val="22"/>
-        </w:rPr>
-        <w:t xml:space="preserve"> </w:t>
-      </w:r>
-      <w:r>
-        <w:rPr>
-          <w:sz w:val="22"/>
-          <w:szCs w:val="22"/>
-        </w:rPr>
-        <w:t>from</w:t>
-      </w:r>
-      <w:r>
-        <w:rPr>
-          <w:spacing w:val="5"/>
-          <w:sz w:val="22"/>
-          <w:szCs w:val="22"/>
-        </w:rPr>
-        <w:t xml:space="preserve"> </w:t>
-      </w:r>
-      <w:r>
-        <w:rPr>
-          <w:sz w:val="22"/>
-          <w:szCs w:val="22"/>
-        </w:rPr>
-        <w:t>our</w:t>
-      </w:r>
-      <w:r>
-        <w:rPr>
-          <w:spacing w:val="6"/>
-          <w:sz w:val="22"/>
-          <w:szCs w:val="22"/>
-        </w:rPr>
-        <w:t xml:space="preserve"> </w:t>
-      </w:r>
-      <w:r>
-        <w:rPr>
-          <w:sz w:val="22"/>
-          <w:szCs w:val="22"/>
-        </w:rPr>
-        <w:t>group.</w:t>
-      </w:r>
-      <w:r>
-        <w:rPr>
-          <w:sz w:val="22"/>
-          <w:szCs w:val="22"/>
-        </w:rPr>
-        <w:t xml:space="preserve"> The expected schedule of publications is as follows (see work plan in project description):</w:t>
-      </w:r>
-    </w:p>
-    <w:tbl>
-      <w:tblPr>
-        <w:tblStyle w:val="PlainTable5"/>
-        <w:tblW w:w="0" w:type="auto"/>
-        <w:tblInd w:w="1899" w:type="dxa"/>
-        <w:tblLayout w:type="fixed"/>
-        <w:tblLook w:val="0600" w:firstRow="0" w:lastRow="0" w:firstColumn="0" w:lastColumn="0" w:noHBand="1" w:noVBand="1"/>
-      </w:tblPr>
-      <w:tblGrid>
-        <w:gridCol w:w="1611"/>
-        <w:gridCol w:w="3358"/>
-      </w:tblGrid>
-      <w:tr>
-        <w:tc>
-          <w:tcPr>
-            <w:tcW w:w="1611" w:type="dxa"/>
-            <w:shd w:val="clear" w:color="auto" w:fill="auto"/>
-          </w:tcPr>
-          <w:p>
-            <w:pPr>
-              <w:pStyle w:val="BodyText"/>
-              <w:spacing w:before="0" w:line="288" w:lineRule="auto"/>
-              <w:ind w:left="180" w:right="-20" w:firstLine="360"/>
-              <w:jc w:val="center"/>
-              <w:rPr>
-                <w:color w:val="000000" w:themeColor="text1"/>
-                <w:sz w:val="22"/>
-                <w:szCs w:val="22"/>
-              </w:rPr>
-            </w:pPr>
-            <w:r>
-              <w:rPr>
-                <w:color w:val="000000" w:themeColor="text1"/>
-                <w:sz w:val="22"/>
-                <w:szCs w:val="22"/>
-              </w:rPr>
-              <w:t>Year 1</w:t>
-            </w:r>
-          </w:p>
-        </w:tc>
-        <w:tc>
-          <w:tcPr>
-            <w:tcW w:w="3358" w:type="dxa"/>
-          </w:tcPr>
-          <w:p>
-            <w:pPr>
-              <w:pStyle w:val="BodyText"/>
-              <w:spacing w:before="0" w:line="288" w:lineRule="auto"/>
-              <w:ind w:left="180" w:right="1263" w:firstLine="360"/>
-              <w:jc w:val="left"/>
-              <w:rPr>
-                <w:color w:val="000000" w:themeColor="text1"/>
-                <w:sz w:val="22"/>
-                <w:szCs w:val="22"/>
-              </w:rPr>
-            </w:pPr>
-            <w:r>
-              <w:rPr>
-                <w:color w:val="000000" w:themeColor="text1"/>
-                <w:sz w:val="22"/>
-                <w:szCs w:val="22"/>
-              </w:rPr>
-              <w:t>1 publication</w:t>
-            </w:r>
-          </w:p>
-        </w:tc>
-      </w:tr>
-      <w:tr>
-        <w:tc>
-          <w:tcPr>
-            <w:tcW w:w="1611" w:type="dxa"/>
-          </w:tcPr>
-          <w:p>
-            <w:pPr>
-              <w:pStyle w:val="BodyText"/>
-              <w:spacing w:before="0" w:line="288" w:lineRule="auto"/>
-              <w:ind w:left="180" w:right="-20" w:firstLine="360"/>
-              <w:jc w:val="center"/>
-              <w:rPr>
-                <w:color w:val="000000" w:themeColor="text1"/>
-                <w:sz w:val="22"/>
-                <w:szCs w:val="22"/>
-              </w:rPr>
-            </w:pPr>
-            <w:r>
-              <w:rPr>
-                <w:color w:val="000000" w:themeColor="text1"/>
-                <w:sz w:val="22"/>
-                <w:szCs w:val="22"/>
-              </w:rPr>
-              <w:t>Year 2</w:t>
-            </w:r>
-          </w:p>
-        </w:tc>
-        <w:tc>
-          <w:tcPr>
-            <w:tcW w:w="3358" w:type="dxa"/>
-          </w:tcPr>
-          <w:p>
-            <w:pPr>
-              <w:pStyle w:val="BodyText"/>
-              <w:spacing w:before="0" w:line="288" w:lineRule="auto"/>
-              <w:ind w:left="180" w:right="1263" w:firstLine="360"/>
-              <w:jc w:val="left"/>
-              <w:rPr>
-                <w:color w:val="000000" w:themeColor="text1"/>
-                <w:sz w:val="22"/>
-                <w:szCs w:val="22"/>
-              </w:rPr>
-            </w:pPr>
-            <w:r>
-              <w:rPr>
-                <w:color w:val="000000" w:themeColor="text1"/>
-                <w:sz w:val="22"/>
-                <w:szCs w:val="22"/>
-              </w:rPr>
-              <w:t>2</w:t>
-            </w:r>
-            <w:r>
-              <w:rPr>
-                <w:color w:val="000000" w:themeColor="text1"/>
-                <w:sz w:val="22"/>
-                <w:szCs w:val="22"/>
-              </w:rPr>
-              <w:t xml:space="preserve"> </w:t>
-            </w:r>
-            <w:proofErr w:type="gramStart"/>
-            <w:r>
-              <w:rPr>
-                <w:color w:val="000000" w:themeColor="text1"/>
-                <w:sz w:val="22"/>
-                <w:szCs w:val="22"/>
-              </w:rPr>
-              <w:t>publication</w:t>
-            </w:r>
-            <w:proofErr w:type="gramEnd"/>
-          </w:p>
-        </w:tc>
-      </w:tr>
-      <w:tr>
-        <w:tc>
-          <w:tcPr>
-            <w:tcW w:w="1611" w:type="dxa"/>
-          </w:tcPr>
-          <w:p>
-            <w:pPr>
-              <w:pStyle w:val="BodyText"/>
-              <w:spacing w:before="0" w:line="288" w:lineRule="auto"/>
-              <w:ind w:left="180" w:right="-20" w:firstLine="360"/>
-              <w:jc w:val="center"/>
-              <w:rPr>
-                <w:color w:val="000000" w:themeColor="text1"/>
-                <w:sz w:val="22"/>
-                <w:szCs w:val="22"/>
-              </w:rPr>
-            </w:pPr>
-            <w:r>
-              <w:rPr>
-                <w:color w:val="000000" w:themeColor="text1"/>
-                <w:sz w:val="22"/>
-                <w:szCs w:val="22"/>
-              </w:rPr>
-              <w:t>Year 3</w:t>
-            </w:r>
-          </w:p>
-        </w:tc>
-        <w:tc>
-          <w:tcPr>
-            <w:tcW w:w="3358" w:type="dxa"/>
-          </w:tcPr>
-          <w:p>
-            <w:pPr>
-              <w:pStyle w:val="BodyText"/>
-              <w:spacing w:before="0" w:line="288" w:lineRule="auto"/>
-              <w:ind w:left="180" w:right="1263" w:firstLine="360"/>
-              <w:jc w:val="left"/>
-              <w:rPr>
-                <w:color w:val="000000" w:themeColor="text1"/>
-                <w:sz w:val="22"/>
-                <w:szCs w:val="22"/>
-              </w:rPr>
-            </w:pPr>
-            <w:r>
-              <w:rPr>
-                <w:color w:val="000000" w:themeColor="text1"/>
-                <w:sz w:val="22"/>
-                <w:szCs w:val="22"/>
-              </w:rPr>
-              <w:t>2</w:t>
-            </w:r>
-            <w:r>
-              <w:rPr>
-                <w:color w:val="000000" w:themeColor="text1"/>
-                <w:sz w:val="22"/>
-                <w:szCs w:val="22"/>
-              </w:rPr>
-              <w:t xml:space="preserve"> </w:t>
-            </w:r>
-            <w:r>
-              <w:rPr>
-                <w:color w:val="000000" w:themeColor="text1"/>
-                <w:sz w:val="22"/>
-                <w:szCs w:val="22"/>
-              </w:rPr>
-              <w:t>publications</w:t>
-            </w:r>
-          </w:p>
-        </w:tc>
-      </w:tr>
-    </w:tbl>
-    <w:p>
-      <w:pPr>
-        <w:pStyle w:val="Heading1"/>
-        <w:numPr>
-          <w:ilvl w:val="0"/>
-          <w:numId w:val="1"/>
-        </w:numPr>
-        <w:tabs>
-          <w:tab w:val="left" w:pos="752"/>
-        </w:tabs>
-        <w:spacing w:before="160"/>
-        <w:ind w:left="180" w:right="1584" w:firstLine="360"/>
-        <w:rPr>
-          <w:sz w:val="22"/>
-          <w:szCs w:val="22"/>
-        </w:rPr>
-      </w:pPr>
-      <w:r>
-        <w:rPr>
-          <w:sz w:val="22"/>
-          <w:szCs w:val="22"/>
-        </w:rPr>
-        <w:t>Indirect</w:t>
-      </w:r>
-      <w:r>
-        <w:rPr>
-          <w:spacing w:val="1"/>
-          <w:sz w:val="22"/>
-          <w:szCs w:val="22"/>
-        </w:rPr>
-        <w:t xml:space="preserve"> </w:t>
-      </w:r>
-      <w:r>
-        <w:rPr>
-          <w:sz w:val="22"/>
-          <w:szCs w:val="22"/>
+          <w:sz w:val="24"/>
+          <w:szCs w:val="24"/>
         </w:rPr>
         <w:t>Costs:</w:t>
       </w:r>
@@ -3806,22 +2338,22 @@
         <w:spacing w:line="288" w:lineRule="auto"/>
         <w:ind w:left="180" w:right="1580" w:firstLine="360"/>
         <w:rPr>
-          <w:sz w:val="22"/>
-          <w:szCs w:val="22"/>
-        </w:rPr>
-      </w:pPr>
-      <w:r>
-        <w:rPr>
-          <w:sz w:val="22"/>
-          <w:szCs w:val="22"/>
+          <w:sz w:val="24"/>
+          <w:szCs w:val="24"/>
+        </w:rPr>
+      </w:pPr>
+      <w:r>
+        <w:rPr>
+          <w:sz w:val="24"/>
+          <w:szCs w:val="24"/>
         </w:rPr>
         <w:t xml:space="preserve">Indirect costs were estimated in </w:t>
       </w:r>
       <w:r>
         <w:rPr>
           <w:color w:val="000000" w:themeColor="text1"/>
-          <w:sz w:val="22"/>
-          <w:szCs w:val="22"/>
+          <w:sz w:val="24"/>
+          <w:szCs w:val="24"/>
         </w:rPr>
         <w:t xml:space="preserve">accordance with </w:t>
       </w:r>
@@ -3829,8 +2361,8 @@
         <w:rPr>
           <w:color w:val="000000" w:themeColor="text1"/>
           <w:spacing w:val="-3"/>
-          <w:sz w:val="22"/>
-          <w:szCs w:val="22"/>
+          <w:sz w:val="24"/>
+          <w:szCs w:val="24"/>
         </w:rPr>
         <w:t>the PI institution’s</w:t>
       </w:r>
@@ -3838,8 +2370,8 @@
         <w:rPr>
           <w:color w:val="000000" w:themeColor="text1"/>
           <w:spacing w:val="-3"/>
-          <w:sz w:val="22"/>
-          <w:szCs w:val="22"/>
+          <w:sz w:val="24"/>
+          <w:szCs w:val="24"/>
         </w:rPr>
         <w:t xml:space="preserve"> rate agreement, which was approved by DHHS, the Federal Cognizant Audit Agency on </w:t>
       </w:r>
@@ -3847,8 +2379,8 @@
         <w:rPr>
           <w:color w:val="000000" w:themeColor="text1"/>
           <w:spacing w:val="-3"/>
-          <w:sz w:val="22"/>
-          <w:szCs w:val="22"/>
+          <w:sz w:val="24"/>
+          <w:szCs w:val="24"/>
         </w:rPr>
         <w:t>09/30/2020</w:t>
       </w:r>
@@ -3856,8 +2388,8 @@
         <w:rPr>
           <w:color w:val="000000" w:themeColor="text1"/>
           <w:spacing w:val="-3"/>
-          <w:sz w:val="22"/>
-          <w:szCs w:val="22"/>
+          <w:sz w:val="24"/>
+          <w:szCs w:val="24"/>
         </w:rPr>
         <w:t>.</w:t>
       </w:r>
@@ -3865,8 +2397,8 @@
         <w:rPr>
           <w:color w:val="000000" w:themeColor="text1"/>
           <w:spacing w:val="-3"/>
-          <w:sz w:val="22"/>
-          <w:szCs w:val="22"/>
+          <w:sz w:val="24"/>
+          <w:szCs w:val="24"/>
         </w:rPr>
         <w:t xml:space="preserve"> The rate of 56% MTDC was used based on the nature of the proposed work. </w:t>
       </w:r>

</xml_diff>

<commit_message>
ADAP 2023: Fix typos in budget justifications
</commit_message>
<xml_diff>
--- a/budget/budget_justification.docx
+++ b/budget/budget_justification.docx
@@ -1,14 +1,14 @@
 
 <file path=word/document.xml><?xml version="1.0" encoding="utf-8"?>
-<w:document xmlns:o="urn:schemas-microsoft-com:office:office" xmlns:r="http://schemas.openxmlformats.org/officeDocument/2006/relationships" xmlns:v="urn:schemas-microsoft-com:vml" xmlns:w="http://schemas.openxmlformats.org/wordprocessingml/2006/main" xmlns:w10="urn:schemas-microsoft-com:office:word" xmlns:wp="http://schemas.openxmlformats.org/drawingml/2006/wordprocessingDrawing" xmlns:wps="http://schemas.microsoft.com/office/word/2010/wordprocessingShape" xmlns:wpg="http://schemas.microsoft.com/office/word/2010/wordprocessingGroup" xmlns:mc="http://schemas.openxmlformats.org/markup-compatibility/2006" xmlns:wp14="http://schemas.microsoft.com/office/word/2010/wordprocessingDrawing" xmlns:w14="http://schemas.microsoft.com/office/word/2010/wordml" mc:Ignorable="w14 wp14">
+<w:document xmlns:wpc="http://schemas.microsoft.com/office/word/2010/wordprocessingCanvas" xmlns:cx="http://schemas.microsoft.com/office/drawing/2014/chartex" xmlns:cx1="http://schemas.microsoft.com/office/drawing/2015/9/8/chartex" xmlns:cx2="http://schemas.microsoft.com/office/drawing/2015/10/21/chartex" xmlns:cx3="http://schemas.microsoft.com/office/drawing/2016/5/9/chartex" xmlns:cx4="http://schemas.microsoft.com/office/drawing/2016/5/10/chartex" xmlns:cx5="http://schemas.microsoft.com/office/drawing/2016/5/11/chartex" xmlns:cx6="http://schemas.microsoft.com/office/drawing/2016/5/12/chartex" xmlns:cx7="http://schemas.microsoft.com/office/drawing/2016/5/13/chartex" xmlns:cx8="http://schemas.microsoft.com/office/drawing/2016/5/14/chartex" xmlns:mc="http://schemas.openxmlformats.org/markup-compatibility/2006" xmlns:aink="http://schemas.microsoft.com/office/drawing/2016/ink" xmlns:am3d="http://schemas.microsoft.com/office/drawing/2017/model3d" xmlns:o="urn:schemas-microsoft-com:office:office" xmlns:oel="http://schemas.microsoft.com/office/2019/extlst" xmlns:r="http://schemas.openxmlformats.org/officeDocument/2006/relationships" xmlns:m="http://schemas.openxmlformats.org/officeDocument/2006/math" xmlns:v="urn:schemas-microsoft-com:vml" xmlns:wp14="http://schemas.microsoft.com/office/word/2010/wordprocessingDrawing" xmlns:wp="http://schemas.openxmlformats.org/drawingml/2006/wordprocessingDrawing" xmlns:w10="urn:schemas-microsoft-com:office:word" xmlns:w="http://schemas.openxmlformats.org/wordprocessingml/2006/main" xmlns:w14="http://schemas.microsoft.com/office/word/2010/wordml" xmlns:w15="http://schemas.microsoft.com/office/word/2012/wordml" xmlns:w16cex="http://schemas.microsoft.com/office/word/2018/wordml/cex" xmlns:w16cid="http://schemas.microsoft.com/office/word/2016/wordml/cid" xmlns:w16="http://schemas.microsoft.com/office/word/2018/wordml" xmlns:w16sdtdh="http://schemas.microsoft.com/office/word/2020/wordml/sdtdatahash" xmlns:w16se="http://schemas.microsoft.com/office/word/2015/wordml/symex" xmlns:wpg="http://schemas.microsoft.com/office/word/2010/wordprocessingGroup" xmlns:wpi="http://schemas.microsoft.com/office/word/2010/wordprocessingInk" xmlns:wne="http://schemas.microsoft.com/office/word/2006/wordml" xmlns:wps="http://schemas.microsoft.com/office/word/2010/wordprocessingShape" mc:Ignorable="w14 w15 w16se w16cid w16 w16cex w16sdtdh wp14">
   <w:body>
     <w:p>
       <w:pPr>
         <w:pStyle w:val="Heading1"/>
         <w:tabs>
-          <w:tab w:val="left" w:pos="572" w:leader="none"/>
+          <w:tab w:val="left" w:pos="572"/>
         </w:tabs>
-        <w:spacing w:before="97" w:after="0"/>
+        <w:spacing w:before="97"/>
         <w:ind w:left="180" w:right="1580" w:firstLine="360"/>
         <w:jc w:val="center"/>
         <w:rPr>
@@ -49,9 +49,9 @@
       <w:pPr>
         <w:pStyle w:val="Heading1"/>
         <w:tabs>
-          <w:tab w:val="left" w:pos="572" w:leader="none"/>
+          <w:tab w:val="left" w:pos="572"/>
         </w:tabs>
-        <w:spacing w:before="97" w:after="0"/>
+        <w:spacing w:before="97"/>
         <w:ind w:left="180" w:right="1580" w:firstLine="360"/>
         <w:jc w:val="center"/>
         <w:rPr>
@@ -59,17 +59,11 @@
           <w:szCs w:val="28"/>
         </w:rPr>
       </w:pPr>
-      <w:r>
-        <w:rPr>
-          <w:sz w:val="28"/>
-          <w:szCs w:val="28"/>
-        </w:rPr>
-      </w:r>
     </w:p>
     <w:p>
       <w:pPr>
-        <w:pStyle w:val="TextBody"/>
-        <w:spacing w:lineRule="auto" w:line="288"/>
+        <w:pStyle w:val="BodyText"/>
+        <w:spacing w:line="288" w:lineRule="auto"/>
         <w:ind w:left="180" w:right="1580" w:firstLine="360"/>
         <w:rPr>
           <w:color w:val="000000" w:themeColor="text1"/>
@@ -93,22 +87,141 @@
           <w:szCs w:val="24"/>
         </w:rPr>
         <w:softHyphen/>
+      </w:r>
+      <w:r>
+        <w:rPr>
+          <w:color w:val="000000" w:themeColor="text1"/>
+          <w:sz w:val="24"/>
+          <w:szCs w:val="24"/>
+        </w:rPr>
         <w:softHyphen/>
+      </w:r>
+      <w:r>
+        <w:rPr>
+          <w:color w:val="000000" w:themeColor="text1"/>
+          <w:sz w:val="24"/>
+          <w:szCs w:val="24"/>
+        </w:rPr>
         <w:softHyphen/>
+      </w:r>
+      <w:r>
+        <w:rPr>
+          <w:color w:val="000000" w:themeColor="text1"/>
+          <w:sz w:val="24"/>
+          <w:szCs w:val="24"/>
+        </w:rPr>
         <w:softHyphen/>
+      </w:r>
+      <w:r>
+        <w:rPr>
+          <w:color w:val="000000" w:themeColor="text1"/>
+          <w:sz w:val="24"/>
+          <w:szCs w:val="24"/>
+        </w:rPr>
         <w:softHyphen/>
+      </w:r>
+      <w:r>
+        <w:rPr>
+          <w:color w:val="000000" w:themeColor="text1"/>
+          <w:sz w:val="24"/>
+          <w:szCs w:val="24"/>
+        </w:rPr>
         <w:softHyphen/>
+      </w:r>
+      <w:r>
+        <w:rPr>
+          <w:color w:val="000000" w:themeColor="text1"/>
+          <w:sz w:val="24"/>
+          <w:szCs w:val="24"/>
+        </w:rPr>
         <w:softHyphen/>
+      </w:r>
+      <w:r>
+        <w:rPr>
+          <w:color w:val="000000" w:themeColor="text1"/>
+          <w:sz w:val="24"/>
+          <w:szCs w:val="24"/>
+        </w:rPr>
         <w:softHyphen/>
+      </w:r>
+      <w:r>
+        <w:rPr>
+          <w:color w:val="000000" w:themeColor="text1"/>
+          <w:sz w:val="24"/>
+          <w:szCs w:val="24"/>
+        </w:rPr>
         <w:softHyphen/>
+      </w:r>
+      <w:r>
+        <w:rPr>
+          <w:color w:val="000000" w:themeColor="text1"/>
+          <w:sz w:val="24"/>
+          <w:szCs w:val="24"/>
+        </w:rPr>
         <w:softHyphen/>
+      </w:r>
+      <w:r>
+        <w:rPr>
+          <w:color w:val="000000" w:themeColor="text1"/>
+          <w:sz w:val="24"/>
+          <w:szCs w:val="24"/>
+        </w:rPr>
         <w:softHyphen/>
+      </w:r>
+      <w:r>
+        <w:rPr>
+          <w:color w:val="000000" w:themeColor="text1"/>
+          <w:sz w:val="24"/>
+          <w:szCs w:val="24"/>
+        </w:rPr>
         <w:softHyphen/>
+      </w:r>
+      <w:r>
+        <w:rPr>
+          <w:color w:val="000000" w:themeColor="text1"/>
+          <w:sz w:val="24"/>
+          <w:szCs w:val="24"/>
+        </w:rPr>
         <w:softHyphen/>
+      </w:r>
+      <w:r>
+        <w:rPr>
+          <w:color w:val="000000" w:themeColor="text1"/>
+          <w:sz w:val="24"/>
+          <w:szCs w:val="24"/>
+        </w:rPr>
         <w:softHyphen/>
+      </w:r>
+      <w:r>
+        <w:rPr>
+          <w:color w:val="000000" w:themeColor="text1"/>
+          <w:sz w:val="24"/>
+          <w:szCs w:val="24"/>
+        </w:rPr>
         <w:softHyphen/>
+      </w:r>
+      <w:r>
+        <w:rPr>
+          <w:color w:val="000000" w:themeColor="text1"/>
+          <w:sz w:val="24"/>
+          <w:szCs w:val="24"/>
+        </w:rPr>
         <w:softHyphen/>
+      </w:r>
+      <w:r>
+        <w:rPr>
+          <w:color w:val="000000" w:themeColor="text1"/>
+          <w:sz w:val="24"/>
+          <w:szCs w:val="24"/>
+        </w:rPr>
         <w:softHyphen/>
+      </w:r>
+      <w:r>
+        <w:rPr>
+          <w:color w:val="000000" w:themeColor="text1"/>
+          <w:sz w:val="24"/>
+          <w:szCs w:val="24"/>
+        </w:rPr>
         <w:softHyphen/>
       </w:r>
     </w:p>
@@ -120,9 +233,9 @@
           <w:numId w:val="2"/>
         </w:numPr>
         <w:tabs>
-          <w:tab w:val="left" w:pos="752" w:leader="none"/>
+          <w:tab w:val="left" w:pos="752"/>
         </w:tabs>
-        <w:spacing w:lineRule="exact" w:line="238" w:before="160" w:after="0"/>
+        <w:spacing w:before="160" w:line="238" w:lineRule="exact"/>
         <w:ind w:left="180" w:right="1584" w:firstLine="360"/>
         <w:rPr>
           <w:sz w:val="24"/>
@@ -154,8 +267,8 @@
     </w:p>
     <w:p>
       <w:pPr>
-        <w:pStyle w:val="TextBody"/>
-        <w:spacing w:lineRule="auto" w:line="288" w:before="48" w:after="0"/>
+        <w:pStyle w:val="BodyText"/>
+        <w:spacing w:before="48" w:line="288" w:lineRule="auto"/>
         <w:ind w:left="180" w:right="1580" w:firstLine="360"/>
         <w:rPr>
           <w:sz w:val="24"/>
@@ -178,9 +291,9 @@
           <w:numId w:val="2"/>
         </w:numPr>
         <w:tabs>
-          <w:tab w:val="left" w:pos="931" w:leader="none"/>
+          <w:tab w:val="left" w:pos="931"/>
         </w:tabs>
-        <w:spacing w:before="160" w:after="0"/>
+        <w:spacing w:before="160"/>
         <w:ind w:left="180" w:right="1584" w:firstLine="360"/>
         <w:rPr>
           <w:sz w:val="24"/>
@@ -205,9 +318,9 @@
           <w:numId w:val="2"/>
         </w:numPr>
         <w:tabs>
-          <w:tab w:val="left" w:pos="931" w:leader="none"/>
+          <w:tab w:val="left" w:pos="931"/>
         </w:tabs>
-        <w:spacing w:lineRule="auto" w:line="360" w:before="160" w:after="0"/>
+        <w:spacing w:before="160" w:line="360" w:lineRule="auto"/>
         <w:ind w:left="180" w:right="1584" w:firstLine="360"/>
         <w:rPr>
           <w:sz w:val="24"/>
@@ -229,6 +342,7 @@
         </w:rPr>
         <w:t xml:space="preserve">Dr. </w:t>
       </w:r>
+      <w:proofErr w:type="spellStart"/>
       <w:r>
         <w:rPr>
           <w:sz w:val="24"/>
@@ -236,6 +350,7 @@
         </w:rPr>
         <w:t>Kaloyan</w:t>
       </w:r>
+      <w:proofErr w:type="spellEnd"/>
       <w:r>
         <w:rPr>
           <w:spacing w:val="-14"/>
@@ -244,6 +359,7 @@
         </w:rPr>
         <w:t xml:space="preserve"> </w:t>
       </w:r>
+      <w:proofErr w:type="spellStart"/>
       <w:r>
         <w:rPr>
           <w:spacing w:val="-3"/>
@@ -262,11 +378,12 @@
       <w:bookmarkEnd w:id="7"/>
       <w:bookmarkEnd w:id="8"/>
       <w:bookmarkEnd w:id="9"/>
+      <w:proofErr w:type="spellEnd"/>
     </w:p>
     <w:p>
       <w:pPr>
-        <w:pStyle w:val="TextBody"/>
-        <w:spacing w:lineRule="auto" w:line="288" w:before="0" w:after="0"/>
+        <w:pStyle w:val="BodyText"/>
+        <w:spacing w:before="0" w:line="288" w:lineRule="auto"/>
         <w:ind w:left="180" w:right="1580" w:firstLine="360"/>
         <w:rPr>
           <w:color w:val="000000" w:themeColor="text1"/>
@@ -317,13 +434,29 @@
           <w:sz w:val="24"/>
           <w:szCs w:val="24"/>
         </w:rPr>
-        <w:t>, 1 month for each of the three summers.</w:t>
+        <w:t xml:space="preserve">, 1 month for each of the </w:t>
+      </w:r>
+      <w:r>
+        <w:rPr>
+          <w:color w:val="000000" w:themeColor="text1"/>
+          <w:sz w:val="24"/>
+          <w:szCs w:val="24"/>
+        </w:rPr>
+        <w:t>two</w:t>
+      </w:r>
+      <w:r>
+        <w:rPr>
+          <w:color w:val="000000" w:themeColor="text1"/>
+          <w:sz w:val="24"/>
+          <w:szCs w:val="24"/>
+        </w:rPr>
+        <w:t xml:space="preserve"> summers.</w:t>
       </w:r>
     </w:p>
     <w:p>
       <w:pPr>
-        <w:pStyle w:val="TextBody"/>
-        <w:spacing w:lineRule="auto" w:line="288" w:before="0" w:after="0"/>
+        <w:pStyle w:val="BodyText"/>
+        <w:spacing w:before="0" w:line="288" w:lineRule="auto"/>
         <w:ind w:left="180" w:right="1580" w:firstLine="360"/>
         <w:rPr>
           <w:spacing w:val="-3"/>
@@ -458,7 +591,21 @@
           <w:sz w:val="24"/>
           <w:szCs w:val="24"/>
         </w:rPr>
-        <w:t>his institution and an additional summer month of salary is provided for faculty who teach during the Summer term</w:t>
+        <w:t xml:space="preserve">his institution and an additional summer month of salary is provided for faculty who teach during the </w:t>
+      </w:r>
+      <w:r>
+        <w:rPr>
+          <w:sz w:val="24"/>
+          <w:szCs w:val="24"/>
+        </w:rPr>
+        <w:t>summer</w:t>
+      </w:r>
+      <w:r>
+        <w:rPr>
+          <w:sz w:val="24"/>
+          <w:szCs w:val="24"/>
+        </w:rPr>
+        <w:t xml:space="preserve"> term</w:t>
       </w:r>
       <w:r>
         <w:rPr>
@@ -471,8 +618,8 @@
     </w:p>
     <w:p>
       <w:pPr>
-        <w:pStyle w:val="TextBody"/>
-        <w:spacing w:lineRule="auto" w:line="288" w:before="47" w:after="240"/>
+        <w:pStyle w:val="BodyText"/>
+        <w:spacing w:after="240" w:line="288" w:lineRule="auto"/>
         <w:ind w:left="180" w:right="1580" w:firstLine="360"/>
         <w:rPr>
           <w:spacing w:val="-3"/>
@@ -486,18 +633,36 @@
           <w:sz w:val="24"/>
           <w:szCs w:val="24"/>
         </w:rPr>
-        <w:t>As the PI of the project, Dr. Penev will:</w:t>
+        <w:t xml:space="preserve">As the PI of the project, Dr. </w:t>
+      </w:r>
+      <w:proofErr w:type="spellStart"/>
+      <w:r>
+        <w:rPr>
+          <w:spacing w:val="-3"/>
+          <w:sz w:val="24"/>
+          <w:szCs w:val="24"/>
+        </w:rPr>
+        <w:t>Penev</w:t>
+      </w:r>
+      <w:proofErr w:type="spellEnd"/>
+      <w:r>
+        <w:rPr>
+          <w:spacing w:val="-3"/>
+          <w:sz w:val="24"/>
+          <w:szCs w:val="24"/>
+        </w:rPr>
+        <w:t xml:space="preserve"> will:</w:t>
       </w:r>
     </w:p>
     <w:p>
       <w:pPr>
-        <w:pStyle w:val="TextBody"/>
+        <w:pStyle w:val="BodyText"/>
         <w:numPr>
           <w:ilvl w:val="0"/>
           <w:numId w:val="3"/>
         </w:numPr>
-        <w:spacing w:lineRule="auto" w:line="276" w:before="47" w:after="240"/>
-        <w:ind w:left="900" w:right="1580" w:hanging="360"/>
+        <w:spacing w:after="240" w:line="276" w:lineRule="auto"/>
+        <w:ind w:left="900" w:right="1580"/>
         <w:rPr>
           <w:spacing w:val="-3"/>
           <w:sz w:val="24"/>
@@ -515,13 +680,13 @@
     </w:p>
     <w:p>
       <w:pPr>
-        <w:pStyle w:val="TextBody"/>
+        <w:pStyle w:val="BodyText"/>
         <w:numPr>
           <w:ilvl w:val="0"/>
           <w:numId w:val="3"/>
         </w:numPr>
-        <w:spacing w:lineRule="auto" w:line="276" w:before="47" w:after="240"/>
-        <w:ind w:left="900" w:right="1580" w:hanging="360"/>
+        <w:spacing w:after="240" w:line="276" w:lineRule="auto"/>
+        <w:ind w:left="900" w:right="1580"/>
         <w:rPr>
           <w:spacing w:val="-3"/>
           <w:sz w:val="24"/>
@@ -539,13 +704,13 @@
     </w:p>
     <w:p>
       <w:pPr>
-        <w:pStyle w:val="TextBody"/>
+        <w:pStyle w:val="BodyText"/>
         <w:numPr>
           <w:ilvl w:val="0"/>
           <w:numId w:val="3"/>
         </w:numPr>
-        <w:spacing w:lineRule="auto" w:line="276" w:before="47" w:after="240"/>
-        <w:ind w:left="900" w:right="1580" w:hanging="360"/>
+        <w:spacing w:after="240" w:line="276" w:lineRule="auto"/>
+        <w:ind w:left="900" w:right="1580"/>
         <w:rPr>
           <w:spacing w:val="-3"/>
           <w:sz w:val="24"/>
@@ -563,13 +728,13 @@
     </w:p>
     <w:p>
       <w:pPr>
-        <w:pStyle w:val="TextBody"/>
+        <w:pStyle w:val="BodyText"/>
         <w:numPr>
           <w:ilvl w:val="0"/>
           <w:numId w:val="3"/>
         </w:numPr>
-        <w:spacing w:lineRule="auto" w:line="276" w:before="47" w:after="240"/>
-        <w:ind w:left="900" w:right="1580" w:hanging="360"/>
+        <w:spacing w:after="240" w:line="276" w:lineRule="auto"/>
+        <w:ind w:left="900" w:right="1580"/>
         <w:rPr>
           <w:spacing w:val="-3"/>
           <w:sz w:val="24"/>
@@ -587,13 +752,13 @@
     </w:p>
     <w:p>
       <w:pPr>
-        <w:pStyle w:val="TextBody"/>
+        <w:pStyle w:val="BodyText"/>
         <w:numPr>
           <w:ilvl w:val="0"/>
           <w:numId w:val="3"/>
         </w:numPr>
-        <w:spacing w:lineRule="auto" w:line="276" w:before="47" w:after="240"/>
-        <w:ind w:left="900" w:right="1580" w:hanging="360"/>
+        <w:spacing w:after="240" w:line="276" w:lineRule="auto"/>
+        <w:ind w:left="900" w:right="1580"/>
         <w:rPr>
           <w:spacing w:val="-3"/>
           <w:sz w:val="24"/>
@@ -611,13 +776,13 @@
     </w:p>
     <w:p>
       <w:pPr>
-        <w:pStyle w:val="TextBody"/>
+        <w:pStyle w:val="BodyText"/>
         <w:numPr>
           <w:ilvl w:val="0"/>
           <w:numId w:val="3"/>
         </w:numPr>
-        <w:spacing w:lineRule="auto" w:line="276" w:before="47" w:after="240"/>
-        <w:ind w:left="900" w:right="1580" w:hanging="360"/>
+        <w:spacing w:after="240" w:line="276" w:lineRule="auto"/>
+        <w:ind w:left="900" w:right="1580"/>
         <w:rPr>
           <w:spacing w:val="-3"/>
           <w:sz w:val="24"/>
@@ -635,13 +800,13 @@
     </w:p>
     <w:p>
       <w:pPr>
-        <w:pStyle w:val="TextBody"/>
+        <w:pStyle w:val="BodyText"/>
         <w:numPr>
           <w:ilvl w:val="0"/>
           <w:numId w:val="3"/>
         </w:numPr>
-        <w:spacing w:lineRule="auto" w:line="276" w:before="47" w:after="240"/>
-        <w:ind w:left="900" w:right="1580" w:hanging="360"/>
+        <w:spacing w:after="240" w:line="276" w:lineRule="auto"/>
+        <w:ind w:left="900" w:right="1580"/>
         <w:rPr>
           <w:spacing w:val="-3"/>
           <w:sz w:val="24"/>
@@ -659,41 +824,27 @@
     </w:p>
     <w:p>
       <w:pPr>
-        <w:pStyle w:val="TextBody"/>
-        <w:spacing w:lineRule="auto" w:line="276" w:before="47" w:after="240"/>
-        <w:ind w:left="900" w:right="1580" w:hanging="0"/>
+        <w:pStyle w:val="BodyText"/>
+        <w:spacing w:after="240" w:line="276" w:lineRule="auto"/>
+        <w:ind w:left="900" w:right="1580"/>
         <w:rPr>
           <w:spacing w:val="-3"/>
           <w:sz w:val="24"/>
           <w:szCs w:val="24"/>
         </w:rPr>
       </w:pPr>
-      <w:r>
-        <w:rPr>
-          <w:spacing w:val="-3"/>
-          <w:sz w:val="24"/>
-          <w:szCs w:val="24"/>
-        </w:rPr>
-      </w:r>
     </w:p>
     <w:p>
       <w:pPr>
-        <w:pStyle w:val="TextBody"/>
-        <w:spacing w:lineRule="auto" w:line="276" w:before="47" w:after="240"/>
-        <w:ind w:left="900" w:right="1580" w:hanging="0"/>
+        <w:pStyle w:val="BodyText"/>
+        <w:spacing w:after="240" w:line="276" w:lineRule="auto"/>
+        <w:ind w:left="900" w:right="1580"/>
         <w:rPr>
           <w:spacing w:val="-3"/>
           <w:sz w:val="24"/>
           <w:szCs w:val="24"/>
         </w:rPr>
       </w:pPr>
-      <w:r>
-        <w:rPr>
-          <w:spacing w:val="-3"/>
-          <w:sz w:val="24"/>
-          <w:szCs w:val="24"/>
-        </w:rPr>
-      </w:r>
     </w:p>
     <w:p>
       <w:pPr>
@@ -703,9 +854,9 @@
           <w:numId w:val="2"/>
         </w:numPr>
         <w:tabs>
-          <w:tab w:val="left" w:pos="752" w:leader="none"/>
+          <w:tab w:val="left" w:pos="752"/>
         </w:tabs>
-        <w:spacing w:lineRule="exact" w:line="239" w:before="160" w:after="0"/>
+        <w:spacing w:before="160" w:line="239" w:lineRule="exact"/>
         <w:ind w:left="180" w:right="1584" w:firstLine="360"/>
         <w:rPr>
           <w:sz w:val="24"/>
@@ -717,6 +868,7 @@
           <w:sz w:val="24"/>
           <w:szCs w:val="24"/>
         </w:rPr>
+        <w:lastRenderedPageBreak/>
         <w:t>Graduate</w:t>
       </w:r>
       <w:r>
@@ -737,8 +889,8 @@
     </w:p>
     <w:p>
       <w:pPr>
-        <w:pStyle w:val="TextBody"/>
-        <w:spacing w:lineRule="auto" w:line="288" w:before="42" w:after="0"/>
+        <w:pStyle w:val="BodyText"/>
+        <w:spacing w:before="42" w:line="288" w:lineRule="auto"/>
         <w:ind w:left="180" w:right="1580" w:firstLine="360"/>
         <w:rPr>
           <w:sz w:val="24"/>
@@ -773,15 +925,61 @@
           <w:sz w:val="24"/>
           <w:szCs w:val="24"/>
         </w:rPr>
-        <w:t>group and contributed significantnly in the preparation of this proposal. Mr Schussler will be lead authors on at least two of the publications produced and a significant contributor on the other two.</w:t>
+        <w:t xml:space="preserve">group and contributed </w:t>
+      </w:r>
+      <w:r>
+        <w:rPr>
+          <w:sz w:val="24"/>
+          <w:szCs w:val="24"/>
+        </w:rPr>
+        <w:t>significantly</w:t>
+      </w:r>
+      <w:r>
+        <w:rPr>
+          <w:sz w:val="24"/>
+          <w:szCs w:val="24"/>
+        </w:rPr>
+        <w:t xml:space="preserve"> </w:t>
+      </w:r>
+      <w:proofErr w:type="gramStart"/>
+      <w:r>
+        <w:rPr>
+          <w:sz w:val="24"/>
+          <w:szCs w:val="24"/>
+        </w:rPr>
+        <w:t>in</w:t>
+      </w:r>
+      <w:proofErr w:type="gramEnd"/>
+      <w:r>
+        <w:rPr>
+          <w:sz w:val="24"/>
+          <w:szCs w:val="24"/>
+        </w:rPr>
+        <w:t xml:space="preserve"> the preparation of this proposal. </w:t>
+      </w:r>
+      <w:proofErr w:type="spellStart"/>
+      <w:r>
+        <w:rPr>
+          <w:sz w:val="24"/>
+          <w:szCs w:val="24"/>
+        </w:rPr>
+        <w:t>Mr</w:t>
+      </w:r>
+      <w:proofErr w:type="spellEnd"/>
+      <w:r>
+        <w:rPr>
+          <w:sz w:val="24"/>
+          <w:szCs w:val="24"/>
+        </w:rPr>
+        <w:t xml:space="preserve"> Schussler will be lead authors on at least two of the publications produced and a significant contributor on the other two.</w:t>
       </w:r>
       <w:bookmarkStart w:id="10" w:name="High_Precision_Photometry_Even_With_Larg"/>
       <w:bookmarkEnd w:id="10"/>
     </w:p>
     <w:p>
       <w:pPr>
-        <w:pStyle w:val="TextBody"/>
-        <w:spacing w:lineRule="auto" w:line="288" w:before="42" w:after="240"/>
+        <w:pStyle w:val="BodyText"/>
+        <w:spacing w:before="42" w:after="240" w:line="288" w:lineRule="auto"/>
         <w:ind w:left="180" w:right="1580" w:firstLine="360"/>
         <w:rPr>
           <w:sz w:val="24"/>
@@ -804,9 +1002,9 @@
           <w:numId w:val="2"/>
         </w:numPr>
         <w:tabs>
-          <w:tab w:val="left" w:pos="752" w:leader="none"/>
+          <w:tab w:val="left" w:pos="752"/>
         </w:tabs>
-        <w:spacing w:lineRule="exact" w:line="240" w:before="160" w:after="0"/>
+        <w:spacing w:before="160" w:line="240" w:lineRule="exact"/>
         <w:ind w:left="180" w:right="1584" w:firstLine="360"/>
         <w:rPr>
           <w:color w:val="000000" w:themeColor="text1"/>
@@ -825,8 +1023,8 @@
     </w:p>
     <w:p>
       <w:pPr>
-        <w:pStyle w:val="TextBody"/>
-        <w:spacing w:lineRule="auto" w:line="288" w:before="43" w:after="240"/>
+        <w:pStyle w:val="BodyText"/>
+        <w:spacing w:before="43" w:after="240" w:line="288" w:lineRule="auto"/>
         <w:ind w:left="180" w:right="1580" w:firstLine="360"/>
         <w:rPr>
           <w:sz w:val="24"/>
@@ -851,9 +1049,9 @@
           <w:numId w:val="2"/>
         </w:numPr>
         <w:tabs>
-          <w:tab w:val="left" w:pos="752" w:leader="none"/>
+          <w:tab w:val="left" w:pos="752"/>
         </w:tabs>
-        <w:spacing w:lineRule="exact" w:line="240" w:before="160" w:after="0"/>
+        <w:spacing w:before="160" w:line="240" w:lineRule="exact"/>
         <w:ind w:left="180" w:right="1584" w:firstLine="360"/>
         <w:rPr>
           <w:color w:val="000000" w:themeColor="text1"/>
@@ -872,8 +1070,8 @@
     </w:p>
     <w:p>
       <w:pPr>
-        <w:pStyle w:val="TextBody"/>
-        <w:spacing w:lineRule="auto" w:line="264" w:before="44" w:after="0"/>
+        <w:pStyle w:val="BodyText"/>
+        <w:spacing w:before="44" w:line="264" w:lineRule="auto"/>
         <w:ind w:left="180" w:right="1580" w:firstLine="360"/>
         <w:rPr>
           <w:sz w:val="24"/>
@@ -893,7 +1091,21 @@
           <w:sz w:val="24"/>
           <w:szCs w:val="24"/>
         </w:rPr>
-        <w:t>to technical conferences and meetings held domestically are anticipated to disseminate the scientific results. Based on the work plan (see project description) we include support for 1 trip to a scientific conference for each proposal participant for a total of four trips</w:t>
+        <w:t xml:space="preserve">to technical conferences and meetings held domestically are anticipated to disseminate the scientific results. Based on the work plan (see project description) we include support for 1 trip to a scientific conference for each proposal participant </w:t>
+      </w:r>
+      <w:r>
+        <w:rPr>
+          <w:sz w:val="24"/>
+          <w:szCs w:val="24"/>
+        </w:rPr>
+        <w:t xml:space="preserve">each year </w:t>
+      </w:r>
+      <w:r>
+        <w:rPr>
+          <w:sz w:val="24"/>
+          <w:szCs w:val="24"/>
+        </w:rPr>
+        <w:t>for a total of four trips</w:t>
       </w:r>
       <w:r>
         <w:rPr>
@@ -943,10 +1155,9 @@
     </w:p>
     <w:p>
       <w:pPr>
-        <w:pStyle w:val="TextBody"/>
-        <w:spacing w:lineRule="auto" w:line="252" w:before="25" w:after="240"/>
+        <w:pStyle w:val="BodyText"/>
+        <w:spacing w:before="25" w:after="240" w:line="252" w:lineRule="auto"/>
         <w:ind w:left="180" w:right="1580" w:firstLine="360"/>
-        <w:rPr/>
       </w:pPr>
       <w:r>
         <w:rPr>
@@ -964,9 +1175,9 @@
           <w:numId w:val="1"/>
         </w:numPr>
         <w:tabs>
-          <w:tab w:val="left" w:pos="752" w:leader="none"/>
+          <w:tab w:val="left" w:pos="752"/>
         </w:tabs>
-        <w:spacing w:before="160" w:after="0"/>
+        <w:spacing w:before="160"/>
         <w:ind w:left="180" w:right="1584" w:firstLine="360"/>
         <w:rPr>
           <w:sz w:val="24"/>
@@ -998,8 +1209,8 @@
     </w:p>
     <w:p>
       <w:pPr>
-        <w:pStyle w:val="TextBody"/>
-        <w:spacing w:lineRule="auto" w:line="271" w:before="47" w:after="240"/>
+        <w:pStyle w:val="BodyText"/>
+        <w:spacing w:after="240" w:line="271" w:lineRule="auto"/>
         <w:ind w:left="180" w:right="1580" w:firstLine="360"/>
         <w:rPr>
           <w:sz w:val="24"/>
@@ -1285,9 +1496,9 @@
           <w:numId w:val="1"/>
         </w:numPr>
         <w:tabs>
-          <w:tab w:val="left" w:pos="752" w:leader="none"/>
+          <w:tab w:val="left" w:pos="752"/>
         </w:tabs>
-        <w:spacing w:before="160" w:after="0"/>
+        <w:spacing w:before="160"/>
         <w:ind w:left="180" w:right="1584" w:firstLine="360"/>
         <w:rPr>
           <w:sz w:val="24"/>
@@ -1319,10 +1530,9 @@
     </w:p>
     <w:p>
       <w:pPr>
-        <w:pStyle w:val="TextBody"/>
-        <w:spacing w:lineRule="auto" w:line="288"/>
+        <w:pStyle w:val="BodyText"/>
+        <w:spacing w:line="288" w:lineRule="auto"/>
         <w:ind w:left="180" w:right="1580" w:firstLine="360"/>
-        <w:rPr/>
       </w:pPr>
       <w:r>
         <w:rPr>
@@ -1350,79 +1560,109 @@
       </w:r>
     </w:p>
     <w:sectPr>
-      <w:headerReference w:type="default" r:id="rId2"/>
-      <w:type w:val="nextPage"/>
+      <w:headerReference w:type="default" r:id="rId7"/>
       <w:pgSz w:w="12240" w:h="15840"/>
-      <w:pgMar w:left="1300" w:right="0" w:header="677" w:top="1499" w:footer="0" w:bottom="1921" w:gutter="0"/>
-      <w:pgNumType w:start="1" w:fmt="decimal"/>
-      <w:formProt w:val="false"/>
-      <w:textDirection w:val="lrTb"/>
-      <w:docGrid w:type="default" w:linePitch="100" w:charSpace="4096"/>
+      <w:pgMar w:top="1499" w:right="0" w:bottom="1921" w:left="1300" w:header="677" w:footer="0" w:gutter="0"/>
+      <w:pgNumType w:start="1"/>
+      <w:cols w:space="720"/>
+      <w:formProt w:val="0"/>
+      <w:docGrid w:linePitch="100" w:charSpace="4096"/>
     </w:sectPr>
   </w:body>
 </w:document>
 </file>
 
+<file path=word/endnotes.xml><?xml version="1.0" encoding="utf-8"?>
+<w:endnotes xmlns:wpc="http://schemas.microsoft.com/office/word/2010/wordprocessingCanvas" xmlns:cx="http://schemas.microsoft.com/office/drawing/2014/chartex" xmlns:cx1="http://schemas.microsoft.com/office/drawing/2015/9/8/chartex" xmlns:cx2="http://schemas.microsoft.com/office/drawing/2015/10/21/chartex" xmlns:cx3="http://schemas.microsoft.com/office/drawing/2016/5/9/chartex" xmlns:cx4="http://schemas.microsoft.com/office/drawing/2016/5/10/chartex" xmlns:cx5="http://schemas.microsoft.com/office/drawing/2016/5/11/chartex" xmlns:cx6="http://schemas.microsoft.com/office/drawing/2016/5/12/chartex" xmlns:cx7="http://schemas.microsoft.com/office/drawing/2016/5/13/chartex" xmlns:cx8="http://schemas.microsoft.com/office/drawing/2016/5/14/chartex" xmlns:mc="http://schemas.openxmlformats.org/markup-compatibility/2006" xmlns:aink="http://schemas.microsoft.com/office/drawing/2016/ink" xmlns:am3d="http://schemas.microsoft.com/office/drawing/2017/model3d" xmlns:o="urn:schemas-microsoft-com:office:office" xmlns:oel="http://schemas.microsoft.com/office/2019/extlst" xmlns:r="http://schemas.openxmlformats.org/officeDocument/2006/relationships" xmlns:m="http://schemas.openxmlformats.org/officeDocument/2006/math" xmlns:v="urn:schemas-microsoft-com:vml" xmlns:wp14="http://schemas.microsoft.com/office/word/2010/wordprocessingDrawing" xmlns:wp="http://schemas.openxmlformats.org/drawingml/2006/wordprocessingDrawing" xmlns:w10="urn:schemas-microsoft-com:office:word" xmlns:w="http://schemas.openxmlformats.org/wordprocessingml/2006/main" xmlns:w14="http://schemas.microsoft.com/office/word/2010/wordml" xmlns:w15="http://schemas.microsoft.com/office/word/2012/wordml" xmlns:w16cex="http://schemas.microsoft.com/office/word/2018/wordml/cex" xmlns:w16cid="http://schemas.microsoft.com/office/word/2016/wordml/cid" xmlns:w16="http://schemas.microsoft.com/office/word/2018/wordml" xmlns:w16sdtdh="http://schemas.microsoft.com/office/word/2020/wordml/sdtdatahash" xmlns:w16se="http://schemas.microsoft.com/office/word/2015/wordml/symex" xmlns:wpg="http://schemas.microsoft.com/office/word/2010/wordprocessingGroup" xmlns:wpi="http://schemas.microsoft.com/office/word/2010/wordprocessingInk" xmlns:wne="http://schemas.microsoft.com/office/word/2006/wordml" xmlns:wps="http://schemas.microsoft.com/office/word/2010/wordprocessingShape" mc:Ignorable="w14 w15 w16se w16cid w16 w16cex w16sdtdh wp14">
+  <w:endnote w:type="separator" w:id="-1">
+    <w:p>
+      <w:r>
+        <w:separator/>
+      </w:r>
+    </w:p>
+  </w:endnote>
+  <w:endnote w:type="continuationSeparator" w:id="0">
+    <w:p>
+      <w:r>
+        <w:continuationSeparator/>
+      </w:r>
+    </w:p>
+  </w:endnote>
+</w:endnotes>
+</file>
+
+<file path=word/footnotes.xml><?xml version="1.0" encoding="utf-8"?>
+<w:footnotes xmlns:wpc="http://schemas.microsoft.com/office/word/2010/wordprocessingCanvas" xmlns:cx="http://schemas.microsoft.com/office/drawing/2014/chartex" xmlns:cx1="http://schemas.microsoft.com/office/drawing/2015/9/8/chartex" xmlns:cx2="http://schemas.microsoft.com/office/drawing/2015/10/21/chartex" xmlns:cx3="http://schemas.microsoft.com/office/drawing/2016/5/9/chartex" xmlns:cx4="http://schemas.microsoft.com/office/drawing/2016/5/10/chartex" xmlns:cx5="http://schemas.microsoft.com/office/drawing/2016/5/11/chartex" xmlns:cx6="http://schemas.microsoft.com/office/drawing/2016/5/12/chartex" xmlns:cx7="http://schemas.microsoft.com/office/drawing/2016/5/13/chartex" xmlns:cx8="http://schemas.microsoft.com/office/drawing/2016/5/14/chartex" xmlns:mc="http://schemas.openxmlformats.org/markup-compatibility/2006" xmlns:aink="http://schemas.microsoft.com/office/drawing/2016/ink" xmlns:am3d="http://schemas.microsoft.com/office/drawing/2017/model3d" xmlns:o="urn:schemas-microsoft-com:office:office" xmlns:oel="http://schemas.microsoft.com/office/2019/extlst" xmlns:r="http://schemas.openxmlformats.org/officeDocument/2006/relationships" xmlns:m="http://schemas.openxmlformats.org/officeDocument/2006/math" xmlns:v="urn:schemas-microsoft-com:vml" xmlns:wp14="http://schemas.microsoft.com/office/word/2010/wordprocessingDrawing" xmlns:wp="http://schemas.openxmlformats.org/drawingml/2006/wordprocessingDrawing" xmlns:w10="urn:schemas-microsoft-com:office:word" xmlns:w="http://schemas.openxmlformats.org/wordprocessingml/2006/main" xmlns:w14="http://schemas.microsoft.com/office/word/2010/wordml" xmlns:w15="http://schemas.microsoft.com/office/word/2012/wordml" xmlns:w16cex="http://schemas.microsoft.com/office/word/2018/wordml/cex" xmlns:w16cid="http://schemas.microsoft.com/office/word/2016/wordml/cid" xmlns:w16="http://schemas.microsoft.com/office/word/2018/wordml" xmlns:w16sdtdh="http://schemas.microsoft.com/office/word/2020/wordml/sdtdatahash" xmlns:w16se="http://schemas.microsoft.com/office/word/2015/wordml/symex" xmlns:wpg="http://schemas.microsoft.com/office/word/2010/wordprocessingGroup" xmlns:wpi="http://schemas.microsoft.com/office/word/2010/wordprocessingInk" xmlns:wne="http://schemas.microsoft.com/office/word/2006/wordml" xmlns:wps="http://schemas.microsoft.com/office/word/2010/wordprocessingShape" mc:Ignorable="w14 w15 w16se w16cid w16 w16cex w16sdtdh wp14">
+  <w:footnote w:type="separator" w:id="-1">
+    <w:p>
+      <w:r>
+        <w:separator/>
+      </w:r>
+    </w:p>
+  </w:footnote>
+  <w:footnote w:type="continuationSeparator" w:id="0">
+    <w:p>
+      <w:r>
+        <w:continuationSeparator/>
+      </w:r>
+    </w:p>
+  </w:footnote>
+</w:footnotes>
+</file>
+
 <file path=word/header1.xml><?xml version="1.0" encoding="utf-8"?>
-<w:hdr xmlns:o="urn:schemas-microsoft-com:office:office" xmlns:r="http://schemas.openxmlformats.org/officeDocument/2006/relationships" xmlns:v="urn:schemas-microsoft-com:vml" xmlns:w="http://schemas.openxmlformats.org/wordprocessingml/2006/main" xmlns:w10="urn:schemas-microsoft-com:office:word" xmlns:wp="http://schemas.openxmlformats.org/drawingml/2006/wordprocessingDrawing" xmlns:wps="http://schemas.microsoft.com/office/word/2010/wordprocessingShape" xmlns:wpg="http://schemas.microsoft.com/office/word/2010/wordprocessingGroup" xmlns:mc="http://schemas.openxmlformats.org/markup-compatibility/2006" xmlns:wp14="http://schemas.microsoft.com/office/word/2010/wordprocessingDrawing" xmlns:w14="http://schemas.microsoft.com/office/word/2010/wordml" mc:Ignorable="w14 wp14">
+<w:hdr xmlns:wpc="http://schemas.microsoft.com/office/word/2010/wordprocessingCanvas" xmlns:cx="http://schemas.microsoft.com/office/drawing/2014/chartex" xmlns:cx1="http://schemas.microsoft.com/office/drawing/2015/9/8/chartex" xmlns:cx2="http://schemas.microsoft.com/office/drawing/2015/10/21/chartex" xmlns:cx3="http://schemas.microsoft.com/office/drawing/2016/5/9/chartex" xmlns:cx4="http://schemas.microsoft.com/office/drawing/2016/5/10/chartex" xmlns:cx5="http://schemas.microsoft.com/office/drawing/2016/5/11/chartex" xmlns:cx6="http://schemas.microsoft.com/office/drawing/2016/5/12/chartex" xmlns:cx7="http://schemas.microsoft.com/office/drawing/2016/5/13/chartex" xmlns:cx8="http://schemas.microsoft.com/office/drawing/2016/5/14/chartex" xmlns:mc="http://schemas.openxmlformats.org/markup-compatibility/2006" xmlns:aink="http://schemas.microsoft.com/office/drawing/2016/ink" xmlns:am3d="http://schemas.microsoft.com/office/drawing/2017/model3d" xmlns:o="urn:schemas-microsoft-com:office:office" xmlns:oel="http://schemas.microsoft.com/office/2019/extlst" xmlns:r="http://schemas.openxmlformats.org/officeDocument/2006/relationships" xmlns:m="http://schemas.openxmlformats.org/officeDocument/2006/math" xmlns:v="urn:schemas-microsoft-com:vml" xmlns:wp14="http://schemas.microsoft.com/office/word/2010/wordprocessingDrawing" xmlns:wp="http://schemas.openxmlformats.org/drawingml/2006/wordprocessingDrawing" xmlns:w10="urn:schemas-microsoft-com:office:word" xmlns:w="http://schemas.openxmlformats.org/wordprocessingml/2006/main" xmlns:w14="http://schemas.microsoft.com/office/word/2010/wordml" xmlns:w15="http://schemas.microsoft.com/office/word/2012/wordml" xmlns:w16cex="http://schemas.microsoft.com/office/word/2018/wordml/cex" xmlns:w16cid="http://schemas.microsoft.com/office/word/2016/wordml/cid" xmlns:w16="http://schemas.microsoft.com/office/word/2018/wordml" xmlns:w16sdtdh="http://schemas.microsoft.com/office/word/2020/wordml/sdtdatahash" xmlns:w16se="http://schemas.microsoft.com/office/word/2015/wordml/symex" xmlns:wpg="http://schemas.microsoft.com/office/word/2010/wordprocessingGroup" xmlns:wpi="http://schemas.microsoft.com/office/word/2010/wordprocessingInk" xmlns:wne="http://schemas.microsoft.com/office/word/2006/wordml" xmlns:wps="http://schemas.microsoft.com/office/word/2010/wordprocessingShape" mc:Ignorable="w14 w15 w16se w16cid w16 w16cex w16sdtdh wp14">
   <w:p>
     <w:pPr>
-      <w:pStyle w:val="TextBody"/>
-      <w:spacing w:lineRule="auto" w:line="12" w:before="0" w:after="0"/>
-      <w:ind w:left="0" w:right="0" w:hanging="0"/>
+      <w:pStyle w:val="BodyText"/>
+      <w:spacing w:before="0" w:line="12" w:lineRule="auto"/>
+      <w:ind w:left="0" w:right="0"/>
       <w:jc w:val="left"/>
       <w:rPr>
         <w:sz w:val="20"/>
       </w:rPr>
     </w:pPr>
-    <w:r>
-      <w:rPr>
-        <w:sz w:val="20"/>
-      </w:rPr>
-    </w:r>
   </w:p>
 </w:hdr>
 </file>
 
 <file path=word/numbering.xml><?xml version="1.0" encoding="utf-8"?>
-<w:numbering xmlns:w="http://schemas.openxmlformats.org/wordprocessingml/2006/main" xmlns:o="urn:schemas-microsoft-com:office:office" xmlns:r="http://schemas.openxmlformats.org/officeDocument/2006/relationships" xmlns:v="urn:schemas-microsoft-com:vml">
-  <w:abstractNum w:abstractNumId="1">
+<w:numbering xmlns:wpc="http://schemas.microsoft.com/office/word/2010/wordprocessingCanvas" xmlns:cx="http://schemas.microsoft.com/office/drawing/2014/chartex" xmlns:cx1="http://schemas.microsoft.com/office/drawing/2015/9/8/chartex" xmlns:cx2="http://schemas.microsoft.com/office/drawing/2015/10/21/chartex" xmlns:cx3="http://schemas.microsoft.com/office/drawing/2016/5/9/chartex" xmlns:cx4="http://schemas.microsoft.com/office/drawing/2016/5/10/chartex" xmlns:cx5="http://schemas.microsoft.com/office/drawing/2016/5/11/chartex" xmlns:cx6="http://schemas.microsoft.com/office/drawing/2016/5/12/chartex" xmlns:cx7="http://schemas.microsoft.com/office/drawing/2016/5/13/chartex" xmlns:cx8="http://schemas.microsoft.com/office/drawing/2016/5/14/chartex" xmlns:mc="http://schemas.openxmlformats.org/markup-compatibility/2006" xmlns:aink="http://schemas.microsoft.com/office/drawing/2016/ink" xmlns:am3d="http://schemas.microsoft.com/office/drawing/2017/model3d" xmlns:o="urn:schemas-microsoft-com:office:office" xmlns:oel="http://schemas.microsoft.com/office/2019/extlst" xmlns:r="http://schemas.openxmlformats.org/officeDocument/2006/relationships" xmlns:m="http://schemas.openxmlformats.org/officeDocument/2006/math" xmlns:v="urn:schemas-microsoft-com:vml" xmlns:wp14="http://schemas.microsoft.com/office/word/2010/wordprocessingDrawing" xmlns:wp="http://schemas.openxmlformats.org/drawingml/2006/wordprocessingDrawing" xmlns:w10="urn:schemas-microsoft-com:office:word" xmlns:w="http://schemas.openxmlformats.org/wordprocessingml/2006/main" xmlns:w14="http://schemas.microsoft.com/office/word/2010/wordml" xmlns:w15="http://schemas.microsoft.com/office/word/2012/wordml" xmlns:w16cex="http://schemas.microsoft.com/office/word/2018/wordml/cex" xmlns:w16cid="http://schemas.microsoft.com/office/word/2016/wordml/cid" xmlns:w16="http://schemas.microsoft.com/office/word/2018/wordml" xmlns:w16sdtdh="http://schemas.microsoft.com/office/word/2020/wordml/sdtdatahash" xmlns:w16se="http://schemas.microsoft.com/office/word/2015/wordml/symex" xmlns:wpg="http://schemas.microsoft.com/office/word/2010/wordprocessingGroup" xmlns:wpi="http://schemas.microsoft.com/office/word/2010/wordprocessingInk" xmlns:wne="http://schemas.microsoft.com/office/word/2006/wordml" xmlns:wps="http://schemas.microsoft.com/office/word/2010/wordprocessingShape" mc:Ignorable="w14 w15 w16se w16cid w16 w16cex w16sdtdh wp14">
+  <w:abstractNum w:abstractNumId="0" w15:restartNumberingAfterBreak="0">
+    <w:nsid w:val="05A37390"/>
+    <w:multiLevelType w:val="multilevel"/>
+    <w:tmpl w:val="457AA992"/>
     <w:lvl w:ilvl="0">
-      <w:start w:val="4"/>
+      <w:start w:val="1"/>
       <w:numFmt w:val="decimal"/>
-      <w:lvlText w:val="%1"/>
-      <w:lvlJc w:val="left"/>
-      <w:pPr>
-        <w:ind w:left="751" w:hanging="634"/>
+      <w:lvlText w:val="%1."/>
+      <w:lvlJc w:val="left"/>
+      <w:pPr>
+        <w:ind w:left="1188" w:hanging="360"/>
       </w:pPr>
     </w:lvl>
     <w:lvl w:ilvl="1">
-      <w:start w:val="5"/>
-      <w:numFmt w:val="decimal"/>
-      <w:lvlText w:val="12.%2"/>
-      <w:lvlJc w:val="left"/>
-      <w:pPr>
-        <w:ind w:left="751" w:hanging="634"/>
+      <w:start w:val="1"/>
+      <w:numFmt w:val="bullet"/>
+      <w:lvlText w:val="o"/>
+      <w:lvlJc w:val="left"/>
+      <w:pPr>
+        <w:ind w:left="1908" w:hanging="360"/>
       </w:pPr>
       <w:rPr>
-        <w:sz w:val="21"/>
-        <w:b/>
-        <w:szCs w:val="21"/>
-        <w:bCs/>
-        <w:w w:val="102"/>
-        <w:rFonts w:eastAsia="Arial" w:cs="Arial"/>
+        <w:rFonts w:ascii="Courier New" w:hAnsi="Courier New" w:cs="Courier New" w:hint="default"/>
       </w:rPr>
     </w:lvl>
     <w:lvl w:ilvl="2">
       <w:start w:val="1"/>
       <w:numFmt w:val="bullet"/>
-      <w:lvlText w:val=""/>
-      <w:lvlJc w:val="left"/>
-      <w:pPr>
-        <w:ind w:left="2796" w:hanging="634"/>
+      <w:lvlText w:val=""/>
+      <w:lvlJc w:val="left"/>
+      <w:pPr>
+        <w:ind w:left="2628" w:hanging="360"/>
       </w:pPr>
       <w:rPr>
-        <w:rFonts w:ascii="Symbol" w:hAnsi="Symbol" w:cs="Symbol" w:hint="default"/>
+        <w:rFonts w:ascii="Wingdings" w:hAnsi="Wingdings" w:cs="Wingdings" w:hint="default"/>
       </w:rPr>
     </w:lvl>
     <w:lvl w:ilvl="3">
@@ -1431,7 +1671,7 @@
       <w:lvlText w:val=""/>
       <w:lvlJc w:val="left"/>
       <w:pPr>
-        <w:ind w:left="3814" w:hanging="634"/>
+        <w:ind w:left="3348" w:hanging="360"/>
       </w:pPr>
       <w:rPr>
         <w:rFonts w:ascii="Symbol" w:hAnsi="Symbol" w:cs="Symbol" w:hint="default"/>
@@ -1440,25 +1680,25 @@
     <w:lvl w:ilvl="4">
       <w:start w:val="1"/>
       <w:numFmt w:val="bullet"/>
-      <w:lvlText w:val=""/>
-      <w:lvlJc w:val="left"/>
-      <w:pPr>
-        <w:ind w:left="4832" w:hanging="634"/>
+      <w:lvlText w:val="o"/>
+      <w:lvlJc w:val="left"/>
+      <w:pPr>
+        <w:ind w:left="4068" w:hanging="360"/>
       </w:pPr>
       <w:rPr>
-        <w:rFonts w:ascii="Symbol" w:hAnsi="Symbol" w:cs="Symbol" w:hint="default"/>
+        <w:rFonts w:ascii="Courier New" w:hAnsi="Courier New" w:cs="Courier New" w:hint="default"/>
       </w:rPr>
     </w:lvl>
     <w:lvl w:ilvl="5">
       <w:start w:val="1"/>
       <w:numFmt w:val="bullet"/>
-      <w:lvlText w:val=""/>
-      <w:lvlJc w:val="left"/>
-      <w:pPr>
-        <w:ind w:left="5850" w:hanging="634"/>
+      <w:lvlText w:val=""/>
+      <w:lvlJc w:val="left"/>
+      <w:pPr>
+        <w:ind w:left="4788" w:hanging="360"/>
       </w:pPr>
       <w:rPr>
-        <w:rFonts w:ascii="Symbol" w:hAnsi="Symbol" w:cs="Symbol" w:hint="default"/>
+        <w:rFonts w:ascii="Wingdings" w:hAnsi="Wingdings" w:cs="Wingdings" w:hint="default"/>
       </w:rPr>
     </w:lvl>
     <w:lvl w:ilvl="6">
@@ -1467,242 +1707,6 @@
       <w:lvlText w:val=""/>
       <w:lvlJc w:val="left"/>
       <w:pPr>
-        <w:ind w:left="6868" w:hanging="634"/>
-      </w:pPr>
-      <w:rPr>
-        <w:rFonts w:ascii="Symbol" w:hAnsi="Symbol" w:cs="Symbol" w:hint="default"/>
-      </w:rPr>
-    </w:lvl>
-    <w:lvl w:ilvl="7">
-      <w:start w:val="1"/>
-      <w:numFmt w:val="bullet"/>
-      <w:lvlText w:val=""/>
-      <w:lvlJc w:val="left"/>
-      <w:pPr>
-        <w:ind w:left="7886" w:hanging="634"/>
-      </w:pPr>
-      <w:rPr>
-        <w:rFonts w:ascii="Symbol" w:hAnsi="Symbol" w:cs="Symbol" w:hint="default"/>
-      </w:rPr>
-    </w:lvl>
-    <w:lvl w:ilvl="8">
-      <w:start w:val="1"/>
-      <w:numFmt w:val="bullet"/>
-      <w:lvlText w:val=""/>
-      <w:lvlJc w:val="left"/>
-      <w:pPr>
-        <w:ind w:left="8904" w:hanging="634"/>
-      </w:pPr>
-      <w:rPr>
-        <w:rFonts w:ascii="Symbol" w:hAnsi="Symbol" w:cs="Symbol" w:hint="default"/>
-      </w:rPr>
-    </w:lvl>
-  </w:abstractNum>
-  <w:abstractNum w:abstractNumId="2">
-    <w:lvl w:ilvl="0">
-      <w:start w:val="1"/>
-      <w:numFmt w:val="decimal"/>
-      <w:lvlText w:val="%1"/>
-      <w:lvlJc w:val="left"/>
-      <w:pPr>
-        <w:ind w:left="391" w:hanging="455"/>
-      </w:pPr>
-      <w:rPr>
-        <w:sz w:val="24"/>
-        <w:b/>
-        <w:szCs w:val="24"/>
-        <w:bCs/>
-        <w:w w:val="102"/>
-        <w:rFonts w:eastAsia="Arial" w:cs="Arial"/>
-      </w:rPr>
-    </w:lvl>
-    <w:lvl w:ilvl="1">
-      <w:start w:val="1"/>
-      <w:numFmt w:val="decimal"/>
-      <w:lvlText w:val="%1.%2"/>
-      <w:lvlJc w:val="left"/>
-      <w:pPr>
-        <w:ind w:left="571" w:hanging="634"/>
-      </w:pPr>
-      <w:rPr>
-        <w:sz w:val="24"/>
-        <w:b/>
-        <w:szCs w:val="24"/>
-        <w:bCs/>
-        <w:w w:val="102"/>
-        <w:rFonts w:eastAsia="Arial" w:cs="Arial"/>
-      </w:rPr>
-    </w:lvl>
-    <w:lvl w:ilvl="2">
-      <w:start w:val="1"/>
-      <w:numFmt w:val="decimal"/>
-      <w:lvlText w:val="%1.%2.%3"/>
-      <w:lvlJc w:val="left"/>
-      <w:pPr>
-        <w:ind w:left="750" w:hanging="814"/>
-      </w:pPr>
-      <w:rPr>
-        <w:sz w:val="24"/>
-        <w:b/>
-        <w:szCs w:val="21"/>
-        <w:bCs/>
-        <w:w w:val="102"/>
-        <w:rFonts w:eastAsia="Arial" w:cs="Arial"/>
-      </w:rPr>
-    </w:lvl>
-    <w:lvl w:ilvl="3">
-      <w:start w:val="1"/>
-      <w:numFmt w:val="bullet"/>
-      <w:lvlText w:val="•"/>
-      <w:lvlJc w:val="left"/>
-      <w:pPr>
-        <w:ind w:left="522" w:hanging="201"/>
-      </w:pPr>
-      <w:rPr>
-        <w:rFonts w:ascii="Arial" w:hAnsi="Arial" w:cs="Arial" w:hint="default"/>
-        <w:sz w:val="24"/>
-        <w:szCs w:val="24"/>
-        <w:w w:val="99"/>
-        <w:rFonts w:cs="Arial"/>
-      </w:rPr>
-    </w:lvl>
-    <w:lvl w:ilvl="4">
-      <w:start w:val="1"/>
-      <w:numFmt w:val="bullet"/>
-      <w:lvlText w:val=""/>
-      <w:lvlJc w:val="left"/>
-      <w:pPr>
-        <w:ind w:left="2188" w:hanging="201"/>
-      </w:pPr>
-      <w:rPr>
-        <w:rFonts w:ascii="Symbol" w:hAnsi="Symbol" w:cs="Symbol" w:hint="default"/>
-      </w:rPr>
-    </w:lvl>
-    <w:lvl w:ilvl="5">
-      <w:start w:val="1"/>
-      <w:numFmt w:val="bullet"/>
-      <w:lvlText w:val=""/>
-      <w:lvlJc w:val="left"/>
-      <w:pPr>
-        <w:ind w:left="3617" w:hanging="201"/>
-      </w:pPr>
-      <w:rPr>
-        <w:rFonts w:ascii="Symbol" w:hAnsi="Symbol" w:cs="Symbol" w:hint="default"/>
-      </w:rPr>
-    </w:lvl>
-    <w:lvl w:ilvl="6">
-      <w:start w:val="1"/>
-      <w:numFmt w:val="bullet"/>
-      <w:lvlText w:val=""/>
-      <w:lvlJc w:val="left"/>
-      <w:pPr>
-        <w:ind w:left="5045" w:hanging="201"/>
-      </w:pPr>
-      <w:rPr>
-        <w:rFonts w:ascii="Symbol" w:hAnsi="Symbol" w:cs="Symbol" w:hint="default"/>
-      </w:rPr>
-    </w:lvl>
-    <w:lvl w:ilvl="7">
-      <w:start w:val="1"/>
-      <w:numFmt w:val="bullet"/>
-      <w:lvlText w:val=""/>
-      <w:lvlJc w:val="left"/>
-      <w:pPr>
-        <w:ind w:left="6474" w:hanging="201"/>
-      </w:pPr>
-      <w:rPr>
-        <w:rFonts w:ascii="Symbol" w:hAnsi="Symbol" w:cs="Symbol" w:hint="default"/>
-      </w:rPr>
-    </w:lvl>
-    <w:lvl w:ilvl="8">
-      <w:start w:val="1"/>
-      <w:numFmt w:val="bullet"/>
-      <w:lvlText w:val=""/>
-      <w:lvlJc w:val="left"/>
-      <w:pPr>
-        <w:ind w:left="7902" w:hanging="201"/>
-      </w:pPr>
-      <w:rPr>
-        <w:rFonts w:ascii="Symbol" w:hAnsi="Symbol" w:cs="Symbol" w:hint="default"/>
-      </w:rPr>
-    </w:lvl>
-  </w:abstractNum>
-  <w:abstractNum w:abstractNumId="3">
-    <w:lvl w:ilvl="0">
-      <w:start w:val="1"/>
-      <w:numFmt w:val="decimal"/>
-      <w:lvlText w:val="%1."/>
-      <w:lvlJc w:val="left"/>
-      <w:pPr>
-        <w:ind w:left="1188" w:hanging="360"/>
-      </w:pPr>
-    </w:lvl>
-    <w:lvl w:ilvl="1">
-      <w:start w:val="1"/>
-      <w:numFmt w:val="bullet"/>
-      <w:lvlText w:val="o"/>
-      <w:lvlJc w:val="left"/>
-      <w:pPr>
-        <w:ind w:left="1908" w:hanging="360"/>
-      </w:pPr>
-      <w:rPr>
-        <w:rFonts w:ascii="Courier New" w:hAnsi="Courier New" w:cs="Courier New" w:hint="default"/>
-      </w:rPr>
-    </w:lvl>
-    <w:lvl w:ilvl="2">
-      <w:start w:val="1"/>
-      <w:numFmt w:val="bullet"/>
-      <w:lvlText w:val=""/>
-      <w:lvlJc w:val="left"/>
-      <w:pPr>
-        <w:ind w:left="2628" w:hanging="360"/>
-      </w:pPr>
-      <w:rPr>
-        <w:rFonts w:ascii="Wingdings" w:hAnsi="Wingdings" w:cs="Wingdings" w:hint="default"/>
-      </w:rPr>
-    </w:lvl>
-    <w:lvl w:ilvl="3">
-      <w:start w:val="1"/>
-      <w:numFmt w:val="bullet"/>
-      <w:lvlText w:val=""/>
-      <w:lvlJc w:val="left"/>
-      <w:pPr>
-        <w:ind w:left="3348" w:hanging="360"/>
-      </w:pPr>
-      <w:rPr>
-        <w:rFonts w:ascii="Symbol" w:hAnsi="Symbol" w:cs="Symbol" w:hint="default"/>
-      </w:rPr>
-    </w:lvl>
-    <w:lvl w:ilvl="4">
-      <w:start w:val="1"/>
-      <w:numFmt w:val="bullet"/>
-      <w:lvlText w:val="o"/>
-      <w:lvlJc w:val="left"/>
-      <w:pPr>
-        <w:ind w:left="4068" w:hanging="360"/>
-      </w:pPr>
-      <w:rPr>
-        <w:rFonts w:ascii="Courier New" w:hAnsi="Courier New" w:cs="Courier New" w:hint="default"/>
-      </w:rPr>
-    </w:lvl>
-    <w:lvl w:ilvl="5">
-      <w:start w:val="1"/>
-      <w:numFmt w:val="bullet"/>
-      <w:lvlText w:val=""/>
-      <w:lvlJc w:val="left"/>
-      <w:pPr>
-        <w:ind w:left="4788" w:hanging="360"/>
-      </w:pPr>
-      <w:rPr>
-        <w:rFonts w:ascii="Wingdings" w:hAnsi="Wingdings" w:cs="Wingdings" w:hint="default"/>
-      </w:rPr>
-    </w:lvl>
-    <w:lvl w:ilvl="6">
-      <w:start w:val="1"/>
-      <w:numFmt w:val="bullet"/>
-      <w:lvlText w:val=""/>
-      <w:lvlJc w:val="left"/>
-      <w:pPr>
         <w:ind w:left="5508" w:hanging="360"/>
       </w:pPr>
       <w:rPr>
@@ -1734,7 +1738,10 @@
       </w:rPr>
     </w:lvl>
   </w:abstractNum>
-  <w:abstractNum w:abstractNumId="4">
+  <w:abstractNum w:abstractNumId="1" w15:restartNumberingAfterBreak="0">
+    <w:nsid w:val="2252674A"/>
+    <w:multiLevelType w:val="multilevel"/>
+    <w:tmpl w:val="8F6CA590"/>
     <w:lvl w:ilvl="0">
       <w:start w:val="1"/>
       <w:numFmt w:val="none"/>
@@ -1742,7 +1749,7 @@
       <w:lvlText w:val=""/>
       <w:lvlJc w:val="left"/>
       <w:pPr>
-        <w:ind w:left="0" w:hanging="0"/>
+        <w:ind w:left="0" w:firstLine="0"/>
       </w:pPr>
     </w:lvl>
     <w:lvl w:ilvl="1">
@@ -1752,7 +1759,7 @@
       <w:lvlText w:val=""/>
       <w:lvlJc w:val="left"/>
       <w:pPr>
-        <w:ind w:left="0" w:hanging="0"/>
+        <w:ind w:left="0" w:firstLine="0"/>
       </w:pPr>
     </w:lvl>
     <w:lvl w:ilvl="2">
@@ -1762,7 +1769,7 @@
       <w:lvlText w:val=""/>
       <w:lvlJc w:val="left"/>
       <w:pPr>
-        <w:ind w:left="0" w:hanging="0"/>
+        <w:ind w:left="0" w:firstLine="0"/>
       </w:pPr>
     </w:lvl>
     <w:lvl w:ilvl="3">
@@ -1772,7 +1779,7 @@
       <w:lvlText w:val=""/>
       <w:lvlJc w:val="left"/>
       <w:pPr>
-        <w:ind w:left="0" w:hanging="0"/>
+        <w:ind w:left="0" w:firstLine="0"/>
       </w:pPr>
     </w:lvl>
     <w:lvl w:ilvl="4">
@@ -1782,7 +1789,7 @@
       <w:lvlText w:val=""/>
       <w:lvlJc w:val="left"/>
       <w:pPr>
-        <w:ind w:left="0" w:hanging="0"/>
+        <w:ind w:left="0" w:firstLine="0"/>
       </w:pPr>
     </w:lvl>
     <w:lvl w:ilvl="5">
@@ -1792,7 +1799,7 @@
       <w:lvlText w:val=""/>
       <w:lvlJc w:val="left"/>
       <w:pPr>
-        <w:ind w:left="0" w:hanging="0"/>
+        <w:ind w:left="0" w:firstLine="0"/>
       </w:pPr>
     </w:lvl>
     <w:lvl w:ilvl="6">
@@ -1802,7 +1809,7 @@
       <w:lvlText w:val=""/>
       <w:lvlJc w:val="left"/>
       <w:pPr>
-        <w:ind w:left="0" w:hanging="0"/>
+        <w:ind w:left="0" w:firstLine="0"/>
       </w:pPr>
     </w:lvl>
     <w:lvl w:ilvl="7">
@@ -1812,7 +1819,7 @@
       <w:lvlText w:val=""/>
       <w:lvlJc w:val="left"/>
       <w:pPr>
-        <w:ind w:left="0" w:hanging="0"/>
+        <w:ind w:left="0" w:firstLine="0"/>
       </w:pPr>
     </w:lvl>
     <w:lvl w:ilvl="8">
@@ -1822,51 +1829,295 @@
       <w:lvlText w:val=""/>
       <w:lvlJc w:val="left"/>
       <w:pPr>
-        <w:ind w:left="0" w:hanging="0"/>
+        <w:ind w:left="0" w:firstLine="0"/>
       </w:pPr>
     </w:lvl>
   </w:abstractNum>
-  <w:num w:numId="1">
-    <w:abstractNumId w:val="1"/>
+  <w:abstractNum w:abstractNumId="2" w15:restartNumberingAfterBreak="0">
+    <w:nsid w:val="2A827AF9"/>
+    <w:multiLevelType w:val="multilevel"/>
+    <w:tmpl w:val="041E6B38"/>
+    <w:lvl w:ilvl="0">
+      <w:start w:val="1"/>
+      <w:numFmt w:val="decimal"/>
+      <w:lvlText w:val="%1"/>
+      <w:lvlJc w:val="left"/>
+      <w:pPr>
+        <w:ind w:left="391" w:hanging="455"/>
+      </w:pPr>
+      <w:rPr>
+        <w:rFonts w:eastAsia="Arial" w:cs="Arial"/>
+        <w:b/>
+        <w:bCs/>
+        <w:w w:val="102"/>
+        <w:sz w:val="24"/>
+        <w:szCs w:val="24"/>
+      </w:rPr>
+    </w:lvl>
+    <w:lvl w:ilvl="1">
+      <w:start w:val="1"/>
+      <w:numFmt w:val="decimal"/>
+      <w:lvlText w:val="%1.%2"/>
+      <w:lvlJc w:val="left"/>
+      <w:pPr>
+        <w:ind w:left="571" w:hanging="634"/>
+      </w:pPr>
+      <w:rPr>
+        <w:rFonts w:eastAsia="Arial" w:cs="Arial"/>
+        <w:b/>
+        <w:bCs/>
+        <w:w w:val="102"/>
+        <w:sz w:val="24"/>
+        <w:szCs w:val="24"/>
+      </w:rPr>
+    </w:lvl>
+    <w:lvl w:ilvl="2">
+      <w:start w:val="1"/>
+      <w:numFmt w:val="decimal"/>
+      <w:lvlText w:val="%1.%2.%3"/>
+      <w:lvlJc w:val="left"/>
+      <w:pPr>
+        <w:ind w:left="750" w:hanging="814"/>
+      </w:pPr>
+      <w:rPr>
+        <w:rFonts w:eastAsia="Arial" w:cs="Arial"/>
+        <w:b/>
+        <w:bCs/>
+        <w:w w:val="102"/>
+        <w:sz w:val="24"/>
+        <w:szCs w:val="21"/>
+      </w:rPr>
+    </w:lvl>
+    <w:lvl w:ilvl="3">
+      <w:start w:val="1"/>
+      <w:numFmt w:val="bullet"/>
+      <w:lvlText w:val="•"/>
+      <w:lvlJc w:val="left"/>
+      <w:pPr>
+        <w:ind w:left="522" w:hanging="201"/>
+      </w:pPr>
+      <w:rPr>
+        <w:rFonts w:ascii="Arial" w:hAnsi="Arial" w:cs="Arial" w:hint="default"/>
+        <w:w w:val="99"/>
+        <w:sz w:val="24"/>
+        <w:szCs w:val="24"/>
+      </w:rPr>
+    </w:lvl>
+    <w:lvl w:ilvl="4">
+      <w:start w:val="1"/>
+      <w:numFmt w:val="bullet"/>
+      <w:lvlText w:val=""/>
+      <w:lvlJc w:val="left"/>
+      <w:pPr>
+        <w:ind w:left="2188" w:hanging="201"/>
+      </w:pPr>
+      <w:rPr>
+        <w:rFonts w:ascii="Symbol" w:hAnsi="Symbol" w:cs="Symbol" w:hint="default"/>
+      </w:rPr>
+    </w:lvl>
+    <w:lvl w:ilvl="5">
+      <w:start w:val="1"/>
+      <w:numFmt w:val="bullet"/>
+      <w:lvlText w:val=""/>
+      <w:lvlJc w:val="left"/>
+      <w:pPr>
+        <w:ind w:left="3617" w:hanging="201"/>
+      </w:pPr>
+      <w:rPr>
+        <w:rFonts w:ascii="Symbol" w:hAnsi="Symbol" w:cs="Symbol" w:hint="default"/>
+      </w:rPr>
+    </w:lvl>
+    <w:lvl w:ilvl="6">
+      <w:start w:val="1"/>
+      <w:numFmt w:val="bullet"/>
+      <w:lvlText w:val=""/>
+      <w:lvlJc w:val="left"/>
+      <w:pPr>
+        <w:ind w:left="5045" w:hanging="201"/>
+      </w:pPr>
+      <w:rPr>
+        <w:rFonts w:ascii="Symbol" w:hAnsi="Symbol" w:cs="Symbol" w:hint="default"/>
+      </w:rPr>
+    </w:lvl>
+    <w:lvl w:ilvl="7">
+      <w:start w:val="1"/>
+      <w:numFmt w:val="bullet"/>
+      <w:lvlText w:val=""/>
+      <w:lvlJc w:val="left"/>
+      <w:pPr>
+        <w:ind w:left="6474" w:hanging="201"/>
+      </w:pPr>
+      <w:rPr>
+        <w:rFonts w:ascii="Symbol" w:hAnsi="Symbol" w:cs="Symbol" w:hint="default"/>
+      </w:rPr>
+    </w:lvl>
+    <w:lvl w:ilvl="8">
+      <w:start w:val="1"/>
+      <w:numFmt w:val="bullet"/>
+      <w:lvlText w:val=""/>
+      <w:lvlJc w:val="left"/>
+      <w:pPr>
+        <w:ind w:left="7902" w:hanging="201"/>
+      </w:pPr>
+      <w:rPr>
+        <w:rFonts w:ascii="Symbol" w:hAnsi="Symbol" w:cs="Symbol" w:hint="default"/>
+      </w:rPr>
+    </w:lvl>
+  </w:abstractNum>
+  <w:abstractNum w:abstractNumId="3" w15:restartNumberingAfterBreak="0">
+    <w:nsid w:val="45034F39"/>
+    <w:multiLevelType w:val="multilevel"/>
+    <w:tmpl w:val="E6141BE6"/>
+    <w:lvl w:ilvl="0">
+      <w:start w:val="4"/>
+      <w:numFmt w:val="decimal"/>
+      <w:lvlText w:val="%1"/>
+      <w:lvlJc w:val="left"/>
+      <w:pPr>
+        <w:ind w:left="751" w:hanging="634"/>
+      </w:pPr>
+    </w:lvl>
+    <w:lvl w:ilvl="1">
+      <w:start w:val="5"/>
+      <w:numFmt w:val="decimal"/>
+      <w:lvlText w:val="12.%2"/>
+      <w:lvlJc w:val="left"/>
+      <w:pPr>
+        <w:ind w:left="751" w:hanging="634"/>
+      </w:pPr>
+      <w:rPr>
+        <w:rFonts w:eastAsia="Arial" w:cs="Arial"/>
+        <w:b/>
+        <w:bCs/>
+        <w:w w:val="102"/>
+        <w:sz w:val="21"/>
+        <w:szCs w:val="21"/>
+      </w:rPr>
+    </w:lvl>
+    <w:lvl w:ilvl="2">
+      <w:start w:val="1"/>
+      <w:numFmt w:val="bullet"/>
+      <w:lvlText w:val=""/>
+      <w:lvlJc w:val="left"/>
+      <w:pPr>
+        <w:ind w:left="2796" w:hanging="634"/>
+      </w:pPr>
+      <w:rPr>
+        <w:rFonts w:ascii="Symbol" w:hAnsi="Symbol" w:cs="Symbol" w:hint="default"/>
+      </w:rPr>
+    </w:lvl>
+    <w:lvl w:ilvl="3">
+      <w:start w:val="1"/>
+      <w:numFmt w:val="bullet"/>
+      <w:lvlText w:val=""/>
+      <w:lvlJc w:val="left"/>
+      <w:pPr>
+        <w:ind w:left="3814" w:hanging="634"/>
+      </w:pPr>
+      <w:rPr>
+        <w:rFonts w:ascii="Symbol" w:hAnsi="Symbol" w:cs="Symbol" w:hint="default"/>
+      </w:rPr>
+    </w:lvl>
+    <w:lvl w:ilvl="4">
+      <w:start w:val="1"/>
+      <w:numFmt w:val="bullet"/>
+      <w:lvlText w:val=""/>
+      <w:lvlJc w:val="left"/>
+      <w:pPr>
+        <w:ind w:left="4832" w:hanging="634"/>
+      </w:pPr>
+      <w:rPr>
+        <w:rFonts w:ascii="Symbol" w:hAnsi="Symbol" w:cs="Symbol" w:hint="default"/>
+      </w:rPr>
+    </w:lvl>
+    <w:lvl w:ilvl="5">
+      <w:start w:val="1"/>
+      <w:numFmt w:val="bullet"/>
+      <w:lvlText w:val=""/>
+      <w:lvlJc w:val="left"/>
+      <w:pPr>
+        <w:ind w:left="5850" w:hanging="634"/>
+      </w:pPr>
+      <w:rPr>
+        <w:rFonts w:ascii="Symbol" w:hAnsi="Symbol" w:cs="Symbol" w:hint="default"/>
+      </w:rPr>
+    </w:lvl>
+    <w:lvl w:ilvl="6">
+      <w:start w:val="1"/>
+      <w:numFmt w:val="bullet"/>
+      <w:lvlText w:val=""/>
+      <w:lvlJc w:val="left"/>
+      <w:pPr>
+        <w:ind w:left="6868" w:hanging="634"/>
+      </w:pPr>
+      <w:rPr>
+        <w:rFonts w:ascii="Symbol" w:hAnsi="Symbol" w:cs="Symbol" w:hint="default"/>
+      </w:rPr>
+    </w:lvl>
+    <w:lvl w:ilvl="7">
+      <w:start w:val="1"/>
+      <w:numFmt w:val="bullet"/>
+      <w:lvlText w:val=""/>
+      <w:lvlJc w:val="left"/>
+      <w:pPr>
+        <w:ind w:left="7886" w:hanging="634"/>
+      </w:pPr>
+      <w:rPr>
+        <w:rFonts w:ascii="Symbol" w:hAnsi="Symbol" w:cs="Symbol" w:hint="default"/>
+      </w:rPr>
+    </w:lvl>
+    <w:lvl w:ilvl="8">
+      <w:start w:val="1"/>
+      <w:numFmt w:val="bullet"/>
+      <w:lvlText w:val=""/>
+      <w:lvlJc w:val="left"/>
+      <w:pPr>
+        <w:ind w:left="8904" w:hanging="634"/>
+      </w:pPr>
+      <w:rPr>
+        <w:rFonts w:ascii="Symbol" w:hAnsi="Symbol" w:cs="Symbol" w:hint="default"/>
+      </w:rPr>
+    </w:lvl>
+  </w:abstractNum>
+  <w:num w:numId="1" w16cid:durableId="1688095591">
+    <w:abstractNumId w:val="3"/>
   </w:num>
-  <w:num w:numId="2">
+  <w:num w:numId="2" w16cid:durableId="196627233">
     <w:abstractNumId w:val="2"/>
   </w:num>
-  <w:num w:numId="3">
-    <w:abstractNumId w:val="3"/>
+  <w:num w:numId="3" w16cid:durableId="1116634458">
+    <w:abstractNumId w:val="0"/>
   </w:num>
-  <w:num w:numId="4">
-    <w:abstractNumId w:val="4"/>
+  <w:num w:numId="4" w16cid:durableId="1249147845">
+    <w:abstractNumId w:val="1"/>
   </w:num>
 </w:numbering>
 </file>
 
 <file path=word/styles.xml><?xml version="1.0" encoding="utf-8"?>
-<w:styles xmlns:w="http://schemas.openxmlformats.org/wordprocessingml/2006/main" xmlns:w14="http://schemas.microsoft.com/office/word/2010/wordml" xmlns:mc="http://schemas.openxmlformats.org/markup-compatibility/2006" mc:Ignorable="w14">
+<w:styles xmlns:mc="http://schemas.openxmlformats.org/markup-compatibility/2006" xmlns:r="http://schemas.openxmlformats.org/officeDocument/2006/relationships" xmlns:w="http://schemas.openxmlformats.org/wordprocessingml/2006/main" xmlns:w14="http://schemas.microsoft.com/office/word/2010/wordml" xmlns:w15="http://schemas.microsoft.com/office/word/2012/wordml" xmlns:w16cex="http://schemas.microsoft.com/office/word/2018/wordml/cex" xmlns:w16cid="http://schemas.microsoft.com/office/word/2016/wordml/cid" xmlns:w16="http://schemas.microsoft.com/office/word/2018/wordml" xmlns:w16sdtdh="http://schemas.microsoft.com/office/word/2020/wordml/sdtdatahash" xmlns:w16se="http://schemas.microsoft.com/office/word/2015/wordml/symex" mc:Ignorable="w14 w15 w16se w16cid w16 w16cex w16sdtdh">
   <w:docDefaults>
     <w:rPrDefault>
       <w:rPr>
-        <w:rFonts w:ascii="Calibri" w:hAnsi="Calibri" w:eastAsia="Calibri" w:cs="" w:asciiTheme="minorHAnsi" w:cstheme="minorBidi" w:eastAsiaTheme="minorHAnsi" w:hAnsiTheme="minorHAnsi"/>
+        <w:rFonts w:asciiTheme="minorHAnsi" w:eastAsiaTheme="minorHAnsi" w:hAnsiTheme="minorHAnsi" w:cstheme="minorBidi"/>
         <w:sz w:val="22"/>
         <w:szCs w:val="22"/>
         <w:lang w:val="en-US" w:eastAsia="en-US" w:bidi="ar-SA"/>
       </w:rPr>
     </w:rPrDefault>
-    <w:pPrDefault>
-      <w:pPr/>
-    </w:pPrDefault>
+    <w:pPrDefault/>
   </w:docDefaults>
   <w:latentStyles w:defLockedState="0" w:defUIPriority="99" w:defSemiHidden="0" w:defUnhideWhenUsed="0" w:defQFormat="0" w:count="376">
     <w:lsdException w:name="Normal" w:uiPriority="0" w:qFormat="1"/>
     <w:lsdException w:name="heading 1" w:uiPriority="9" w:qFormat="1"/>
-    <w:lsdException w:name="heading 2" w:uiPriority="9" w:semiHidden="1" w:unhideWhenUsed="1" w:qFormat="1"/>
-    <w:lsdException w:name="heading 3" w:uiPriority="9" w:semiHidden="1" w:unhideWhenUsed="1" w:qFormat="1"/>
-    <w:lsdException w:name="heading 4" w:uiPriority="9" w:semiHidden="1" w:unhideWhenUsed="1" w:qFormat="1"/>
-    <w:lsdException w:name="heading 5" w:uiPriority="9" w:semiHidden="1" w:unhideWhenUsed="1" w:qFormat="1"/>
-    <w:lsdException w:name="heading 6" w:uiPriority="9" w:semiHidden="1" w:unhideWhenUsed="1" w:qFormat="1"/>
-    <w:lsdException w:name="heading 7" w:uiPriority="9" w:semiHidden="1" w:unhideWhenUsed="1" w:qFormat="1"/>
-    <w:lsdException w:name="heading 8" w:uiPriority="9" w:semiHidden="1" w:unhideWhenUsed="1" w:qFormat="1"/>
-    <w:lsdException w:name="heading 9" w:uiPriority="9" w:semiHidden="1" w:unhideWhenUsed="1" w:qFormat="1"/>
+    <w:lsdException w:name="heading 2" w:semiHidden="1" w:uiPriority="9" w:unhideWhenUsed="1" w:qFormat="1"/>
+    <w:lsdException w:name="heading 3" w:semiHidden="1" w:uiPriority="9" w:unhideWhenUsed="1" w:qFormat="1"/>
+    <w:lsdException w:name="heading 4" w:semiHidden="1" w:uiPriority="9" w:unhideWhenUsed="1" w:qFormat="1"/>
+    <w:lsdException w:name="heading 5" w:semiHidden="1" w:uiPriority="9" w:unhideWhenUsed="1" w:qFormat="1"/>
+    <w:lsdException w:name="heading 6" w:semiHidden="1" w:uiPriority="9" w:unhideWhenUsed="1" w:qFormat="1"/>
+    <w:lsdException w:name="heading 7" w:semiHidden="1" w:uiPriority="9" w:unhideWhenUsed="1" w:qFormat="1"/>
+    <w:lsdException w:name="heading 8" w:semiHidden="1" w:uiPriority="9" w:unhideWhenUsed="1" w:qFormat="1"/>
+    <w:lsdException w:name="heading 9" w:semiHidden="1" w:uiPriority="9" w:unhideWhenUsed="1" w:qFormat="1"/>
     <w:lsdException w:name="index 1" w:semiHidden="1" w:unhideWhenUsed="1"/>
     <w:lsdException w:name="index 2" w:semiHidden="1" w:unhideWhenUsed="1"/>
     <w:lsdException w:name="index 3" w:semiHidden="1" w:unhideWhenUsed="1"/>
@@ -1876,22 +2127,22 @@
     <w:lsdException w:name="index 7" w:semiHidden="1" w:unhideWhenUsed="1"/>
     <w:lsdException w:name="index 8" w:semiHidden="1" w:unhideWhenUsed="1"/>
     <w:lsdException w:name="index 9" w:semiHidden="1" w:unhideWhenUsed="1"/>
-    <w:lsdException w:name="toc 1" w:uiPriority="39" w:semiHidden="1" w:unhideWhenUsed="1"/>
-    <w:lsdException w:name="toc 2" w:uiPriority="39" w:semiHidden="1" w:unhideWhenUsed="1"/>
-    <w:lsdException w:name="toc 3" w:uiPriority="39" w:semiHidden="1" w:unhideWhenUsed="1"/>
-    <w:lsdException w:name="toc 4" w:uiPriority="39" w:semiHidden="1" w:unhideWhenUsed="1"/>
-    <w:lsdException w:name="toc 5" w:uiPriority="39" w:semiHidden="1" w:unhideWhenUsed="1"/>
-    <w:lsdException w:name="toc 6" w:uiPriority="39" w:semiHidden="1" w:unhideWhenUsed="1"/>
-    <w:lsdException w:name="toc 7" w:uiPriority="39" w:semiHidden="1" w:unhideWhenUsed="1"/>
-    <w:lsdException w:name="toc 8" w:uiPriority="39" w:semiHidden="1" w:unhideWhenUsed="1"/>
-    <w:lsdException w:name="toc 9" w:uiPriority="39" w:semiHidden="1" w:unhideWhenUsed="1"/>
+    <w:lsdException w:name="toc 1" w:semiHidden="1" w:uiPriority="39" w:unhideWhenUsed="1"/>
+    <w:lsdException w:name="toc 2" w:semiHidden="1" w:uiPriority="39" w:unhideWhenUsed="1"/>
+    <w:lsdException w:name="toc 3" w:semiHidden="1" w:uiPriority="39" w:unhideWhenUsed="1"/>
+    <w:lsdException w:name="toc 4" w:semiHidden="1" w:uiPriority="39" w:unhideWhenUsed="1"/>
+    <w:lsdException w:name="toc 5" w:semiHidden="1" w:uiPriority="39" w:unhideWhenUsed="1"/>
+    <w:lsdException w:name="toc 6" w:semiHidden="1" w:uiPriority="39" w:unhideWhenUsed="1"/>
+    <w:lsdException w:name="toc 7" w:semiHidden="1" w:uiPriority="39" w:unhideWhenUsed="1"/>
+    <w:lsdException w:name="toc 8" w:semiHidden="1" w:uiPriority="39" w:unhideWhenUsed="1"/>
+    <w:lsdException w:name="toc 9" w:semiHidden="1" w:uiPriority="39" w:unhideWhenUsed="1"/>
     <w:lsdException w:name="Normal Indent" w:semiHidden="1" w:unhideWhenUsed="1"/>
     <w:lsdException w:name="footnote text" w:semiHidden="1" w:unhideWhenUsed="1"/>
     <w:lsdException w:name="annotation text" w:semiHidden="1" w:unhideWhenUsed="1"/>
     <w:lsdException w:name="header" w:semiHidden="1" w:unhideWhenUsed="1"/>
     <w:lsdException w:name="footer" w:semiHidden="1" w:unhideWhenUsed="1"/>
     <w:lsdException w:name="index heading" w:semiHidden="1" w:unhideWhenUsed="1"/>
-    <w:lsdException w:name="caption" w:uiPriority="35" w:semiHidden="1" w:unhideWhenUsed="1" w:qFormat="1"/>
+    <w:lsdException w:name="caption" w:semiHidden="1" w:uiPriority="35" w:unhideWhenUsed="1" w:qFormat="1"/>
     <w:lsdException w:name="table of figures" w:semiHidden="1" w:unhideWhenUsed="1"/>
     <w:lsdException w:name="envelope address" w:semiHidden="1" w:unhideWhenUsed="1"/>
     <w:lsdException w:name="envelope return" w:semiHidden="1" w:unhideWhenUsed="1"/>
@@ -1922,7 +2173,7 @@
     <w:lsdException w:name="Title" w:uiPriority="10" w:qFormat="1"/>
     <w:lsdException w:name="Closing" w:semiHidden="1" w:unhideWhenUsed="1"/>
     <w:lsdException w:name="Signature" w:semiHidden="1" w:unhideWhenUsed="1"/>
-    <w:lsdException w:name="Default Paragraph Font" w:uiPriority="1" w:semiHidden="1" w:unhideWhenUsed="1"/>
+    <w:lsdException w:name="Default Paragraph Font" w:semiHidden="1" w:uiPriority="1" w:unhideWhenUsed="1"/>
     <w:lsdException w:name="Body Text" w:semiHidden="1" w:unhideWhenUsed="1"/>
     <w:lsdException w:name="Body Text Indent" w:semiHidden="1" w:unhideWhenUsed="1"/>
     <w:lsdException w:name="List Continue" w:semiHidden="1" w:unhideWhenUsed="1"/>
@@ -2122,8 +2373,8 @@
     <w:lsdException w:name="Subtle Reference" w:uiPriority="31" w:qFormat="1"/>
     <w:lsdException w:name="Intense Reference" w:uiPriority="32" w:qFormat="1"/>
     <w:lsdException w:name="Book Title" w:uiPriority="33" w:qFormat="1"/>
-    <w:lsdException w:name="Bibliography" w:uiPriority="37" w:semiHidden="1" w:unhideWhenUsed="1"/>
-    <w:lsdException w:name="TOC Heading" w:uiPriority="39" w:semiHidden="1" w:unhideWhenUsed="1" w:qFormat="1"/>
+    <w:lsdException w:name="Bibliography" w:semiHidden="1" w:uiPriority="37" w:unhideWhenUsed="1"/>
+    <w:lsdException w:name="TOC Heading" w:semiHidden="1" w:uiPriority="39" w:unhideWhenUsed="1" w:qFormat="1"/>
     <w:lsdException w:name="Plain Table 1" w:uiPriority="41"/>
     <w:lsdException w:name="Plain Table 2" w:uiPriority="42"/>
     <w:lsdException w:name="Plain Table 3" w:uiPriority="43"/>
@@ -2234,26 +2485,16 @@
     <w:lsdException w:name="Unresolved Mention" w:semiHidden="1" w:unhideWhenUsed="1"/>
     <w:lsdException w:name="Smart Link" w:semiHidden="1" w:unhideWhenUsed="1"/>
   </w:latentStyles>
-  <w:style w:type="paragraph" w:styleId="Normal" w:default="1">
+  <w:style w:type="paragraph" w:default="1" w:styleId="Normal">
     <w:name w:val="Normal"/>
     <w:uiPriority w:val="1"/>
     <w:qFormat/>
-    <w:pPr>
-      <w:widowControl/>
-      <w:bidi w:val="0"/>
-      <w:jc w:val="left"/>
-    </w:pPr>
-    <w:rPr>
-      <w:rFonts w:ascii="Arial" w:hAnsi="Arial" w:eastAsia="Arial" w:cs="Arial"/>
-      <w:color w:val="auto"/>
-      <w:kern w:val="0"/>
-      <w:sz w:val="22"/>
-      <w:szCs w:val="22"/>
-      <w:lang w:val="en-US" w:eastAsia="en-US" w:bidi="ar-SA"/>
+    <w:rPr>
+      <w:rFonts w:ascii="Arial" w:eastAsia="Arial" w:hAnsi="Arial" w:cs="Arial"/>
     </w:rPr>
   </w:style>
   <w:style w:type="paragraph" w:styleId="Heading1">
-    <w:name w:val="Heading 1"/>
+    <w:name w:val="heading 1"/>
     <w:basedOn w:val="Normal"/>
     <w:uiPriority w:val="1"/>
     <w:qFormat/>
@@ -2269,482 +2510,11 @@
       <w:szCs w:val="21"/>
     </w:rPr>
   </w:style>
-  <w:style w:type="character" w:styleId="DefaultParagraphFont" w:default="1">
+  <w:style w:type="character" w:default="1" w:styleId="DefaultParagraphFont">
     <w:name w:val="Default Paragraph Font"/>
     <w:uiPriority w:val="1"/>
     <w:semiHidden/>
     <w:unhideWhenUsed/>
-    <w:qFormat/>
-    <w:rPr/>
-  </w:style>
-  <w:style w:type="character" w:styleId="HeaderChar" w:customStyle="1">
-    <w:name w:val="Header Char"/>
-    <w:basedOn w:val="DefaultParagraphFont"/>
-    <w:link w:val="Header"/>
-    <w:uiPriority w:val="99"/>
-    <w:qFormat/>
-    <w:rsid w:val="006834d6"/>
-    <w:rPr>
-      <w:rFonts w:ascii="Arial" w:hAnsi="Arial" w:eastAsia="Arial" w:cs="Arial"/>
-    </w:rPr>
-  </w:style>
-  <w:style w:type="character" w:styleId="FooterChar" w:customStyle="1">
-    <w:name w:val="Footer Char"/>
-    <w:basedOn w:val="DefaultParagraphFont"/>
-    <w:link w:val="Footer"/>
-    <w:uiPriority w:val="99"/>
-    <w:qFormat/>
-    <w:rsid w:val="006834d6"/>
-    <w:rPr>
-      <w:rFonts w:ascii="Arial" w:hAnsi="Arial" w:eastAsia="Arial" w:cs="Arial"/>
-    </w:rPr>
-  </w:style>
-  <w:style w:type="character" w:styleId="Pagenumber">
-    <w:name w:val="page number"/>
-    <w:basedOn w:val="DefaultParagraphFont"/>
-    <w:uiPriority w:val="99"/>
-    <w:semiHidden/>
-    <w:unhideWhenUsed/>
-    <w:qFormat/>
-    <w:rsid w:val="009252f1"/>
-    <w:rPr/>
-  </w:style>
-  <w:style w:type="character" w:styleId="InternetLink">
-    <w:name w:val="Internet Link"/>
-    <w:basedOn w:val="DefaultParagraphFont"/>
-    <w:uiPriority w:val="99"/>
-    <w:semiHidden/>
-    <w:unhideWhenUsed/>
-    <w:rsid w:val="000a3605"/>
-    <w:rPr>
-      <w:color w:val="0000FF"/>
-      <w:u w:val="single"/>
-    </w:rPr>
-  </w:style>
-  <w:style w:type="character" w:styleId="ListLabel1">
-    <w:name w:val="ListLabel 1"/>
-    <w:qFormat/>
-    <w:rPr>
-      <w:rFonts w:eastAsia="Arial" w:cs="Arial"/>
-      <w:b/>
-      <w:bCs/>
-      <w:w w:val="102"/>
-      <w:sz w:val="21"/>
-      <w:szCs w:val="21"/>
-    </w:rPr>
-  </w:style>
-  <w:style w:type="character" w:styleId="ListLabel2">
-    <w:name w:val="ListLabel 2"/>
-    <w:qFormat/>
-    <w:rPr>
-      <w:rFonts w:eastAsia="Arial" w:cs="Arial"/>
-      <w:b/>
-      <w:bCs/>
-      <w:w w:val="102"/>
-      <w:sz w:val="21"/>
-      <w:szCs w:val="21"/>
-    </w:rPr>
-  </w:style>
-  <w:style w:type="character" w:styleId="ListLabel3">
-    <w:name w:val="ListLabel 3"/>
-    <w:qFormat/>
-    <w:rPr>
-      <w:rFonts w:eastAsia="Arial" w:cs="Arial"/>
-      <w:b/>
-      <w:bCs/>
-      <w:w w:val="102"/>
-      <w:sz w:val="21"/>
-      <w:szCs w:val="21"/>
-    </w:rPr>
-  </w:style>
-  <w:style w:type="character" w:styleId="ListLabel4">
-    <w:name w:val="ListLabel 4"/>
-    <w:qFormat/>
-    <w:rPr>
-      <w:rFonts w:eastAsia="Arial" w:cs="Arial"/>
-      <w:b/>
-      <w:bCs/>
-      <w:w w:val="102"/>
-      <w:sz w:val="21"/>
-      <w:szCs w:val="21"/>
-    </w:rPr>
-  </w:style>
-  <w:style w:type="character" w:styleId="ListLabel5">
-    <w:name w:val="ListLabel 5"/>
-    <w:qFormat/>
-    <w:rPr>
-      <w:rFonts w:eastAsia="Arial" w:cs="Arial"/>
-      <w:w w:val="99"/>
-      <w:sz w:val="24"/>
-      <w:szCs w:val="24"/>
-    </w:rPr>
-  </w:style>
-  <w:style w:type="character" w:styleId="ListLabel6">
-    <w:name w:val="ListLabel 6"/>
-    <w:qFormat/>
-    <w:rPr>
-      <w:rFonts w:eastAsia="Arial" w:cs="Arial"/>
-      <w:b/>
-      <w:bCs/>
-      <w:w w:val="102"/>
-      <w:sz w:val="21"/>
-      <w:szCs w:val="21"/>
-    </w:rPr>
-  </w:style>
-  <w:style w:type="character" w:styleId="ListLabel7">
-    <w:name w:val="ListLabel 7"/>
-    <w:qFormat/>
-    <w:rPr>
-      <w:rFonts w:eastAsia="Arial" w:cs="Arial"/>
-      <w:b/>
-      <w:bCs/>
-      <w:w w:val="102"/>
-      <w:sz w:val="21"/>
-      <w:szCs w:val="21"/>
-    </w:rPr>
-  </w:style>
-  <w:style w:type="character" w:styleId="ListLabel8">
-    <w:name w:val="ListLabel 8"/>
-    <w:qFormat/>
-    <w:rPr>
-      <w:rFonts w:eastAsia="Arial" w:cs="Arial"/>
-      <w:b/>
-      <w:bCs/>
-      <w:w w:val="102"/>
-      <w:sz w:val="21"/>
-      <w:szCs w:val="21"/>
-    </w:rPr>
-  </w:style>
-  <w:style w:type="character" w:styleId="ListLabel9">
-    <w:name w:val="ListLabel 9"/>
-    <w:qFormat/>
-    <w:rPr>
-      <w:rFonts w:eastAsia="Arial" w:cs="Arial"/>
-      <w:w w:val="99"/>
-      <w:sz w:val="24"/>
-      <w:szCs w:val="24"/>
-    </w:rPr>
-  </w:style>
-  <w:style w:type="character" w:styleId="ListLabel10">
-    <w:name w:val="ListLabel 10"/>
-    <w:qFormat/>
-    <w:rPr>
-      <w:rFonts w:eastAsia="Arial" w:cs="Arial"/>
-      <w:b/>
-      <w:bCs/>
-      <w:w w:val="102"/>
-      <w:sz w:val="21"/>
-      <w:szCs w:val="21"/>
-    </w:rPr>
-  </w:style>
-  <w:style w:type="character" w:styleId="ListLabel11">
-    <w:name w:val="ListLabel 11"/>
-    <w:qFormat/>
-    <w:rPr>
-      <w:rFonts w:eastAsia="Arial" w:cs="Arial"/>
-      <w:b/>
-      <w:bCs/>
-      <w:w w:val="102"/>
-      <w:sz w:val="21"/>
-      <w:szCs w:val="21"/>
-    </w:rPr>
-  </w:style>
-  <w:style w:type="character" w:styleId="ListLabel12">
-    <w:name w:val="ListLabel 12"/>
-    <w:qFormat/>
-    <w:rPr>
-      <w:rFonts w:eastAsia="Arial" w:cs="Arial"/>
-      <w:b/>
-      <w:bCs/>
-      <w:w w:val="102"/>
-      <w:sz w:val="24"/>
-      <w:szCs w:val="24"/>
-    </w:rPr>
-  </w:style>
-  <w:style w:type="character" w:styleId="ListLabel13">
-    <w:name w:val="ListLabel 13"/>
-    <w:qFormat/>
-    <w:rPr>
-      <w:rFonts w:eastAsia="Arial" w:cs="Arial"/>
-      <w:b/>
-      <w:bCs/>
-      <w:w w:val="102"/>
-      <w:sz w:val="24"/>
-      <w:szCs w:val="24"/>
-    </w:rPr>
-  </w:style>
-  <w:style w:type="character" w:styleId="ListLabel14">
-    <w:name w:val="ListLabel 14"/>
-    <w:qFormat/>
-    <w:rPr>
-      <w:rFonts w:eastAsia="Arial" w:cs="Arial"/>
-      <w:b/>
-      <w:bCs/>
-      <w:w w:val="102"/>
-      <w:sz w:val="24"/>
-      <w:szCs w:val="21"/>
-    </w:rPr>
-  </w:style>
-  <w:style w:type="character" w:styleId="ListLabel15">
-    <w:name w:val="ListLabel 15"/>
-    <w:qFormat/>
-    <w:rPr>
-      <w:rFonts w:eastAsia="Arial" w:cs="Arial"/>
-      <w:w w:val="99"/>
-      <w:sz w:val="24"/>
-      <w:szCs w:val="24"/>
-    </w:rPr>
-  </w:style>
-  <w:style w:type="character" w:styleId="ListLabel16">
-    <w:name w:val="ListLabel 16"/>
-    <w:qFormat/>
-    <w:rPr>
-      <w:rFonts w:eastAsia="Arial" w:cs="Arial"/>
-      <w:b/>
-      <w:bCs/>
-      <w:w w:val="102"/>
-      <w:sz w:val="21"/>
-      <w:szCs w:val="21"/>
-    </w:rPr>
-  </w:style>
-  <w:style w:type="character" w:styleId="ListLabel17">
-    <w:name w:val="ListLabel 17"/>
-    <w:qFormat/>
-    <w:rPr>
-      <w:rFonts w:eastAsia="Arial" w:cs="Arial"/>
-      <w:b/>
-      <w:bCs/>
-      <w:w w:val="102"/>
-      <w:sz w:val="21"/>
-      <w:szCs w:val="21"/>
-    </w:rPr>
-  </w:style>
-  <w:style w:type="character" w:styleId="ListLabel18">
-    <w:name w:val="ListLabel 18"/>
-    <w:qFormat/>
-    <w:rPr>
-      <w:rFonts w:eastAsia="Arial" w:cs="Arial"/>
-      <w:b/>
-      <w:bCs/>
-      <w:w w:val="102"/>
-      <w:sz w:val="21"/>
-      <w:szCs w:val="21"/>
-    </w:rPr>
-  </w:style>
-  <w:style w:type="character" w:styleId="ListLabel19">
-    <w:name w:val="ListLabel 19"/>
-    <w:qFormat/>
-    <w:rPr>
-      <w:rFonts w:eastAsia="Arial" w:cs="Arial"/>
-      <w:w w:val="99"/>
-      <w:sz w:val="24"/>
-      <w:szCs w:val="24"/>
-    </w:rPr>
-  </w:style>
-  <w:style w:type="character" w:styleId="ListLabel20">
-    <w:name w:val="ListLabel 20"/>
-    <w:qFormat/>
-    <w:rPr>
-      <w:rFonts w:eastAsia="Arial" w:cs="Arial"/>
-      <w:b/>
-      <w:bCs/>
-      <w:w w:val="102"/>
-      <w:sz w:val="21"/>
-      <w:szCs w:val="21"/>
-    </w:rPr>
-  </w:style>
-  <w:style w:type="character" w:styleId="ListLabel21">
-    <w:name w:val="ListLabel 21"/>
-    <w:qFormat/>
-    <w:rPr>
-      <w:rFonts w:eastAsia="Arial" w:cs="Arial"/>
-      <w:b/>
-      <w:bCs/>
-      <w:w w:val="102"/>
-      <w:sz w:val="21"/>
-      <w:szCs w:val="21"/>
-    </w:rPr>
-  </w:style>
-  <w:style w:type="character" w:styleId="ListLabel22">
-    <w:name w:val="ListLabel 22"/>
-    <w:qFormat/>
-    <w:rPr>
-      <w:rFonts w:cs="Courier New"/>
-    </w:rPr>
-  </w:style>
-  <w:style w:type="character" w:styleId="ListLabel23">
-    <w:name w:val="ListLabel 23"/>
-    <w:qFormat/>
-    <w:rPr>
-      <w:rFonts w:cs="Courier New"/>
-    </w:rPr>
-  </w:style>
-  <w:style w:type="character" w:styleId="ListLabel24">
-    <w:name w:val="ListLabel 24"/>
-    <w:qFormat/>
-    <w:rPr>
-      <w:rFonts w:cs="Courier New"/>
-    </w:rPr>
-  </w:style>
-  <w:style w:type="character" w:styleId="ListLabel25">
-    <w:name w:val="ListLabel 25"/>
-    <w:qFormat/>
-    <w:rPr>
-      <w:rFonts w:cs="Courier New"/>
-    </w:rPr>
-  </w:style>
-  <w:style w:type="character" w:styleId="ListLabel26">
-    <w:name w:val="ListLabel 26"/>
-    <w:qFormat/>
-    <w:rPr>
-      <w:rFonts w:cs="Courier New"/>
-    </w:rPr>
-  </w:style>
-  <w:style w:type="character" w:styleId="ListLabel27">
-    <w:name w:val="ListLabel 27"/>
-    <w:qFormat/>
-    <w:rPr>
-      <w:rFonts w:cs="Courier New"/>
-    </w:rPr>
-  </w:style>
-  <w:style w:type="paragraph" w:styleId="Heading">
-    <w:name w:val="Heading"/>
-    <w:basedOn w:val="Normal"/>
-    <w:next w:val="TextBody"/>
-    <w:qFormat/>
-    <w:pPr>
-      <w:keepNext w:val="true"/>
-      <w:spacing w:before="240" w:after="120"/>
-    </w:pPr>
-    <w:rPr>
-      <w:rFonts w:ascii="Liberation Sans" w:hAnsi="Liberation Sans" w:eastAsia="AR PL SungtiL GB" w:cs="Lohit Devanagari"/>
-      <w:sz w:val="28"/>
-      <w:szCs w:val="28"/>
-    </w:rPr>
-  </w:style>
-  <w:style w:type="paragraph" w:styleId="TextBody">
-    <w:name w:val="Body Text"/>
-    <w:basedOn w:val="Normal"/>
-    <w:uiPriority w:val="1"/>
-    <w:qFormat/>
-    <w:pPr>
-      <w:spacing w:before="47" w:after="0"/>
-      <w:ind w:left="117" w:right="1415" w:hanging="0"/>
-      <w:jc w:val="both"/>
-    </w:pPr>
-    <w:rPr>
-      <w:sz w:val="21"/>
-      <w:szCs w:val="21"/>
-    </w:rPr>
-  </w:style>
-  <w:style w:type="paragraph" w:styleId="List">
-    <w:name w:val="List"/>
-    <w:basedOn w:val="TextBody"/>
-    <w:pPr/>
-    <w:rPr>
-      <w:rFonts w:cs="Lohit Devanagari"/>
-    </w:rPr>
-  </w:style>
-  <w:style w:type="paragraph" w:styleId="Caption">
-    <w:name w:val="Caption"/>
-    <w:basedOn w:val="Normal"/>
-    <w:qFormat/>
-    <w:pPr>
-      <w:suppressLineNumbers/>
-      <w:spacing w:before="120" w:after="120"/>
-    </w:pPr>
-    <w:rPr>
-      <w:rFonts w:cs="Lohit Devanagari"/>
-      <w:i/>
-      <w:iCs/>
-      <w:sz w:val="24"/>
-      <w:szCs w:val="24"/>
-    </w:rPr>
-  </w:style>
-  <w:style w:type="paragraph" w:styleId="Index">
-    <w:name w:val="Index"/>
-    <w:basedOn w:val="Normal"/>
-    <w:qFormat/>
-    <w:pPr>
-      <w:suppressLineNumbers/>
-    </w:pPr>
-    <w:rPr>
-      <w:rFonts w:cs="Lohit Devanagari"/>
-    </w:rPr>
-  </w:style>
-  <w:style w:type="paragraph" w:styleId="ListParagraph">
-    <w:name w:val="List Paragraph"/>
-    <w:basedOn w:val="Normal"/>
-    <w:uiPriority w:val="1"/>
-    <w:qFormat/>
-    <w:pPr>
-      <w:ind w:left="751" w:hanging="635"/>
-      <w:jc w:val="both"/>
-    </w:pPr>
-    <w:rPr/>
-  </w:style>
-  <w:style w:type="paragraph" w:styleId="TableParagraph" w:customStyle="1">
-    <w:name w:val="Table Paragraph"/>
-    <w:basedOn w:val="Normal"/>
-    <w:uiPriority w:val="1"/>
-    <w:qFormat/>
-    <w:pPr/>
-    <w:rPr/>
-  </w:style>
-  <w:style w:type="paragraph" w:styleId="Header">
-    <w:name w:val="Header"/>
-    <w:basedOn w:val="Normal"/>
-    <w:link w:val="HeaderChar"/>
-    <w:uiPriority w:val="99"/>
-    <w:unhideWhenUsed/>
-    <w:rsid w:val="006834d6"/>
-    <w:pPr>
-      <w:tabs>
-        <w:tab w:val="center" w:pos="4680" w:leader="none"/>
-        <w:tab w:val="right" w:pos="9360" w:leader="none"/>
-      </w:tabs>
-    </w:pPr>
-    <w:rPr/>
-  </w:style>
-  <w:style w:type="paragraph" w:styleId="Footer">
-    <w:name w:val="Footer"/>
-    <w:basedOn w:val="Normal"/>
-    <w:link w:val="FooterChar"/>
-    <w:uiPriority w:val="99"/>
-    <w:unhideWhenUsed/>
-    <w:rsid w:val="006834d6"/>
-    <w:pPr>
-      <w:tabs>
-        <w:tab w:val="center" w:pos="4680" w:leader="none"/>
-        <w:tab w:val="right" w:pos="9360" w:leader="none"/>
-      </w:tabs>
-    </w:pPr>
-    <w:rPr/>
-  </w:style>
-  <w:style w:type="paragraph" w:styleId="NormalWeb">
-    <w:name w:val="Normal (Web)"/>
-    <w:basedOn w:val="Normal"/>
-    <w:uiPriority w:val="99"/>
-    <w:semiHidden/>
-    <w:unhideWhenUsed/>
-    <w:qFormat/>
-    <w:rsid w:val="00040495"/>
-    <w:pPr>
-      <w:widowControl/>
-      <w:spacing w:beforeAutospacing="1" w:afterAutospacing="1"/>
-    </w:pPr>
-    <w:rPr>
-      <w:rFonts w:ascii="Times New Roman" w:hAnsi="Times New Roman" w:eastAsia="Times New Roman" w:cs="Times New Roman"/>
-      <w:sz w:val="24"/>
-      <w:szCs w:val="24"/>
-    </w:rPr>
-  </w:style>
-  <w:style w:type="numbering" w:styleId="NoList" w:default="1">
-    <w:name w:val="No List"/>
-    <w:uiPriority w:val="99"/>
-    <w:semiHidden/>
-    <w:unhideWhenUsed/>
-    <w:qFormat/>
   </w:style>
   <w:style w:type="table" w:default="1" w:styleId="TableNormal">
     <w:name w:val="Normal Table"/>
@@ -2761,19 +2531,479 @@
       </w:tblCellMar>
     </w:tblPr>
   </w:style>
+  <w:style w:type="numbering" w:default="1" w:styleId="NoList">
+    <w:name w:val="No List"/>
+    <w:uiPriority w:val="99"/>
+    <w:semiHidden/>
+    <w:unhideWhenUsed/>
+  </w:style>
+  <w:style w:type="character" w:customStyle="1" w:styleId="HeaderChar">
+    <w:name w:val="Header Char"/>
+    <w:basedOn w:val="DefaultParagraphFont"/>
+    <w:link w:val="Header"/>
+    <w:uiPriority w:val="99"/>
+    <w:qFormat/>
+    <w:rsid w:val="006834D6"/>
+    <w:rPr>
+      <w:rFonts w:ascii="Arial" w:eastAsia="Arial" w:hAnsi="Arial" w:cs="Arial"/>
+    </w:rPr>
+  </w:style>
+  <w:style w:type="character" w:customStyle="1" w:styleId="FooterChar">
+    <w:name w:val="Footer Char"/>
+    <w:basedOn w:val="DefaultParagraphFont"/>
+    <w:link w:val="Footer"/>
+    <w:uiPriority w:val="99"/>
+    <w:qFormat/>
+    <w:rsid w:val="006834D6"/>
+    <w:rPr>
+      <w:rFonts w:ascii="Arial" w:eastAsia="Arial" w:hAnsi="Arial" w:cs="Arial"/>
+    </w:rPr>
+  </w:style>
+  <w:style w:type="character" w:styleId="PageNumber">
+    <w:name w:val="page number"/>
+    <w:basedOn w:val="DefaultParagraphFont"/>
+    <w:uiPriority w:val="99"/>
+    <w:semiHidden/>
+    <w:unhideWhenUsed/>
+    <w:qFormat/>
+    <w:rsid w:val="009252F1"/>
+  </w:style>
+  <w:style w:type="character" w:customStyle="1" w:styleId="InternetLink">
+    <w:name w:val="Internet Link"/>
+    <w:basedOn w:val="DefaultParagraphFont"/>
+    <w:uiPriority w:val="99"/>
+    <w:semiHidden/>
+    <w:unhideWhenUsed/>
+    <w:rsid w:val="000A3605"/>
+    <w:rPr>
+      <w:color w:val="0000FF"/>
+      <w:u w:val="single"/>
+    </w:rPr>
+  </w:style>
+  <w:style w:type="character" w:customStyle="1" w:styleId="ListLabel1">
+    <w:name w:val="ListLabel 1"/>
+    <w:qFormat/>
+    <w:rPr>
+      <w:rFonts w:eastAsia="Arial" w:cs="Arial"/>
+      <w:b/>
+      <w:bCs/>
+      <w:w w:val="102"/>
+      <w:sz w:val="21"/>
+      <w:szCs w:val="21"/>
+    </w:rPr>
+  </w:style>
+  <w:style w:type="character" w:customStyle="1" w:styleId="ListLabel2">
+    <w:name w:val="ListLabel 2"/>
+    <w:qFormat/>
+    <w:rPr>
+      <w:rFonts w:eastAsia="Arial" w:cs="Arial"/>
+      <w:b/>
+      <w:bCs/>
+      <w:w w:val="102"/>
+      <w:sz w:val="21"/>
+      <w:szCs w:val="21"/>
+    </w:rPr>
+  </w:style>
+  <w:style w:type="character" w:customStyle="1" w:styleId="ListLabel3">
+    <w:name w:val="ListLabel 3"/>
+    <w:qFormat/>
+    <w:rPr>
+      <w:rFonts w:eastAsia="Arial" w:cs="Arial"/>
+      <w:b/>
+      <w:bCs/>
+      <w:w w:val="102"/>
+      <w:sz w:val="21"/>
+      <w:szCs w:val="21"/>
+    </w:rPr>
+  </w:style>
+  <w:style w:type="character" w:customStyle="1" w:styleId="ListLabel4">
+    <w:name w:val="ListLabel 4"/>
+    <w:qFormat/>
+    <w:rPr>
+      <w:rFonts w:eastAsia="Arial" w:cs="Arial"/>
+      <w:b/>
+      <w:bCs/>
+      <w:w w:val="102"/>
+      <w:sz w:val="21"/>
+      <w:szCs w:val="21"/>
+    </w:rPr>
+  </w:style>
+  <w:style w:type="character" w:customStyle="1" w:styleId="ListLabel5">
+    <w:name w:val="ListLabel 5"/>
+    <w:qFormat/>
+    <w:rPr>
+      <w:rFonts w:eastAsia="Arial" w:cs="Arial"/>
+      <w:w w:val="99"/>
+      <w:sz w:val="24"/>
+      <w:szCs w:val="24"/>
+    </w:rPr>
+  </w:style>
+  <w:style w:type="character" w:customStyle="1" w:styleId="ListLabel6">
+    <w:name w:val="ListLabel 6"/>
+    <w:qFormat/>
+    <w:rPr>
+      <w:rFonts w:eastAsia="Arial" w:cs="Arial"/>
+      <w:b/>
+      <w:bCs/>
+      <w:w w:val="102"/>
+      <w:sz w:val="21"/>
+      <w:szCs w:val="21"/>
+    </w:rPr>
+  </w:style>
+  <w:style w:type="character" w:customStyle="1" w:styleId="ListLabel7">
+    <w:name w:val="ListLabel 7"/>
+    <w:qFormat/>
+    <w:rPr>
+      <w:rFonts w:eastAsia="Arial" w:cs="Arial"/>
+      <w:b/>
+      <w:bCs/>
+      <w:w w:val="102"/>
+      <w:sz w:val="21"/>
+      <w:szCs w:val="21"/>
+    </w:rPr>
+  </w:style>
+  <w:style w:type="character" w:customStyle="1" w:styleId="ListLabel8">
+    <w:name w:val="ListLabel 8"/>
+    <w:qFormat/>
+    <w:rPr>
+      <w:rFonts w:eastAsia="Arial" w:cs="Arial"/>
+      <w:b/>
+      <w:bCs/>
+      <w:w w:val="102"/>
+      <w:sz w:val="21"/>
+      <w:szCs w:val="21"/>
+    </w:rPr>
+  </w:style>
+  <w:style w:type="character" w:customStyle="1" w:styleId="ListLabel9">
+    <w:name w:val="ListLabel 9"/>
+    <w:qFormat/>
+    <w:rPr>
+      <w:rFonts w:eastAsia="Arial" w:cs="Arial"/>
+      <w:w w:val="99"/>
+      <w:sz w:val="24"/>
+      <w:szCs w:val="24"/>
+    </w:rPr>
+  </w:style>
+  <w:style w:type="character" w:customStyle="1" w:styleId="ListLabel10">
+    <w:name w:val="ListLabel 10"/>
+    <w:qFormat/>
+    <w:rPr>
+      <w:rFonts w:eastAsia="Arial" w:cs="Arial"/>
+      <w:b/>
+      <w:bCs/>
+      <w:w w:val="102"/>
+      <w:sz w:val="21"/>
+      <w:szCs w:val="21"/>
+    </w:rPr>
+  </w:style>
+  <w:style w:type="character" w:customStyle="1" w:styleId="ListLabel11">
+    <w:name w:val="ListLabel 11"/>
+    <w:qFormat/>
+    <w:rPr>
+      <w:rFonts w:eastAsia="Arial" w:cs="Arial"/>
+      <w:b/>
+      <w:bCs/>
+      <w:w w:val="102"/>
+      <w:sz w:val="21"/>
+      <w:szCs w:val="21"/>
+    </w:rPr>
+  </w:style>
+  <w:style w:type="character" w:customStyle="1" w:styleId="ListLabel12">
+    <w:name w:val="ListLabel 12"/>
+    <w:qFormat/>
+    <w:rPr>
+      <w:rFonts w:eastAsia="Arial" w:cs="Arial"/>
+      <w:b/>
+      <w:bCs/>
+      <w:w w:val="102"/>
+      <w:sz w:val="24"/>
+      <w:szCs w:val="24"/>
+    </w:rPr>
+  </w:style>
+  <w:style w:type="character" w:customStyle="1" w:styleId="ListLabel13">
+    <w:name w:val="ListLabel 13"/>
+    <w:qFormat/>
+    <w:rPr>
+      <w:rFonts w:eastAsia="Arial" w:cs="Arial"/>
+      <w:b/>
+      <w:bCs/>
+      <w:w w:val="102"/>
+      <w:sz w:val="24"/>
+      <w:szCs w:val="24"/>
+    </w:rPr>
+  </w:style>
+  <w:style w:type="character" w:customStyle="1" w:styleId="ListLabel14">
+    <w:name w:val="ListLabel 14"/>
+    <w:qFormat/>
+    <w:rPr>
+      <w:rFonts w:eastAsia="Arial" w:cs="Arial"/>
+      <w:b/>
+      <w:bCs/>
+      <w:w w:val="102"/>
+      <w:sz w:val="24"/>
+      <w:szCs w:val="21"/>
+    </w:rPr>
+  </w:style>
+  <w:style w:type="character" w:customStyle="1" w:styleId="ListLabel15">
+    <w:name w:val="ListLabel 15"/>
+    <w:qFormat/>
+    <w:rPr>
+      <w:rFonts w:eastAsia="Arial" w:cs="Arial"/>
+      <w:w w:val="99"/>
+      <w:sz w:val="24"/>
+      <w:szCs w:val="24"/>
+    </w:rPr>
+  </w:style>
+  <w:style w:type="character" w:customStyle="1" w:styleId="ListLabel16">
+    <w:name w:val="ListLabel 16"/>
+    <w:qFormat/>
+    <w:rPr>
+      <w:rFonts w:eastAsia="Arial" w:cs="Arial"/>
+      <w:b/>
+      <w:bCs/>
+      <w:w w:val="102"/>
+      <w:sz w:val="21"/>
+      <w:szCs w:val="21"/>
+    </w:rPr>
+  </w:style>
+  <w:style w:type="character" w:customStyle="1" w:styleId="ListLabel17">
+    <w:name w:val="ListLabel 17"/>
+    <w:qFormat/>
+    <w:rPr>
+      <w:rFonts w:eastAsia="Arial" w:cs="Arial"/>
+      <w:b/>
+      <w:bCs/>
+      <w:w w:val="102"/>
+      <w:sz w:val="21"/>
+      <w:szCs w:val="21"/>
+    </w:rPr>
+  </w:style>
+  <w:style w:type="character" w:customStyle="1" w:styleId="ListLabel18">
+    <w:name w:val="ListLabel 18"/>
+    <w:qFormat/>
+    <w:rPr>
+      <w:rFonts w:eastAsia="Arial" w:cs="Arial"/>
+      <w:b/>
+      <w:bCs/>
+      <w:w w:val="102"/>
+      <w:sz w:val="21"/>
+      <w:szCs w:val="21"/>
+    </w:rPr>
+  </w:style>
+  <w:style w:type="character" w:customStyle="1" w:styleId="ListLabel19">
+    <w:name w:val="ListLabel 19"/>
+    <w:qFormat/>
+    <w:rPr>
+      <w:rFonts w:eastAsia="Arial" w:cs="Arial"/>
+      <w:w w:val="99"/>
+      <w:sz w:val="24"/>
+      <w:szCs w:val="24"/>
+    </w:rPr>
+  </w:style>
+  <w:style w:type="character" w:customStyle="1" w:styleId="ListLabel20">
+    <w:name w:val="ListLabel 20"/>
+    <w:qFormat/>
+    <w:rPr>
+      <w:rFonts w:eastAsia="Arial" w:cs="Arial"/>
+      <w:b/>
+      <w:bCs/>
+      <w:w w:val="102"/>
+      <w:sz w:val="21"/>
+      <w:szCs w:val="21"/>
+    </w:rPr>
+  </w:style>
+  <w:style w:type="character" w:customStyle="1" w:styleId="ListLabel21">
+    <w:name w:val="ListLabel 21"/>
+    <w:qFormat/>
+    <w:rPr>
+      <w:rFonts w:eastAsia="Arial" w:cs="Arial"/>
+      <w:b/>
+      <w:bCs/>
+      <w:w w:val="102"/>
+      <w:sz w:val="21"/>
+      <w:szCs w:val="21"/>
+    </w:rPr>
+  </w:style>
+  <w:style w:type="character" w:customStyle="1" w:styleId="ListLabel22">
+    <w:name w:val="ListLabel 22"/>
+    <w:qFormat/>
+    <w:rPr>
+      <w:rFonts w:cs="Courier New"/>
+    </w:rPr>
+  </w:style>
+  <w:style w:type="character" w:customStyle="1" w:styleId="ListLabel23">
+    <w:name w:val="ListLabel 23"/>
+    <w:qFormat/>
+    <w:rPr>
+      <w:rFonts w:cs="Courier New"/>
+    </w:rPr>
+  </w:style>
+  <w:style w:type="character" w:customStyle="1" w:styleId="ListLabel24">
+    <w:name w:val="ListLabel 24"/>
+    <w:qFormat/>
+    <w:rPr>
+      <w:rFonts w:cs="Courier New"/>
+    </w:rPr>
+  </w:style>
+  <w:style w:type="character" w:customStyle="1" w:styleId="ListLabel25">
+    <w:name w:val="ListLabel 25"/>
+    <w:qFormat/>
+    <w:rPr>
+      <w:rFonts w:cs="Courier New"/>
+    </w:rPr>
+  </w:style>
+  <w:style w:type="character" w:customStyle="1" w:styleId="ListLabel26">
+    <w:name w:val="ListLabel 26"/>
+    <w:qFormat/>
+    <w:rPr>
+      <w:rFonts w:cs="Courier New"/>
+    </w:rPr>
+  </w:style>
+  <w:style w:type="character" w:customStyle="1" w:styleId="ListLabel27">
+    <w:name w:val="ListLabel 27"/>
+    <w:qFormat/>
+    <w:rPr>
+      <w:rFonts w:cs="Courier New"/>
+    </w:rPr>
+  </w:style>
+  <w:style w:type="paragraph" w:customStyle="1" w:styleId="Heading">
+    <w:name w:val="Heading"/>
+    <w:basedOn w:val="Normal"/>
+    <w:next w:val="BodyText"/>
+    <w:qFormat/>
+    <w:pPr>
+      <w:keepNext/>
+      <w:spacing w:before="240" w:after="120"/>
+    </w:pPr>
+    <w:rPr>
+      <w:rFonts w:ascii="Liberation Sans" w:eastAsia="AR PL SungtiL GB" w:hAnsi="Liberation Sans" w:cs="Lohit Devanagari"/>
+      <w:sz w:val="28"/>
+      <w:szCs w:val="28"/>
+    </w:rPr>
+  </w:style>
+  <w:style w:type="paragraph" w:styleId="BodyText">
+    <w:name w:val="Body Text"/>
+    <w:basedOn w:val="Normal"/>
+    <w:uiPriority w:val="1"/>
+    <w:qFormat/>
+    <w:pPr>
+      <w:spacing w:before="47"/>
+      <w:ind w:left="117" w:right="1415"/>
+      <w:jc w:val="both"/>
+    </w:pPr>
+    <w:rPr>
+      <w:sz w:val="21"/>
+      <w:szCs w:val="21"/>
+    </w:rPr>
+  </w:style>
+  <w:style w:type="paragraph" w:styleId="List">
+    <w:name w:val="List"/>
+    <w:basedOn w:val="BodyText"/>
+    <w:rPr>
+      <w:rFonts w:cs="Lohit Devanagari"/>
+    </w:rPr>
+  </w:style>
+  <w:style w:type="paragraph" w:styleId="Caption">
+    <w:name w:val="caption"/>
+    <w:basedOn w:val="Normal"/>
+    <w:qFormat/>
+    <w:pPr>
+      <w:suppressLineNumbers/>
+      <w:spacing w:before="120" w:after="120"/>
+    </w:pPr>
+    <w:rPr>
+      <w:rFonts w:cs="Lohit Devanagari"/>
+      <w:i/>
+      <w:iCs/>
+      <w:sz w:val="24"/>
+      <w:szCs w:val="24"/>
+    </w:rPr>
+  </w:style>
+  <w:style w:type="paragraph" w:customStyle="1" w:styleId="Index">
+    <w:name w:val="Index"/>
+    <w:basedOn w:val="Normal"/>
+    <w:qFormat/>
+    <w:pPr>
+      <w:suppressLineNumbers/>
+    </w:pPr>
+    <w:rPr>
+      <w:rFonts w:cs="Lohit Devanagari"/>
+    </w:rPr>
+  </w:style>
+  <w:style w:type="paragraph" w:styleId="ListParagraph">
+    <w:name w:val="List Paragraph"/>
+    <w:basedOn w:val="Normal"/>
+    <w:uiPriority w:val="1"/>
+    <w:qFormat/>
+    <w:pPr>
+      <w:ind w:left="751" w:hanging="635"/>
+      <w:jc w:val="both"/>
+    </w:pPr>
+  </w:style>
+  <w:style w:type="paragraph" w:customStyle="1" w:styleId="TableParagraph">
+    <w:name w:val="Table Paragraph"/>
+    <w:basedOn w:val="Normal"/>
+    <w:uiPriority w:val="1"/>
+    <w:qFormat/>
+  </w:style>
+  <w:style w:type="paragraph" w:styleId="Header">
+    <w:name w:val="header"/>
+    <w:basedOn w:val="Normal"/>
+    <w:link w:val="HeaderChar"/>
+    <w:uiPriority w:val="99"/>
+    <w:unhideWhenUsed/>
+    <w:rsid w:val="006834D6"/>
+    <w:pPr>
+      <w:tabs>
+        <w:tab w:val="center" w:pos="4680"/>
+        <w:tab w:val="right" w:pos="9360"/>
+      </w:tabs>
+    </w:pPr>
+  </w:style>
+  <w:style w:type="paragraph" w:styleId="Footer">
+    <w:name w:val="footer"/>
+    <w:basedOn w:val="Normal"/>
+    <w:link w:val="FooterChar"/>
+    <w:uiPriority w:val="99"/>
+    <w:unhideWhenUsed/>
+    <w:rsid w:val="006834D6"/>
+    <w:pPr>
+      <w:tabs>
+        <w:tab w:val="center" w:pos="4680"/>
+        <w:tab w:val="right" w:pos="9360"/>
+      </w:tabs>
+    </w:pPr>
+  </w:style>
+  <w:style w:type="paragraph" w:styleId="NormalWeb">
+    <w:name w:val="Normal (Web)"/>
+    <w:basedOn w:val="Normal"/>
+    <w:uiPriority w:val="99"/>
+    <w:semiHidden/>
+    <w:unhideWhenUsed/>
+    <w:qFormat/>
+    <w:rsid w:val="00040495"/>
+    <w:pPr>
+      <w:spacing w:beforeAutospacing="1" w:afterAutospacing="1"/>
+    </w:pPr>
+    <w:rPr>
+      <w:rFonts w:ascii="Times New Roman" w:eastAsia="Times New Roman" w:hAnsi="Times New Roman" w:cs="Times New Roman"/>
+      <w:sz w:val="24"/>
+      <w:szCs w:val="24"/>
+    </w:rPr>
+  </w:style>
   <w:style w:type="table" w:styleId="TableGrid">
     <w:name w:val="Table Grid"/>
     <w:basedOn w:val="TableNormal"/>
     <w:uiPriority w:val="39"/>
-    <w:rsid w:val="00d063e2"/>
+    <w:rsid w:val="00D063E2"/>
     <w:tblPr>
       <w:tblBorders>
-        <w:top w:val="single" w:color="auto" w:sz="4" w:space="0"/>
-        <w:left w:val="single" w:color="auto" w:sz="4" w:space="0"/>
-        <w:bottom w:val="single" w:color="auto" w:sz="4" w:space="0"/>
-        <w:right w:val="single" w:color="auto" w:sz="4" w:space="0"/>
-        <w:insideH w:val="single" w:color="auto" w:sz="4" w:space="0"/>
-        <w:insideV w:val="single" w:color="auto" w:sz="4" w:space="0"/>
+        <w:top w:val="single" w:sz="4" w:space="0" w:color="auto"/>
+        <w:left w:val="single" w:sz="4" w:space="0" w:color="auto"/>
+        <w:bottom w:val="single" w:sz="4" w:space="0" w:color="auto"/>
+        <w:right w:val="single" w:sz="4" w:space="0" w:color="auto"/>
+        <w:insideH w:val="single" w:sz="4" w:space="0" w:color="auto"/>
+        <w:insideV w:val="single" w:sz="4" w:space="0" w:color="auto"/>
       </w:tblBorders>
     </w:tblPr>
   </w:style>
@@ -2781,35 +3011,35 @@
     <w:name w:val="Plain Table 5"/>
     <w:basedOn w:val="TableNormal"/>
     <w:uiPriority w:val="45"/>
-    <w:rsid w:val="00d063e2"/>
+    <w:rsid w:val="00D063E2"/>
     <w:tblPr>
       <w:tblStyleRowBandSize w:val="1"/>
       <w:tblStyleColBandSize w:val="1"/>
     </w:tblPr>
     <w:tblStylePr w:type="firstRow">
       <w:rPr>
-        <w:rFonts w:asciiTheme="majorHAnsi" w:hAnsiTheme="majorHAnsi" w:eastAsiaTheme="majorEastAsia" w:cstheme="majorBidi"/>
+        <w:rFonts w:asciiTheme="majorHAnsi" w:eastAsiaTheme="majorEastAsia" w:hAnsiTheme="majorHAnsi" w:cstheme="majorBidi"/>
         <w:i/>
         <w:sz w:val="26"/>
       </w:rPr>
       <w:tblPr/>
       <w:tcPr>
         <w:tcBorders>
-          <w:bottom w:val="single" w:color="7F7F7F" w:themeColor="text1" w:sz="4" w:space="0"/>
+          <w:bottom w:val="single" w:sz="4" w:space="0" w:color="000000" w:themeColor="text1"/>
         </w:tcBorders>
         <w:shd w:val="clear" w:color="auto" w:fill="FFFFFF" w:themeFill="background1"/>
       </w:tcPr>
     </w:tblStylePr>
     <w:tblStylePr w:type="lastRow">
       <w:rPr>
-        <w:rFonts w:asciiTheme="majorHAnsi" w:hAnsiTheme="majorHAnsi" w:eastAsiaTheme="majorEastAsia" w:cstheme="majorBidi"/>
+        <w:rFonts w:asciiTheme="majorHAnsi" w:eastAsiaTheme="majorEastAsia" w:hAnsiTheme="majorHAnsi" w:cstheme="majorBidi"/>
         <w:i/>
         <w:sz w:val="26"/>
       </w:rPr>
       <w:tblPr/>
       <w:tcPr>
         <w:tcBorders>
-          <w:top w:val="single" w:color="7F7F7F" w:themeColor="text1" w:sz="4" w:space="0"/>
+          <w:top w:val="single" w:sz="4" w:space="0" w:color="000000" w:themeColor="text1"/>
         </w:tcBorders>
         <w:shd w:val="clear" w:color="auto" w:fill="FFFFFF" w:themeFill="background1"/>
       </w:tcPr>
@@ -2819,28 +3049,28 @@
         <w:jc w:val="right"/>
       </w:pPr>
       <w:rPr>
-        <w:rFonts w:asciiTheme="majorHAnsi" w:hAnsiTheme="majorHAnsi" w:eastAsiaTheme="majorEastAsia" w:cstheme="majorBidi"/>
+        <w:rFonts w:asciiTheme="majorHAnsi" w:eastAsiaTheme="majorEastAsia" w:hAnsiTheme="majorHAnsi" w:cstheme="majorBidi"/>
         <w:i/>
         <w:sz w:val="26"/>
       </w:rPr>
       <w:tblPr/>
       <w:tcPr>
         <w:tcBorders>
-          <w:right w:val="single" w:color="7F7F7F" w:themeColor="text1" w:sz="4" w:space="0"/>
+          <w:right w:val="single" w:sz="4" w:space="0" w:color="000000" w:themeColor="text1"/>
         </w:tcBorders>
         <w:shd w:val="clear" w:color="auto" w:fill="FFFFFF" w:themeFill="background1"/>
       </w:tcPr>
     </w:tblStylePr>
     <w:tblStylePr w:type="lastCol">
       <w:rPr>
-        <w:rFonts w:asciiTheme="majorHAnsi" w:hAnsiTheme="majorHAnsi" w:eastAsiaTheme="majorEastAsia" w:cstheme="majorBidi"/>
+        <w:rFonts w:asciiTheme="majorHAnsi" w:eastAsiaTheme="majorEastAsia" w:hAnsiTheme="majorHAnsi" w:cstheme="majorBidi"/>
         <w:i/>
         <w:sz w:val="26"/>
       </w:rPr>
       <w:tblPr/>
       <w:tcPr>
         <w:tcBorders>
-          <w:left w:val="single" w:color="7F7F7F" w:themeColor="text1" w:sz="4" w:space="0"/>
+          <w:left w:val="single" w:sz="4" w:space="0" w:color="000000" w:themeColor="text1"/>
         </w:tcBorders>
         <w:shd w:val="clear" w:color="auto" w:fill="FFFFFF" w:themeFill="background1"/>
       </w:tcPr>
@@ -2848,13 +3078,13 @@
     <w:tblStylePr w:type="band1Vert">
       <w:tblPr/>
       <w:tcPr>
-        <w:shd w:val="clear" w:color="auto" w:fill="F2F2F2" w:themeFill="background1" w:themeFillShade="f2"/>
+        <w:shd w:val="clear" w:color="auto" w:fill="F2F2F2" w:themeFill="background1" w:themeFillShade="F2"/>
       </w:tcPr>
     </w:tblStylePr>
     <w:tblStylePr w:type="band1Horz">
       <w:tblPr/>
       <w:tcPr>
-        <w:shd w:val="clear" w:color="auto" w:fill="F2F2F2" w:themeFill="background1" w:themeFillShade="f2"/>
+        <w:shd w:val="clear" w:color="auto" w:fill="F2F2F2" w:themeFill="background1" w:themeFillShade="F2"/>
       </w:tcPr>
     </w:tblStylePr>
     <w:tblStylePr w:type="neCell">

</xml_diff>

<commit_message>
ADAP 2023: Update after another round of proof reading
</commit_message>
<xml_diff>
--- a/budget/budget_justification.docx
+++ b/budget/budget_justification.docx
@@ -1,14 +1,14 @@
 
 <file path=word/document.xml><?xml version="1.0" encoding="utf-8"?>
-<w:document xmlns:wpc="http://schemas.microsoft.com/office/word/2010/wordprocessingCanvas" xmlns:cx="http://schemas.microsoft.com/office/drawing/2014/chartex" xmlns:cx1="http://schemas.microsoft.com/office/drawing/2015/9/8/chartex" xmlns:cx2="http://schemas.microsoft.com/office/drawing/2015/10/21/chartex" xmlns:cx3="http://schemas.microsoft.com/office/drawing/2016/5/9/chartex" xmlns:cx4="http://schemas.microsoft.com/office/drawing/2016/5/10/chartex" xmlns:cx5="http://schemas.microsoft.com/office/drawing/2016/5/11/chartex" xmlns:cx6="http://schemas.microsoft.com/office/drawing/2016/5/12/chartex" xmlns:cx7="http://schemas.microsoft.com/office/drawing/2016/5/13/chartex" xmlns:cx8="http://schemas.microsoft.com/office/drawing/2016/5/14/chartex" xmlns:mc="http://schemas.openxmlformats.org/markup-compatibility/2006" xmlns:aink="http://schemas.microsoft.com/office/drawing/2016/ink" xmlns:am3d="http://schemas.microsoft.com/office/drawing/2017/model3d" xmlns:o="urn:schemas-microsoft-com:office:office" xmlns:oel="http://schemas.microsoft.com/office/2019/extlst" xmlns:r="http://schemas.openxmlformats.org/officeDocument/2006/relationships" xmlns:m="http://schemas.openxmlformats.org/officeDocument/2006/math" xmlns:v="urn:schemas-microsoft-com:vml" xmlns:wp14="http://schemas.microsoft.com/office/word/2010/wordprocessingDrawing" xmlns:wp="http://schemas.openxmlformats.org/drawingml/2006/wordprocessingDrawing" xmlns:w10="urn:schemas-microsoft-com:office:word" xmlns:w="http://schemas.openxmlformats.org/wordprocessingml/2006/main" xmlns:w14="http://schemas.microsoft.com/office/word/2010/wordml" xmlns:w15="http://schemas.microsoft.com/office/word/2012/wordml" xmlns:w16cex="http://schemas.microsoft.com/office/word/2018/wordml/cex" xmlns:w16cid="http://schemas.microsoft.com/office/word/2016/wordml/cid" xmlns:w16="http://schemas.microsoft.com/office/word/2018/wordml" xmlns:w16sdtdh="http://schemas.microsoft.com/office/word/2020/wordml/sdtdatahash" xmlns:w16se="http://schemas.microsoft.com/office/word/2015/wordml/symex" xmlns:wpg="http://schemas.microsoft.com/office/word/2010/wordprocessingGroup" xmlns:wpi="http://schemas.microsoft.com/office/word/2010/wordprocessingInk" xmlns:wne="http://schemas.microsoft.com/office/word/2006/wordml" xmlns:wps="http://schemas.microsoft.com/office/word/2010/wordprocessingShape" mc:Ignorable="w14 w15 w16se w16cid w16 w16cex w16sdtdh wp14">
+<w:document xmlns:o="urn:schemas-microsoft-com:office:office" xmlns:r="http://schemas.openxmlformats.org/officeDocument/2006/relationships" xmlns:v="urn:schemas-microsoft-com:vml" xmlns:w="http://schemas.openxmlformats.org/wordprocessingml/2006/main" xmlns:w10="urn:schemas-microsoft-com:office:word" xmlns:wp="http://schemas.openxmlformats.org/drawingml/2006/wordprocessingDrawing" xmlns:wps="http://schemas.microsoft.com/office/word/2010/wordprocessingShape" xmlns:wpg="http://schemas.microsoft.com/office/word/2010/wordprocessingGroup" xmlns:mc="http://schemas.openxmlformats.org/markup-compatibility/2006" xmlns:wp14="http://schemas.microsoft.com/office/word/2010/wordprocessingDrawing" xmlns:w14="http://schemas.microsoft.com/office/word/2010/wordml" mc:Ignorable="w14 wp14">
   <w:body>
     <w:p>
       <w:pPr>
         <w:pStyle w:val="Heading1"/>
         <w:tabs>
-          <w:tab w:val="left" w:pos="572"/>
+          <w:tab w:val="left" w:pos="572" w:leader="none"/>
         </w:tabs>
-        <w:spacing w:before="97"/>
+        <w:spacing w:before="97" w:after="0"/>
         <w:ind w:left="180" w:right="1580" w:firstLine="360"/>
         <w:jc w:val="center"/>
         <w:rPr>
@@ -16,9 +16,9 @@
           <w:szCs w:val="28"/>
         </w:rPr>
       </w:pPr>
-      <w:bookmarkStart w:id="0" w:name="Budget_Justification"/>
-      <w:bookmarkStart w:id="1" w:name="Post%E2%80%93Processing"/>
-      <w:bookmarkStart w:id="2" w:name="Goals_and_Significance"/>
+      <w:bookmarkStart w:id="0" w:name="Goals_and_Significance"/>
+      <w:bookmarkStart w:id="1" w:name="Post%25E2%2580%2593Processing"/>
+      <w:bookmarkStart w:id="2" w:name="Budget_Justification"/>
       <w:bookmarkEnd w:id="0"/>
       <w:bookmarkEnd w:id="1"/>
       <w:bookmarkEnd w:id="2"/>
@@ -49,9 +49,9 @@
       <w:pPr>
         <w:pStyle w:val="Heading1"/>
         <w:tabs>
-          <w:tab w:val="left" w:pos="572"/>
+          <w:tab w:val="left" w:pos="572" w:leader="none"/>
         </w:tabs>
-        <w:spacing w:before="97"/>
+        <w:spacing w:before="97" w:after="0"/>
         <w:ind w:left="180" w:right="1580" w:firstLine="360"/>
         <w:jc w:val="center"/>
         <w:rPr>
@@ -59,11 +59,17 @@
           <w:szCs w:val="28"/>
         </w:rPr>
       </w:pPr>
+      <w:r>
+        <w:rPr>
+          <w:sz w:val="28"/>
+          <w:szCs w:val="28"/>
+        </w:rPr>
+      </w:r>
     </w:p>
     <w:p>
       <w:pPr>
-        <w:pStyle w:val="BodyText"/>
-        <w:spacing w:line="288" w:lineRule="auto"/>
+        <w:pStyle w:val="TextBody"/>
+        <w:spacing w:lineRule="auto" w:line="288"/>
         <w:ind w:left="180" w:right="1580" w:firstLine="360"/>
         <w:rPr>
           <w:color w:val="000000" w:themeColor="text1"/>
@@ -78,7 +84,21 @@
           <w:sz w:val="24"/>
           <w:szCs w:val="24"/>
         </w:rPr>
-        <w:t>The budget includes salary, benefits, travel, publication charges, and indirect costs for the host institution of the PI as well as support for one graduate.</w:t>
+        <w:t xml:space="preserve">The budget includes salary, benefits, travel, publication charges, and indirect costs for the host institution of the PI as well as support for one graduate </w:t>
+      </w:r>
+      <w:r>
+        <w:rPr>
+          <w:sz w:val="24"/>
+          <w:szCs w:val="24"/>
+        </w:rPr>
+        <w:t>student</w:t>
+      </w:r>
+      <w:r>
+        <w:rPr>
+          <w:sz w:val="24"/>
+          <w:szCs w:val="24"/>
+        </w:rPr>
+        <w:t>.</w:t>
       </w:r>
       <w:r>
         <w:rPr>
@@ -87,141 +107,22 @@
           <w:szCs w:val="24"/>
         </w:rPr>
         <w:softHyphen/>
-      </w:r>
-      <w:r>
-        <w:rPr>
-          <w:color w:val="000000" w:themeColor="text1"/>
-          <w:sz w:val="24"/>
-          <w:szCs w:val="24"/>
-        </w:rPr>
         <w:softHyphen/>
-      </w:r>
-      <w:r>
-        <w:rPr>
-          <w:color w:val="000000" w:themeColor="text1"/>
-          <w:sz w:val="24"/>
-          <w:szCs w:val="24"/>
-        </w:rPr>
         <w:softHyphen/>
-      </w:r>
-      <w:r>
-        <w:rPr>
-          <w:color w:val="000000" w:themeColor="text1"/>
-          <w:sz w:val="24"/>
-          <w:szCs w:val="24"/>
-        </w:rPr>
         <w:softHyphen/>
-      </w:r>
-      <w:r>
-        <w:rPr>
-          <w:color w:val="000000" w:themeColor="text1"/>
-          <w:sz w:val="24"/>
-          <w:szCs w:val="24"/>
-        </w:rPr>
         <w:softHyphen/>
-      </w:r>
-      <w:r>
-        <w:rPr>
-          <w:color w:val="000000" w:themeColor="text1"/>
-          <w:sz w:val="24"/>
-          <w:szCs w:val="24"/>
-        </w:rPr>
         <w:softHyphen/>
-      </w:r>
-      <w:r>
-        <w:rPr>
-          <w:color w:val="000000" w:themeColor="text1"/>
-          <w:sz w:val="24"/>
-          <w:szCs w:val="24"/>
-        </w:rPr>
         <w:softHyphen/>
-      </w:r>
-      <w:r>
-        <w:rPr>
-          <w:color w:val="000000" w:themeColor="text1"/>
-          <w:sz w:val="24"/>
-          <w:szCs w:val="24"/>
-        </w:rPr>
         <w:softHyphen/>
-      </w:r>
-      <w:r>
-        <w:rPr>
-          <w:color w:val="000000" w:themeColor="text1"/>
-          <w:sz w:val="24"/>
-          <w:szCs w:val="24"/>
-        </w:rPr>
         <w:softHyphen/>
-      </w:r>
-      <w:r>
-        <w:rPr>
-          <w:color w:val="000000" w:themeColor="text1"/>
-          <w:sz w:val="24"/>
-          <w:szCs w:val="24"/>
-        </w:rPr>
         <w:softHyphen/>
-      </w:r>
-      <w:r>
-        <w:rPr>
-          <w:color w:val="000000" w:themeColor="text1"/>
-          <w:sz w:val="24"/>
-          <w:szCs w:val="24"/>
-        </w:rPr>
         <w:softHyphen/>
-      </w:r>
-      <w:r>
-        <w:rPr>
-          <w:color w:val="000000" w:themeColor="text1"/>
-          <w:sz w:val="24"/>
-          <w:szCs w:val="24"/>
-        </w:rPr>
         <w:softHyphen/>
-      </w:r>
-      <w:r>
-        <w:rPr>
-          <w:color w:val="000000" w:themeColor="text1"/>
-          <w:sz w:val="24"/>
-          <w:szCs w:val="24"/>
-        </w:rPr>
         <w:softHyphen/>
-      </w:r>
-      <w:r>
-        <w:rPr>
-          <w:color w:val="000000" w:themeColor="text1"/>
-          <w:sz w:val="24"/>
-          <w:szCs w:val="24"/>
-        </w:rPr>
         <w:softHyphen/>
-      </w:r>
-      <w:r>
-        <w:rPr>
-          <w:color w:val="000000" w:themeColor="text1"/>
-          <w:sz w:val="24"/>
-          <w:szCs w:val="24"/>
-        </w:rPr>
         <w:softHyphen/>
-      </w:r>
-      <w:r>
-        <w:rPr>
-          <w:color w:val="000000" w:themeColor="text1"/>
-          <w:sz w:val="24"/>
-          <w:szCs w:val="24"/>
-        </w:rPr>
         <w:softHyphen/>
-      </w:r>
-      <w:r>
-        <w:rPr>
-          <w:color w:val="000000" w:themeColor="text1"/>
-          <w:sz w:val="24"/>
-          <w:szCs w:val="24"/>
-        </w:rPr>
         <w:softHyphen/>
-      </w:r>
-      <w:r>
-        <w:rPr>
-          <w:color w:val="000000" w:themeColor="text1"/>
-          <w:sz w:val="24"/>
-          <w:szCs w:val="24"/>
-        </w:rPr>
         <w:softHyphen/>
       </w:r>
     </w:p>
@@ -233,9 +134,9 @@
           <w:numId w:val="2"/>
         </w:numPr>
         <w:tabs>
-          <w:tab w:val="left" w:pos="752"/>
+          <w:tab w:val="left" w:pos="752" w:leader="none"/>
         </w:tabs>
-        <w:spacing w:before="160" w:line="238" w:lineRule="exact"/>
+        <w:spacing w:lineRule="exact" w:line="238" w:before="160" w:after="0"/>
         <w:ind w:left="180" w:right="1584" w:firstLine="360"/>
         <w:rPr>
           <w:sz w:val="24"/>
@@ -267,8 +168,8 @@
     </w:p>
     <w:p>
       <w:pPr>
-        <w:pStyle w:val="BodyText"/>
-        <w:spacing w:before="48" w:line="288" w:lineRule="auto"/>
+        <w:pStyle w:val="TextBody"/>
+        <w:spacing w:lineRule="auto" w:line="288" w:before="48" w:after="0"/>
         <w:ind w:left="180" w:right="1580" w:firstLine="360"/>
         <w:rPr>
           <w:sz w:val="24"/>
@@ -291,9 +192,9 @@
           <w:numId w:val="2"/>
         </w:numPr>
         <w:tabs>
-          <w:tab w:val="left" w:pos="931"/>
+          <w:tab w:val="left" w:pos="931" w:leader="none"/>
         </w:tabs>
-        <w:spacing w:before="160"/>
+        <w:spacing w:before="160" w:after="0"/>
         <w:ind w:left="180" w:right="1584" w:firstLine="360"/>
         <w:rPr>
           <w:sz w:val="24"/>
@@ -318,9 +219,9 @@
           <w:numId w:val="2"/>
         </w:numPr>
         <w:tabs>
-          <w:tab w:val="left" w:pos="931"/>
+          <w:tab w:val="left" w:pos="931" w:leader="none"/>
         </w:tabs>
-        <w:spacing w:before="160" w:line="360" w:lineRule="auto"/>
+        <w:spacing w:lineRule="auto" w:line="360" w:before="160" w:after="0"/>
         <w:ind w:left="180" w:right="1584" w:firstLine="360"/>
         <w:rPr>
           <w:sz w:val="24"/>
@@ -342,7 +243,6 @@
         </w:rPr>
         <w:t xml:space="preserve">Dr. </w:t>
       </w:r>
-      <w:proofErr w:type="spellStart"/>
       <w:r>
         <w:rPr>
           <w:sz w:val="24"/>
@@ -350,7 +250,6 @@
         </w:rPr>
         <w:t>Kaloyan</w:t>
       </w:r>
-      <w:proofErr w:type="spellEnd"/>
       <w:r>
         <w:rPr>
           <w:spacing w:val="-14"/>
@@ -359,7 +258,6 @@
         </w:rPr>
         <w:t xml:space="preserve"> </w:t>
       </w:r>
-      <w:proofErr w:type="spellStart"/>
       <w:r>
         <w:rPr>
           <w:spacing w:val="-3"/>
@@ -368,22 +266,21 @@
         </w:rPr>
         <w:t>Penev</w:t>
       </w:r>
-      <w:bookmarkStart w:id="5" w:name="Publication_Costs"/>
-      <w:bookmarkStart w:id="6" w:name="Photometry"/>
+      <w:bookmarkStart w:id="5" w:name="Data_Management_Plan"/>
+      <w:bookmarkStart w:id="6" w:name="Supplies"/>
       <w:bookmarkStart w:id="7" w:name="Pipeline_Architecture"/>
-      <w:bookmarkStart w:id="8" w:name="Supplies"/>
-      <w:bookmarkStart w:id="9" w:name="Data_Management_Plan"/>
+      <w:bookmarkStart w:id="8" w:name="Photometry"/>
+      <w:bookmarkStart w:id="9" w:name="Publication_Costs"/>
       <w:bookmarkEnd w:id="5"/>
       <w:bookmarkEnd w:id="6"/>
       <w:bookmarkEnd w:id="7"/>
       <w:bookmarkEnd w:id="8"/>
       <w:bookmarkEnd w:id="9"/>
-      <w:proofErr w:type="spellEnd"/>
     </w:p>
     <w:p>
       <w:pPr>
-        <w:pStyle w:val="BodyText"/>
-        <w:spacing w:before="0" w:line="288" w:lineRule="auto"/>
+        <w:pStyle w:val="TextBody"/>
+        <w:spacing w:lineRule="auto" w:line="288" w:before="0" w:after="0"/>
         <w:ind w:left="180" w:right="1580" w:firstLine="360"/>
         <w:rPr>
           <w:color w:val="000000" w:themeColor="text1"/>
@@ -434,29 +331,13 @@
           <w:sz w:val="24"/>
           <w:szCs w:val="24"/>
         </w:rPr>
-        <w:t xml:space="preserve">, 1 month for each of the </w:t>
-      </w:r>
-      <w:r>
-        <w:rPr>
-          <w:color w:val="000000" w:themeColor="text1"/>
-          <w:sz w:val="24"/>
-          <w:szCs w:val="24"/>
-        </w:rPr>
-        <w:t>two</w:t>
-      </w:r>
-      <w:r>
-        <w:rPr>
-          <w:color w:val="000000" w:themeColor="text1"/>
-          <w:sz w:val="24"/>
-          <w:szCs w:val="24"/>
-        </w:rPr>
-        <w:t xml:space="preserve"> summers.</w:t>
+        <w:t>, 1 month for each of the two summers.</w:t>
       </w:r>
     </w:p>
     <w:p>
       <w:pPr>
-        <w:pStyle w:val="BodyText"/>
-        <w:spacing w:before="0" w:line="288" w:lineRule="auto"/>
+        <w:pStyle w:val="TextBody"/>
+        <w:spacing w:lineRule="auto" w:line="288" w:before="0" w:after="0"/>
         <w:ind w:left="180" w:right="1580" w:firstLine="360"/>
         <w:rPr>
           <w:spacing w:val="-3"/>
@@ -591,21 +472,7 @@
           <w:sz w:val="24"/>
           <w:szCs w:val="24"/>
         </w:rPr>
-        <w:t xml:space="preserve">his institution and an additional summer month of salary is provided for faculty who teach during the </w:t>
-      </w:r>
-      <w:r>
-        <w:rPr>
-          <w:sz w:val="24"/>
-          <w:szCs w:val="24"/>
-        </w:rPr>
-        <w:t>summer</w:t>
-      </w:r>
-      <w:r>
-        <w:rPr>
-          <w:sz w:val="24"/>
-          <w:szCs w:val="24"/>
-        </w:rPr>
-        <w:t xml:space="preserve"> term</w:t>
+        <w:t>his institution and an additional summer month of salary is provided for faculty who teach during the summer term</w:t>
       </w:r>
       <w:r>
         <w:rPr>
@@ -618,8 +485,8 @@
     </w:p>
     <w:p>
       <w:pPr>
-        <w:pStyle w:val="BodyText"/>
-        <w:spacing w:after="240" w:line="288" w:lineRule="auto"/>
+        <w:pStyle w:val="TextBody"/>
+        <w:spacing w:lineRule="auto" w:line="288" w:before="47" w:after="240"/>
         <w:ind w:left="180" w:right="1580" w:firstLine="360"/>
         <w:rPr>
           <w:spacing w:val="-3"/>
@@ -633,36 +500,18 @@
           <w:sz w:val="24"/>
           <w:szCs w:val="24"/>
         </w:rPr>
-        <w:t xml:space="preserve">As the PI of the project, Dr. </w:t>
-      </w:r>
-      <w:proofErr w:type="spellStart"/>
-      <w:r>
-        <w:rPr>
-          <w:spacing w:val="-3"/>
-          <w:sz w:val="24"/>
-          <w:szCs w:val="24"/>
-        </w:rPr>
-        <w:t>Penev</w:t>
-      </w:r>
-      <w:proofErr w:type="spellEnd"/>
-      <w:r>
-        <w:rPr>
-          <w:spacing w:val="-3"/>
-          <w:sz w:val="24"/>
-          <w:szCs w:val="24"/>
-        </w:rPr>
-        <w:t xml:space="preserve"> will:</w:t>
+        <w:t>As the PI of the project, Dr. Penev will:</w:t>
       </w:r>
     </w:p>
     <w:p>
       <w:pPr>
-        <w:pStyle w:val="BodyText"/>
+        <w:pStyle w:val="TextBody"/>
         <w:numPr>
           <w:ilvl w:val="0"/>
           <w:numId w:val="3"/>
         </w:numPr>
-        <w:spacing w:after="240" w:line="276" w:lineRule="auto"/>
-        <w:ind w:left="900" w:right="1580"/>
+        <w:spacing w:lineRule="auto" w:line="276" w:before="47" w:after="240"/>
+        <w:ind w:left="900" w:right="1580" w:hanging="360"/>
         <w:rPr>
           <w:spacing w:val="-3"/>
           <w:sz w:val="24"/>
@@ -680,13 +529,13 @@
     </w:p>
     <w:p>
       <w:pPr>
-        <w:pStyle w:val="BodyText"/>
+        <w:pStyle w:val="TextBody"/>
         <w:numPr>
           <w:ilvl w:val="0"/>
           <w:numId w:val="3"/>
         </w:numPr>
-        <w:spacing w:after="240" w:line="276" w:lineRule="auto"/>
-        <w:ind w:left="900" w:right="1580"/>
+        <w:spacing w:lineRule="auto" w:line="276" w:before="47" w:after="240"/>
+        <w:ind w:left="900" w:right="1580" w:hanging="360"/>
         <w:rPr>
           <w:spacing w:val="-3"/>
           <w:sz w:val="24"/>
@@ -704,13 +553,13 @@
     </w:p>
     <w:p>
       <w:pPr>
-        <w:pStyle w:val="BodyText"/>
+        <w:pStyle w:val="TextBody"/>
         <w:numPr>
           <w:ilvl w:val="0"/>
           <w:numId w:val="3"/>
         </w:numPr>
-        <w:spacing w:after="240" w:line="276" w:lineRule="auto"/>
-        <w:ind w:left="900" w:right="1580"/>
+        <w:spacing w:lineRule="auto" w:line="276" w:before="47" w:after="240"/>
+        <w:ind w:left="900" w:right="1580" w:hanging="360"/>
         <w:rPr>
           <w:spacing w:val="-3"/>
           <w:sz w:val="24"/>
@@ -728,13 +577,13 @@
     </w:p>
     <w:p>
       <w:pPr>
-        <w:pStyle w:val="BodyText"/>
+        <w:pStyle w:val="TextBody"/>
         <w:numPr>
           <w:ilvl w:val="0"/>
           <w:numId w:val="3"/>
         </w:numPr>
-        <w:spacing w:after="240" w:line="276" w:lineRule="auto"/>
-        <w:ind w:left="900" w:right="1580"/>
+        <w:spacing w:lineRule="auto" w:line="276" w:before="47" w:after="240"/>
+        <w:ind w:left="900" w:right="1580" w:hanging="360"/>
         <w:rPr>
           <w:spacing w:val="-3"/>
           <w:sz w:val="24"/>
@@ -752,13 +601,13 @@
     </w:p>
     <w:p>
       <w:pPr>
-        <w:pStyle w:val="BodyText"/>
+        <w:pStyle w:val="TextBody"/>
         <w:numPr>
           <w:ilvl w:val="0"/>
           <w:numId w:val="3"/>
         </w:numPr>
-        <w:spacing w:after="240" w:line="276" w:lineRule="auto"/>
-        <w:ind w:left="900" w:right="1580"/>
+        <w:spacing w:lineRule="auto" w:line="276" w:before="47" w:after="240"/>
+        <w:ind w:left="900" w:right="1580" w:hanging="360"/>
         <w:rPr>
           <w:spacing w:val="-3"/>
           <w:sz w:val="24"/>
@@ -776,13 +625,13 @@
     </w:p>
     <w:p>
       <w:pPr>
-        <w:pStyle w:val="BodyText"/>
+        <w:pStyle w:val="TextBody"/>
         <w:numPr>
           <w:ilvl w:val="0"/>
           <w:numId w:val="3"/>
         </w:numPr>
-        <w:spacing w:after="240" w:line="276" w:lineRule="auto"/>
-        <w:ind w:left="900" w:right="1580"/>
+        <w:spacing w:lineRule="auto" w:line="276" w:before="47" w:after="240"/>
+        <w:ind w:left="900" w:right="1580" w:hanging="360"/>
         <w:rPr>
           <w:spacing w:val="-3"/>
           <w:sz w:val="24"/>
@@ -800,13 +649,13 @@
     </w:p>
     <w:p>
       <w:pPr>
-        <w:pStyle w:val="BodyText"/>
+        <w:pStyle w:val="TextBody"/>
         <w:numPr>
           <w:ilvl w:val="0"/>
           <w:numId w:val="3"/>
         </w:numPr>
-        <w:spacing w:after="240" w:line="276" w:lineRule="auto"/>
-        <w:ind w:left="900" w:right="1580"/>
+        <w:spacing w:lineRule="auto" w:line="276" w:before="47" w:after="240"/>
+        <w:ind w:left="900" w:right="1580" w:hanging="360"/>
         <w:rPr>
           <w:spacing w:val="-3"/>
           <w:sz w:val="24"/>
@@ -824,27 +673,41 @@
     </w:p>
     <w:p>
       <w:pPr>
-        <w:pStyle w:val="BodyText"/>
-        <w:spacing w:after="240" w:line="276" w:lineRule="auto"/>
-        <w:ind w:left="900" w:right="1580"/>
+        <w:pStyle w:val="TextBody"/>
+        <w:spacing w:lineRule="auto" w:line="276" w:before="47" w:after="240"/>
+        <w:ind w:left="900" w:right="1580" w:hanging="0"/>
         <w:rPr>
           <w:spacing w:val="-3"/>
           <w:sz w:val="24"/>
           <w:szCs w:val="24"/>
         </w:rPr>
       </w:pPr>
+      <w:r>
+        <w:rPr>
+          <w:spacing w:val="-3"/>
+          <w:sz w:val="24"/>
+          <w:szCs w:val="24"/>
+        </w:rPr>
+      </w:r>
     </w:p>
     <w:p>
       <w:pPr>
-        <w:pStyle w:val="BodyText"/>
-        <w:spacing w:after="240" w:line="276" w:lineRule="auto"/>
-        <w:ind w:left="900" w:right="1580"/>
+        <w:pStyle w:val="TextBody"/>
+        <w:spacing w:lineRule="auto" w:line="276" w:before="47" w:after="240"/>
+        <w:ind w:left="900" w:right="1580" w:hanging="0"/>
         <w:rPr>
           <w:spacing w:val="-3"/>
           <w:sz w:val="24"/>
           <w:szCs w:val="24"/>
         </w:rPr>
       </w:pPr>
+      <w:r>
+        <w:rPr>
+          <w:spacing w:val="-3"/>
+          <w:sz w:val="24"/>
+          <w:szCs w:val="24"/>
+        </w:rPr>
+      </w:r>
     </w:p>
     <w:p>
       <w:pPr>
@@ -854,9 +717,9 @@
           <w:numId w:val="2"/>
         </w:numPr>
         <w:tabs>
-          <w:tab w:val="left" w:pos="752"/>
+          <w:tab w:val="left" w:pos="752" w:leader="none"/>
         </w:tabs>
-        <w:spacing w:before="160" w:line="239" w:lineRule="exact"/>
+        <w:spacing w:lineRule="exact" w:line="239" w:before="160" w:after="0"/>
         <w:ind w:left="180" w:right="1584" w:firstLine="360"/>
         <w:rPr>
           <w:sz w:val="24"/>
@@ -868,7 +731,6 @@
           <w:sz w:val="24"/>
           <w:szCs w:val="24"/>
         </w:rPr>
-        <w:lastRenderedPageBreak/>
         <w:t>Graduate</w:t>
       </w:r>
       <w:r>
@@ -889,8 +751,8 @@
     </w:p>
     <w:p>
       <w:pPr>
-        <w:pStyle w:val="BodyText"/>
-        <w:spacing w:before="42" w:line="288" w:lineRule="auto"/>
+        <w:pStyle w:val="TextBody"/>
+        <w:spacing w:lineRule="auto" w:line="288" w:before="42" w:after="0"/>
         <w:ind w:left="180" w:right="1580" w:firstLine="360"/>
         <w:rPr>
           <w:sz w:val="24"/>
@@ -925,61 +787,15 @@
           <w:sz w:val="24"/>
           <w:szCs w:val="24"/>
         </w:rPr>
-        <w:t xml:space="preserve">group and contributed </w:t>
-      </w:r>
-      <w:r>
-        <w:rPr>
-          <w:sz w:val="24"/>
-          <w:szCs w:val="24"/>
-        </w:rPr>
-        <w:t>significantly</w:t>
-      </w:r>
-      <w:r>
-        <w:rPr>
-          <w:sz w:val="24"/>
-          <w:szCs w:val="24"/>
-        </w:rPr>
-        <w:t xml:space="preserve"> </w:t>
-      </w:r>
-      <w:proofErr w:type="gramStart"/>
-      <w:r>
-        <w:rPr>
-          <w:sz w:val="24"/>
-          <w:szCs w:val="24"/>
-        </w:rPr>
-        <w:t>in</w:t>
-      </w:r>
-      <w:proofErr w:type="gramEnd"/>
-      <w:r>
-        <w:rPr>
-          <w:sz w:val="24"/>
-          <w:szCs w:val="24"/>
-        </w:rPr>
-        <w:t xml:space="preserve"> the preparation of this proposal. </w:t>
-      </w:r>
-      <w:proofErr w:type="spellStart"/>
-      <w:r>
-        <w:rPr>
-          <w:sz w:val="24"/>
-          <w:szCs w:val="24"/>
-        </w:rPr>
-        <w:t>Mr</w:t>
-      </w:r>
-      <w:proofErr w:type="spellEnd"/>
-      <w:r>
-        <w:rPr>
-          <w:sz w:val="24"/>
-          <w:szCs w:val="24"/>
-        </w:rPr>
-        <w:t xml:space="preserve"> Schussler will be lead authors on at least two of the publications produced and a significant contributor on the other two.</w:t>
+        <w:t>group and contributed significantly in the preparation of this proposal. Mr Schussler will be lead authors on at least two of the publications produced and a significant contributor on the other two.</w:t>
       </w:r>
       <w:bookmarkStart w:id="10" w:name="High_Precision_Photometry_Even_With_Larg"/>
       <w:bookmarkEnd w:id="10"/>
     </w:p>
     <w:p>
       <w:pPr>
-        <w:pStyle w:val="BodyText"/>
-        <w:spacing w:before="42" w:after="240" w:line="288" w:lineRule="auto"/>
+        <w:pStyle w:val="TextBody"/>
+        <w:spacing w:lineRule="auto" w:line="288" w:before="42" w:after="240"/>
         <w:ind w:left="180" w:right="1580" w:firstLine="360"/>
         <w:rPr>
           <w:sz w:val="24"/>
@@ -1002,9 +818,9 @@
           <w:numId w:val="2"/>
         </w:numPr>
         <w:tabs>
-          <w:tab w:val="left" w:pos="752"/>
+          <w:tab w:val="left" w:pos="752" w:leader="none"/>
         </w:tabs>
-        <w:spacing w:before="160" w:line="240" w:lineRule="exact"/>
+        <w:spacing w:lineRule="exact" w:line="240" w:before="160" w:after="0"/>
         <w:ind w:left="180" w:right="1584" w:firstLine="360"/>
         <w:rPr>
           <w:color w:val="000000" w:themeColor="text1"/>
@@ -1023,8 +839,8 @@
     </w:p>
     <w:p>
       <w:pPr>
-        <w:pStyle w:val="BodyText"/>
-        <w:spacing w:before="43" w:after="240" w:line="288" w:lineRule="auto"/>
+        <w:pStyle w:val="TextBody"/>
+        <w:spacing w:lineRule="auto" w:line="288" w:before="43" w:after="240"/>
         <w:ind w:left="180" w:right="1580" w:firstLine="360"/>
         <w:rPr>
           <w:sz w:val="24"/>
@@ -1049,9 +865,9 @@
           <w:numId w:val="2"/>
         </w:numPr>
         <w:tabs>
-          <w:tab w:val="left" w:pos="752"/>
+          <w:tab w:val="left" w:pos="752" w:leader="none"/>
         </w:tabs>
-        <w:spacing w:before="160" w:line="240" w:lineRule="exact"/>
+        <w:spacing w:lineRule="exact" w:line="240" w:before="160" w:after="0"/>
         <w:ind w:left="180" w:right="1584" w:firstLine="360"/>
         <w:rPr>
           <w:color w:val="000000" w:themeColor="text1"/>
@@ -1070,8 +886,8 @@
     </w:p>
     <w:p>
       <w:pPr>
-        <w:pStyle w:val="BodyText"/>
-        <w:spacing w:before="44" w:line="264" w:lineRule="auto"/>
+        <w:pStyle w:val="TextBody"/>
+        <w:spacing w:lineRule="auto" w:line="264" w:before="44" w:after="0"/>
         <w:ind w:left="180" w:right="1580" w:firstLine="360"/>
         <w:rPr>
           <w:sz w:val="24"/>
@@ -1091,21 +907,7 @@
           <w:sz w:val="24"/>
           <w:szCs w:val="24"/>
         </w:rPr>
-        <w:t xml:space="preserve">to technical conferences and meetings held domestically are anticipated to disseminate the scientific results. Based on the work plan (see project description) we include support for 1 trip to a scientific conference for each proposal participant </w:t>
-      </w:r>
-      <w:r>
-        <w:rPr>
-          <w:sz w:val="24"/>
-          <w:szCs w:val="24"/>
-        </w:rPr>
-        <w:t xml:space="preserve">each year </w:t>
-      </w:r>
-      <w:r>
-        <w:rPr>
-          <w:sz w:val="24"/>
-          <w:szCs w:val="24"/>
-        </w:rPr>
-        <w:t>for a total of four trips</w:t>
+        <w:t>to technical conferences and meetings held domestically are anticipated to disseminate the scientific results. Based on the work plan (see project description) we include support for 1 trip to a scientific conference for each proposal participant each year for a total of four trips</w:t>
       </w:r>
       <w:r>
         <w:rPr>
@@ -1155,9 +957,10 @@
     </w:p>
     <w:p>
       <w:pPr>
-        <w:pStyle w:val="BodyText"/>
-        <w:spacing w:before="25" w:after="240" w:line="252" w:lineRule="auto"/>
+        <w:pStyle w:val="TextBody"/>
+        <w:spacing w:lineRule="auto" w:line="252" w:before="25" w:after="240"/>
         <w:ind w:left="180" w:right="1580" w:firstLine="360"/>
+        <w:rPr/>
       </w:pPr>
       <w:r>
         <w:rPr>
@@ -1175,9 +978,9 @@
           <w:numId w:val="1"/>
         </w:numPr>
         <w:tabs>
-          <w:tab w:val="left" w:pos="752"/>
+          <w:tab w:val="left" w:pos="752" w:leader="none"/>
         </w:tabs>
-        <w:spacing w:before="160"/>
+        <w:spacing w:before="160" w:after="0"/>
         <w:ind w:left="180" w:right="1584" w:firstLine="360"/>
         <w:rPr>
           <w:sz w:val="24"/>
@@ -1209,8 +1012,8 @@
     </w:p>
     <w:p>
       <w:pPr>
-        <w:pStyle w:val="BodyText"/>
-        <w:spacing w:after="240" w:line="271" w:lineRule="auto"/>
+        <w:pStyle w:val="TextBody"/>
+        <w:spacing w:lineRule="auto" w:line="271" w:before="47" w:after="240"/>
         <w:ind w:left="180" w:right="1580" w:firstLine="360"/>
         <w:rPr>
           <w:sz w:val="24"/>
@@ -1496,9 +1299,9 @@
           <w:numId w:val="1"/>
         </w:numPr>
         <w:tabs>
-          <w:tab w:val="left" w:pos="752"/>
+          <w:tab w:val="left" w:pos="752" w:leader="none"/>
         </w:tabs>
-        <w:spacing w:before="160"/>
+        <w:spacing w:before="160" w:after="0"/>
         <w:ind w:left="180" w:right="1584" w:firstLine="360"/>
         <w:rPr>
           <w:sz w:val="24"/>
@@ -1530,9 +1333,10 @@
     </w:p>
     <w:p>
       <w:pPr>
-        <w:pStyle w:val="BodyText"/>
-        <w:spacing w:line="288" w:lineRule="auto"/>
+        <w:pStyle w:val="TextBody"/>
+        <w:spacing w:lineRule="auto" w:line="288"/>
         <w:ind w:left="180" w:right="1580" w:firstLine="360"/>
+        <w:rPr/>
       </w:pPr>
       <w:r>
         <w:rPr>
@@ -1560,78 +1364,296 @@
       </w:r>
     </w:p>
     <w:sectPr>
-      <w:headerReference w:type="default" r:id="rId7"/>
+      <w:headerReference w:type="default" r:id="rId2"/>
+      <w:type w:val="nextPage"/>
       <w:pgSz w:w="12240" w:h="15840"/>
-      <w:pgMar w:top="1499" w:right="0" w:bottom="1921" w:left="1300" w:header="677" w:footer="0" w:gutter="0"/>
-      <w:pgNumType w:start="1"/>
-      <w:cols w:space="720"/>
-      <w:formProt w:val="0"/>
-      <w:docGrid w:linePitch="100" w:charSpace="4096"/>
+      <w:pgMar w:left="1300" w:right="0" w:header="677" w:top="1499" w:footer="0" w:bottom="1921" w:gutter="0"/>
+      <w:pgNumType w:start="1" w:fmt="decimal"/>
+      <w:formProt w:val="false"/>
+      <w:textDirection w:val="lrTb"/>
+      <w:docGrid w:type="default" w:linePitch="100" w:charSpace="8192"/>
     </w:sectPr>
   </w:body>
 </w:document>
 </file>
 
-<file path=word/endnotes.xml><?xml version="1.0" encoding="utf-8"?>
-<w:endnotes xmlns:wpc="http://schemas.microsoft.com/office/word/2010/wordprocessingCanvas" xmlns:cx="http://schemas.microsoft.com/office/drawing/2014/chartex" xmlns:cx1="http://schemas.microsoft.com/office/drawing/2015/9/8/chartex" xmlns:cx2="http://schemas.microsoft.com/office/drawing/2015/10/21/chartex" xmlns:cx3="http://schemas.microsoft.com/office/drawing/2016/5/9/chartex" xmlns:cx4="http://schemas.microsoft.com/office/drawing/2016/5/10/chartex" xmlns:cx5="http://schemas.microsoft.com/office/drawing/2016/5/11/chartex" xmlns:cx6="http://schemas.microsoft.com/office/drawing/2016/5/12/chartex" xmlns:cx7="http://schemas.microsoft.com/office/drawing/2016/5/13/chartex" xmlns:cx8="http://schemas.microsoft.com/office/drawing/2016/5/14/chartex" xmlns:mc="http://schemas.openxmlformats.org/markup-compatibility/2006" xmlns:aink="http://schemas.microsoft.com/office/drawing/2016/ink" xmlns:am3d="http://schemas.microsoft.com/office/drawing/2017/model3d" xmlns:o="urn:schemas-microsoft-com:office:office" xmlns:oel="http://schemas.microsoft.com/office/2019/extlst" xmlns:r="http://schemas.openxmlformats.org/officeDocument/2006/relationships" xmlns:m="http://schemas.openxmlformats.org/officeDocument/2006/math" xmlns:v="urn:schemas-microsoft-com:vml" xmlns:wp14="http://schemas.microsoft.com/office/word/2010/wordprocessingDrawing" xmlns:wp="http://schemas.openxmlformats.org/drawingml/2006/wordprocessingDrawing" xmlns:w10="urn:schemas-microsoft-com:office:word" xmlns:w="http://schemas.openxmlformats.org/wordprocessingml/2006/main" xmlns:w14="http://schemas.microsoft.com/office/word/2010/wordml" xmlns:w15="http://schemas.microsoft.com/office/word/2012/wordml" xmlns:w16cex="http://schemas.microsoft.com/office/word/2018/wordml/cex" xmlns:w16cid="http://schemas.microsoft.com/office/word/2016/wordml/cid" xmlns:w16="http://schemas.microsoft.com/office/word/2018/wordml" xmlns:w16sdtdh="http://schemas.microsoft.com/office/word/2020/wordml/sdtdatahash" xmlns:w16se="http://schemas.microsoft.com/office/word/2015/wordml/symex" xmlns:wpg="http://schemas.microsoft.com/office/word/2010/wordprocessingGroup" xmlns:wpi="http://schemas.microsoft.com/office/word/2010/wordprocessingInk" xmlns:wne="http://schemas.microsoft.com/office/word/2006/wordml" xmlns:wps="http://schemas.microsoft.com/office/word/2010/wordprocessingShape" mc:Ignorable="w14 w15 w16se w16cid w16 w16cex w16sdtdh wp14">
-  <w:endnote w:type="separator" w:id="-1">
-    <w:p>
-      <w:r>
-        <w:separator/>
-      </w:r>
-    </w:p>
-  </w:endnote>
-  <w:endnote w:type="continuationSeparator" w:id="0">
-    <w:p>
-      <w:r>
-        <w:continuationSeparator/>
-      </w:r>
-    </w:p>
-  </w:endnote>
-</w:endnotes>
-</file>
-
-<file path=word/footnotes.xml><?xml version="1.0" encoding="utf-8"?>
-<w:footnotes xmlns:wpc="http://schemas.microsoft.com/office/word/2010/wordprocessingCanvas" xmlns:cx="http://schemas.microsoft.com/office/drawing/2014/chartex" xmlns:cx1="http://schemas.microsoft.com/office/drawing/2015/9/8/chartex" xmlns:cx2="http://schemas.microsoft.com/office/drawing/2015/10/21/chartex" xmlns:cx3="http://schemas.microsoft.com/office/drawing/2016/5/9/chartex" xmlns:cx4="http://schemas.microsoft.com/office/drawing/2016/5/10/chartex" xmlns:cx5="http://schemas.microsoft.com/office/drawing/2016/5/11/chartex" xmlns:cx6="http://schemas.microsoft.com/office/drawing/2016/5/12/chartex" xmlns:cx7="http://schemas.microsoft.com/office/drawing/2016/5/13/chartex" xmlns:cx8="http://schemas.microsoft.com/office/drawing/2016/5/14/chartex" xmlns:mc="http://schemas.openxmlformats.org/markup-compatibility/2006" xmlns:aink="http://schemas.microsoft.com/office/drawing/2016/ink" xmlns:am3d="http://schemas.microsoft.com/office/drawing/2017/model3d" xmlns:o="urn:schemas-microsoft-com:office:office" xmlns:oel="http://schemas.microsoft.com/office/2019/extlst" xmlns:r="http://schemas.openxmlformats.org/officeDocument/2006/relationships" xmlns:m="http://schemas.openxmlformats.org/officeDocument/2006/math" xmlns:v="urn:schemas-microsoft-com:vml" xmlns:wp14="http://schemas.microsoft.com/office/word/2010/wordprocessingDrawing" xmlns:wp="http://schemas.openxmlformats.org/drawingml/2006/wordprocessingDrawing" xmlns:w10="urn:schemas-microsoft-com:office:word" xmlns:w="http://schemas.openxmlformats.org/wordprocessingml/2006/main" xmlns:w14="http://schemas.microsoft.com/office/word/2010/wordml" xmlns:w15="http://schemas.microsoft.com/office/word/2012/wordml" xmlns:w16cex="http://schemas.microsoft.com/office/word/2018/wordml/cex" xmlns:w16cid="http://schemas.microsoft.com/office/word/2016/wordml/cid" xmlns:w16="http://schemas.microsoft.com/office/word/2018/wordml" xmlns:w16sdtdh="http://schemas.microsoft.com/office/word/2020/wordml/sdtdatahash" xmlns:w16se="http://schemas.microsoft.com/office/word/2015/wordml/symex" xmlns:wpg="http://schemas.microsoft.com/office/word/2010/wordprocessingGroup" xmlns:wpi="http://schemas.microsoft.com/office/word/2010/wordprocessingInk" xmlns:wne="http://schemas.microsoft.com/office/word/2006/wordml" xmlns:wps="http://schemas.microsoft.com/office/word/2010/wordprocessingShape" mc:Ignorable="w14 w15 w16se w16cid w16 w16cex w16sdtdh wp14">
-  <w:footnote w:type="separator" w:id="-1">
-    <w:p>
-      <w:r>
-        <w:separator/>
-      </w:r>
-    </w:p>
-  </w:footnote>
-  <w:footnote w:type="continuationSeparator" w:id="0">
-    <w:p>
-      <w:r>
-        <w:continuationSeparator/>
-      </w:r>
-    </w:p>
-  </w:footnote>
-</w:footnotes>
-</file>
-
 <file path=word/header1.xml><?xml version="1.0" encoding="utf-8"?>
-<w:hdr xmlns:wpc="http://schemas.microsoft.com/office/word/2010/wordprocessingCanvas" xmlns:cx="http://schemas.microsoft.com/office/drawing/2014/chartex" xmlns:cx1="http://schemas.microsoft.com/office/drawing/2015/9/8/chartex" xmlns:cx2="http://schemas.microsoft.com/office/drawing/2015/10/21/chartex" xmlns:cx3="http://schemas.microsoft.com/office/drawing/2016/5/9/chartex" xmlns:cx4="http://schemas.microsoft.com/office/drawing/2016/5/10/chartex" xmlns:cx5="http://schemas.microsoft.com/office/drawing/2016/5/11/chartex" xmlns:cx6="http://schemas.microsoft.com/office/drawing/2016/5/12/chartex" xmlns:cx7="http://schemas.microsoft.com/office/drawing/2016/5/13/chartex" xmlns:cx8="http://schemas.microsoft.com/office/drawing/2016/5/14/chartex" xmlns:mc="http://schemas.openxmlformats.org/markup-compatibility/2006" xmlns:aink="http://schemas.microsoft.com/office/drawing/2016/ink" xmlns:am3d="http://schemas.microsoft.com/office/drawing/2017/model3d" xmlns:o="urn:schemas-microsoft-com:office:office" xmlns:oel="http://schemas.microsoft.com/office/2019/extlst" xmlns:r="http://schemas.openxmlformats.org/officeDocument/2006/relationships" xmlns:m="http://schemas.openxmlformats.org/officeDocument/2006/math" xmlns:v="urn:schemas-microsoft-com:vml" xmlns:wp14="http://schemas.microsoft.com/office/word/2010/wordprocessingDrawing" xmlns:wp="http://schemas.openxmlformats.org/drawingml/2006/wordprocessingDrawing" xmlns:w10="urn:schemas-microsoft-com:office:word" xmlns:w="http://schemas.openxmlformats.org/wordprocessingml/2006/main" xmlns:w14="http://schemas.microsoft.com/office/word/2010/wordml" xmlns:w15="http://schemas.microsoft.com/office/word/2012/wordml" xmlns:w16cex="http://schemas.microsoft.com/office/word/2018/wordml/cex" xmlns:w16cid="http://schemas.microsoft.com/office/word/2016/wordml/cid" xmlns:w16="http://schemas.microsoft.com/office/word/2018/wordml" xmlns:w16sdtdh="http://schemas.microsoft.com/office/word/2020/wordml/sdtdatahash" xmlns:w16se="http://schemas.microsoft.com/office/word/2015/wordml/symex" xmlns:wpg="http://schemas.microsoft.com/office/word/2010/wordprocessingGroup" xmlns:wpi="http://schemas.microsoft.com/office/word/2010/wordprocessingInk" xmlns:wne="http://schemas.microsoft.com/office/word/2006/wordml" xmlns:wps="http://schemas.microsoft.com/office/word/2010/wordprocessingShape" mc:Ignorable="w14 w15 w16se w16cid w16 w16cex w16sdtdh wp14">
+<w:hdr xmlns:o="urn:schemas-microsoft-com:office:office" xmlns:r="http://schemas.openxmlformats.org/officeDocument/2006/relationships" xmlns:v="urn:schemas-microsoft-com:vml" xmlns:w="http://schemas.openxmlformats.org/wordprocessingml/2006/main" xmlns:w10="urn:schemas-microsoft-com:office:word" xmlns:wp="http://schemas.openxmlformats.org/drawingml/2006/wordprocessingDrawing" xmlns:wps="http://schemas.microsoft.com/office/word/2010/wordprocessingShape" xmlns:wpg="http://schemas.microsoft.com/office/word/2010/wordprocessingGroup" xmlns:mc="http://schemas.openxmlformats.org/markup-compatibility/2006" xmlns:wp14="http://schemas.microsoft.com/office/word/2010/wordprocessingDrawing" xmlns:w14="http://schemas.microsoft.com/office/word/2010/wordml" mc:Ignorable="w14 wp14">
   <w:p>
     <w:pPr>
-      <w:pStyle w:val="BodyText"/>
-      <w:spacing w:before="0" w:line="12" w:lineRule="auto"/>
-      <w:ind w:left="0" w:right="0"/>
+      <w:pStyle w:val="TextBody"/>
+      <w:spacing w:lineRule="auto" w:line="9" w:before="0" w:after="0"/>
+      <w:ind w:left="0" w:right="0" w:hanging="0"/>
       <w:jc w:val="left"/>
       <w:rPr>
         <w:sz w:val="20"/>
       </w:rPr>
     </w:pPr>
+    <w:r>
+      <w:rPr>
+        <w:sz w:val="20"/>
+      </w:rPr>
+    </w:r>
   </w:p>
 </w:hdr>
 </file>
 
 <file path=word/numbering.xml><?xml version="1.0" encoding="utf-8"?>
-<w:numbering xmlns:wpc="http://schemas.microsoft.com/office/word/2010/wordprocessingCanvas" xmlns:cx="http://schemas.microsoft.com/office/drawing/2014/chartex" xmlns:cx1="http://schemas.microsoft.com/office/drawing/2015/9/8/chartex" xmlns:cx2="http://schemas.microsoft.com/office/drawing/2015/10/21/chartex" xmlns:cx3="http://schemas.microsoft.com/office/drawing/2016/5/9/chartex" xmlns:cx4="http://schemas.microsoft.com/office/drawing/2016/5/10/chartex" xmlns:cx5="http://schemas.microsoft.com/office/drawing/2016/5/11/chartex" xmlns:cx6="http://schemas.microsoft.com/office/drawing/2016/5/12/chartex" xmlns:cx7="http://schemas.microsoft.com/office/drawing/2016/5/13/chartex" xmlns:cx8="http://schemas.microsoft.com/office/drawing/2016/5/14/chartex" xmlns:mc="http://schemas.openxmlformats.org/markup-compatibility/2006" xmlns:aink="http://schemas.microsoft.com/office/drawing/2016/ink" xmlns:am3d="http://schemas.microsoft.com/office/drawing/2017/model3d" xmlns:o="urn:schemas-microsoft-com:office:office" xmlns:oel="http://schemas.microsoft.com/office/2019/extlst" xmlns:r="http://schemas.openxmlformats.org/officeDocument/2006/relationships" xmlns:m="http://schemas.openxmlformats.org/officeDocument/2006/math" xmlns:v="urn:schemas-microsoft-com:vml" xmlns:wp14="http://schemas.microsoft.com/office/word/2010/wordprocessingDrawing" xmlns:wp="http://schemas.openxmlformats.org/drawingml/2006/wordprocessingDrawing" xmlns:w10="urn:schemas-microsoft-com:office:word" xmlns:w="http://schemas.openxmlformats.org/wordprocessingml/2006/main" xmlns:w14="http://schemas.microsoft.com/office/word/2010/wordml" xmlns:w15="http://schemas.microsoft.com/office/word/2012/wordml" xmlns:w16cex="http://schemas.microsoft.com/office/word/2018/wordml/cex" xmlns:w16cid="http://schemas.microsoft.com/office/word/2016/wordml/cid" xmlns:w16="http://schemas.microsoft.com/office/word/2018/wordml" xmlns:w16sdtdh="http://schemas.microsoft.com/office/word/2020/wordml/sdtdatahash" xmlns:w16se="http://schemas.microsoft.com/office/word/2015/wordml/symex" xmlns:wpg="http://schemas.microsoft.com/office/word/2010/wordprocessingGroup" xmlns:wpi="http://schemas.microsoft.com/office/word/2010/wordprocessingInk" xmlns:wne="http://schemas.microsoft.com/office/word/2006/wordml" xmlns:wps="http://schemas.microsoft.com/office/word/2010/wordprocessingShape" mc:Ignorable="w14 w15 w16se w16cid w16 w16cex w16sdtdh wp14">
-  <w:abstractNum w:abstractNumId="0" w15:restartNumberingAfterBreak="0">
-    <w:nsid w:val="05A37390"/>
-    <w:multiLevelType w:val="multilevel"/>
-    <w:tmpl w:val="457AA992"/>
+<w:numbering xmlns:w="http://schemas.openxmlformats.org/wordprocessingml/2006/main" xmlns:o="urn:schemas-microsoft-com:office:office" xmlns:r="http://schemas.openxmlformats.org/officeDocument/2006/relationships" xmlns:v="urn:schemas-microsoft-com:vml">
+  <w:abstractNum w:abstractNumId="1">
+    <w:lvl w:ilvl="0">
+      <w:start w:val="4"/>
+      <w:numFmt w:val="decimal"/>
+      <w:lvlText w:val="%1"/>
+      <w:lvlJc w:val="left"/>
+      <w:pPr>
+        <w:ind w:left="751" w:hanging="634"/>
+      </w:pPr>
+    </w:lvl>
+    <w:lvl w:ilvl="1">
+      <w:start w:val="5"/>
+      <w:numFmt w:val="decimal"/>
+      <w:lvlText w:val="12.%2"/>
+      <w:lvlJc w:val="left"/>
+      <w:pPr>
+        <w:ind w:left="751" w:hanging="634"/>
+      </w:pPr>
+      <w:rPr>
+        <w:sz w:val="21"/>
+        <w:b/>
+        <w:szCs w:val="21"/>
+        <w:bCs/>
+        <w:w w:val="102"/>
+        <w:rFonts w:eastAsia="Arial" w:cs="Arial"/>
+      </w:rPr>
+    </w:lvl>
+    <w:lvl w:ilvl="2">
+      <w:start w:val="1"/>
+      <w:numFmt w:val="bullet"/>
+      <w:lvlText w:val=""/>
+      <w:lvlJc w:val="left"/>
+      <w:pPr>
+        <w:ind w:left="2796" w:hanging="634"/>
+      </w:pPr>
+      <w:rPr>
+        <w:rFonts w:ascii="Symbol" w:hAnsi="Symbol" w:cs="Symbol" w:hint="default"/>
+        <w:rFonts w:cs="Symbol"/>
+      </w:rPr>
+    </w:lvl>
+    <w:lvl w:ilvl="3">
+      <w:start w:val="1"/>
+      <w:numFmt w:val="bullet"/>
+      <w:lvlText w:val=""/>
+      <w:lvlJc w:val="left"/>
+      <w:pPr>
+        <w:ind w:left="3814" w:hanging="634"/>
+      </w:pPr>
+      <w:rPr>
+        <w:rFonts w:ascii="Symbol" w:hAnsi="Symbol" w:cs="Symbol" w:hint="default"/>
+        <w:rFonts w:cs="Symbol"/>
+      </w:rPr>
+    </w:lvl>
+    <w:lvl w:ilvl="4">
+      <w:start w:val="1"/>
+      <w:numFmt w:val="bullet"/>
+      <w:lvlText w:val=""/>
+      <w:lvlJc w:val="left"/>
+      <w:pPr>
+        <w:ind w:left="4832" w:hanging="634"/>
+      </w:pPr>
+      <w:rPr>
+        <w:rFonts w:ascii="Symbol" w:hAnsi="Symbol" w:cs="Symbol" w:hint="default"/>
+        <w:rFonts w:cs="Symbol"/>
+      </w:rPr>
+    </w:lvl>
+    <w:lvl w:ilvl="5">
+      <w:start w:val="1"/>
+      <w:numFmt w:val="bullet"/>
+      <w:lvlText w:val=""/>
+      <w:lvlJc w:val="left"/>
+      <w:pPr>
+        <w:ind w:left="5850" w:hanging="634"/>
+      </w:pPr>
+      <w:rPr>
+        <w:rFonts w:ascii="Symbol" w:hAnsi="Symbol" w:cs="Symbol" w:hint="default"/>
+        <w:rFonts w:cs="Symbol"/>
+      </w:rPr>
+    </w:lvl>
+    <w:lvl w:ilvl="6">
+      <w:start w:val="1"/>
+      <w:numFmt w:val="bullet"/>
+      <w:lvlText w:val=""/>
+      <w:lvlJc w:val="left"/>
+      <w:pPr>
+        <w:ind w:left="6868" w:hanging="634"/>
+      </w:pPr>
+      <w:rPr>
+        <w:rFonts w:ascii="Symbol" w:hAnsi="Symbol" w:cs="Symbol" w:hint="default"/>
+        <w:rFonts w:cs="Symbol"/>
+      </w:rPr>
+    </w:lvl>
+    <w:lvl w:ilvl="7">
+      <w:start w:val="1"/>
+      <w:numFmt w:val="bullet"/>
+      <w:lvlText w:val=""/>
+      <w:lvlJc w:val="left"/>
+      <w:pPr>
+        <w:ind w:left="7886" w:hanging="634"/>
+      </w:pPr>
+      <w:rPr>
+        <w:rFonts w:ascii="Symbol" w:hAnsi="Symbol" w:cs="Symbol" w:hint="default"/>
+        <w:rFonts w:cs="Symbol"/>
+      </w:rPr>
+    </w:lvl>
+    <w:lvl w:ilvl="8">
+      <w:start w:val="1"/>
+      <w:numFmt w:val="bullet"/>
+      <w:lvlText w:val=""/>
+      <w:lvlJc w:val="left"/>
+      <w:pPr>
+        <w:ind w:left="8904" w:hanging="634"/>
+      </w:pPr>
+      <w:rPr>
+        <w:rFonts w:ascii="Symbol" w:hAnsi="Symbol" w:cs="Symbol" w:hint="default"/>
+        <w:rFonts w:cs="Symbol"/>
+      </w:rPr>
+    </w:lvl>
+  </w:abstractNum>
+  <w:abstractNum w:abstractNumId="2">
+    <w:lvl w:ilvl="0">
+      <w:start w:val="1"/>
+      <w:numFmt w:val="decimal"/>
+      <w:lvlText w:val="%1"/>
+      <w:lvlJc w:val="left"/>
+      <w:pPr>
+        <w:ind w:left="391" w:hanging="455"/>
+      </w:pPr>
+      <w:rPr>
+        <w:sz w:val="24"/>
+        <w:b/>
+        <w:szCs w:val="24"/>
+        <w:bCs/>
+        <w:w w:val="102"/>
+        <w:rFonts w:eastAsia="Arial" w:cs="Arial"/>
+      </w:rPr>
+    </w:lvl>
+    <w:lvl w:ilvl="1">
+      <w:start w:val="1"/>
+      <w:numFmt w:val="decimal"/>
+      <w:lvlText w:val="%1.%2"/>
+      <w:lvlJc w:val="left"/>
+      <w:pPr>
+        <w:ind w:left="571" w:hanging="634"/>
+      </w:pPr>
+      <w:rPr>
+        <w:sz w:val="24"/>
+        <w:b/>
+        <w:szCs w:val="24"/>
+        <w:bCs/>
+        <w:w w:val="102"/>
+        <w:rFonts w:eastAsia="Arial" w:cs="Arial"/>
+      </w:rPr>
+    </w:lvl>
+    <w:lvl w:ilvl="2">
+      <w:start w:val="1"/>
+      <w:numFmt w:val="decimal"/>
+      <w:lvlText w:val="%1.%2.%3"/>
+      <w:lvlJc w:val="left"/>
+      <w:pPr>
+        <w:ind w:left="750" w:hanging="814"/>
+      </w:pPr>
+      <w:rPr>
+        <w:sz w:val="24"/>
+        <w:b/>
+        <w:szCs w:val="21"/>
+        <w:bCs/>
+        <w:w w:val="102"/>
+        <w:rFonts w:eastAsia="Arial" w:cs="Arial"/>
+      </w:rPr>
+    </w:lvl>
+    <w:lvl w:ilvl="3">
+      <w:start w:val="1"/>
+      <w:numFmt w:val="bullet"/>
+      <w:lvlText w:val="•"/>
+      <w:lvlJc w:val="left"/>
+      <w:pPr>
+        <w:ind w:left="522" w:hanging="201"/>
+      </w:pPr>
+      <w:rPr>
+        <w:rFonts w:ascii="Arial" w:hAnsi="Arial" w:cs="Arial" w:hint="default"/>
+        <w:sz w:val="24"/>
+        <w:szCs w:val="24"/>
+        <w:w w:val="99"/>
+        <w:rFonts w:cs="Arial"/>
+      </w:rPr>
+    </w:lvl>
+    <w:lvl w:ilvl="4">
+      <w:start w:val="1"/>
+      <w:numFmt w:val="bullet"/>
+      <w:lvlText w:val=""/>
+      <w:lvlJc w:val="left"/>
+      <w:pPr>
+        <w:ind w:left="2188" w:hanging="201"/>
+      </w:pPr>
+      <w:rPr>
+        <w:rFonts w:ascii="Symbol" w:hAnsi="Symbol" w:cs="Symbol" w:hint="default"/>
+        <w:rFonts w:cs="Symbol"/>
+      </w:rPr>
+    </w:lvl>
+    <w:lvl w:ilvl="5">
+      <w:start w:val="1"/>
+      <w:numFmt w:val="bullet"/>
+      <w:lvlText w:val=""/>
+      <w:lvlJc w:val="left"/>
+      <w:pPr>
+        <w:ind w:left="3617" w:hanging="201"/>
+      </w:pPr>
+      <w:rPr>
+        <w:rFonts w:ascii="Symbol" w:hAnsi="Symbol" w:cs="Symbol" w:hint="default"/>
+        <w:rFonts w:cs="Symbol"/>
+      </w:rPr>
+    </w:lvl>
+    <w:lvl w:ilvl="6">
+      <w:start w:val="1"/>
+      <w:numFmt w:val="bullet"/>
+      <w:lvlText w:val=""/>
+      <w:lvlJc w:val="left"/>
+      <w:pPr>
+        <w:ind w:left="5045" w:hanging="201"/>
+      </w:pPr>
+      <w:rPr>
+        <w:rFonts w:ascii="Symbol" w:hAnsi="Symbol" w:cs="Symbol" w:hint="default"/>
+        <w:rFonts w:cs="Symbol"/>
+      </w:rPr>
+    </w:lvl>
+    <w:lvl w:ilvl="7">
+      <w:start w:val="1"/>
+      <w:numFmt w:val="bullet"/>
+      <w:lvlText w:val=""/>
+      <w:lvlJc w:val="left"/>
+      <w:pPr>
+        <w:ind w:left="6474" w:hanging="201"/>
+      </w:pPr>
+      <w:rPr>
+        <w:rFonts w:ascii="Symbol" w:hAnsi="Symbol" w:cs="Symbol" w:hint="default"/>
+        <w:rFonts w:cs="Symbol"/>
+      </w:rPr>
+    </w:lvl>
+    <w:lvl w:ilvl="8">
+      <w:start w:val="1"/>
+      <w:numFmt w:val="bullet"/>
+      <w:lvlText w:val=""/>
+      <w:lvlJc w:val="left"/>
+      <w:pPr>
+        <w:ind w:left="7902" w:hanging="201"/>
+      </w:pPr>
+      <w:rPr>
+        <w:rFonts w:ascii="Symbol" w:hAnsi="Symbol" w:cs="Symbol" w:hint="default"/>
+        <w:rFonts w:cs="Symbol"/>
+      </w:rPr>
+    </w:lvl>
+  </w:abstractNum>
+  <w:abstractNum w:abstractNumId="3">
     <w:lvl w:ilvl="0">
       <w:start w:val="1"/>
       <w:numFmt w:val="decimal"/>
@@ -1651,6 +1673,7 @@
       </w:pPr>
       <w:rPr>
         <w:rFonts w:ascii="Courier New" w:hAnsi="Courier New" w:cs="Courier New" w:hint="default"/>
+        <w:rFonts w:cs="Courier New"/>
       </w:rPr>
     </w:lvl>
     <w:lvl w:ilvl="2">
@@ -1663,6 +1686,7 @@
       </w:pPr>
       <w:rPr>
         <w:rFonts w:ascii="Wingdings" w:hAnsi="Wingdings" w:cs="Wingdings" w:hint="default"/>
+        <w:rFonts w:cs="Wingdings"/>
       </w:rPr>
     </w:lvl>
     <w:lvl w:ilvl="3">
@@ -1675,6 +1699,7 @@
       </w:pPr>
       <w:rPr>
         <w:rFonts w:ascii="Symbol" w:hAnsi="Symbol" w:cs="Symbol" w:hint="default"/>
+        <w:rFonts w:cs="Symbol"/>
       </w:rPr>
     </w:lvl>
     <w:lvl w:ilvl="4">
@@ -1687,6 +1712,7 @@
       </w:pPr>
       <w:rPr>
         <w:rFonts w:ascii="Courier New" w:hAnsi="Courier New" w:cs="Courier New" w:hint="default"/>
+        <w:rFonts w:cs="Courier New"/>
       </w:rPr>
     </w:lvl>
     <w:lvl w:ilvl="5">
@@ -1699,6 +1725,7 @@
       </w:pPr>
       <w:rPr>
         <w:rFonts w:ascii="Wingdings" w:hAnsi="Wingdings" w:cs="Wingdings" w:hint="default"/>
+        <w:rFonts w:cs="Wingdings"/>
       </w:rPr>
     </w:lvl>
     <w:lvl w:ilvl="6">
@@ -1711,6 +1738,7 @@
       </w:pPr>
       <w:rPr>
         <w:rFonts w:ascii="Symbol" w:hAnsi="Symbol" w:cs="Symbol" w:hint="default"/>
+        <w:rFonts w:cs="Symbol"/>
       </w:rPr>
     </w:lvl>
     <w:lvl w:ilvl="7">
@@ -1723,6 +1751,7 @@
       </w:pPr>
       <w:rPr>
         <w:rFonts w:ascii="Courier New" w:hAnsi="Courier New" w:cs="Courier New" w:hint="default"/>
+        <w:rFonts w:cs="Courier New"/>
       </w:rPr>
     </w:lvl>
     <w:lvl w:ilvl="8">
@@ -1735,13 +1764,11 @@
       </w:pPr>
       <w:rPr>
         <w:rFonts w:ascii="Wingdings" w:hAnsi="Wingdings" w:cs="Wingdings" w:hint="default"/>
+        <w:rFonts w:cs="Wingdings"/>
       </w:rPr>
     </w:lvl>
   </w:abstractNum>
-  <w:abstractNum w:abstractNumId="1" w15:restartNumberingAfterBreak="0">
-    <w:nsid w:val="2252674A"/>
-    <w:multiLevelType w:val="multilevel"/>
-    <w:tmpl w:val="8F6CA590"/>
+  <w:abstractNum w:abstractNumId="4">
     <w:lvl w:ilvl="0">
       <w:start w:val="1"/>
       <w:numFmt w:val="none"/>
@@ -1749,7 +1776,7 @@
       <w:lvlText w:val=""/>
       <w:lvlJc w:val="left"/>
       <w:pPr>
-        <w:ind w:left="0" w:firstLine="0"/>
+        <w:ind w:left="0" w:hanging="0"/>
       </w:pPr>
     </w:lvl>
     <w:lvl w:ilvl="1">
@@ -1759,7 +1786,7 @@
       <w:lvlText w:val=""/>
       <w:lvlJc w:val="left"/>
       <w:pPr>
-        <w:ind w:left="0" w:firstLine="0"/>
+        <w:ind w:left="0" w:hanging="0"/>
       </w:pPr>
     </w:lvl>
     <w:lvl w:ilvl="2">
@@ -1769,7 +1796,7 @@
       <w:lvlText w:val=""/>
       <w:lvlJc w:val="left"/>
       <w:pPr>
-        <w:ind w:left="0" w:firstLine="0"/>
+        <w:ind w:left="0" w:hanging="0"/>
       </w:pPr>
     </w:lvl>
     <w:lvl w:ilvl="3">
@@ -1779,7 +1806,7 @@
       <w:lvlText w:val=""/>
       <w:lvlJc w:val="left"/>
       <w:pPr>
-        <w:ind w:left="0" w:firstLine="0"/>
+        <w:ind w:left="0" w:hanging="0"/>
       </w:pPr>
     </w:lvl>
     <w:lvl w:ilvl="4">
@@ -1789,7 +1816,7 @@
       <w:lvlText w:val=""/>
       <w:lvlJc w:val="left"/>
       <w:pPr>
-        <w:ind w:left="0" w:firstLine="0"/>
+        <w:ind w:left="0" w:hanging="0"/>
       </w:pPr>
     </w:lvl>
     <w:lvl w:ilvl="5">
@@ -1799,7 +1826,7 @@
       <w:lvlText w:val=""/>
       <w:lvlJc w:val="left"/>
       <w:pPr>
-        <w:ind w:left="0" w:firstLine="0"/>
+        <w:ind w:left="0" w:hanging="0"/>
       </w:pPr>
     </w:lvl>
     <w:lvl w:ilvl="6">
@@ -1809,7 +1836,7 @@
       <w:lvlText w:val=""/>
       <w:lvlJc w:val="left"/>
       <w:pPr>
-        <w:ind w:left="0" w:firstLine="0"/>
+        <w:ind w:left="0" w:hanging="0"/>
       </w:pPr>
     </w:lvl>
     <w:lvl w:ilvl="7">
@@ -1819,7 +1846,7 @@
       <w:lvlText w:val=""/>
       <w:lvlJc w:val="left"/>
       <w:pPr>
-        <w:ind w:left="0" w:firstLine="0"/>
+        <w:ind w:left="0" w:hanging="0"/>
       </w:pPr>
     </w:lvl>
     <w:lvl w:ilvl="8">
@@ -1829,295 +1856,51 @@
       <w:lvlText w:val=""/>
       <w:lvlJc w:val="left"/>
       <w:pPr>
-        <w:ind w:left="0" w:firstLine="0"/>
+        <w:ind w:left="0" w:hanging="0"/>
       </w:pPr>
     </w:lvl>
   </w:abstractNum>
-  <w:abstractNum w:abstractNumId="2" w15:restartNumberingAfterBreak="0">
-    <w:nsid w:val="2A827AF9"/>
-    <w:multiLevelType w:val="multilevel"/>
-    <w:tmpl w:val="041E6B38"/>
-    <w:lvl w:ilvl="0">
-      <w:start w:val="1"/>
-      <w:numFmt w:val="decimal"/>
-      <w:lvlText w:val="%1"/>
-      <w:lvlJc w:val="left"/>
-      <w:pPr>
-        <w:ind w:left="391" w:hanging="455"/>
-      </w:pPr>
-      <w:rPr>
-        <w:rFonts w:eastAsia="Arial" w:cs="Arial"/>
-        <w:b/>
-        <w:bCs/>
-        <w:w w:val="102"/>
-        <w:sz w:val="24"/>
-        <w:szCs w:val="24"/>
-      </w:rPr>
-    </w:lvl>
-    <w:lvl w:ilvl="1">
-      <w:start w:val="1"/>
-      <w:numFmt w:val="decimal"/>
-      <w:lvlText w:val="%1.%2"/>
-      <w:lvlJc w:val="left"/>
-      <w:pPr>
-        <w:ind w:left="571" w:hanging="634"/>
-      </w:pPr>
-      <w:rPr>
-        <w:rFonts w:eastAsia="Arial" w:cs="Arial"/>
-        <w:b/>
-        <w:bCs/>
-        <w:w w:val="102"/>
-        <w:sz w:val="24"/>
-        <w:szCs w:val="24"/>
-      </w:rPr>
-    </w:lvl>
-    <w:lvl w:ilvl="2">
-      <w:start w:val="1"/>
-      <w:numFmt w:val="decimal"/>
-      <w:lvlText w:val="%1.%2.%3"/>
-      <w:lvlJc w:val="left"/>
-      <w:pPr>
-        <w:ind w:left="750" w:hanging="814"/>
-      </w:pPr>
-      <w:rPr>
-        <w:rFonts w:eastAsia="Arial" w:cs="Arial"/>
-        <w:b/>
-        <w:bCs/>
-        <w:w w:val="102"/>
-        <w:sz w:val="24"/>
-        <w:szCs w:val="21"/>
-      </w:rPr>
-    </w:lvl>
-    <w:lvl w:ilvl="3">
-      <w:start w:val="1"/>
-      <w:numFmt w:val="bullet"/>
-      <w:lvlText w:val="•"/>
-      <w:lvlJc w:val="left"/>
-      <w:pPr>
-        <w:ind w:left="522" w:hanging="201"/>
-      </w:pPr>
-      <w:rPr>
-        <w:rFonts w:ascii="Arial" w:hAnsi="Arial" w:cs="Arial" w:hint="default"/>
-        <w:w w:val="99"/>
-        <w:sz w:val="24"/>
-        <w:szCs w:val="24"/>
-      </w:rPr>
-    </w:lvl>
-    <w:lvl w:ilvl="4">
-      <w:start w:val="1"/>
-      <w:numFmt w:val="bullet"/>
-      <w:lvlText w:val=""/>
-      <w:lvlJc w:val="left"/>
-      <w:pPr>
-        <w:ind w:left="2188" w:hanging="201"/>
-      </w:pPr>
-      <w:rPr>
-        <w:rFonts w:ascii="Symbol" w:hAnsi="Symbol" w:cs="Symbol" w:hint="default"/>
-      </w:rPr>
-    </w:lvl>
-    <w:lvl w:ilvl="5">
-      <w:start w:val="1"/>
-      <w:numFmt w:val="bullet"/>
-      <w:lvlText w:val=""/>
-      <w:lvlJc w:val="left"/>
-      <w:pPr>
-        <w:ind w:left="3617" w:hanging="201"/>
-      </w:pPr>
-      <w:rPr>
-        <w:rFonts w:ascii="Symbol" w:hAnsi="Symbol" w:cs="Symbol" w:hint="default"/>
-      </w:rPr>
-    </w:lvl>
-    <w:lvl w:ilvl="6">
-      <w:start w:val="1"/>
-      <w:numFmt w:val="bullet"/>
-      <w:lvlText w:val=""/>
-      <w:lvlJc w:val="left"/>
-      <w:pPr>
-        <w:ind w:left="5045" w:hanging="201"/>
-      </w:pPr>
-      <w:rPr>
-        <w:rFonts w:ascii="Symbol" w:hAnsi="Symbol" w:cs="Symbol" w:hint="default"/>
-      </w:rPr>
-    </w:lvl>
-    <w:lvl w:ilvl="7">
-      <w:start w:val="1"/>
-      <w:numFmt w:val="bullet"/>
-      <w:lvlText w:val=""/>
-      <w:lvlJc w:val="left"/>
-      <w:pPr>
-        <w:ind w:left="6474" w:hanging="201"/>
-      </w:pPr>
-      <w:rPr>
-        <w:rFonts w:ascii="Symbol" w:hAnsi="Symbol" w:cs="Symbol" w:hint="default"/>
-      </w:rPr>
-    </w:lvl>
-    <w:lvl w:ilvl="8">
-      <w:start w:val="1"/>
-      <w:numFmt w:val="bullet"/>
-      <w:lvlText w:val=""/>
-      <w:lvlJc w:val="left"/>
-      <w:pPr>
-        <w:ind w:left="7902" w:hanging="201"/>
-      </w:pPr>
-      <w:rPr>
-        <w:rFonts w:ascii="Symbol" w:hAnsi="Symbol" w:cs="Symbol" w:hint="default"/>
-      </w:rPr>
-    </w:lvl>
-  </w:abstractNum>
-  <w:abstractNum w:abstractNumId="3" w15:restartNumberingAfterBreak="0">
-    <w:nsid w:val="45034F39"/>
-    <w:multiLevelType w:val="multilevel"/>
-    <w:tmpl w:val="E6141BE6"/>
-    <w:lvl w:ilvl="0">
-      <w:start w:val="4"/>
-      <w:numFmt w:val="decimal"/>
-      <w:lvlText w:val="%1"/>
-      <w:lvlJc w:val="left"/>
-      <w:pPr>
-        <w:ind w:left="751" w:hanging="634"/>
-      </w:pPr>
-    </w:lvl>
-    <w:lvl w:ilvl="1">
-      <w:start w:val="5"/>
-      <w:numFmt w:val="decimal"/>
-      <w:lvlText w:val="12.%2"/>
-      <w:lvlJc w:val="left"/>
-      <w:pPr>
-        <w:ind w:left="751" w:hanging="634"/>
-      </w:pPr>
-      <w:rPr>
-        <w:rFonts w:eastAsia="Arial" w:cs="Arial"/>
-        <w:b/>
-        <w:bCs/>
-        <w:w w:val="102"/>
-        <w:sz w:val="21"/>
-        <w:szCs w:val="21"/>
-      </w:rPr>
-    </w:lvl>
-    <w:lvl w:ilvl="2">
-      <w:start w:val="1"/>
-      <w:numFmt w:val="bullet"/>
-      <w:lvlText w:val=""/>
-      <w:lvlJc w:val="left"/>
-      <w:pPr>
-        <w:ind w:left="2796" w:hanging="634"/>
-      </w:pPr>
-      <w:rPr>
-        <w:rFonts w:ascii="Symbol" w:hAnsi="Symbol" w:cs="Symbol" w:hint="default"/>
-      </w:rPr>
-    </w:lvl>
-    <w:lvl w:ilvl="3">
-      <w:start w:val="1"/>
-      <w:numFmt w:val="bullet"/>
-      <w:lvlText w:val=""/>
-      <w:lvlJc w:val="left"/>
-      <w:pPr>
-        <w:ind w:left="3814" w:hanging="634"/>
-      </w:pPr>
-      <w:rPr>
-        <w:rFonts w:ascii="Symbol" w:hAnsi="Symbol" w:cs="Symbol" w:hint="default"/>
-      </w:rPr>
-    </w:lvl>
-    <w:lvl w:ilvl="4">
-      <w:start w:val="1"/>
-      <w:numFmt w:val="bullet"/>
-      <w:lvlText w:val=""/>
-      <w:lvlJc w:val="left"/>
-      <w:pPr>
-        <w:ind w:left="4832" w:hanging="634"/>
-      </w:pPr>
-      <w:rPr>
-        <w:rFonts w:ascii="Symbol" w:hAnsi="Symbol" w:cs="Symbol" w:hint="default"/>
-      </w:rPr>
-    </w:lvl>
-    <w:lvl w:ilvl="5">
-      <w:start w:val="1"/>
-      <w:numFmt w:val="bullet"/>
-      <w:lvlText w:val=""/>
-      <w:lvlJc w:val="left"/>
-      <w:pPr>
-        <w:ind w:left="5850" w:hanging="634"/>
-      </w:pPr>
-      <w:rPr>
-        <w:rFonts w:ascii="Symbol" w:hAnsi="Symbol" w:cs="Symbol" w:hint="default"/>
-      </w:rPr>
-    </w:lvl>
-    <w:lvl w:ilvl="6">
-      <w:start w:val="1"/>
-      <w:numFmt w:val="bullet"/>
-      <w:lvlText w:val=""/>
-      <w:lvlJc w:val="left"/>
-      <w:pPr>
-        <w:ind w:left="6868" w:hanging="634"/>
-      </w:pPr>
-      <w:rPr>
-        <w:rFonts w:ascii="Symbol" w:hAnsi="Symbol" w:cs="Symbol" w:hint="default"/>
-      </w:rPr>
-    </w:lvl>
-    <w:lvl w:ilvl="7">
-      <w:start w:val="1"/>
-      <w:numFmt w:val="bullet"/>
-      <w:lvlText w:val=""/>
-      <w:lvlJc w:val="left"/>
-      <w:pPr>
-        <w:ind w:left="7886" w:hanging="634"/>
-      </w:pPr>
-      <w:rPr>
-        <w:rFonts w:ascii="Symbol" w:hAnsi="Symbol" w:cs="Symbol" w:hint="default"/>
-      </w:rPr>
-    </w:lvl>
-    <w:lvl w:ilvl="8">
-      <w:start w:val="1"/>
-      <w:numFmt w:val="bullet"/>
-      <w:lvlText w:val=""/>
-      <w:lvlJc w:val="left"/>
-      <w:pPr>
-        <w:ind w:left="8904" w:hanging="634"/>
-      </w:pPr>
-      <w:rPr>
-        <w:rFonts w:ascii="Symbol" w:hAnsi="Symbol" w:cs="Symbol" w:hint="default"/>
-      </w:rPr>
-    </w:lvl>
-  </w:abstractNum>
-  <w:num w:numId="1" w16cid:durableId="1688095591">
+  <w:num w:numId="1">
+    <w:abstractNumId w:val="1"/>
+  </w:num>
+  <w:num w:numId="2">
+    <w:abstractNumId w:val="2"/>
+  </w:num>
+  <w:num w:numId="3">
     <w:abstractNumId w:val="3"/>
   </w:num>
-  <w:num w:numId="2" w16cid:durableId="196627233">
-    <w:abstractNumId w:val="2"/>
-  </w:num>
-  <w:num w:numId="3" w16cid:durableId="1116634458">
-    <w:abstractNumId w:val="0"/>
-  </w:num>
-  <w:num w:numId="4" w16cid:durableId="1249147845">
-    <w:abstractNumId w:val="1"/>
+  <w:num w:numId="4">
+    <w:abstractNumId w:val="4"/>
   </w:num>
 </w:numbering>
 </file>
 
 <file path=word/styles.xml><?xml version="1.0" encoding="utf-8"?>
-<w:styles xmlns:mc="http://schemas.openxmlformats.org/markup-compatibility/2006" xmlns:r="http://schemas.openxmlformats.org/officeDocument/2006/relationships" xmlns:w="http://schemas.openxmlformats.org/wordprocessingml/2006/main" xmlns:w14="http://schemas.microsoft.com/office/word/2010/wordml" xmlns:w15="http://schemas.microsoft.com/office/word/2012/wordml" xmlns:w16cex="http://schemas.microsoft.com/office/word/2018/wordml/cex" xmlns:w16cid="http://schemas.microsoft.com/office/word/2016/wordml/cid" xmlns:w16="http://schemas.microsoft.com/office/word/2018/wordml" xmlns:w16sdtdh="http://schemas.microsoft.com/office/word/2020/wordml/sdtdatahash" xmlns:w16se="http://schemas.microsoft.com/office/word/2015/wordml/symex" mc:Ignorable="w14 w15 w16se w16cid w16 w16cex w16sdtdh">
+<w:styles xmlns:w="http://schemas.openxmlformats.org/wordprocessingml/2006/main" xmlns:w14="http://schemas.microsoft.com/office/word/2010/wordml" xmlns:mc="http://schemas.openxmlformats.org/markup-compatibility/2006" mc:Ignorable="w14">
   <w:docDefaults>
     <w:rPrDefault>
       <w:rPr>
-        <w:rFonts w:asciiTheme="minorHAnsi" w:eastAsiaTheme="minorHAnsi" w:hAnsiTheme="minorHAnsi" w:cstheme="minorBidi"/>
+        <w:rFonts w:ascii="Calibri" w:hAnsi="Calibri" w:eastAsia="Calibri" w:cs="" w:asciiTheme="minorHAnsi" w:cstheme="minorBidi" w:eastAsiaTheme="minorHAnsi" w:hAnsiTheme="minorHAnsi"/>
         <w:sz w:val="22"/>
         <w:szCs w:val="22"/>
         <w:lang w:val="en-US" w:eastAsia="en-US" w:bidi="ar-SA"/>
       </w:rPr>
     </w:rPrDefault>
-    <w:pPrDefault/>
+    <w:pPrDefault>
+      <w:pPr/>
+    </w:pPrDefault>
   </w:docDefaults>
   <w:latentStyles w:defLockedState="0" w:defUIPriority="99" w:defSemiHidden="0" w:defUnhideWhenUsed="0" w:defQFormat="0" w:count="376">
     <w:lsdException w:name="Normal" w:uiPriority="0" w:qFormat="1"/>
     <w:lsdException w:name="heading 1" w:uiPriority="9" w:qFormat="1"/>
-    <w:lsdException w:name="heading 2" w:semiHidden="1" w:uiPriority="9" w:unhideWhenUsed="1" w:qFormat="1"/>
-    <w:lsdException w:name="heading 3" w:semiHidden="1" w:uiPriority="9" w:unhideWhenUsed="1" w:qFormat="1"/>
-    <w:lsdException w:name="heading 4" w:semiHidden="1" w:uiPriority="9" w:unhideWhenUsed="1" w:qFormat="1"/>
-    <w:lsdException w:name="heading 5" w:semiHidden="1" w:uiPriority="9" w:unhideWhenUsed="1" w:qFormat="1"/>
-    <w:lsdException w:name="heading 6" w:semiHidden="1" w:uiPriority="9" w:unhideWhenUsed="1" w:qFormat="1"/>
-    <w:lsdException w:name="heading 7" w:semiHidden="1" w:uiPriority="9" w:unhideWhenUsed="1" w:qFormat="1"/>
-    <w:lsdException w:name="heading 8" w:semiHidden="1" w:uiPriority="9" w:unhideWhenUsed="1" w:qFormat="1"/>
-    <w:lsdException w:name="heading 9" w:semiHidden="1" w:uiPriority="9" w:unhideWhenUsed="1" w:qFormat="1"/>
+    <w:lsdException w:name="heading 2" w:uiPriority="9" w:semiHidden="1" w:unhideWhenUsed="1" w:qFormat="1"/>
+    <w:lsdException w:name="heading 3" w:uiPriority="9" w:semiHidden="1" w:unhideWhenUsed="1" w:qFormat="1"/>
+    <w:lsdException w:name="heading 4" w:uiPriority="9" w:semiHidden="1" w:unhideWhenUsed="1" w:qFormat="1"/>
+    <w:lsdException w:name="heading 5" w:uiPriority="9" w:semiHidden="1" w:unhideWhenUsed="1" w:qFormat="1"/>
+    <w:lsdException w:name="heading 6" w:uiPriority="9" w:semiHidden="1" w:unhideWhenUsed="1" w:qFormat="1"/>
+    <w:lsdException w:name="heading 7" w:uiPriority="9" w:semiHidden="1" w:unhideWhenUsed="1" w:qFormat="1"/>
+    <w:lsdException w:name="heading 8" w:uiPriority="9" w:semiHidden="1" w:unhideWhenUsed="1" w:qFormat="1"/>
+    <w:lsdException w:name="heading 9" w:uiPriority="9" w:semiHidden="1" w:unhideWhenUsed="1" w:qFormat="1"/>
     <w:lsdException w:name="index 1" w:semiHidden="1" w:unhideWhenUsed="1"/>
     <w:lsdException w:name="index 2" w:semiHidden="1" w:unhideWhenUsed="1"/>
     <w:lsdException w:name="index 3" w:semiHidden="1" w:unhideWhenUsed="1"/>
@@ -2127,22 +1910,22 @@
     <w:lsdException w:name="index 7" w:semiHidden="1" w:unhideWhenUsed="1"/>
     <w:lsdException w:name="index 8" w:semiHidden="1" w:unhideWhenUsed="1"/>
     <w:lsdException w:name="index 9" w:semiHidden="1" w:unhideWhenUsed="1"/>
-    <w:lsdException w:name="toc 1" w:semiHidden="1" w:uiPriority="39" w:unhideWhenUsed="1"/>
-    <w:lsdException w:name="toc 2" w:semiHidden="1" w:uiPriority="39" w:unhideWhenUsed="1"/>
-    <w:lsdException w:name="toc 3" w:semiHidden="1" w:uiPriority="39" w:unhideWhenUsed="1"/>
-    <w:lsdException w:name="toc 4" w:semiHidden="1" w:uiPriority="39" w:unhideWhenUsed="1"/>
-    <w:lsdException w:name="toc 5" w:semiHidden="1" w:uiPriority="39" w:unhideWhenUsed="1"/>
-    <w:lsdException w:name="toc 6" w:semiHidden="1" w:uiPriority="39" w:unhideWhenUsed="1"/>
-    <w:lsdException w:name="toc 7" w:semiHidden="1" w:uiPriority="39" w:unhideWhenUsed="1"/>
-    <w:lsdException w:name="toc 8" w:semiHidden="1" w:uiPriority="39" w:unhideWhenUsed="1"/>
-    <w:lsdException w:name="toc 9" w:semiHidden="1" w:uiPriority="39" w:unhideWhenUsed="1"/>
+    <w:lsdException w:name="toc 1" w:uiPriority="39" w:semiHidden="1" w:unhideWhenUsed="1"/>
+    <w:lsdException w:name="toc 2" w:uiPriority="39" w:semiHidden="1" w:unhideWhenUsed="1"/>
+    <w:lsdException w:name="toc 3" w:uiPriority="39" w:semiHidden="1" w:unhideWhenUsed="1"/>
+    <w:lsdException w:name="toc 4" w:uiPriority="39" w:semiHidden="1" w:unhideWhenUsed="1"/>
+    <w:lsdException w:name="toc 5" w:uiPriority="39" w:semiHidden="1" w:unhideWhenUsed="1"/>
+    <w:lsdException w:name="toc 6" w:uiPriority="39" w:semiHidden="1" w:unhideWhenUsed="1"/>
+    <w:lsdException w:name="toc 7" w:uiPriority="39" w:semiHidden="1" w:unhideWhenUsed="1"/>
+    <w:lsdException w:name="toc 8" w:uiPriority="39" w:semiHidden="1" w:unhideWhenUsed="1"/>
+    <w:lsdException w:name="toc 9" w:uiPriority="39" w:semiHidden="1" w:unhideWhenUsed="1"/>
     <w:lsdException w:name="Normal Indent" w:semiHidden="1" w:unhideWhenUsed="1"/>
     <w:lsdException w:name="footnote text" w:semiHidden="1" w:unhideWhenUsed="1"/>
     <w:lsdException w:name="annotation text" w:semiHidden="1" w:unhideWhenUsed="1"/>
     <w:lsdException w:name="header" w:semiHidden="1" w:unhideWhenUsed="1"/>
     <w:lsdException w:name="footer" w:semiHidden="1" w:unhideWhenUsed="1"/>
     <w:lsdException w:name="index heading" w:semiHidden="1" w:unhideWhenUsed="1"/>
-    <w:lsdException w:name="caption" w:semiHidden="1" w:uiPriority="35" w:unhideWhenUsed="1" w:qFormat="1"/>
+    <w:lsdException w:name="caption" w:uiPriority="35" w:semiHidden="1" w:unhideWhenUsed="1" w:qFormat="1"/>
     <w:lsdException w:name="table of figures" w:semiHidden="1" w:unhideWhenUsed="1"/>
     <w:lsdException w:name="envelope address" w:semiHidden="1" w:unhideWhenUsed="1"/>
     <w:lsdException w:name="envelope return" w:semiHidden="1" w:unhideWhenUsed="1"/>
@@ -2173,7 +1956,7 @@
     <w:lsdException w:name="Title" w:uiPriority="10" w:qFormat="1"/>
     <w:lsdException w:name="Closing" w:semiHidden="1" w:unhideWhenUsed="1"/>
     <w:lsdException w:name="Signature" w:semiHidden="1" w:unhideWhenUsed="1"/>
-    <w:lsdException w:name="Default Paragraph Font" w:semiHidden="1" w:uiPriority="1" w:unhideWhenUsed="1"/>
+    <w:lsdException w:name="Default Paragraph Font" w:uiPriority="1" w:semiHidden="1" w:unhideWhenUsed="1"/>
     <w:lsdException w:name="Body Text" w:semiHidden="1" w:unhideWhenUsed="1"/>
     <w:lsdException w:name="Body Text Indent" w:semiHidden="1" w:unhideWhenUsed="1"/>
     <w:lsdException w:name="List Continue" w:semiHidden="1" w:unhideWhenUsed="1"/>
@@ -2373,8 +2156,8 @@
     <w:lsdException w:name="Subtle Reference" w:uiPriority="31" w:qFormat="1"/>
     <w:lsdException w:name="Intense Reference" w:uiPriority="32" w:qFormat="1"/>
     <w:lsdException w:name="Book Title" w:uiPriority="33" w:qFormat="1"/>
-    <w:lsdException w:name="Bibliography" w:semiHidden="1" w:uiPriority="37" w:unhideWhenUsed="1"/>
-    <w:lsdException w:name="TOC Heading" w:semiHidden="1" w:uiPriority="39" w:unhideWhenUsed="1" w:qFormat="1"/>
+    <w:lsdException w:name="Bibliography" w:uiPriority="37" w:semiHidden="1" w:unhideWhenUsed="1"/>
+    <w:lsdException w:name="TOC Heading" w:uiPriority="39" w:semiHidden="1" w:unhideWhenUsed="1" w:qFormat="1"/>
     <w:lsdException w:name="Plain Table 1" w:uiPriority="41"/>
     <w:lsdException w:name="Plain Table 2" w:uiPriority="42"/>
     <w:lsdException w:name="Plain Table 3" w:uiPriority="43"/>
@@ -2485,16 +2268,26 @@
     <w:lsdException w:name="Unresolved Mention" w:semiHidden="1" w:unhideWhenUsed="1"/>
     <w:lsdException w:name="Smart Link" w:semiHidden="1" w:unhideWhenUsed="1"/>
   </w:latentStyles>
-  <w:style w:type="paragraph" w:default="1" w:styleId="Normal">
+  <w:style w:type="paragraph" w:styleId="Normal" w:default="1">
     <w:name w:val="Normal"/>
     <w:uiPriority w:val="1"/>
     <w:qFormat/>
-    <w:rPr>
-      <w:rFonts w:ascii="Arial" w:eastAsia="Arial" w:hAnsi="Arial" w:cs="Arial"/>
+    <w:pPr>
+      <w:widowControl/>
+      <w:bidi w:val="0"/>
+      <w:jc w:val="left"/>
+    </w:pPr>
+    <w:rPr>
+      <w:rFonts w:ascii="Arial" w:hAnsi="Arial" w:eastAsia="Arial" w:cs="Arial"/>
+      <w:color w:val="auto"/>
+      <w:kern w:val="0"/>
+      <w:sz w:val="22"/>
+      <w:szCs w:val="22"/>
+      <w:lang w:val="en-US" w:eastAsia="en-US" w:bidi="ar-SA"/>
     </w:rPr>
   </w:style>
   <w:style w:type="paragraph" w:styleId="Heading1">
-    <w:name w:val="heading 1"/>
+    <w:name w:val="Heading 1"/>
     <w:basedOn w:val="Normal"/>
     <w:uiPriority w:val="1"/>
     <w:qFormat/>
@@ -2510,11 +2303,695 @@
       <w:szCs w:val="21"/>
     </w:rPr>
   </w:style>
-  <w:style w:type="character" w:default="1" w:styleId="DefaultParagraphFont">
+  <w:style w:type="character" w:styleId="DefaultParagraphFont" w:default="1">
     <w:name w:val="Default Paragraph Font"/>
     <w:uiPriority w:val="1"/>
     <w:semiHidden/>
     <w:unhideWhenUsed/>
+    <w:qFormat/>
+    <w:rPr/>
+  </w:style>
+  <w:style w:type="character" w:styleId="HeaderChar" w:customStyle="1">
+    <w:name w:val="Header Char"/>
+    <w:basedOn w:val="DefaultParagraphFont"/>
+    <w:link w:val="Header"/>
+    <w:uiPriority w:val="99"/>
+    <w:qFormat/>
+    <w:rsid w:val="006834d6"/>
+    <w:rPr>
+      <w:rFonts w:ascii="Arial" w:hAnsi="Arial" w:eastAsia="Arial" w:cs="Arial"/>
+    </w:rPr>
+  </w:style>
+  <w:style w:type="character" w:styleId="FooterChar" w:customStyle="1">
+    <w:name w:val="Footer Char"/>
+    <w:basedOn w:val="DefaultParagraphFont"/>
+    <w:link w:val="Footer"/>
+    <w:uiPriority w:val="99"/>
+    <w:qFormat/>
+    <w:rsid w:val="006834d6"/>
+    <w:rPr>
+      <w:rFonts w:ascii="Arial" w:hAnsi="Arial" w:eastAsia="Arial" w:cs="Arial"/>
+    </w:rPr>
+  </w:style>
+  <w:style w:type="character" w:styleId="Pagenumber">
+    <w:name w:val="page number"/>
+    <w:basedOn w:val="DefaultParagraphFont"/>
+    <w:uiPriority w:val="99"/>
+    <w:semiHidden/>
+    <w:unhideWhenUsed/>
+    <w:qFormat/>
+    <w:rsid w:val="009252f1"/>
+    <w:rPr/>
+  </w:style>
+  <w:style w:type="character" w:styleId="InternetLink" w:customStyle="1">
+    <w:name w:val="Internet Link"/>
+    <w:basedOn w:val="DefaultParagraphFont"/>
+    <w:uiPriority w:val="99"/>
+    <w:semiHidden/>
+    <w:unhideWhenUsed/>
+    <w:rsid w:val="000a3605"/>
+    <w:rPr>
+      <w:color w:val="0000FF"/>
+      <w:u w:val="single"/>
+    </w:rPr>
+  </w:style>
+  <w:style w:type="character" w:styleId="ListLabel1" w:customStyle="1">
+    <w:name w:val="ListLabel 1"/>
+    <w:qFormat/>
+    <w:rPr>
+      <w:rFonts w:eastAsia="Arial" w:cs="Arial"/>
+      <w:b/>
+      <w:bCs/>
+      <w:w w:val="102"/>
+      <w:sz w:val="21"/>
+      <w:szCs w:val="21"/>
+    </w:rPr>
+  </w:style>
+  <w:style w:type="character" w:styleId="ListLabel2" w:customStyle="1">
+    <w:name w:val="ListLabel 2"/>
+    <w:qFormat/>
+    <w:rPr>
+      <w:rFonts w:eastAsia="Arial" w:cs="Arial"/>
+      <w:b/>
+      <w:bCs/>
+      <w:w w:val="102"/>
+      <w:sz w:val="21"/>
+      <w:szCs w:val="21"/>
+    </w:rPr>
+  </w:style>
+  <w:style w:type="character" w:styleId="ListLabel3" w:customStyle="1">
+    <w:name w:val="ListLabel 3"/>
+    <w:qFormat/>
+    <w:rPr>
+      <w:rFonts w:eastAsia="Arial" w:cs="Arial"/>
+      <w:b/>
+      <w:bCs/>
+      <w:w w:val="102"/>
+      <w:sz w:val="21"/>
+      <w:szCs w:val="21"/>
+    </w:rPr>
+  </w:style>
+  <w:style w:type="character" w:styleId="ListLabel4" w:customStyle="1">
+    <w:name w:val="ListLabel 4"/>
+    <w:qFormat/>
+    <w:rPr>
+      <w:rFonts w:eastAsia="Arial" w:cs="Arial"/>
+      <w:b/>
+      <w:bCs/>
+      <w:w w:val="102"/>
+      <w:sz w:val="21"/>
+      <w:szCs w:val="21"/>
+    </w:rPr>
+  </w:style>
+  <w:style w:type="character" w:styleId="ListLabel5" w:customStyle="1">
+    <w:name w:val="ListLabel 5"/>
+    <w:qFormat/>
+    <w:rPr>
+      <w:rFonts w:eastAsia="Arial" w:cs="Arial"/>
+      <w:w w:val="99"/>
+      <w:sz w:val="24"/>
+      <w:szCs w:val="24"/>
+    </w:rPr>
+  </w:style>
+  <w:style w:type="character" w:styleId="ListLabel6" w:customStyle="1">
+    <w:name w:val="ListLabel 6"/>
+    <w:qFormat/>
+    <w:rPr>
+      <w:rFonts w:eastAsia="Arial" w:cs="Arial"/>
+      <w:b/>
+      <w:bCs/>
+      <w:w w:val="102"/>
+      <w:sz w:val="21"/>
+      <w:szCs w:val="21"/>
+    </w:rPr>
+  </w:style>
+  <w:style w:type="character" w:styleId="ListLabel7" w:customStyle="1">
+    <w:name w:val="ListLabel 7"/>
+    <w:qFormat/>
+    <w:rPr>
+      <w:rFonts w:eastAsia="Arial" w:cs="Arial"/>
+      <w:b/>
+      <w:bCs/>
+      <w:w w:val="102"/>
+      <w:sz w:val="21"/>
+      <w:szCs w:val="21"/>
+    </w:rPr>
+  </w:style>
+  <w:style w:type="character" w:styleId="ListLabel8" w:customStyle="1">
+    <w:name w:val="ListLabel 8"/>
+    <w:qFormat/>
+    <w:rPr>
+      <w:rFonts w:eastAsia="Arial" w:cs="Arial"/>
+      <w:b/>
+      <w:bCs/>
+      <w:w w:val="102"/>
+      <w:sz w:val="21"/>
+      <w:szCs w:val="21"/>
+    </w:rPr>
+  </w:style>
+  <w:style w:type="character" w:styleId="ListLabel9" w:customStyle="1">
+    <w:name w:val="ListLabel 9"/>
+    <w:qFormat/>
+    <w:rPr>
+      <w:rFonts w:eastAsia="Arial" w:cs="Arial"/>
+      <w:w w:val="99"/>
+      <w:sz w:val="24"/>
+      <w:szCs w:val="24"/>
+    </w:rPr>
+  </w:style>
+  <w:style w:type="character" w:styleId="ListLabel10" w:customStyle="1">
+    <w:name w:val="ListLabel 10"/>
+    <w:qFormat/>
+    <w:rPr>
+      <w:rFonts w:eastAsia="Arial" w:cs="Arial"/>
+      <w:b/>
+      <w:bCs/>
+      <w:w w:val="102"/>
+      <w:sz w:val="21"/>
+      <w:szCs w:val="21"/>
+    </w:rPr>
+  </w:style>
+  <w:style w:type="character" w:styleId="ListLabel11" w:customStyle="1">
+    <w:name w:val="ListLabel 11"/>
+    <w:qFormat/>
+    <w:rPr>
+      <w:rFonts w:eastAsia="Arial" w:cs="Arial"/>
+      <w:b/>
+      <w:bCs/>
+      <w:w w:val="102"/>
+      <w:sz w:val="21"/>
+      <w:szCs w:val="21"/>
+    </w:rPr>
+  </w:style>
+  <w:style w:type="character" w:styleId="ListLabel12" w:customStyle="1">
+    <w:name w:val="ListLabel 12"/>
+    <w:qFormat/>
+    <w:rPr>
+      <w:rFonts w:eastAsia="Arial" w:cs="Arial"/>
+      <w:b/>
+      <w:bCs/>
+      <w:w w:val="102"/>
+      <w:sz w:val="24"/>
+      <w:szCs w:val="24"/>
+    </w:rPr>
+  </w:style>
+  <w:style w:type="character" w:styleId="ListLabel13" w:customStyle="1">
+    <w:name w:val="ListLabel 13"/>
+    <w:qFormat/>
+    <w:rPr>
+      <w:rFonts w:eastAsia="Arial" w:cs="Arial"/>
+      <w:b/>
+      <w:bCs/>
+      <w:w w:val="102"/>
+      <w:sz w:val="24"/>
+      <w:szCs w:val="24"/>
+    </w:rPr>
+  </w:style>
+  <w:style w:type="character" w:styleId="ListLabel14" w:customStyle="1">
+    <w:name w:val="ListLabel 14"/>
+    <w:qFormat/>
+    <w:rPr>
+      <w:rFonts w:eastAsia="Arial" w:cs="Arial"/>
+      <w:b/>
+      <w:bCs/>
+      <w:w w:val="102"/>
+      <w:sz w:val="24"/>
+      <w:szCs w:val="21"/>
+    </w:rPr>
+  </w:style>
+  <w:style w:type="character" w:styleId="ListLabel15" w:customStyle="1">
+    <w:name w:val="ListLabel 15"/>
+    <w:qFormat/>
+    <w:rPr>
+      <w:rFonts w:eastAsia="Arial" w:cs="Arial"/>
+      <w:w w:val="99"/>
+      <w:sz w:val="24"/>
+      <w:szCs w:val="24"/>
+    </w:rPr>
+  </w:style>
+  <w:style w:type="character" w:styleId="ListLabel16" w:customStyle="1">
+    <w:name w:val="ListLabel 16"/>
+    <w:qFormat/>
+    <w:rPr>
+      <w:rFonts w:eastAsia="Arial" w:cs="Arial"/>
+      <w:b/>
+      <w:bCs/>
+      <w:w w:val="102"/>
+      <w:sz w:val="21"/>
+      <w:szCs w:val="21"/>
+    </w:rPr>
+  </w:style>
+  <w:style w:type="character" w:styleId="ListLabel17" w:customStyle="1">
+    <w:name w:val="ListLabel 17"/>
+    <w:qFormat/>
+    <w:rPr>
+      <w:rFonts w:eastAsia="Arial" w:cs="Arial"/>
+      <w:b/>
+      <w:bCs/>
+      <w:w w:val="102"/>
+      <w:sz w:val="21"/>
+      <w:szCs w:val="21"/>
+    </w:rPr>
+  </w:style>
+  <w:style w:type="character" w:styleId="ListLabel18" w:customStyle="1">
+    <w:name w:val="ListLabel 18"/>
+    <w:qFormat/>
+    <w:rPr>
+      <w:rFonts w:eastAsia="Arial" w:cs="Arial"/>
+      <w:b/>
+      <w:bCs/>
+      <w:w w:val="102"/>
+      <w:sz w:val="21"/>
+      <w:szCs w:val="21"/>
+    </w:rPr>
+  </w:style>
+  <w:style w:type="character" w:styleId="ListLabel19" w:customStyle="1">
+    <w:name w:val="ListLabel 19"/>
+    <w:qFormat/>
+    <w:rPr>
+      <w:rFonts w:eastAsia="Arial" w:cs="Arial"/>
+      <w:w w:val="99"/>
+      <w:sz w:val="24"/>
+      <w:szCs w:val="24"/>
+    </w:rPr>
+  </w:style>
+  <w:style w:type="character" w:styleId="ListLabel20" w:customStyle="1">
+    <w:name w:val="ListLabel 20"/>
+    <w:qFormat/>
+    <w:rPr>
+      <w:rFonts w:eastAsia="Arial" w:cs="Arial"/>
+      <w:b/>
+      <w:bCs/>
+      <w:w w:val="102"/>
+      <w:sz w:val="21"/>
+      <w:szCs w:val="21"/>
+    </w:rPr>
+  </w:style>
+  <w:style w:type="character" w:styleId="ListLabel21" w:customStyle="1">
+    <w:name w:val="ListLabel 21"/>
+    <w:qFormat/>
+    <w:rPr>
+      <w:rFonts w:eastAsia="Arial" w:cs="Arial"/>
+      <w:b/>
+      <w:bCs/>
+      <w:w w:val="102"/>
+      <w:sz w:val="21"/>
+      <w:szCs w:val="21"/>
+    </w:rPr>
+  </w:style>
+  <w:style w:type="character" w:styleId="ListLabel22" w:customStyle="1">
+    <w:name w:val="ListLabel 22"/>
+    <w:qFormat/>
+    <w:rPr>
+      <w:rFonts w:cs="Courier New"/>
+    </w:rPr>
+  </w:style>
+  <w:style w:type="character" w:styleId="ListLabel23" w:customStyle="1">
+    <w:name w:val="ListLabel 23"/>
+    <w:qFormat/>
+    <w:rPr>
+      <w:rFonts w:cs="Courier New"/>
+    </w:rPr>
+  </w:style>
+  <w:style w:type="character" w:styleId="ListLabel24" w:customStyle="1">
+    <w:name w:val="ListLabel 24"/>
+    <w:qFormat/>
+    <w:rPr>
+      <w:rFonts w:cs="Courier New"/>
+    </w:rPr>
+  </w:style>
+  <w:style w:type="character" w:styleId="ListLabel25" w:customStyle="1">
+    <w:name w:val="ListLabel 25"/>
+    <w:qFormat/>
+    <w:rPr>
+      <w:rFonts w:cs="Courier New"/>
+    </w:rPr>
+  </w:style>
+  <w:style w:type="character" w:styleId="ListLabel26" w:customStyle="1">
+    <w:name w:val="ListLabel 26"/>
+    <w:qFormat/>
+    <w:rPr>
+      <w:rFonts w:cs="Courier New"/>
+    </w:rPr>
+  </w:style>
+  <w:style w:type="character" w:styleId="ListLabel27" w:customStyle="1">
+    <w:name w:val="ListLabel 27"/>
+    <w:qFormat/>
+    <w:rPr>
+      <w:rFonts w:cs="Courier New"/>
+    </w:rPr>
+  </w:style>
+  <w:style w:type="character" w:styleId="ListLabel28">
+    <w:name w:val="ListLabel 28"/>
+    <w:qFormat/>
+    <w:rPr>
+      <w:rFonts w:eastAsia="Arial" w:cs="Arial"/>
+      <w:b/>
+      <w:bCs/>
+      <w:w w:val="102"/>
+      <w:sz w:val="21"/>
+      <w:szCs w:val="21"/>
+    </w:rPr>
+  </w:style>
+  <w:style w:type="character" w:styleId="ListLabel29">
+    <w:name w:val="ListLabel 29"/>
+    <w:qFormat/>
+    <w:rPr>
+      <w:rFonts w:cs="Symbol"/>
+    </w:rPr>
+  </w:style>
+  <w:style w:type="character" w:styleId="ListLabel30">
+    <w:name w:val="ListLabel 30"/>
+    <w:qFormat/>
+    <w:rPr>
+      <w:rFonts w:cs="Symbol"/>
+    </w:rPr>
+  </w:style>
+  <w:style w:type="character" w:styleId="ListLabel31">
+    <w:name w:val="ListLabel 31"/>
+    <w:qFormat/>
+    <w:rPr>
+      <w:rFonts w:cs="Symbol"/>
+    </w:rPr>
+  </w:style>
+  <w:style w:type="character" w:styleId="ListLabel32">
+    <w:name w:val="ListLabel 32"/>
+    <w:qFormat/>
+    <w:rPr>
+      <w:rFonts w:cs="Symbol"/>
+    </w:rPr>
+  </w:style>
+  <w:style w:type="character" w:styleId="ListLabel33">
+    <w:name w:val="ListLabel 33"/>
+    <w:qFormat/>
+    <w:rPr>
+      <w:rFonts w:cs="Symbol"/>
+    </w:rPr>
+  </w:style>
+  <w:style w:type="character" w:styleId="ListLabel34">
+    <w:name w:val="ListLabel 34"/>
+    <w:qFormat/>
+    <w:rPr>
+      <w:rFonts w:cs="Symbol"/>
+    </w:rPr>
+  </w:style>
+  <w:style w:type="character" w:styleId="ListLabel35">
+    <w:name w:val="ListLabel 35"/>
+    <w:qFormat/>
+    <w:rPr>
+      <w:rFonts w:cs="Symbol"/>
+    </w:rPr>
+  </w:style>
+  <w:style w:type="character" w:styleId="ListLabel36">
+    <w:name w:val="ListLabel 36"/>
+    <w:qFormat/>
+    <w:rPr>
+      <w:rFonts w:eastAsia="Arial" w:cs="Arial"/>
+      <w:b/>
+      <w:bCs/>
+      <w:w w:val="102"/>
+      <w:sz w:val="24"/>
+      <w:szCs w:val="24"/>
+    </w:rPr>
+  </w:style>
+  <w:style w:type="character" w:styleId="ListLabel37">
+    <w:name w:val="ListLabel 37"/>
+    <w:qFormat/>
+    <w:rPr>
+      <w:rFonts w:eastAsia="Arial" w:cs="Arial"/>
+      <w:b/>
+      <w:bCs/>
+      <w:w w:val="102"/>
+      <w:sz w:val="24"/>
+      <w:szCs w:val="24"/>
+    </w:rPr>
+  </w:style>
+  <w:style w:type="character" w:styleId="ListLabel38">
+    <w:name w:val="ListLabel 38"/>
+    <w:qFormat/>
+    <w:rPr>
+      <w:rFonts w:eastAsia="Arial" w:cs="Arial"/>
+      <w:b/>
+      <w:bCs/>
+      <w:w w:val="102"/>
+      <w:sz w:val="24"/>
+      <w:szCs w:val="21"/>
+    </w:rPr>
+  </w:style>
+  <w:style w:type="character" w:styleId="ListLabel39">
+    <w:name w:val="ListLabel 39"/>
+    <w:qFormat/>
+    <w:rPr>
+      <w:rFonts w:cs="Arial"/>
+      <w:w w:val="99"/>
+      <w:sz w:val="24"/>
+      <w:szCs w:val="24"/>
+    </w:rPr>
+  </w:style>
+  <w:style w:type="character" w:styleId="ListLabel40">
+    <w:name w:val="ListLabel 40"/>
+    <w:qFormat/>
+    <w:rPr>
+      <w:rFonts w:cs="Symbol"/>
+    </w:rPr>
+  </w:style>
+  <w:style w:type="character" w:styleId="ListLabel41">
+    <w:name w:val="ListLabel 41"/>
+    <w:qFormat/>
+    <w:rPr>
+      <w:rFonts w:cs="Symbol"/>
+    </w:rPr>
+  </w:style>
+  <w:style w:type="character" w:styleId="ListLabel42">
+    <w:name w:val="ListLabel 42"/>
+    <w:qFormat/>
+    <w:rPr>
+      <w:rFonts w:cs="Symbol"/>
+    </w:rPr>
+  </w:style>
+  <w:style w:type="character" w:styleId="ListLabel43">
+    <w:name w:val="ListLabel 43"/>
+    <w:qFormat/>
+    <w:rPr>
+      <w:rFonts w:cs="Symbol"/>
+    </w:rPr>
+  </w:style>
+  <w:style w:type="character" w:styleId="ListLabel44">
+    <w:name w:val="ListLabel 44"/>
+    <w:qFormat/>
+    <w:rPr>
+      <w:rFonts w:cs="Symbol"/>
+    </w:rPr>
+  </w:style>
+  <w:style w:type="character" w:styleId="ListLabel45">
+    <w:name w:val="ListLabel 45"/>
+    <w:qFormat/>
+    <w:rPr>
+      <w:rFonts w:cs="Courier New"/>
+    </w:rPr>
+  </w:style>
+  <w:style w:type="character" w:styleId="ListLabel46">
+    <w:name w:val="ListLabel 46"/>
+    <w:qFormat/>
+    <w:rPr>
+      <w:rFonts w:cs="Wingdings"/>
+    </w:rPr>
+  </w:style>
+  <w:style w:type="character" w:styleId="ListLabel47">
+    <w:name w:val="ListLabel 47"/>
+    <w:qFormat/>
+    <w:rPr>
+      <w:rFonts w:cs="Symbol"/>
+    </w:rPr>
+  </w:style>
+  <w:style w:type="character" w:styleId="ListLabel48">
+    <w:name w:val="ListLabel 48"/>
+    <w:qFormat/>
+    <w:rPr>
+      <w:rFonts w:cs="Courier New"/>
+    </w:rPr>
+  </w:style>
+  <w:style w:type="character" w:styleId="ListLabel49">
+    <w:name w:val="ListLabel 49"/>
+    <w:qFormat/>
+    <w:rPr>
+      <w:rFonts w:cs="Wingdings"/>
+    </w:rPr>
+  </w:style>
+  <w:style w:type="character" w:styleId="ListLabel50">
+    <w:name w:val="ListLabel 50"/>
+    <w:qFormat/>
+    <w:rPr>
+      <w:rFonts w:cs="Symbol"/>
+    </w:rPr>
+  </w:style>
+  <w:style w:type="character" w:styleId="ListLabel51">
+    <w:name w:val="ListLabel 51"/>
+    <w:qFormat/>
+    <w:rPr>
+      <w:rFonts w:cs="Courier New"/>
+    </w:rPr>
+  </w:style>
+  <w:style w:type="character" w:styleId="ListLabel52">
+    <w:name w:val="ListLabel 52"/>
+    <w:qFormat/>
+    <w:rPr>
+      <w:rFonts w:cs="Wingdings"/>
+    </w:rPr>
+  </w:style>
+  <w:style w:type="paragraph" w:styleId="Heading" w:customStyle="1">
+    <w:name w:val="Heading"/>
+    <w:basedOn w:val="Normal"/>
+    <w:next w:val="TextBody"/>
+    <w:qFormat/>
+    <w:pPr>
+      <w:keepNext w:val="true"/>
+      <w:spacing w:before="240" w:after="120"/>
+    </w:pPr>
+    <w:rPr>
+      <w:rFonts w:ascii="Liberation Sans" w:hAnsi="Liberation Sans" w:eastAsia="AR PL SungtiL GB" w:cs="Lohit Devanagari"/>
+      <w:sz w:val="28"/>
+      <w:szCs w:val="28"/>
+    </w:rPr>
+  </w:style>
+  <w:style w:type="paragraph" w:styleId="TextBody">
+    <w:name w:val="Body Text"/>
+    <w:basedOn w:val="Normal"/>
+    <w:uiPriority w:val="1"/>
+    <w:qFormat/>
+    <w:pPr>
+      <w:spacing w:before="47" w:after="0"/>
+      <w:ind w:left="117" w:right="1415" w:hanging="0"/>
+      <w:jc w:val="both"/>
+    </w:pPr>
+    <w:rPr>
+      <w:sz w:val="21"/>
+      <w:szCs w:val="21"/>
+    </w:rPr>
+  </w:style>
+  <w:style w:type="paragraph" w:styleId="List">
+    <w:name w:val="List"/>
+    <w:basedOn w:val="TextBody"/>
+    <w:pPr/>
+    <w:rPr>
+      <w:rFonts w:cs="Lohit Devanagari"/>
+    </w:rPr>
+  </w:style>
+  <w:style w:type="paragraph" w:styleId="Caption">
+    <w:name w:val="Caption"/>
+    <w:basedOn w:val="Normal"/>
+    <w:qFormat/>
+    <w:pPr>
+      <w:suppressLineNumbers/>
+      <w:spacing w:before="120" w:after="120"/>
+    </w:pPr>
+    <w:rPr>
+      <w:rFonts w:cs="Lohit Devanagari"/>
+      <w:i/>
+      <w:iCs/>
+      <w:sz w:val="24"/>
+      <w:szCs w:val="24"/>
+    </w:rPr>
+  </w:style>
+  <w:style w:type="paragraph" w:styleId="Index" w:customStyle="1">
+    <w:name w:val="Index"/>
+    <w:basedOn w:val="Normal"/>
+    <w:qFormat/>
+    <w:pPr>
+      <w:suppressLineNumbers/>
+    </w:pPr>
+    <w:rPr>
+      <w:rFonts w:cs="Lohit Devanagari"/>
+    </w:rPr>
+  </w:style>
+  <w:style w:type="paragraph" w:styleId="Caption1">
+    <w:name w:val="caption"/>
+    <w:basedOn w:val="Normal"/>
+    <w:qFormat/>
+    <w:pPr>
+      <w:suppressLineNumbers/>
+      <w:spacing w:before="120" w:after="120"/>
+    </w:pPr>
+    <w:rPr>
+      <w:rFonts w:cs="Lohit Devanagari"/>
+      <w:i/>
+      <w:iCs/>
+      <w:sz w:val="24"/>
+      <w:szCs w:val="24"/>
+    </w:rPr>
+  </w:style>
+  <w:style w:type="paragraph" w:styleId="ListParagraph">
+    <w:name w:val="List Paragraph"/>
+    <w:basedOn w:val="Normal"/>
+    <w:uiPriority w:val="1"/>
+    <w:qFormat/>
+    <w:pPr>
+      <w:ind w:left="751" w:hanging="635"/>
+      <w:jc w:val="both"/>
+    </w:pPr>
+    <w:rPr/>
+  </w:style>
+  <w:style w:type="paragraph" w:styleId="TableParagraph" w:customStyle="1">
+    <w:name w:val="Table Paragraph"/>
+    <w:basedOn w:val="Normal"/>
+    <w:uiPriority w:val="1"/>
+    <w:qFormat/>
+    <w:pPr/>
+    <w:rPr/>
+  </w:style>
+  <w:style w:type="paragraph" w:styleId="Header">
+    <w:name w:val="Header"/>
+    <w:basedOn w:val="Normal"/>
+    <w:link w:val="HeaderChar"/>
+    <w:uiPriority w:val="99"/>
+    <w:unhideWhenUsed/>
+    <w:rsid w:val="006834d6"/>
+    <w:pPr>
+      <w:tabs>
+        <w:tab w:val="center" w:pos="4680" w:leader="none"/>
+        <w:tab w:val="right" w:pos="9360" w:leader="none"/>
+      </w:tabs>
+    </w:pPr>
+    <w:rPr/>
+  </w:style>
+  <w:style w:type="paragraph" w:styleId="Footer">
+    <w:name w:val="Footer"/>
+    <w:basedOn w:val="Normal"/>
+    <w:link w:val="FooterChar"/>
+    <w:uiPriority w:val="99"/>
+    <w:unhideWhenUsed/>
+    <w:rsid w:val="006834d6"/>
+    <w:pPr>
+      <w:tabs>
+        <w:tab w:val="center" w:pos="4680" w:leader="none"/>
+        <w:tab w:val="right" w:pos="9360" w:leader="none"/>
+      </w:tabs>
+    </w:pPr>
+    <w:rPr/>
+  </w:style>
+  <w:style w:type="paragraph" w:styleId="NormalWeb">
+    <w:name w:val="Normal (Web)"/>
+    <w:basedOn w:val="Normal"/>
+    <w:uiPriority w:val="99"/>
+    <w:semiHidden/>
+    <w:unhideWhenUsed/>
+    <w:qFormat/>
+    <w:rsid w:val="00040495"/>
+    <w:pPr>
+      <w:spacing w:beforeAutospacing="1" w:afterAutospacing="1"/>
+    </w:pPr>
+    <w:rPr>
+      <w:rFonts w:ascii="Times New Roman" w:hAnsi="Times New Roman" w:eastAsia="Times New Roman" w:cs="Times New Roman"/>
+      <w:sz w:val="24"/>
+      <w:szCs w:val="24"/>
+    </w:rPr>
+  </w:style>
+  <w:style w:type="numbering" w:styleId="NoList" w:default="1">
+    <w:name w:val="No List"/>
+    <w:uiPriority w:val="99"/>
+    <w:semiHidden/>
+    <w:unhideWhenUsed/>
+    <w:qFormat/>
   </w:style>
   <w:style w:type="table" w:default="1" w:styleId="TableNormal">
     <w:name w:val="Normal Table"/>
@@ -2531,479 +3008,19 @@
       </w:tblCellMar>
     </w:tblPr>
   </w:style>
-  <w:style w:type="numbering" w:default="1" w:styleId="NoList">
-    <w:name w:val="No List"/>
-    <w:uiPriority w:val="99"/>
-    <w:semiHidden/>
-    <w:unhideWhenUsed/>
-  </w:style>
-  <w:style w:type="character" w:customStyle="1" w:styleId="HeaderChar">
-    <w:name w:val="Header Char"/>
-    <w:basedOn w:val="DefaultParagraphFont"/>
-    <w:link w:val="Header"/>
-    <w:uiPriority w:val="99"/>
-    <w:qFormat/>
-    <w:rsid w:val="006834D6"/>
-    <w:rPr>
-      <w:rFonts w:ascii="Arial" w:eastAsia="Arial" w:hAnsi="Arial" w:cs="Arial"/>
-    </w:rPr>
-  </w:style>
-  <w:style w:type="character" w:customStyle="1" w:styleId="FooterChar">
-    <w:name w:val="Footer Char"/>
-    <w:basedOn w:val="DefaultParagraphFont"/>
-    <w:link w:val="Footer"/>
-    <w:uiPriority w:val="99"/>
-    <w:qFormat/>
-    <w:rsid w:val="006834D6"/>
-    <w:rPr>
-      <w:rFonts w:ascii="Arial" w:eastAsia="Arial" w:hAnsi="Arial" w:cs="Arial"/>
-    </w:rPr>
-  </w:style>
-  <w:style w:type="character" w:styleId="PageNumber">
-    <w:name w:val="page number"/>
-    <w:basedOn w:val="DefaultParagraphFont"/>
-    <w:uiPriority w:val="99"/>
-    <w:semiHidden/>
-    <w:unhideWhenUsed/>
-    <w:qFormat/>
-    <w:rsid w:val="009252F1"/>
-  </w:style>
-  <w:style w:type="character" w:customStyle="1" w:styleId="InternetLink">
-    <w:name w:val="Internet Link"/>
-    <w:basedOn w:val="DefaultParagraphFont"/>
-    <w:uiPriority w:val="99"/>
-    <w:semiHidden/>
-    <w:unhideWhenUsed/>
-    <w:rsid w:val="000A3605"/>
-    <w:rPr>
-      <w:color w:val="0000FF"/>
-      <w:u w:val="single"/>
-    </w:rPr>
-  </w:style>
-  <w:style w:type="character" w:customStyle="1" w:styleId="ListLabel1">
-    <w:name w:val="ListLabel 1"/>
-    <w:qFormat/>
-    <w:rPr>
-      <w:rFonts w:eastAsia="Arial" w:cs="Arial"/>
-      <w:b/>
-      <w:bCs/>
-      <w:w w:val="102"/>
-      <w:sz w:val="21"/>
-      <w:szCs w:val="21"/>
-    </w:rPr>
-  </w:style>
-  <w:style w:type="character" w:customStyle="1" w:styleId="ListLabel2">
-    <w:name w:val="ListLabel 2"/>
-    <w:qFormat/>
-    <w:rPr>
-      <w:rFonts w:eastAsia="Arial" w:cs="Arial"/>
-      <w:b/>
-      <w:bCs/>
-      <w:w w:val="102"/>
-      <w:sz w:val="21"/>
-      <w:szCs w:val="21"/>
-    </w:rPr>
-  </w:style>
-  <w:style w:type="character" w:customStyle="1" w:styleId="ListLabel3">
-    <w:name w:val="ListLabel 3"/>
-    <w:qFormat/>
-    <w:rPr>
-      <w:rFonts w:eastAsia="Arial" w:cs="Arial"/>
-      <w:b/>
-      <w:bCs/>
-      <w:w w:val="102"/>
-      <w:sz w:val="21"/>
-      <w:szCs w:val="21"/>
-    </w:rPr>
-  </w:style>
-  <w:style w:type="character" w:customStyle="1" w:styleId="ListLabel4">
-    <w:name w:val="ListLabel 4"/>
-    <w:qFormat/>
-    <w:rPr>
-      <w:rFonts w:eastAsia="Arial" w:cs="Arial"/>
-      <w:b/>
-      <w:bCs/>
-      <w:w w:val="102"/>
-      <w:sz w:val="21"/>
-      <w:szCs w:val="21"/>
-    </w:rPr>
-  </w:style>
-  <w:style w:type="character" w:customStyle="1" w:styleId="ListLabel5">
-    <w:name w:val="ListLabel 5"/>
-    <w:qFormat/>
-    <w:rPr>
-      <w:rFonts w:eastAsia="Arial" w:cs="Arial"/>
-      <w:w w:val="99"/>
-      <w:sz w:val="24"/>
-      <w:szCs w:val="24"/>
-    </w:rPr>
-  </w:style>
-  <w:style w:type="character" w:customStyle="1" w:styleId="ListLabel6">
-    <w:name w:val="ListLabel 6"/>
-    <w:qFormat/>
-    <w:rPr>
-      <w:rFonts w:eastAsia="Arial" w:cs="Arial"/>
-      <w:b/>
-      <w:bCs/>
-      <w:w w:val="102"/>
-      <w:sz w:val="21"/>
-      <w:szCs w:val="21"/>
-    </w:rPr>
-  </w:style>
-  <w:style w:type="character" w:customStyle="1" w:styleId="ListLabel7">
-    <w:name w:val="ListLabel 7"/>
-    <w:qFormat/>
-    <w:rPr>
-      <w:rFonts w:eastAsia="Arial" w:cs="Arial"/>
-      <w:b/>
-      <w:bCs/>
-      <w:w w:val="102"/>
-      <w:sz w:val="21"/>
-      <w:szCs w:val="21"/>
-    </w:rPr>
-  </w:style>
-  <w:style w:type="character" w:customStyle="1" w:styleId="ListLabel8">
-    <w:name w:val="ListLabel 8"/>
-    <w:qFormat/>
-    <w:rPr>
-      <w:rFonts w:eastAsia="Arial" w:cs="Arial"/>
-      <w:b/>
-      <w:bCs/>
-      <w:w w:val="102"/>
-      <w:sz w:val="21"/>
-      <w:szCs w:val="21"/>
-    </w:rPr>
-  </w:style>
-  <w:style w:type="character" w:customStyle="1" w:styleId="ListLabel9">
-    <w:name w:val="ListLabel 9"/>
-    <w:qFormat/>
-    <w:rPr>
-      <w:rFonts w:eastAsia="Arial" w:cs="Arial"/>
-      <w:w w:val="99"/>
-      <w:sz w:val="24"/>
-      <w:szCs w:val="24"/>
-    </w:rPr>
-  </w:style>
-  <w:style w:type="character" w:customStyle="1" w:styleId="ListLabel10">
-    <w:name w:val="ListLabel 10"/>
-    <w:qFormat/>
-    <w:rPr>
-      <w:rFonts w:eastAsia="Arial" w:cs="Arial"/>
-      <w:b/>
-      <w:bCs/>
-      <w:w w:val="102"/>
-      <w:sz w:val="21"/>
-      <w:szCs w:val="21"/>
-    </w:rPr>
-  </w:style>
-  <w:style w:type="character" w:customStyle="1" w:styleId="ListLabel11">
-    <w:name w:val="ListLabel 11"/>
-    <w:qFormat/>
-    <w:rPr>
-      <w:rFonts w:eastAsia="Arial" w:cs="Arial"/>
-      <w:b/>
-      <w:bCs/>
-      <w:w w:val="102"/>
-      <w:sz w:val="21"/>
-      <w:szCs w:val="21"/>
-    </w:rPr>
-  </w:style>
-  <w:style w:type="character" w:customStyle="1" w:styleId="ListLabel12">
-    <w:name w:val="ListLabel 12"/>
-    <w:qFormat/>
-    <w:rPr>
-      <w:rFonts w:eastAsia="Arial" w:cs="Arial"/>
-      <w:b/>
-      <w:bCs/>
-      <w:w w:val="102"/>
-      <w:sz w:val="24"/>
-      <w:szCs w:val="24"/>
-    </w:rPr>
-  </w:style>
-  <w:style w:type="character" w:customStyle="1" w:styleId="ListLabel13">
-    <w:name w:val="ListLabel 13"/>
-    <w:qFormat/>
-    <w:rPr>
-      <w:rFonts w:eastAsia="Arial" w:cs="Arial"/>
-      <w:b/>
-      <w:bCs/>
-      <w:w w:val="102"/>
-      <w:sz w:val="24"/>
-      <w:szCs w:val="24"/>
-    </w:rPr>
-  </w:style>
-  <w:style w:type="character" w:customStyle="1" w:styleId="ListLabel14">
-    <w:name w:val="ListLabel 14"/>
-    <w:qFormat/>
-    <w:rPr>
-      <w:rFonts w:eastAsia="Arial" w:cs="Arial"/>
-      <w:b/>
-      <w:bCs/>
-      <w:w w:val="102"/>
-      <w:sz w:val="24"/>
-      <w:szCs w:val="21"/>
-    </w:rPr>
-  </w:style>
-  <w:style w:type="character" w:customStyle="1" w:styleId="ListLabel15">
-    <w:name w:val="ListLabel 15"/>
-    <w:qFormat/>
-    <w:rPr>
-      <w:rFonts w:eastAsia="Arial" w:cs="Arial"/>
-      <w:w w:val="99"/>
-      <w:sz w:val="24"/>
-      <w:szCs w:val="24"/>
-    </w:rPr>
-  </w:style>
-  <w:style w:type="character" w:customStyle="1" w:styleId="ListLabel16">
-    <w:name w:val="ListLabel 16"/>
-    <w:qFormat/>
-    <w:rPr>
-      <w:rFonts w:eastAsia="Arial" w:cs="Arial"/>
-      <w:b/>
-      <w:bCs/>
-      <w:w w:val="102"/>
-      <w:sz w:val="21"/>
-      <w:szCs w:val="21"/>
-    </w:rPr>
-  </w:style>
-  <w:style w:type="character" w:customStyle="1" w:styleId="ListLabel17">
-    <w:name w:val="ListLabel 17"/>
-    <w:qFormat/>
-    <w:rPr>
-      <w:rFonts w:eastAsia="Arial" w:cs="Arial"/>
-      <w:b/>
-      <w:bCs/>
-      <w:w w:val="102"/>
-      <w:sz w:val="21"/>
-      <w:szCs w:val="21"/>
-    </w:rPr>
-  </w:style>
-  <w:style w:type="character" w:customStyle="1" w:styleId="ListLabel18">
-    <w:name w:val="ListLabel 18"/>
-    <w:qFormat/>
-    <w:rPr>
-      <w:rFonts w:eastAsia="Arial" w:cs="Arial"/>
-      <w:b/>
-      <w:bCs/>
-      <w:w w:val="102"/>
-      <w:sz w:val="21"/>
-      <w:szCs w:val="21"/>
-    </w:rPr>
-  </w:style>
-  <w:style w:type="character" w:customStyle="1" w:styleId="ListLabel19">
-    <w:name w:val="ListLabel 19"/>
-    <w:qFormat/>
-    <w:rPr>
-      <w:rFonts w:eastAsia="Arial" w:cs="Arial"/>
-      <w:w w:val="99"/>
-      <w:sz w:val="24"/>
-      <w:szCs w:val="24"/>
-    </w:rPr>
-  </w:style>
-  <w:style w:type="character" w:customStyle="1" w:styleId="ListLabel20">
-    <w:name w:val="ListLabel 20"/>
-    <w:qFormat/>
-    <w:rPr>
-      <w:rFonts w:eastAsia="Arial" w:cs="Arial"/>
-      <w:b/>
-      <w:bCs/>
-      <w:w w:val="102"/>
-      <w:sz w:val="21"/>
-      <w:szCs w:val="21"/>
-    </w:rPr>
-  </w:style>
-  <w:style w:type="character" w:customStyle="1" w:styleId="ListLabel21">
-    <w:name w:val="ListLabel 21"/>
-    <w:qFormat/>
-    <w:rPr>
-      <w:rFonts w:eastAsia="Arial" w:cs="Arial"/>
-      <w:b/>
-      <w:bCs/>
-      <w:w w:val="102"/>
-      <w:sz w:val="21"/>
-      <w:szCs w:val="21"/>
-    </w:rPr>
-  </w:style>
-  <w:style w:type="character" w:customStyle="1" w:styleId="ListLabel22">
-    <w:name w:val="ListLabel 22"/>
-    <w:qFormat/>
-    <w:rPr>
-      <w:rFonts w:cs="Courier New"/>
-    </w:rPr>
-  </w:style>
-  <w:style w:type="character" w:customStyle="1" w:styleId="ListLabel23">
-    <w:name w:val="ListLabel 23"/>
-    <w:qFormat/>
-    <w:rPr>
-      <w:rFonts w:cs="Courier New"/>
-    </w:rPr>
-  </w:style>
-  <w:style w:type="character" w:customStyle="1" w:styleId="ListLabel24">
-    <w:name w:val="ListLabel 24"/>
-    <w:qFormat/>
-    <w:rPr>
-      <w:rFonts w:cs="Courier New"/>
-    </w:rPr>
-  </w:style>
-  <w:style w:type="character" w:customStyle="1" w:styleId="ListLabel25">
-    <w:name w:val="ListLabel 25"/>
-    <w:qFormat/>
-    <w:rPr>
-      <w:rFonts w:cs="Courier New"/>
-    </w:rPr>
-  </w:style>
-  <w:style w:type="character" w:customStyle="1" w:styleId="ListLabel26">
-    <w:name w:val="ListLabel 26"/>
-    <w:qFormat/>
-    <w:rPr>
-      <w:rFonts w:cs="Courier New"/>
-    </w:rPr>
-  </w:style>
-  <w:style w:type="character" w:customStyle="1" w:styleId="ListLabel27">
-    <w:name w:val="ListLabel 27"/>
-    <w:qFormat/>
-    <w:rPr>
-      <w:rFonts w:cs="Courier New"/>
-    </w:rPr>
-  </w:style>
-  <w:style w:type="paragraph" w:customStyle="1" w:styleId="Heading">
-    <w:name w:val="Heading"/>
-    <w:basedOn w:val="Normal"/>
-    <w:next w:val="BodyText"/>
-    <w:qFormat/>
-    <w:pPr>
-      <w:keepNext/>
-      <w:spacing w:before="240" w:after="120"/>
-    </w:pPr>
-    <w:rPr>
-      <w:rFonts w:ascii="Liberation Sans" w:eastAsia="AR PL SungtiL GB" w:hAnsi="Liberation Sans" w:cs="Lohit Devanagari"/>
-      <w:sz w:val="28"/>
-      <w:szCs w:val="28"/>
-    </w:rPr>
-  </w:style>
-  <w:style w:type="paragraph" w:styleId="BodyText">
-    <w:name w:val="Body Text"/>
-    <w:basedOn w:val="Normal"/>
-    <w:uiPriority w:val="1"/>
-    <w:qFormat/>
-    <w:pPr>
-      <w:spacing w:before="47"/>
-      <w:ind w:left="117" w:right="1415"/>
-      <w:jc w:val="both"/>
-    </w:pPr>
-    <w:rPr>
-      <w:sz w:val="21"/>
-      <w:szCs w:val="21"/>
-    </w:rPr>
-  </w:style>
-  <w:style w:type="paragraph" w:styleId="List">
-    <w:name w:val="List"/>
-    <w:basedOn w:val="BodyText"/>
-    <w:rPr>
-      <w:rFonts w:cs="Lohit Devanagari"/>
-    </w:rPr>
-  </w:style>
-  <w:style w:type="paragraph" w:styleId="Caption">
-    <w:name w:val="caption"/>
-    <w:basedOn w:val="Normal"/>
-    <w:qFormat/>
-    <w:pPr>
-      <w:suppressLineNumbers/>
-      <w:spacing w:before="120" w:after="120"/>
-    </w:pPr>
-    <w:rPr>
-      <w:rFonts w:cs="Lohit Devanagari"/>
-      <w:i/>
-      <w:iCs/>
-      <w:sz w:val="24"/>
-      <w:szCs w:val="24"/>
-    </w:rPr>
-  </w:style>
-  <w:style w:type="paragraph" w:customStyle="1" w:styleId="Index">
-    <w:name w:val="Index"/>
-    <w:basedOn w:val="Normal"/>
-    <w:qFormat/>
-    <w:pPr>
-      <w:suppressLineNumbers/>
-    </w:pPr>
-    <w:rPr>
-      <w:rFonts w:cs="Lohit Devanagari"/>
-    </w:rPr>
-  </w:style>
-  <w:style w:type="paragraph" w:styleId="ListParagraph">
-    <w:name w:val="List Paragraph"/>
-    <w:basedOn w:val="Normal"/>
-    <w:uiPriority w:val="1"/>
-    <w:qFormat/>
-    <w:pPr>
-      <w:ind w:left="751" w:hanging="635"/>
-      <w:jc w:val="both"/>
-    </w:pPr>
-  </w:style>
-  <w:style w:type="paragraph" w:customStyle="1" w:styleId="TableParagraph">
-    <w:name w:val="Table Paragraph"/>
-    <w:basedOn w:val="Normal"/>
-    <w:uiPriority w:val="1"/>
-    <w:qFormat/>
-  </w:style>
-  <w:style w:type="paragraph" w:styleId="Header">
-    <w:name w:val="header"/>
-    <w:basedOn w:val="Normal"/>
-    <w:link w:val="HeaderChar"/>
-    <w:uiPriority w:val="99"/>
-    <w:unhideWhenUsed/>
-    <w:rsid w:val="006834D6"/>
-    <w:pPr>
-      <w:tabs>
-        <w:tab w:val="center" w:pos="4680"/>
-        <w:tab w:val="right" w:pos="9360"/>
-      </w:tabs>
-    </w:pPr>
-  </w:style>
-  <w:style w:type="paragraph" w:styleId="Footer">
-    <w:name w:val="footer"/>
-    <w:basedOn w:val="Normal"/>
-    <w:link w:val="FooterChar"/>
-    <w:uiPriority w:val="99"/>
-    <w:unhideWhenUsed/>
-    <w:rsid w:val="006834D6"/>
-    <w:pPr>
-      <w:tabs>
-        <w:tab w:val="center" w:pos="4680"/>
-        <w:tab w:val="right" w:pos="9360"/>
-      </w:tabs>
-    </w:pPr>
-  </w:style>
-  <w:style w:type="paragraph" w:styleId="NormalWeb">
-    <w:name w:val="Normal (Web)"/>
-    <w:basedOn w:val="Normal"/>
-    <w:uiPriority w:val="99"/>
-    <w:semiHidden/>
-    <w:unhideWhenUsed/>
-    <w:qFormat/>
-    <w:rsid w:val="00040495"/>
-    <w:pPr>
-      <w:spacing w:beforeAutospacing="1" w:afterAutospacing="1"/>
-    </w:pPr>
-    <w:rPr>
-      <w:rFonts w:ascii="Times New Roman" w:eastAsia="Times New Roman" w:hAnsi="Times New Roman" w:cs="Times New Roman"/>
-      <w:sz w:val="24"/>
-      <w:szCs w:val="24"/>
-    </w:rPr>
-  </w:style>
   <w:style w:type="table" w:styleId="TableGrid">
     <w:name w:val="Table Grid"/>
     <w:basedOn w:val="TableNormal"/>
     <w:uiPriority w:val="39"/>
-    <w:rsid w:val="00D063E2"/>
+    <w:rsid w:val="00d063e2"/>
     <w:tblPr>
       <w:tblBorders>
-        <w:top w:val="single" w:sz="4" w:space="0" w:color="auto"/>
-        <w:left w:val="single" w:sz="4" w:space="0" w:color="auto"/>
-        <w:bottom w:val="single" w:sz="4" w:space="0" w:color="auto"/>
-        <w:right w:val="single" w:sz="4" w:space="0" w:color="auto"/>
-        <w:insideH w:val="single" w:sz="4" w:space="0" w:color="auto"/>
-        <w:insideV w:val="single" w:sz="4" w:space="0" w:color="auto"/>
+        <w:top w:val="single" w:color="auto" w:sz="4" w:space="0"/>
+        <w:left w:val="single" w:color="auto" w:sz="4" w:space="0"/>
+        <w:bottom w:val="single" w:color="auto" w:sz="4" w:space="0"/>
+        <w:right w:val="single" w:color="auto" w:sz="4" w:space="0"/>
+        <w:insideH w:val="single" w:color="auto" w:sz="4" w:space="0"/>
+        <w:insideV w:val="single" w:color="auto" w:sz="4" w:space="0"/>
       </w:tblBorders>
     </w:tblPr>
   </w:style>
@@ -3011,35 +3028,35 @@
     <w:name w:val="Plain Table 5"/>
     <w:basedOn w:val="TableNormal"/>
     <w:uiPriority w:val="45"/>
-    <w:rsid w:val="00D063E2"/>
+    <w:rsid w:val="00d063e2"/>
     <w:tblPr>
       <w:tblStyleRowBandSize w:val="1"/>
       <w:tblStyleColBandSize w:val="1"/>
     </w:tblPr>
     <w:tblStylePr w:type="firstRow">
       <w:rPr>
-        <w:rFonts w:asciiTheme="majorHAnsi" w:eastAsiaTheme="majorEastAsia" w:hAnsiTheme="majorHAnsi" w:cstheme="majorBidi"/>
+        <w:rFonts w:asciiTheme="majorHAnsi" w:hAnsiTheme="majorHAnsi" w:eastAsiaTheme="majorEastAsia" w:cstheme="majorBidi"/>
         <w:i/>
         <w:sz w:val="26"/>
       </w:rPr>
       <w:tblPr/>
       <w:tcPr>
         <w:tcBorders>
-          <w:bottom w:val="single" w:sz="4" w:space="0" w:color="000000" w:themeColor="text1"/>
+          <w:bottom w:val="single" w:color="000000" w:themeColor="text1" w:sz="4" w:space="0"/>
         </w:tcBorders>
         <w:shd w:val="clear" w:color="auto" w:fill="FFFFFF" w:themeFill="background1"/>
       </w:tcPr>
     </w:tblStylePr>
     <w:tblStylePr w:type="lastRow">
       <w:rPr>
-        <w:rFonts w:asciiTheme="majorHAnsi" w:eastAsiaTheme="majorEastAsia" w:hAnsiTheme="majorHAnsi" w:cstheme="majorBidi"/>
+        <w:rFonts w:asciiTheme="majorHAnsi" w:hAnsiTheme="majorHAnsi" w:eastAsiaTheme="majorEastAsia" w:cstheme="majorBidi"/>
         <w:i/>
         <w:sz w:val="26"/>
       </w:rPr>
       <w:tblPr/>
       <w:tcPr>
         <w:tcBorders>
-          <w:top w:val="single" w:sz="4" w:space="0" w:color="000000" w:themeColor="text1"/>
+          <w:top w:val="single" w:color="000000" w:themeColor="text1" w:sz="4" w:space="0"/>
         </w:tcBorders>
         <w:shd w:val="clear" w:color="auto" w:fill="FFFFFF" w:themeFill="background1"/>
       </w:tcPr>
@@ -3049,28 +3066,28 @@
         <w:jc w:val="right"/>
       </w:pPr>
       <w:rPr>
-        <w:rFonts w:asciiTheme="majorHAnsi" w:eastAsiaTheme="majorEastAsia" w:hAnsiTheme="majorHAnsi" w:cstheme="majorBidi"/>
+        <w:rFonts w:asciiTheme="majorHAnsi" w:hAnsiTheme="majorHAnsi" w:eastAsiaTheme="majorEastAsia" w:cstheme="majorBidi"/>
         <w:i/>
         <w:sz w:val="26"/>
       </w:rPr>
       <w:tblPr/>
       <w:tcPr>
         <w:tcBorders>
-          <w:right w:val="single" w:sz="4" w:space="0" w:color="000000" w:themeColor="text1"/>
+          <w:right w:val="single" w:color="000000" w:themeColor="text1" w:sz="4" w:space="0"/>
         </w:tcBorders>
         <w:shd w:val="clear" w:color="auto" w:fill="FFFFFF" w:themeFill="background1"/>
       </w:tcPr>
     </w:tblStylePr>
     <w:tblStylePr w:type="lastCol">
       <w:rPr>
-        <w:rFonts w:asciiTheme="majorHAnsi" w:eastAsiaTheme="majorEastAsia" w:hAnsiTheme="majorHAnsi" w:cstheme="majorBidi"/>
+        <w:rFonts w:asciiTheme="majorHAnsi" w:hAnsiTheme="majorHAnsi" w:eastAsiaTheme="majorEastAsia" w:cstheme="majorBidi"/>
         <w:i/>
         <w:sz w:val="26"/>
       </w:rPr>
       <w:tblPr/>
       <w:tcPr>
         <w:tcBorders>
-          <w:left w:val="single" w:sz="4" w:space="0" w:color="000000" w:themeColor="text1"/>
+          <w:left w:val="single" w:color="000000" w:themeColor="text1" w:sz="4" w:space="0"/>
         </w:tcBorders>
         <w:shd w:val="clear" w:color="auto" w:fill="FFFFFF" w:themeFill="background1"/>
       </w:tcPr>
@@ -3078,13 +3095,13 @@
     <w:tblStylePr w:type="band1Vert">
       <w:tblPr/>
       <w:tcPr>
-        <w:shd w:val="clear" w:color="auto" w:fill="F2F2F2" w:themeFill="background1" w:themeFillShade="F2"/>
+        <w:shd w:val="clear" w:color="auto" w:fill="F2F2F2" w:themeFill="background1" w:themeFillShade="f2"/>
       </w:tcPr>
     </w:tblStylePr>
     <w:tblStylePr w:type="band1Horz">
       <w:tblPr/>
       <w:tcPr>
-        <w:shd w:val="clear" w:color="auto" w:fill="F2F2F2" w:themeFill="background1" w:themeFillShade="F2"/>
+        <w:shd w:val="clear" w:color="auto" w:fill="F2F2F2" w:themeFill="background1" w:themeFillShade="f2"/>
       </w:tcPr>
     </w:tblStylePr>
     <w:tblStylePr w:type="neCell">

</xml_diff>

<commit_message>
ADAP 2023: Begin preparing SOW & budget de-conflicted with FINESST
</commit_message>
<xml_diff>
--- a/budget/budget_justification.docx
+++ b/budget/budget_justification.docx
@@ -1,11 +1,12 @@
 
 <file path=word/document.xml><?xml version="1.0" encoding="utf-8"?>
-<w:document xmlns:o="urn:schemas-microsoft-com:office:office" xmlns:r="http://schemas.openxmlformats.org/officeDocument/2006/relationships" xmlns:v="urn:schemas-microsoft-com:vml" xmlns:w="http://schemas.openxmlformats.org/wordprocessingml/2006/main" xmlns:w10="urn:schemas-microsoft-com:office:word" xmlns:wp="http://schemas.openxmlformats.org/drawingml/2006/wordprocessingDrawing" xmlns:wps="http://schemas.microsoft.com/office/word/2010/wordprocessingShape" xmlns:wpg="http://schemas.microsoft.com/office/word/2010/wordprocessingGroup" xmlns:mc="http://schemas.openxmlformats.org/markup-compatibility/2006" xmlns:wp14="http://schemas.microsoft.com/office/word/2010/wordprocessingDrawing" xmlns:w14="http://schemas.microsoft.com/office/word/2010/wordml" mc:Ignorable="w14 wp14">
+<w:document xmlns:o="urn:schemas-microsoft-com:office:office" xmlns:r="http://schemas.openxmlformats.org/officeDocument/2006/relationships" xmlns:v="urn:schemas-microsoft-com:vml" xmlns:w="http://schemas.openxmlformats.org/wordprocessingml/2006/main" xmlns:w10="urn:schemas-microsoft-com:office:word" xmlns:wp="http://schemas.openxmlformats.org/drawingml/2006/wordprocessingDrawing" xmlns:wps="http://schemas.microsoft.com/office/word/2010/wordprocessingShape" xmlns:wpg="http://schemas.microsoft.com/office/word/2010/wordprocessingGroup" xmlns:mc="http://schemas.openxmlformats.org/markup-compatibility/2006" xmlns:wp14="http://schemas.microsoft.com/office/word/2010/wordprocessingDrawing" xmlns:w14="http://schemas.microsoft.com/office/word/2010/wordml" xmlns:w15="http://schemas.microsoft.com/office/word/2012/wordml" mc:Ignorable="w14 wp14 w15">
   <w:body>
     <w:p>
       <w:pPr>
         <w:pStyle w:val="Heading1"/>
         <w:tabs>
+          <w:tab w:val="clear" w:pos="720"/>
           <w:tab w:val="left" w:pos="572" w:leader="none"/>
         </w:tabs>
         <w:spacing w:before="97" w:after="0"/>
@@ -16,9 +17,9 @@
           <w:szCs w:val="28"/>
         </w:rPr>
       </w:pPr>
-      <w:bookmarkStart w:id="0" w:name="Goals_and_Significance"/>
-      <w:bookmarkStart w:id="1" w:name="Post%25E2%2580%2593Processing"/>
-      <w:bookmarkStart w:id="2" w:name="Budget_Justification"/>
+      <w:bookmarkStart w:id="0" w:name="Budget_Justification"/>
+      <w:bookmarkStart w:id="1" w:name="Post%2525E2%252580%252593Processing"/>
+      <w:bookmarkStart w:id="2" w:name="Goals_and_Significance"/>
       <w:bookmarkEnd w:id="0"/>
       <w:bookmarkEnd w:id="1"/>
       <w:bookmarkEnd w:id="2"/>
@@ -49,6 +50,7 @@
       <w:pPr>
         <w:pStyle w:val="Heading1"/>
         <w:tabs>
+          <w:tab w:val="clear" w:pos="720"/>
           <w:tab w:val="left" w:pos="572" w:leader="none"/>
         </w:tabs>
         <w:spacing w:before="97" w:after="0"/>
@@ -84,21 +86,7 @@
           <w:sz w:val="24"/>
           <w:szCs w:val="24"/>
         </w:rPr>
-        <w:t xml:space="preserve">The budget includes salary, benefits, travel, publication charges, and indirect costs for the host institution of the PI as well as support for one graduate </w:t>
-      </w:r>
-      <w:r>
-        <w:rPr>
-          <w:sz w:val="24"/>
-          <w:szCs w:val="24"/>
-        </w:rPr>
-        <w:t>student</w:t>
-      </w:r>
-      <w:r>
-        <w:rPr>
-          <w:sz w:val="24"/>
-          <w:szCs w:val="24"/>
-        </w:rPr>
-        <w:t>.</w:t>
+        <w:t>The budget includes salary, benefits, travel, publication charges, and indirect costs for the host institution of the PI as well as support for one graduate student.</w:t>
       </w:r>
       <w:r>
         <w:rPr>
@@ -134,6 +122,7 @@
           <w:numId w:val="2"/>
         </w:numPr>
         <w:tabs>
+          <w:tab w:val="clear" w:pos="720"/>
           <w:tab w:val="left" w:pos="752" w:leader="none"/>
         </w:tabs>
         <w:spacing w:lineRule="exact" w:line="238" w:before="160" w:after="0"/>
@@ -192,6 +181,7 @@
           <w:numId w:val="2"/>
         </w:numPr>
         <w:tabs>
+          <w:tab w:val="clear" w:pos="720"/>
           <w:tab w:val="left" w:pos="931" w:leader="none"/>
         </w:tabs>
         <w:spacing w:before="160" w:after="0"/>
@@ -219,6 +209,7 @@
           <w:numId w:val="2"/>
         </w:numPr>
         <w:tabs>
+          <w:tab w:val="clear" w:pos="720"/>
           <w:tab w:val="left" w:pos="931" w:leader="none"/>
         </w:tabs>
         <w:spacing w:lineRule="auto" w:line="360" w:before="160" w:after="0"/>
@@ -266,11 +257,11 @@
         </w:rPr>
         <w:t>Penev</w:t>
       </w:r>
-      <w:bookmarkStart w:id="5" w:name="Data_Management_Plan"/>
-      <w:bookmarkStart w:id="6" w:name="Supplies"/>
+      <w:bookmarkStart w:id="5" w:name="Publication_Costs"/>
+      <w:bookmarkStart w:id="6" w:name="Photometry"/>
       <w:bookmarkStart w:id="7" w:name="Pipeline_Architecture"/>
-      <w:bookmarkStart w:id="8" w:name="Photometry"/>
-      <w:bookmarkStart w:id="9" w:name="Publication_Costs"/>
+      <w:bookmarkStart w:id="8" w:name="Supplies"/>
+      <w:bookmarkStart w:id="9" w:name="Data_Management_Plan"/>
       <w:bookmarkEnd w:id="5"/>
       <w:bookmarkEnd w:id="6"/>
       <w:bookmarkEnd w:id="7"/>
@@ -293,37 +284,7 @@
           <w:sz w:val="24"/>
           <w:szCs w:val="24"/>
         </w:rPr>
-        <w:t xml:space="preserve">The budget provides a total of 2 months of summer salary support </w:t>
-      </w:r>
-      <w:r>
-        <w:rPr>
-          <w:spacing w:val="-3"/>
-          <w:sz w:val="24"/>
-          <w:szCs w:val="24"/>
-        </w:rPr>
-        <w:t xml:space="preserve">for the </w:t>
-      </w:r>
-      <w:r>
-        <w:rPr>
-          <w:sz w:val="24"/>
-          <w:szCs w:val="24"/>
-        </w:rPr>
-        <w:t xml:space="preserve">PI </w:t>
-      </w:r>
-      <w:r>
-        <w:rPr>
-          <w:spacing w:val="-3"/>
-          <w:sz w:val="24"/>
-          <w:szCs w:val="24"/>
-        </w:rPr>
-        <w:t xml:space="preserve">over </w:t>
-      </w:r>
-      <w:r>
-        <w:rPr>
-          <w:sz w:val="24"/>
-          <w:szCs w:val="24"/>
-        </w:rPr>
-        <w:t>the term of the proposal</w:t>
+        <w:t xml:space="preserve">The budget provides a total of </w:t>
       </w:r>
       <w:r>
         <w:rPr>
@@ -331,7 +292,15 @@
           <w:sz w:val="24"/>
           <w:szCs w:val="24"/>
         </w:rPr>
-        <w:t>, 1 month for each of the two summers.</w:t>
+        <w:t xml:space="preserve">1 month for the summer </w:t>
+      </w:r>
+      <w:r>
+        <w:rPr>
+          <w:color w:val="000000" w:themeColor="text1"/>
+          <w:sz w:val="24"/>
+          <w:szCs w:val="24"/>
+        </w:rPr>
+        <w:t>of year 2 of the project.</w:t>
       </w:r>
     </w:p>
     <w:p>
@@ -472,7 +441,7 @@
           <w:sz w:val="24"/>
           <w:szCs w:val="24"/>
         </w:rPr>
-        <w:t>his institution and an additional summer month of salary is provided for faculty who teach during the summer term</w:t>
+        <w:t>his institution</w:t>
       </w:r>
       <w:r>
         <w:rPr>
@@ -481,232 +450,6 @@
           <w:szCs w:val="24"/>
         </w:rPr>
         <w:t>.</w:t>
-      </w:r>
-    </w:p>
-    <w:p>
-      <w:pPr>
-        <w:pStyle w:val="TextBody"/>
-        <w:spacing w:lineRule="auto" w:line="288" w:before="47" w:after="240"/>
-        <w:ind w:left="180" w:right="1580" w:firstLine="360"/>
-        <w:rPr>
-          <w:spacing w:val="-3"/>
-          <w:sz w:val="24"/>
-          <w:szCs w:val="24"/>
-        </w:rPr>
-      </w:pPr>
-      <w:r>
-        <w:rPr>
-          <w:spacing w:val="-3"/>
-          <w:sz w:val="24"/>
-          <w:szCs w:val="24"/>
-        </w:rPr>
-        <w:t>As the PI of the project, Dr. Penev will:</w:t>
-      </w:r>
-    </w:p>
-    <w:p>
-      <w:pPr>
-        <w:pStyle w:val="TextBody"/>
-        <w:numPr>
-          <w:ilvl w:val="0"/>
-          <w:numId w:val="3"/>
-        </w:numPr>
-        <w:spacing w:lineRule="auto" w:line="276" w:before="47" w:after="240"/>
-        <w:ind w:left="900" w:right="1580" w:hanging="360"/>
-        <w:rPr>
-          <w:spacing w:val="-3"/>
-          <w:sz w:val="24"/>
-          <w:szCs w:val="24"/>
-        </w:rPr>
-      </w:pPr>
-      <w:r>
-        <w:rPr>
-          <w:spacing w:val="-3"/>
-          <w:sz w:val="24"/>
-          <w:szCs w:val="24"/>
-        </w:rPr>
-        <w:t>Provide the general scientific direction of the project.</w:t>
-      </w:r>
-    </w:p>
-    <w:p>
-      <w:pPr>
-        <w:pStyle w:val="TextBody"/>
-        <w:numPr>
-          <w:ilvl w:val="0"/>
-          <w:numId w:val="3"/>
-        </w:numPr>
-        <w:spacing w:lineRule="auto" w:line="276" w:before="47" w:after="240"/>
-        <w:ind w:left="900" w:right="1580" w:hanging="360"/>
-        <w:rPr>
-          <w:spacing w:val="-3"/>
-          <w:sz w:val="24"/>
-          <w:szCs w:val="24"/>
-        </w:rPr>
-      </w:pPr>
-      <w:r>
-        <w:rPr>
-          <w:spacing w:val="-3"/>
-          <w:sz w:val="24"/>
-          <w:szCs w:val="24"/>
-        </w:rPr>
-        <w:t>Help with collecting and preparing the data required for all analyses listed in the project description.</w:t>
-      </w:r>
-    </w:p>
-    <w:p>
-      <w:pPr>
-        <w:pStyle w:val="TextBody"/>
-        <w:numPr>
-          <w:ilvl w:val="0"/>
-          <w:numId w:val="3"/>
-        </w:numPr>
-        <w:spacing w:lineRule="auto" w:line="276" w:before="47" w:after="240"/>
-        <w:ind w:left="900" w:right="1580" w:hanging="360"/>
-        <w:rPr>
-          <w:spacing w:val="-3"/>
-          <w:sz w:val="24"/>
-          <w:szCs w:val="24"/>
-        </w:rPr>
-      </w:pPr>
-      <w:r>
-        <w:rPr>
-          <w:spacing w:val="-3"/>
-          <w:sz w:val="24"/>
-          <w:szCs w:val="24"/>
-        </w:rPr>
-        <w:t>Oversee the software development effort: coordination, and integration of team member contributions.</w:t>
-      </w:r>
-    </w:p>
-    <w:p>
-      <w:pPr>
-        <w:pStyle w:val="TextBody"/>
-        <w:numPr>
-          <w:ilvl w:val="0"/>
-          <w:numId w:val="3"/>
-        </w:numPr>
-        <w:spacing w:lineRule="auto" w:line="276" w:before="47" w:after="240"/>
-        <w:ind w:left="900" w:right="1580" w:hanging="360"/>
-        <w:rPr>
-          <w:spacing w:val="-3"/>
-          <w:sz w:val="24"/>
-          <w:szCs w:val="24"/>
-        </w:rPr>
-      </w:pPr>
-      <w:r>
-        <w:rPr>
-          <w:spacing w:val="-3"/>
-          <w:sz w:val="24"/>
-          <w:szCs w:val="24"/>
-        </w:rPr>
-        <w:t>Be an active developer in the software effort.</w:t>
-      </w:r>
-    </w:p>
-    <w:p>
-      <w:pPr>
-        <w:pStyle w:val="TextBody"/>
-        <w:numPr>
-          <w:ilvl w:val="0"/>
-          <w:numId w:val="3"/>
-        </w:numPr>
-        <w:spacing w:lineRule="auto" w:line="276" w:before="47" w:after="240"/>
-        <w:ind w:left="900" w:right="1580" w:hanging="360"/>
-        <w:rPr>
-          <w:spacing w:val="-3"/>
-          <w:sz w:val="24"/>
-          <w:szCs w:val="24"/>
-        </w:rPr>
-      </w:pPr>
-      <w:r>
-        <w:rPr>
-          <w:spacing w:val="-3"/>
-          <w:sz w:val="24"/>
-          <w:szCs w:val="24"/>
-        </w:rPr>
-        <w:t>Participate in the manual vetting and review as described in the Science/Technical/Management section.</w:t>
-      </w:r>
-    </w:p>
-    <w:p>
-      <w:pPr>
-        <w:pStyle w:val="TextBody"/>
-        <w:numPr>
-          <w:ilvl w:val="0"/>
-          <w:numId w:val="3"/>
-        </w:numPr>
-        <w:spacing w:lineRule="auto" w:line="276" w:before="47" w:after="240"/>
-        <w:ind w:left="900" w:right="1580" w:hanging="360"/>
-        <w:rPr>
-          <w:spacing w:val="-3"/>
-          <w:sz w:val="24"/>
-          <w:szCs w:val="24"/>
-        </w:rPr>
-      </w:pPr>
-      <w:r>
-        <w:rPr>
-          <w:spacing w:val="-3"/>
-          <w:sz w:val="24"/>
-          <w:szCs w:val="24"/>
-        </w:rPr>
-        <w:t>Request and oversee computing and storage allocation at resources available through the PI’s institution.</w:t>
-      </w:r>
-    </w:p>
-    <w:p>
-      <w:pPr>
-        <w:pStyle w:val="TextBody"/>
-        <w:numPr>
-          <w:ilvl w:val="0"/>
-          <w:numId w:val="3"/>
-        </w:numPr>
-        <w:spacing w:lineRule="auto" w:line="276" w:before="47" w:after="240"/>
-        <w:ind w:left="900" w:right="1580" w:hanging="360"/>
-        <w:rPr>
-          <w:spacing w:val="-3"/>
-          <w:sz w:val="24"/>
-          <w:szCs w:val="24"/>
-        </w:rPr>
-      </w:pPr>
-      <w:r>
-        <w:rPr>
-          <w:spacing w:val="-3"/>
-          <w:sz w:val="24"/>
-          <w:szCs w:val="24"/>
-        </w:rPr>
-        <w:t>Lead two of the publications and help with the preparation of the others.</w:t>
-      </w:r>
-    </w:p>
-    <w:p>
-      <w:pPr>
-        <w:pStyle w:val="TextBody"/>
-        <w:spacing w:lineRule="auto" w:line="276" w:before="47" w:after="240"/>
-        <w:ind w:left="900" w:right="1580" w:hanging="0"/>
-        <w:rPr>
-          <w:spacing w:val="-3"/>
-          <w:sz w:val="24"/>
-          <w:szCs w:val="24"/>
-        </w:rPr>
-      </w:pPr>
-      <w:r>
-        <w:rPr>
-          <w:spacing w:val="-3"/>
-          <w:sz w:val="24"/>
-          <w:szCs w:val="24"/>
-        </w:rPr>
-      </w:r>
-    </w:p>
-    <w:p>
-      <w:pPr>
-        <w:pStyle w:val="TextBody"/>
-        <w:spacing w:lineRule="auto" w:line="276" w:before="47" w:after="240"/>
-        <w:ind w:left="900" w:right="1580" w:hanging="0"/>
-        <w:rPr>
-          <w:spacing w:val="-3"/>
-          <w:sz w:val="24"/>
-          <w:szCs w:val="24"/>
-        </w:rPr>
-      </w:pPr>
-      <w:r>
-        <w:rPr>
-          <w:spacing w:val="-3"/>
-          <w:sz w:val="24"/>
-          <w:szCs w:val="24"/>
-        </w:rPr>
       </w:r>
     </w:p>
     <w:p>
@@ -717,6 +460,7 @@
           <w:numId w:val="2"/>
         </w:numPr>
         <w:tabs>
+          <w:tab w:val="clear" w:pos="720"/>
           <w:tab w:val="left" w:pos="752" w:leader="none"/>
         </w:tabs>
         <w:spacing w:lineRule="exact" w:line="239" w:before="160" w:after="0"/>
@@ -746,7 +490,7 @@
           <w:sz w:val="24"/>
           <w:szCs w:val="24"/>
         </w:rPr>
-        <w:t>Student Joshua Schussler</w:t>
+        <w:t>Student</w:t>
       </w:r>
     </w:p>
     <w:p>
@@ -772,22 +516,35 @@
           <w:sz w:val="24"/>
           <w:szCs w:val="24"/>
         </w:rPr>
-        <w:t>student is a member of the PI</w:t>
-      </w:r>
-      <w:r>
-        <w:rPr>
-          <w:spacing w:val="-5"/>
-          <w:sz w:val="24"/>
-          <w:szCs w:val="24"/>
-        </w:rPr>
-        <w:t xml:space="preserve">’s research </w:t>
-      </w:r>
-      <w:r>
-        <w:rPr>
-          <w:sz w:val="24"/>
-          <w:szCs w:val="24"/>
-        </w:rPr>
-        <w:t>group and contributed significantly in the preparation of this proposal. Mr Schussler will be lead authors on at least two of the publications produced and a significant contributor on the other two.</w:t>
+        <w:t xml:space="preserve">student  will be lead authors on </w:t>
+      </w:r>
+      <w:r>
+        <w:rPr>
+          <w:sz w:val="24"/>
+          <w:szCs w:val="24"/>
+        </w:rPr>
+        <w:t>both</w:t>
+      </w:r>
+      <w:r>
+        <w:rPr>
+          <w:sz w:val="24"/>
+          <w:szCs w:val="24"/>
+        </w:rPr>
+        <w:t xml:space="preserve"> publications produced </w:t>
+      </w:r>
+      <w:r>
+        <w:rPr>
+          <w:sz w:val="24"/>
+          <w:szCs w:val="24"/>
+        </w:rPr>
+        <w:t>by the remaining part of the project</w:t>
+      </w:r>
+      <w:r>
+        <w:rPr>
+          <w:sz w:val="24"/>
+          <w:szCs w:val="24"/>
+        </w:rPr>
+        <w:t>.</w:t>
       </w:r>
       <w:bookmarkStart w:id="10" w:name="High_Precision_Photometry_Even_With_Larg"/>
       <w:bookmarkEnd w:id="10"/>
@@ -807,7 +564,35 @@
           <w:sz w:val="24"/>
           <w:szCs w:val="24"/>
         </w:rPr>
-        <w:t>The proposal includes a total of 24 months of graduate student support over the two proposal years, 12 months for each proposal year.</w:t>
+        <w:t xml:space="preserve">The proposal includes a total of </w:t>
+      </w:r>
+      <w:r>
+        <w:rPr>
+          <w:sz w:val="24"/>
+          <w:szCs w:val="24"/>
+        </w:rPr>
+        <w:t>12</w:t>
+      </w:r>
+      <w:r>
+        <w:rPr>
+          <w:sz w:val="24"/>
+          <w:szCs w:val="24"/>
+        </w:rPr>
+        <w:t xml:space="preserve"> months of graduate student support over the </w:t>
+      </w:r>
+      <w:r>
+        <w:rPr>
+          <w:sz w:val="24"/>
+          <w:szCs w:val="24"/>
+        </w:rPr>
+        <w:t>second year of the proposal</w:t>
+      </w:r>
+      <w:r>
+        <w:rPr>
+          <w:sz w:val="24"/>
+          <w:szCs w:val="24"/>
+        </w:rPr>
+        <w:t>.</w:t>
       </w:r>
     </w:p>
     <w:p>
@@ -818,6 +603,7 @@
           <w:numId w:val="2"/>
         </w:numPr>
         <w:tabs>
+          <w:tab w:val="clear" w:pos="720"/>
           <w:tab w:val="left" w:pos="752" w:leader="none"/>
         </w:tabs>
         <w:spacing w:lineRule="exact" w:line="240" w:before="160" w:after="0"/>
@@ -865,6 +651,7 @@
           <w:numId w:val="2"/>
         </w:numPr>
         <w:tabs>
+          <w:tab w:val="clear" w:pos="720"/>
           <w:tab w:val="left" w:pos="752" w:leader="none"/>
         </w:tabs>
         <w:spacing w:lineRule="exact" w:line="240" w:before="160" w:after="0"/>
@@ -978,6 +765,7 @@
           <w:numId w:val="1"/>
         </w:numPr>
         <w:tabs>
+          <w:tab w:val="clear" w:pos="720"/>
           <w:tab w:val="left" w:pos="752" w:leader="none"/>
         </w:tabs>
         <w:spacing w:before="160" w:after="0"/>
@@ -1016,279 +804,91 @@
         <w:spacing w:lineRule="auto" w:line="271" w:before="47" w:after="240"/>
         <w:ind w:left="180" w:right="1580" w:firstLine="360"/>
         <w:rPr>
-          <w:sz w:val="24"/>
-          <w:szCs w:val="24"/>
+          <w:sz w:val="22"/>
+          <w:szCs w:val="22"/>
         </w:rPr>
       </w:pPr>
       <w:r>
         <w:rPr>
           <w:spacing w:val="-4"/>
-          <w:sz w:val="24"/>
-          <w:szCs w:val="24"/>
+          <w:sz w:val="22"/>
+          <w:szCs w:val="22"/>
         </w:rPr>
         <w:t xml:space="preserve">We </w:t>
       </w:r>
       <w:r>
         <w:rPr>
-          <w:sz w:val="24"/>
-          <w:szCs w:val="24"/>
+          <w:sz w:val="22"/>
+          <w:szCs w:val="22"/>
         </w:rPr>
         <w:t xml:space="preserve">plan </w:t>
       </w:r>
       <w:r>
         <w:rPr>
           <w:spacing w:val="-3"/>
-          <w:sz w:val="24"/>
-          <w:szCs w:val="24"/>
+          <w:sz w:val="22"/>
+          <w:szCs w:val="22"/>
         </w:rPr>
         <w:t xml:space="preserve">for </w:t>
       </w:r>
       <w:r>
         <w:rPr>
-          <w:sz w:val="24"/>
-          <w:szCs w:val="24"/>
-        </w:rPr>
-        <w:t xml:space="preserve">five publications to be produced </w:t>
-      </w:r>
-      <w:r>
-        <w:rPr>
           <w:spacing w:val="-3"/>
-          <w:sz w:val="24"/>
-          <w:szCs w:val="24"/>
+          <w:sz w:val="22"/>
+          <w:szCs w:val="22"/>
+        </w:rPr>
+        <w:t>two</w:t>
+      </w:r>
+      <w:r>
+        <w:rPr>
+          <w:sz w:val="22"/>
+          <w:szCs w:val="22"/>
+        </w:rPr>
+        <w:t xml:space="preserve"> publications to be produced </w:t>
+      </w:r>
+      <w:r>
+        <w:rPr>
+          <w:spacing w:val="-3"/>
+          <w:sz w:val="22"/>
+          <w:szCs w:val="22"/>
         </w:rPr>
         <w:t xml:space="preserve">by </w:t>
       </w:r>
       <w:r>
         <w:rPr>
-          <w:sz w:val="24"/>
-          <w:szCs w:val="24"/>
+          <w:sz w:val="22"/>
+          <w:szCs w:val="22"/>
         </w:rPr>
         <w:t xml:space="preserve">this project. </w:t>
       </w:r>
       <w:r>
         <w:rPr>
           <w:spacing w:val="-4"/>
-          <w:sz w:val="24"/>
-          <w:szCs w:val="24"/>
+          <w:sz w:val="22"/>
+          <w:szCs w:val="22"/>
         </w:rPr>
         <w:t xml:space="preserve">We </w:t>
       </w:r>
       <w:r>
         <w:rPr>
-          <w:sz w:val="24"/>
-          <w:szCs w:val="24"/>
-        </w:rPr>
-        <w:t>will likely submit to the “American Astronomical Society Journals”. Assuming an</w:t>
-      </w:r>
-      <w:r>
-        <w:rPr>
-          <w:spacing w:val="5"/>
-          <w:sz w:val="24"/>
-          <w:szCs w:val="24"/>
-        </w:rPr>
-        <w:t xml:space="preserve"> </w:t>
-      </w:r>
-      <w:r>
-        <w:rPr>
-          <w:sz w:val="24"/>
-          <w:szCs w:val="24"/>
-        </w:rPr>
-        <w:t>average</w:t>
-      </w:r>
-      <w:r>
-        <w:rPr>
-          <w:spacing w:val="5"/>
-          <w:sz w:val="24"/>
-          <w:szCs w:val="24"/>
-        </w:rPr>
-        <w:t xml:space="preserve"> </w:t>
-      </w:r>
-      <w:r>
-        <w:rPr>
-          <w:sz w:val="24"/>
-          <w:szCs w:val="24"/>
-        </w:rPr>
-        <w:t>of</w:t>
-      </w:r>
-      <w:r>
-        <w:rPr>
-          <w:spacing w:val="6"/>
-          <w:sz w:val="24"/>
-          <w:szCs w:val="24"/>
-        </w:rPr>
-        <w:t xml:space="preserve"> </w:t>
-      </w:r>
-      <w:r>
-        <w:rPr>
-          <w:sz w:val="24"/>
-          <w:szCs w:val="24"/>
-        </w:rPr>
-        <w:t>$1,900</w:t>
-      </w:r>
-      <w:r>
-        <w:rPr>
-          <w:spacing w:val="5"/>
-          <w:sz w:val="24"/>
-          <w:szCs w:val="24"/>
-        </w:rPr>
-        <w:t xml:space="preserve"> </w:t>
-      </w:r>
-      <w:r>
-        <w:rPr>
-          <w:sz w:val="24"/>
-          <w:szCs w:val="24"/>
-        </w:rPr>
-        <w:t>per</w:t>
-      </w:r>
-      <w:r>
-        <w:rPr>
-          <w:spacing w:val="6"/>
-          <w:sz w:val="24"/>
-          <w:szCs w:val="24"/>
-        </w:rPr>
-        <w:t xml:space="preserve"> </w:t>
-      </w:r>
-      <w:r>
-        <w:rPr>
-          <w:sz w:val="24"/>
-          <w:szCs w:val="24"/>
-        </w:rPr>
-        <w:t>article ($7,600 total for the project),</w:t>
-      </w:r>
-      <w:r>
-        <w:rPr>
-          <w:spacing w:val="5"/>
-          <w:sz w:val="24"/>
-          <w:szCs w:val="24"/>
-        </w:rPr>
-        <w:t xml:space="preserve"> </w:t>
-      </w:r>
-      <w:r>
-        <w:rPr>
-          <w:sz w:val="24"/>
-          <w:szCs w:val="24"/>
-        </w:rPr>
-        <w:t>based</w:t>
-      </w:r>
-      <w:r>
-        <w:rPr>
-          <w:spacing w:val="6"/>
-          <w:sz w:val="24"/>
-          <w:szCs w:val="24"/>
-        </w:rPr>
-        <w:t xml:space="preserve"> </w:t>
-      </w:r>
-      <w:r>
-        <w:rPr>
-          <w:sz w:val="24"/>
-          <w:szCs w:val="24"/>
-        </w:rPr>
-        <w:t>on</w:t>
-      </w:r>
-      <w:r>
-        <w:rPr>
-          <w:spacing w:val="5"/>
-          <w:sz w:val="24"/>
-          <w:szCs w:val="24"/>
-        </w:rPr>
-        <w:t xml:space="preserve"> </w:t>
-      </w:r>
-      <w:r>
-        <w:rPr>
-          <w:sz w:val="24"/>
-          <w:szCs w:val="24"/>
-        </w:rPr>
-        <w:t>averages</w:t>
-      </w:r>
-      <w:r>
-        <w:rPr>
-          <w:spacing w:val="5"/>
-          <w:sz w:val="24"/>
-          <w:szCs w:val="24"/>
-        </w:rPr>
-        <w:t xml:space="preserve"> </w:t>
-      </w:r>
-      <w:r>
-        <w:rPr>
-          <w:sz w:val="24"/>
-          <w:szCs w:val="24"/>
-        </w:rPr>
-        <w:t>of</w:t>
-      </w:r>
-      <w:r>
-        <w:rPr>
-          <w:spacing w:val="6"/>
-          <w:sz w:val="24"/>
-          <w:szCs w:val="24"/>
-        </w:rPr>
-        <w:t xml:space="preserve"> </w:t>
-      </w:r>
-      <w:r>
-        <w:rPr>
-          <w:sz w:val="24"/>
-          <w:szCs w:val="24"/>
-        </w:rPr>
-        <w:t>past</w:t>
-      </w:r>
-      <w:r>
-        <w:rPr>
-          <w:spacing w:val="5"/>
-          <w:sz w:val="24"/>
-          <w:szCs w:val="24"/>
-        </w:rPr>
-        <w:t xml:space="preserve"> </w:t>
-      </w:r>
-      <w:r>
-        <w:rPr>
-          <w:sz w:val="24"/>
-          <w:szCs w:val="24"/>
-        </w:rPr>
-        <w:t>publications</w:t>
-      </w:r>
-      <w:r>
-        <w:rPr>
-          <w:spacing w:val="6"/>
-          <w:sz w:val="24"/>
-          <w:szCs w:val="24"/>
-        </w:rPr>
-        <w:t xml:space="preserve"> </w:t>
-      </w:r>
-      <w:r>
-        <w:rPr>
-          <w:sz w:val="24"/>
-          <w:szCs w:val="24"/>
-        </w:rPr>
-        <w:t>from</w:t>
-      </w:r>
-      <w:r>
-        <w:rPr>
-          <w:spacing w:val="5"/>
-          <w:sz w:val="24"/>
-          <w:szCs w:val="24"/>
-        </w:rPr>
-        <w:t xml:space="preserve"> </w:t>
-      </w:r>
-      <w:r>
-        <w:rPr>
-          <w:sz w:val="24"/>
-          <w:szCs w:val="24"/>
-        </w:rPr>
-        <w:t>our</w:t>
-      </w:r>
-      <w:r>
-        <w:rPr>
-          <w:spacing w:val="6"/>
-          <w:sz w:val="24"/>
-          <w:szCs w:val="24"/>
-        </w:rPr>
-        <w:t xml:space="preserve"> </w:t>
-      </w:r>
-      <w:r>
-        <w:rPr>
-          <w:sz w:val="24"/>
-          <w:szCs w:val="24"/>
-        </w:rPr>
-        <w:t>group. We expect 1 publication in year 1 and three in year 2 (see work plan in project description):</w:t>
+          <w:sz w:val="22"/>
+          <w:szCs w:val="22"/>
+        </w:rPr>
+        <w:t>will likely submit to the “American Astronomical Society Journals”, which determine publication costs using a tier system. All publications by our group from the past several years would be near the upper boundary of tier 2, resulting in publication costs of $2,704 per article. ($</w:t>
+      </w:r>
+      <w:r>
+        <w:rPr>
+          <w:sz w:val="22"/>
+          <w:szCs w:val="22"/>
+        </w:rPr>
+        <w:t>5,408</w:t>
+      </w:r>
+      <w:r>
+        <w:rPr>
+          <w:sz w:val="22"/>
+          <w:szCs w:val="22"/>
+        </w:rPr>
+        <w:t xml:space="preserve"> total for the project). Tier 2 is also the most represented tier in past AAS publications per AAS journals own data, with 44% of all past publications falling in that tier.</w:t>
       </w:r>
     </w:p>
     <w:p>
@@ -1299,6 +899,7 @@
           <w:numId w:val="1"/>
         </w:numPr>
         <w:tabs>
+          <w:tab w:val="clear" w:pos="720"/>
           <w:tab w:val="left" w:pos="752" w:leader="none"/>
         </w:tabs>
         <w:spacing w:before="160" w:after="0"/>
@@ -1367,7 +968,7 @@
       <w:headerReference w:type="default" r:id="rId2"/>
       <w:type w:val="nextPage"/>
       <w:pgSz w:w="12240" w:h="15840"/>
-      <w:pgMar w:left="1300" w:right="0" w:header="677" w:top="1499" w:footer="0" w:bottom="1921" w:gutter="0"/>
+      <w:pgMar w:left="1300" w:right="0" w:gutter="0" w:header="677" w:top="1499" w:footer="0" w:bottom="1921"/>
       <w:pgNumType w:start="1" w:fmt="decimal"/>
       <w:formProt w:val="false"/>
       <w:textDirection w:val="lrTb"/>
@@ -1378,11 +979,11 @@
 </file>
 
 <file path=word/header1.xml><?xml version="1.0" encoding="utf-8"?>
-<w:hdr xmlns:o="urn:schemas-microsoft-com:office:office" xmlns:r="http://schemas.openxmlformats.org/officeDocument/2006/relationships" xmlns:v="urn:schemas-microsoft-com:vml" xmlns:w="http://schemas.openxmlformats.org/wordprocessingml/2006/main" xmlns:w10="urn:schemas-microsoft-com:office:word" xmlns:wp="http://schemas.openxmlformats.org/drawingml/2006/wordprocessingDrawing" xmlns:wps="http://schemas.microsoft.com/office/word/2010/wordprocessingShape" xmlns:wpg="http://schemas.microsoft.com/office/word/2010/wordprocessingGroup" xmlns:mc="http://schemas.openxmlformats.org/markup-compatibility/2006" xmlns:wp14="http://schemas.microsoft.com/office/word/2010/wordprocessingDrawing" xmlns:w14="http://schemas.microsoft.com/office/word/2010/wordml" mc:Ignorable="w14 wp14">
+<w:hdr xmlns:o="urn:schemas-microsoft-com:office:office" xmlns:r="http://schemas.openxmlformats.org/officeDocument/2006/relationships" xmlns:v="urn:schemas-microsoft-com:vml" xmlns:w="http://schemas.openxmlformats.org/wordprocessingml/2006/main" xmlns:w10="urn:schemas-microsoft-com:office:word" xmlns:wp="http://schemas.openxmlformats.org/drawingml/2006/wordprocessingDrawing" xmlns:wps="http://schemas.microsoft.com/office/word/2010/wordprocessingShape" xmlns:wpg="http://schemas.microsoft.com/office/word/2010/wordprocessingGroup" xmlns:mc="http://schemas.openxmlformats.org/markup-compatibility/2006" xmlns:wp14="http://schemas.microsoft.com/office/word/2010/wordprocessingDrawing" xmlns:w14="http://schemas.microsoft.com/office/word/2010/wordml" xmlns:w15="http://schemas.microsoft.com/office/word/2012/wordml" mc:Ignorable="w14 wp14 w15">
   <w:p>
     <w:pPr>
       <w:pStyle w:val="TextBody"/>
-      <w:spacing w:lineRule="auto" w:line="9" w:before="0" w:after="0"/>
+      <w:spacing w:lineRule="auto" w:line="7" w:before="0" w:after="0"/>
       <w:ind w:left="0" w:right="0" w:hanging="0"/>
       <w:jc w:val="left"/>
       <w:rPr>
@@ -1399,7 +1000,7 @@
 </file>
 
 <file path=word/numbering.xml><?xml version="1.0" encoding="utf-8"?>
-<w:numbering xmlns:w="http://schemas.openxmlformats.org/wordprocessingml/2006/main" xmlns:o="urn:schemas-microsoft-com:office:office" xmlns:r="http://schemas.openxmlformats.org/officeDocument/2006/relationships" xmlns:v="urn:schemas-microsoft-com:vml">
+<w:numbering xmlns:w="http://schemas.openxmlformats.org/wordprocessingml/2006/main" xmlns:o="urn:schemas-microsoft-com:office:office" xmlns:r="http://schemas.openxmlformats.org/officeDocument/2006/relationships" xmlns:v="urn:schemas-microsoft-com:vml" xmlns:mc="http://schemas.openxmlformats.org/markup-compatibility/2006" xmlns:w14="http://schemas.microsoft.com/office/word/2010/wordml" mc:Ignorable="w14">
   <w:abstractNum w:abstractNumId="1">
     <w:lvl w:ilvl="0">
       <w:start w:val="4"/>
@@ -1407,8 +1008,12 @@
       <w:lvlText w:val="%1"/>
       <w:lvlJc w:val="left"/>
       <w:pPr>
+        <w:tabs>
+          <w:tab w:val="num" w:pos="0"/>
+        </w:tabs>
         <w:ind w:left="751" w:hanging="634"/>
       </w:pPr>
+      <w:rPr/>
     </w:lvl>
     <w:lvl w:ilvl="1">
       <w:start w:val="5"/>
@@ -1416,6 +1021,9 @@
       <w:lvlText w:val="12.%2"/>
       <w:lvlJc w:val="left"/>
       <w:pPr>
+        <w:tabs>
+          <w:tab w:val="num" w:pos="0"/>
+        </w:tabs>
         <w:ind w:left="751" w:hanging="634"/>
       </w:pPr>
       <w:rPr>
@@ -1433,11 +1041,13 @@
       <w:lvlText w:val=""/>
       <w:lvlJc w:val="left"/>
       <w:pPr>
+        <w:tabs>
+          <w:tab w:val="num" w:pos="0"/>
+        </w:tabs>
         <w:ind w:left="2796" w:hanging="634"/>
       </w:pPr>
       <w:rPr>
         <w:rFonts w:ascii="Symbol" w:hAnsi="Symbol" w:cs="Symbol" w:hint="default"/>
-        <w:rFonts w:cs="Symbol"/>
       </w:rPr>
     </w:lvl>
     <w:lvl w:ilvl="3">
@@ -1446,11 +1056,13 @@
       <w:lvlText w:val=""/>
       <w:lvlJc w:val="left"/>
       <w:pPr>
+        <w:tabs>
+          <w:tab w:val="num" w:pos="0"/>
+        </w:tabs>
         <w:ind w:left="3814" w:hanging="634"/>
       </w:pPr>
       <w:rPr>
         <w:rFonts w:ascii="Symbol" w:hAnsi="Symbol" w:cs="Symbol" w:hint="default"/>
-        <w:rFonts w:cs="Symbol"/>
       </w:rPr>
     </w:lvl>
     <w:lvl w:ilvl="4">
@@ -1459,11 +1071,13 @@
       <w:lvlText w:val=""/>
       <w:lvlJc w:val="left"/>
       <w:pPr>
+        <w:tabs>
+          <w:tab w:val="num" w:pos="0"/>
+        </w:tabs>
         <w:ind w:left="4832" w:hanging="634"/>
       </w:pPr>
       <w:rPr>
         <w:rFonts w:ascii="Symbol" w:hAnsi="Symbol" w:cs="Symbol" w:hint="default"/>
-        <w:rFonts w:cs="Symbol"/>
       </w:rPr>
     </w:lvl>
     <w:lvl w:ilvl="5">
@@ -1472,11 +1086,13 @@
       <w:lvlText w:val=""/>
       <w:lvlJc w:val="left"/>
       <w:pPr>
+        <w:tabs>
+          <w:tab w:val="num" w:pos="0"/>
+        </w:tabs>
         <w:ind w:left="5850" w:hanging="634"/>
       </w:pPr>
       <w:rPr>
         <w:rFonts w:ascii="Symbol" w:hAnsi="Symbol" w:cs="Symbol" w:hint="default"/>
-        <w:rFonts w:cs="Symbol"/>
       </w:rPr>
     </w:lvl>
     <w:lvl w:ilvl="6">
@@ -1485,11 +1101,13 @@
       <w:lvlText w:val=""/>
       <w:lvlJc w:val="left"/>
       <w:pPr>
+        <w:tabs>
+          <w:tab w:val="num" w:pos="0"/>
+        </w:tabs>
         <w:ind w:left="6868" w:hanging="634"/>
       </w:pPr>
       <w:rPr>
         <w:rFonts w:ascii="Symbol" w:hAnsi="Symbol" w:cs="Symbol" w:hint="default"/>
-        <w:rFonts w:cs="Symbol"/>
       </w:rPr>
     </w:lvl>
     <w:lvl w:ilvl="7">
@@ -1498,11 +1116,13 @@
       <w:lvlText w:val=""/>
       <w:lvlJc w:val="left"/>
       <w:pPr>
+        <w:tabs>
+          <w:tab w:val="num" w:pos="0"/>
+        </w:tabs>
         <w:ind w:left="7886" w:hanging="634"/>
       </w:pPr>
       <w:rPr>
         <w:rFonts w:ascii="Symbol" w:hAnsi="Symbol" w:cs="Symbol" w:hint="default"/>
-        <w:rFonts w:cs="Symbol"/>
       </w:rPr>
     </w:lvl>
     <w:lvl w:ilvl="8">
@@ -1511,11 +1131,13 @@
       <w:lvlText w:val=""/>
       <w:lvlJc w:val="left"/>
       <w:pPr>
+        <w:tabs>
+          <w:tab w:val="num" w:pos="0"/>
+        </w:tabs>
         <w:ind w:left="8904" w:hanging="634"/>
       </w:pPr>
       <w:rPr>
         <w:rFonts w:ascii="Symbol" w:hAnsi="Symbol" w:cs="Symbol" w:hint="default"/>
-        <w:rFonts w:cs="Symbol"/>
       </w:rPr>
     </w:lvl>
   </w:abstractNum>
@@ -1526,6 +1148,9 @@
       <w:lvlText w:val="%1"/>
       <w:lvlJc w:val="left"/>
       <w:pPr>
+        <w:tabs>
+          <w:tab w:val="num" w:pos="0"/>
+        </w:tabs>
         <w:ind w:left="391" w:hanging="455"/>
       </w:pPr>
       <w:rPr>
@@ -1543,6 +1168,9 @@
       <w:lvlText w:val="%1.%2"/>
       <w:lvlJc w:val="left"/>
       <w:pPr>
+        <w:tabs>
+          <w:tab w:val="num" w:pos="0"/>
+        </w:tabs>
         <w:ind w:left="571" w:hanging="634"/>
       </w:pPr>
       <w:rPr>
@@ -1560,6 +1188,9 @@
       <w:lvlText w:val="%1.%2.%3"/>
       <w:lvlJc w:val="left"/>
       <w:pPr>
+        <w:tabs>
+          <w:tab w:val="num" w:pos="0"/>
+        </w:tabs>
         <w:ind w:left="750" w:hanging="814"/>
       </w:pPr>
       <w:rPr>
@@ -1577,6 +1208,9 @@
       <w:lvlText w:val="•"/>
       <w:lvlJc w:val="left"/>
       <w:pPr>
+        <w:tabs>
+          <w:tab w:val="num" w:pos="0"/>
+        </w:tabs>
         <w:ind w:left="522" w:hanging="201"/>
       </w:pPr>
       <w:rPr>
@@ -1584,7 +1218,6 @@
         <w:sz w:val="24"/>
         <w:szCs w:val="24"/>
         <w:w w:val="99"/>
-        <w:rFonts w:cs="Arial"/>
       </w:rPr>
     </w:lvl>
     <w:lvl w:ilvl="4">
@@ -1593,11 +1226,13 @@
       <w:lvlText w:val=""/>
       <w:lvlJc w:val="left"/>
       <w:pPr>
+        <w:tabs>
+          <w:tab w:val="num" w:pos="0"/>
+        </w:tabs>
         <w:ind w:left="2188" w:hanging="201"/>
       </w:pPr>
       <w:rPr>
         <w:rFonts w:ascii="Symbol" w:hAnsi="Symbol" w:cs="Symbol" w:hint="default"/>
-        <w:rFonts w:cs="Symbol"/>
       </w:rPr>
     </w:lvl>
     <w:lvl w:ilvl="5">
@@ -1606,11 +1241,13 @@
       <w:lvlText w:val=""/>
       <w:lvlJc w:val="left"/>
       <w:pPr>
+        <w:tabs>
+          <w:tab w:val="num" w:pos="0"/>
+        </w:tabs>
         <w:ind w:left="3617" w:hanging="201"/>
       </w:pPr>
       <w:rPr>
         <w:rFonts w:ascii="Symbol" w:hAnsi="Symbol" w:cs="Symbol" w:hint="default"/>
-        <w:rFonts w:cs="Symbol"/>
       </w:rPr>
     </w:lvl>
     <w:lvl w:ilvl="6">
@@ -1619,11 +1256,13 @@
       <w:lvlText w:val=""/>
       <w:lvlJc w:val="left"/>
       <w:pPr>
+        <w:tabs>
+          <w:tab w:val="num" w:pos="0"/>
+        </w:tabs>
         <w:ind w:left="5045" w:hanging="201"/>
       </w:pPr>
       <w:rPr>
         <w:rFonts w:ascii="Symbol" w:hAnsi="Symbol" w:cs="Symbol" w:hint="default"/>
-        <w:rFonts w:cs="Symbol"/>
       </w:rPr>
     </w:lvl>
     <w:lvl w:ilvl="7">
@@ -1632,11 +1271,13 @@
       <w:lvlText w:val=""/>
       <w:lvlJc w:val="left"/>
       <w:pPr>
+        <w:tabs>
+          <w:tab w:val="num" w:pos="0"/>
+        </w:tabs>
         <w:ind w:left="6474" w:hanging="201"/>
       </w:pPr>
       <w:rPr>
         <w:rFonts w:ascii="Symbol" w:hAnsi="Symbol" w:cs="Symbol" w:hint="default"/>
-        <w:rFonts w:cs="Symbol"/>
       </w:rPr>
     </w:lvl>
     <w:lvl w:ilvl="8">
@@ -1645,130 +1286,17 @@
       <w:lvlText w:val=""/>
       <w:lvlJc w:val="left"/>
       <w:pPr>
+        <w:tabs>
+          <w:tab w:val="num" w:pos="0"/>
+        </w:tabs>
         <w:ind w:left="7902" w:hanging="201"/>
       </w:pPr>
       <w:rPr>
         <w:rFonts w:ascii="Symbol" w:hAnsi="Symbol" w:cs="Symbol" w:hint="default"/>
-        <w:rFonts w:cs="Symbol"/>
       </w:rPr>
     </w:lvl>
   </w:abstractNum>
   <w:abstractNum w:abstractNumId="3">
-    <w:lvl w:ilvl="0">
-      <w:start w:val="1"/>
-      <w:numFmt w:val="decimal"/>
-      <w:lvlText w:val="%1."/>
-      <w:lvlJc w:val="left"/>
-      <w:pPr>
-        <w:ind w:left="1188" w:hanging="360"/>
-      </w:pPr>
-    </w:lvl>
-    <w:lvl w:ilvl="1">
-      <w:start w:val="1"/>
-      <w:numFmt w:val="bullet"/>
-      <w:lvlText w:val="o"/>
-      <w:lvlJc w:val="left"/>
-      <w:pPr>
-        <w:ind w:left="1908" w:hanging="360"/>
-      </w:pPr>
-      <w:rPr>
-        <w:rFonts w:ascii="Courier New" w:hAnsi="Courier New" w:cs="Courier New" w:hint="default"/>
-        <w:rFonts w:cs="Courier New"/>
-      </w:rPr>
-    </w:lvl>
-    <w:lvl w:ilvl="2">
-      <w:start w:val="1"/>
-      <w:numFmt w:val="bullet"/>
-      <w:lvlText w:val=""/>
-      <w:lvlJc w:val="left"/>
-      <w:pPr>
-        <w:ind w:left="2628" w:hanging="360"/>
-      </w:pPr>
-      <w:rPr>
-        <w:rFonts w:ascii="Wingdings" w:hAnsi="Wingdings" w:cs="Wingdings" w:hint="default"/>
-        <w:rFonts w:cs="Wingdings"/>
-      </w:rPr>
-    </w:lvl>
-    <w:lvl w:ilvl="3">
-      <w:start w:val="1"/>
-      <w:numFmt w:val="bullet"/>
-      <w:lvlText w:val=""/>
-      <w:lvlJc w:val="left"/>
-      <w:pPr>
-        <w:ind w:left="3348" w:hanging="360"/>
-      </w:pPr>
-      <w:rPr>
-        <w:rFonts w:ascii="Symbol" w:hAnsi="Symbol" w:cs="Symbol" w:hint="default"/>
-        <w:rFonts w:cs="Symbol"/>
-      </w:rPr>
-    </w:lvl>
-    <w:lvl w:ilvl="4">
-      <w:start w:val="1"/>
-      <w:numFmt w:val="bullet"/>
-      <w:lvlText w:val="o"/>
-      <w:lvlJc w:val="left"/>
-      <w:pPr>
-        <w:ind w:left="4068" w:hanging="360"/>
-      </w:pPr>
-      <w:rPr>
-        <w:rFonts w:ascii="Courier New" w:hAnsi="Courier New" w:cs="Courier New" w:hint="default"/>
-        <w:rFonts w:cs="Courier New"/>
-      </w:rPr>
-    </w:lvl>
-    <w:lvl w:ilvl="5">
-      <w:start w:val="1"/>
-      <w:numFmt w:val="bullet"/>
-      <w:lvlText w:val=""/>
-      <w:lvlJc w:val="left"/>
-      <w:pPr>
-        <w:ind w:left="4788" w:hanging="360"/>
-      </w:pPr>
-      <w:rPr>
-        <w:rFonts w:ascii="Wingdings" w:hAnsi="Wingdings" w:cs="Wingdings" w:hint="default"/>
-        <w:rFonts w:cs="Wingdings"/>
-      </w:rPr>
-    </w:lvl>
-    <w:lvl w:ilvl="6">
-      <w:start w:val="1"/>
-      <w:numFmt w:val="bullet"/>
-      <w:lvlText w:val=""/>
-      <w:lvlJc w:val="left"/>
-      <w:pPr>
-        <w:ind w:left="5508" w:hanging="360"/>
-      </w:pPr>
-      <w:rPr>
-        <w:rFonts w:ascii="Symbol" w:hAnsi="Symbol" w:cs="Symbol" w:hint="default"/>
-        <w:rFonts w:cs="Symbol"/>
-      </w:rPr>
-    </w:lvl>
-    <w:lvl w:ilvl="7">
-      <w:start w:val="1"/>
-      <w:numFmt w:val="bullet"/>
-      <w:lvlText w:val="o"/>
-      <w:lvlJc w:val="left"/>
-      <w:pPr>
-        <w:ind w:left="6228" w:hanging="360"/>
-      </w:pPr>
-      <w:rPr>
-        <w:rFonts w:ascii="Courier New" w:hAnsi="Courier New" w:cs="Courier New" w:hint="default"/>
-        <w:rFonts w:cs="Courier New"/>
-      </w:rPr>
-    </w:lvl>
-    <w:lvl w:ilvl="8">
-      <w:start w:val="1"/>
-      <w:numFmt w:val="bullet"/>
-      <w:lvlText w:val=""/>
-      <w:lvlJc w:val="left"/>
-      <w:pPr>
-        <w:ind w:left="6948" w:hanging="360"/>
-      </w:pPr>
-      <w:rPr>
-        <w:rFonts w:ascii="Wingdings" w:hAnsi="Wingdings" w:cs="Wingdings" w:hint="default"/>
-        <w:rFonts w:cs="Wingdings"/>
-      </w:rPr>
-    </w:lvl>
-  </w:abstractNum>
-  <w:abstractNum w:abstractNumId="4">
     <w:lvl w:ilvl="0">
       <w:start w:val="1"/>
       <w:numFmt w:val="none"/>
@@ -1776,6 +1304,9 @@
       <w:lvlText w:val=""/>
       <w:lvlJc w:val="left"/>
       <w:pPr>
+        <w:tabs>
+          <w:tab w:val="num" w:pos="0"/>
+        </w:tabs>
         <w:ind w:left="0" w:hanging="0"/>
       </w:pPr>
     </w:lvl>
@@ -1786,6 +1317,9 @@
       <w:lvlText w:val=""/>
       <w:lvlJc w:val="left"/>
       <w:pPr>
+        <w:tabs>
+          <w:tab w:val="num" w:pos="0"/>
+        </w:tabs>
         <w:ind w:left="0" w:hanging="0"/>
       </w:pPr>
     </w:lvl>
@@ -1796,6 +1330,9 @@
       <w:lvlText w:val=""/>
       <w:lvlJc w:val="left"/>
       <w:pPr>
+        <w:tabs>
+          <w:tab w:val="num" w:pos="0"/>
+        </w:tabs>
         <w:ind w:left="0" w:hanging="0"/>
       </w:pPr>
     </w:lvl>
@@ -1806,6 +1343,9 @@
       <w:lvlText w:val=""/>
       <w:lvlJc w:val="left"/>
       <w:pPr>
+        <w:tabs>
+          <w:tab w:val="num" w:pos="0"/>
+        </w:tabs>
         <w:ind w:left="0" w:hanging="0"/>
       </w:pPr>
     </w:lvl>
@@ -1816,6 +1356,9 @@
       <w:lvlText w:val=""/>
       <w:lvlJc w:val="left"/>
       <w:pPr>
+        <w:tabs>
+          <w:tab w:val="num" w:pos="0"/>
+        </w:tabs>
         <w:ind w:left="0" w:hanging="0"/>
       </w:pPr>
     </w:lvl>
@@ -1826,6 +1369,9 @@
       <w:lvlText w:val=""/>
       <w:lvlJc w:val="left"/>
       <w:pPr>
+        <w:tabs>
+          <w:tab w:val="num" w:pos="0"/>
+        </w:tabs>
         <w:ind w:left="0" w:hanging="0"/>
       </w:pPr>
     </w:lvl>
@@ -1836,6 +1382,9 @@
       <w:lvlText w:val=""/>
       <w:lvlJc w:val="left"/>
       <w:pPr>
+        <w:tabs>
+          <w:tab w:val="num" w:pos="0"/>
+        </w:tabs>
         <w:ind w:left="0" w:hanging="0"/>
       </w:pPr>
     </w:lvl>
@@ -1846,6 +1395,9 @@
       <w:lvlText w:val=""/>
       <w:lvlJc w:val="left"/>
       <w:pPr>
+        <w:tabs>
+          <w:tab w:val="num" w:pos="0"/>
+        </w:tabs>
         <w:ind w:left="0" w:hanging="0"/>
       </w:pPr>
     </w:lvl>
@@ -1856,6 +1408,9 @@
       <w:lvlText w:val=""/>
       <w:lvlJc w:val="left"/>
       <w:pPr>
+        <w:tabs>
+          <w:tab w:val="num" w:pos="0"/>
+        </w:tabs>
         <w:ind w:left="0" w:hanging="0"/>
       </w:pPr>
     </w:lvl>
@@ -1868,9 +1423,6 @@
   </w:num>
   <w:num w:numId="3">
     <w:abstractNumId w:val="3"/>
-  </w:num>
-  <w:num w:numId="4">
-    <w:abstractNumId w:val="4"/>
   </w:num>
 </w:numbering>
 </file>
@@ -1887,7 +1439,9 @@
       </w:rPr>
     </w:rPrDefault>
     <w:pPrDefault>
-      <w:pPr/>
+      <w:pPr>
+        <w:suppressAutoHyphens w:val="true"/>
+      </w:pPr>
     </w:pPrDefault>
   </w:docDefaults>
   <w:latentStyles w:defLockedState="0" w:defUIPriority="99" w:defSemiHidden="0" w:defUnhideWhenUsed="0" w:defQFormat="0" w:count="376">
@@ -2275,6 +1829,7 @@
     <w:pPr>
       <w:widowControl/>
       <w:bidi w:val="0"/>
+      <w:spacing w:before="0" w:after="0"/>
       <w:jc w:val="left"/>
     </w:pPr>
     <w:rPr>
@@ -2344,7 +1899,7 @@
     <w:rPr/>
   </w:style>
   <w:style w:type="character" w:styleId="InternetLink" w:customStyle="1">
-    <w:name w:val="Internet Link"/>
+    <w:name w:val="Hyperlink"/>
     <w:basedOn w:val="DefaultParagraphFont"/>
     <w:uiPriority w:val="99"/>
     <w:semiHidden/>
@@ -2353,490 +1908,6 @@
     <w:rPr>
       <w:color w:val="0000FF"/>
       <w:u w:val="single"/>
-    </w:rPr>
-  </w:style>
-  <w:style w:type="character" w:styleId="ListLabel1" w:customStyle="1">
-    <w:name w:val="ListLabel 1"/>
-    <w:qFormat/>
-    <w:rPr>
-      <w:rFonts w:eastAsia="Arial" w:cs="Arial"/>
-      <w:b/>
-      <w:bCs/>
-      <w:w w:val="102"/>
-      <w:sz w:val="21"/>
-      <w:szCs w:val="21"/>
-    </w:rPr>
-  </w:style>
-  <w:style w:type="character" w:styleId="ListLabel2" w:customStyle="1">
-    <w:name w:val="ListLabel 2"/>
-    <w:qFormat/>
-    <w:rPr>
-      <w:rFonts w:eastAsia="Arial" w:cs="Arial"/>
-      <w:b/>
-      <w:bCs/>
-      <w:w w:val="102"/>
-      <w:sz w:val="21"/>
-      <w:szCs w:val="21"/>
-    </w:rPr>
-  </w:style>
-  <w:style w:type="character" w:styleId="ListLabel3" w:customStyle="1">
-    <w:name w:val="ListLabel 3"/>
-    <w:qFormat/>
-    <w:rPr>
-      <w:rFonts w:eastAsia="Arial" w:cs="Arial"/>
-      <w:b/>
-      <w:bCs/>
-      <w:w w:val="102"/>
-      <w:sz w:val="21"/>
-      <w:szCs w:val="21"/>
-    </w:rPr>
-  </w:style>
-  <w:style w:type="character" w:styleId="ListLabel4" w:customStyle="1">
-    <w:name w:val="ListLabel 4"/>
-    <w:qFormat/>
-    <w:rPr>
-      <w:rFonts w:eastAsia="Arial" w:cs="Arial"/>
-      <w:b/>
-      <w:bCs/>
-      <w:w w:val="102"/>
-      <w:sz w:val="21"/>
-      <w:szCs w:val="21"/>
-    </w:rPr>
-  </w:style>
-  <w:style w:type="character" w:styleId="ListLabel5" w:customStyle="1">
-    <w:name w:val="ListLabel 5"/>
-    <w:qFormat/>
-    <w:rPr>
-      <w:rFonts w:eastAsia="Arial" w:cs="Arial"/>
-      <w:w w:val="99"/>
-      <w:sz w:val="24"/>
-      <w:szCs w:val="24"/>
-    </w:rPr>
-  </w:style>
-  <w:style w:type="character" w:styleId="ListLabel6" w:customStyle="1">
-    <w:name w:val="ListLabel 6"/>
-    <w:qFormat/>
-    <w:rPr>
-      <w:rFonts w:eastAsia="Arial" w:cs="Arial"/>
-      <w:b/>
-      <w:bCs/>
-      <w:w w:val="102"/>
-      <w:sz w:val="21"/>
-      <w:szCs w:val="21"/>
-    </w:rPr>
-  </w:style>
-  <w:style w:type="character" w:styleId="ListLabel7" w:customStyle="1">
-    <w:name w:val="ListLabel 7"/>
-    <w:qFormat/>
-    <w:rPr>
-      <w:rFonts w:eastAsia="Arial" w:cs="Arial"/>
-      <w:b/>
-      <w:bCs/>
-      <w:w w:val="102"/>
-      <w:sz w:val="21"/>
-      <w:szCs w:val="21"/>
-    </w:rPr>
-  </w:style>
-  <w:style w:type="character" w:styleId="ListLabel8" w:customStyle="1">
-    <w:name w:val="ListLabel 8"/>
-    <w:qFormat/>
-    <w:rPr>
-      <w:rFonts w:eastAsia="Arial" w:cs="Arial"/>
-      <w:b/>
-      <w:bCs/>
-      <w:w w:val="102"/>
-      <w:sz w:val="21"/>
-      <w:szCs w:val="21"/>
-    </w:rPr>
-  </w:style>
-  <w:style w:type="character" w:styleId="ListLabel9" w:customStyle="1">
-    <w:name w:val="ListLabel 9"/>
-    <w:qFormat/>
-    <w:rPr>
-      <w:rFonts w:eastAsia="Arial" w:cs="Arial"/>
-      <w:w w:val="99"/>
-      <w:sz w:val="24"/>
-      <w:szCs w:val="24"/>
-    </w:rPr>
-  </w:style>
-  <w:style w:type="character" w:styleId="ListLabel10" w:customStyle="1">
-    <w:name w:val="ListLabel 10"/>
-    <w:qFormat/>
-    <w:rPr>
-      <w:rFonts w:eastAsia="Arial" w:cs="Arial"/>
-      <w:b/>
-      <w:bCs/>
-      <w:w w:val="102"/>
-      <w:sz w:val="21"/>
-      <w:szCs w:val="21"/>
-    </w:rPr>
-  </w:style>
-  <w:style w:type="character" w:styleId="ListLabel11" w:customStyle="1">
-    <w:name w:val="ListLabel 11"/>
-    <w:qFormat/>
-    <w:rPr>
-      <w:rFonts w:eastAsia="Arial" w:cs="Arial"/>
-      <w:b/>
-      <w:bCs/>
-      <w:w w:val="102"/>
-      <w:sz w:val="21"/>
-      <w:szCs w:val="21"/>
-    </w:rPr>
-  </w:style>
-  <w:style w:type="character" w:styleId="ListLabel12" w:customStyle="1">
-    <w:name w:val="ListLabel 12"/>
-    <w:qFormat/>
-    <w:rPr>
-      <w:rFonts w:eastAsia="Arial" w:cs="Arial"/>
-      <w:b/>
-      <w:bCs/>
-      <w:w w:val="102"/>
-      <w:sz w:val="24"/>
-      <w:szCs w:val="24"/>
-    </w:rPr>
-  </w:style>
-  <w:style w:type="character" w:styleId="ListLabel13" w:customStyle="1">
-    <w:name w:val="ListLabel 13"/>
-    <w:qFormat/>
-    <w:rPr>
-      <w:rFonts w:eastAsia="Arial" w:cs="Arial"/>
-      <w:b/>
-      <w:bCs/>
-      <w:w w:val="102"/>
-      <w:sz w:val="24"/>
-      <w:szCs w:val="24"/>
-    </w:rPr>
-  </w:style>
-  <w:style w:type="character" w:styleId="ListLabel14" w:customStyle="1">
-    <w:name w:val="ListLabel 14"/>
-    <w:qFormat/>
-    <w:rPr>
-      <w:rFonts w:eastAsia="Arial" w:cs="Arial"/>
-      <w:b/>
-      <w:bCs/>
-      <w:w w:val="102"/>
-      <w:sz w:val="24"/>
-      <w:szCs w:val="21"/>
-    </w:rPr>
-  </w:style>
-  <w:style w:type="character" w:styleId="ListLabel15" w:customStyle="1">
-    <w:name w:val="ListLabel 15"/>
-    <w:qFormat/>
-    <w:rPr>
-      <w:rFonts w:eastAsia="Arial" w:cs="Arial"/>
-      <w:w w:val="99"/>
-      <w:sz w:val="24"/>
-      <w:szCs w:val="24"/>
-    </w:rPr>
-  </w:style>
-  <w:style w:type="character" w:styleId="ListLabel16" w:customStyle="1">
-    <w:name w:val="ListLabel 16"/>
-    <w:qFormat/>
-    <w:rPr>
-      <w:rFonts w:eastAsia="Arial" w:cs="Arial"/>
-      <w:b/>
-      <w:bCs/>
-      <w:w w:val="102"/>
-      <w:sz w:val="21"/>
-      <w:szCs w:val="21"/>
-    </w:rPr>
-  </w:style>
-  <w:style w:type="character" w:styleId="ListLabel17" w:customStyle="1">
-    <w:name w:val="ListLabel 17"/>
-    <w:qFormat/>
-    <w:rPr>
-      <w:rFonts w:eastAsia="Arial" w:cs="Arial"/>
-      <w:b/>
-      <w:bCs/>
-      <w:w w:val="102"/>
-      <w:sz w:val="21"/>
-      <w:szCs w:val="21"/>
-    </w:rPr>
-  </w:style>
-  <w:style w:type="character" w:styleId="ListLabel18" w:customStyle="1">
-    <w:name w:val="ListLabel 18"/>
-    <w:qFormat/>
-    <w:rPr>
-      <w:rFonts w:eastAsia="Arial" w:cs="Arial"/>
-      <w:b/>
-      <w:bCs/>
-      <w:w w:val="102"/>
-      <w:sz w:val="21"/>
-      <w:szCs w:val="21"/>
-    </w:rPr>
-  </w:style>
-  <w:style w:type="character" w:styleId="ListLabel19" w:customStyle="1">
-    <w:name w:val="ListLabel 19"/>
-    <w:qFormat/>
-    <w:rPr>
-      <w:rFonts w:eastAsia="Arial" w:cs="Arial"/>
-      <w:w w:val="99"/>
-      <w:sz w:val="24"/>
-      <w:szCs w:val="24"/>
-    </w:rPr>
-  </w:style>
-  <w:style w:type="character" w:styleId="ListLabel20" w:customStyle="1">
-    <w:name w:val="ListLabel 20"/>
-    <w:qFormat/>
-    <w:rPr>
-      <w:rFonts w:eastAsia="Arial" w:cs="Arial"/>
-      <w:b/>
-      <w:bCs/>
-      <w:w w:val="102"/>
-      <w:sz w:val="21"/>
-      <w:szCs w:val="21"/>
-    </w:rPr>
-  </w:style>
-  <w:style w:type="character" w:styleId="ListLabel21" w:customStyle="1">
-    <w:name w:val="ListLabel 21"/>
-    <w:qFormat/>
-    <w:rPr>
-      <w:rFonts w:eastAsia="Arial" w:cs="Arial"/>
-      <w:b/>
-      <w:bCs/>
-      <w:w w:val="102"/>
-      <w:sz w:val="21"/>
-      <w:szCs w:val="21"/>
-    </w:rPr>
-  </w:style>
-  <w:style w:type="character" w:styleId="ListLabel22" w:customStyle="1">
-    <w:name w:val="ListLabel 22"/>
-    <w:qFormat/>
-    <w:rPr>
-      <w:rFonts w:cs="Courier New"/>
-    </w:rPr>
-  </w:style>
-  <w:style w:type="character" w:styleId="ListLabel23" w:customStyle="1">
-    <w:name w:val="ListLabel 23"/>
-    <w:qFormat/>
-    <w:rPr>
-      <w:rFonts w:cs="Courier New"/>
-    </w:rPr>
-  </w:style>
-  <w:style w:type="character" w:styleId="ListLabel24" w:customStyle="1">
-    <w:name w:val="ListLabel 24"/>
-    <w:qFormat/>
-    <w:rPr>
-      <w:rFonts w:cs="Courier New"/>
-    </w:rPr>
-  </w:style>
-  <w:style w:type="character" w:styleId="ListLabel25" w:customStyle="1">
-    <w:name w:val="ListLabel 25"/>
-    <w:qFormat/>
-    <w:rPr>
-      <w:rFonts w:cs="Courier New"/>
-    </w:rPr>
-  </w:style>
-  <w:style w:type="character" w:styleId="ListLabel26" w:customStyle="1">
-    <w:name w:val="ListLabel 26"/>
-    <w:qFormat/>
-    <w:rPr>
-      <w:rFonts w:cs="Courier New"/>
-    </w:rPr>
-  </w:style>
-  <w:style w:type="character" w:styleId="ListLabel27" w:customStyle="1">
-    <w:name w:val="ListLabel 27"/>
-    <w:qFormat/>
-    <w:rPr>
-      <w:rFonts w:cs="Courier New"/>
-    </w:rPr>
-  </w:style>
-  <w:style w:type="character" w:styleId="ListLabel28">
-    <w:name w:val="ListLabel 28"/>
-    <w:qFormat/>
-    <w:rPr>
-      <w:rFonts w:eastAsia="Arial" w:cs="Arial"/>
-      <w:b/>
-      <w:bCs/>
-      <w:w w:val="102"/>
-      <w:sz w:val="21"/>
-      <w:szCs w:val="21"/>
-    </w:rPr>
-  </w:style>
-  <w:style w:type="character" w:styleId="ListLabel29">
-    <w:name w:val="ListLabel 29"/>
-    <w:qFormat/>
-    <w:rPr>
-      <w:rFonts w:cs="Symbol"/>
-    </w:rPr>
-  </w:style>
-  <w:style w:type="character" w:styleId="ListLabel30">
-    <w:name w:val="ListLabel 30"/>
-    <w:qFormat/>
-    <w:rPr>
-      <w:rFonts w:cs="Symbol"/>
-    </w:rPr>
-  </w:style>
-  <w:style w:type="character" w:styleId="ListLabel31">
-    <w:name w:val="ListLabel 31"/>
-    <w:qFormat/>
-    <w:rPr>
-      <w:rFonts w:cs="Symbol"/>
-    </w:rPr>
-  </w:style>
-  <w:style w:type="character" w:styleId="ListLabel32">
-    <w:name w:val="ListLabel 32"/>
-    <w:qFormat/>
-    <w:rPr>
-      <w:rFonts w:cs="Symbol"/>
-    </w:rPr>
-  </w:style>
-  <w:style w:type="character" w:styleId="ListLabel33">
-    <w:name w:val="ListLabel 33"/>
-    <w:qFormat/>
-    <w:rPr>
-      <w:rFonts w:cs="Symbol"/>
-    </w:rPr>
-  </w:style>
-  <w:style w:type="character" w:styleId="ListLabel34">
-    <w:name w:val="ListLabel 34"/>
-    <w:qFormat/>
-    <w:rPr>
-      <w:rFonts w:cs="Symbol"/>
-    </w:rPr>
-  </w:style>
-  <w:style w:type="character" w:styleId="ListLabel35">
-    <w:name w:val="ListLabel 35"/>
-    <w:qFormat/>
-    <w:rPr>
-      <w:rFonts w:cs="Symbol"/>
-    </w:rPr>
-  </w:style>
-  <w:style w:type="character" w:styleId="ListLabel36">
-    <w:name w:val="ListLabel 36"/>
-    <w:qFormat/>
-    <w:rPr>
-      <w:rFonts w:eastAsia="Arial" w:cs="Arial"/>
-      <w:b/>
-      <w:bCs/>
-      <w:w w:val="102"/>
-      <w:sz w:val="24"/>
-      <w:szCs w:val="24"/>
-    </w:rPr>
-  </w:style>
-  <w:style w:type="character" w:styleId="ListLabel37">
-    <w:name w:val="ListLabel 37"/>
-    <w:qFormat/>
-    <w:rPr>
-      <w:rFonts w:eastAsia="Arial" w:cs="Arial"/>
-      <w:b/>
-      <w:bCs/>
-      <w:w w:val="102"/>
-      <w:sz w:val="24"/>
-      <w:szCs w:val="24"/>
-    </w:rPr>
-  </w:style>
-  <w:style w:type="character" w:styleId="ListLabel38">
-    <w:name w:val="ListLabel 38"/>
-    <w:qFormat/>
-    <w:rPr>
-      <w:rFonts w:eastAsia="Arial" w:cs="Arial"/>
-      <w:b/>
-      <w:bCs/>
-      <w:w w:val="102"/>
-      <w:sz w:val="24"/>
-      <w:szCs w:val="21"/>
-    </w:rPr>
-  </w:style>
-  <w:style w:type="character" w:styleId="ListLabel39">
-    <w:name w:val="ListLabel 39"/>
-    <w:qFormat/>
-    <w:rPr>
-      <w:rFonts w:cs="Arial"/>
-      <w:w w:val="99"/>
-      <w:sz w:val="24"/>
-      <w:szCs w:val="24"/>
-    </w:rPr>
-  </w:style>
-  <w:style w:type="character" w:styleId="ListLabel40">
-    <w:name w:val="ListLabel 40"/>
-    <w:qFormat/>
-    <w:rPr>
-      <w:rFonts w:cs="Symbol"/>
-    </w:rPr>
-  </w:style>
-  <w:style w:type="character" w:styleId="ListLabel41">
-    <w:name w:val="ListLabel 41"/>
-    <w:qFormat/>
-    <w:rPr>
-      <w:rFonts w:cs="Symbol"/>
-    </w:rPr>
-  </w:style>
-  <w:style w:type="character" w:styleId="ListLabel42">
-    <w:name w:val="ListLabel 42"/>
-    <w:qFormat/>
-    <w:rPr>
-      <w:rFonts w:cs="Symbol"/>
-    </w:rPr>
-  </w:style>
-  <w:style w:type="character" w:styleId="ListLabel43">
-    <w:name w:val="ListLabel 43"/>
-    <w:qFormat/>
-    <w:rPr>
-      <w:rFonts w:cs="Symbol"/>
-    </w:rPr>
-  </w:style>
-  <w:style w:type="character" w:styleId="ListLabel44">
-    <w:name w:val="ListLabel 44"/>
-    <w:qFormat/>
-    <w:rPr>
-      <w:rFonts w:cs="Symbol"/>
-    </w:rPr>
-  </w:style>
-  <w:style w:type="character" w:styleId="ListLabel45">
-    <w:name w:val="ListLabel 45"/>
-    <w:qFormat/>
-    <w:rPr>
-      <w:rFonts w:cs="Courier New"/>
-    </w:rPr>
-  </w:style>
-  <w:style w:type="character" w:styleId="ListLabel46">
-    <w:name w:val="ListLabel 46"/>
-    <w:qFormat/>
-    <w:rPr>
-      <w:rFonts w:cs="Wingdings"/>
-    </w:rPr>
-  </w:style>
-  <w:style w:type="character" w:styleId="ListLabel47">
-    <w:name w:val="ListLabel 47"/>
-    <w:qFormat/>
-    <w:rPr>
-      <w:rFonts w:cs="Symbol"/>
-    </w:rPr>
-  </w:style>
-  <w:style w:type="character" w:styleId="ListLabel48">
-    <w:name w:val="ListLabel 48"/>
-    <w:qFormat/>
-    <w:rPr>
-      <w:rFonts w:cs="Courier New"/>
-    </w:rPr>
-  </w:style>
-  <w:style w:type="character" w:styleId="ListLabel49">
-    <w:name w:val="ListLabel 49"/>
-    <w:qFormat/>
-    <w:rPr>
-      <w:rFonts w:cs="Wingdings"/>
-    </w:rPr>
-  </w:style>
-  <w:style w:type="character" w:styleId="ListLabel50">
-    <w:name w:val="ListLabel 50"/>
-    <w:qFormat/>
-    <w:rPr>
-      <w:rFonts w:cs="Symbol"/>
-    </w:rPr>
-  </w:style>
-  <w:style w:type="character" w:styleId="ListLabel51">
-    <w:name w:val="ListLabel 51"/>
-    <w:qFormat/>
-    <w:rPr>
-      <w:rFonts w:cs="Courier New"/>
-    </w:rPr>
-  </w:style>
-  <w:style w:type="character" w:styleId="ListLabel52">
-    <w:name w:val="ListLabel 52"/>
-    <w:qFormat/>
-    <w:rPr>
-      <w:rFonts w:cs="Wingdings"/>
     </w:rPr>
   </w:style>
   <w:style w:type="paragraph" w:styleId="Heading" w:customStyle="1">
@@ -2939,6 +2010,13 @@
     <w:pPr/>
     <w:rPr/>
   </w:style>
+  <w:style w:type="paragraph" w:styleId="HeaderandFooter">
+    <w:name w:val="Header and Footer"/>
+    <w:basedOn w:val="Normal"/>
+    <w:qFormat/>
+    <w:pPr/>
+    <w:rPr/>
+  </w:style>
   <w:style w:type="paragraph" w:styleId="Header">
     <w:name w:val="Header"/>
     <w:basedOn w:val="Normal"/>
@@ -2948,6 +2026,7 @@
     <w:rsid w:val="006834d6"/>
     <w:pPr>
       <w:tabs>
+        <w:tab w:val="clear" w:pos="720"/>
         <w:tab w:val="center" w:pos="4680" w:leader="none"/>
         <w:tab w:val="right" w:pos="9360" w:leader="none"/>
       </w:tabs>
@@ -2963,6 +2042,7 @@
     <w:rsid w:val="006834d6"/>
     <w:pPr>
       <w:tabs>
+        <w:tab w:val="clear" w:pos="720"/>
         <w:tab w:val="center" w:pos="4680" w:leader="none"/>
         <w:tab w:val="right" w:pos="9360" w:leader="none"/>
       </w:tabs>
@@ -2999,7 +2079,6 @@
     <w:semiHidden/>
     <w:unhideWhenUsed/>
     <w:tblPr>
-      <w:tblInd w:w="0" w:type="dxa"/>
       <w:tblCellMar>
         <w:top w:w="0" w:type="dxa"/>
         <w:left w:w="108" w:type="dxa"/>

</xml_diff>